<commit_message>
Laporan: durasi make test dari CI PR #8; tutup pipe di test host KV260
Co-Authored-By: Claude Opus 5.5 <noreply@anthropic.com>
Claude-Session: https://claude.ai/code/session_01JWHcwMqQzXkB9LnTCQYUWo
</commit_message>
<xml_diff>
--- a/docs/laporan/Laporan_PADAN.docx
+++ b/docs/laporan/Laporan_PADAN.docx
@@ -4704,7 +4704,28 @@
         <w:t xml:space="preserve"> </w:t>
       </w:r>
       <w:r>
-        <w:t xml:space="preserve">menjalankan semua target di bawah, sekitar 35 menit. CI GitHub</w:t>
+        <w:t xml:space="preserve">menjalankan semua target di bawah: 30 menit lokal, 33 menit di CI</w:t>
+      </w:r>
+      <w:r>
+        <w:t xml:space="preserve"> </w:t>
+      </w:r>
+      <w:r>
+        <w:t xml:space="preserve">(job</w:t>
+      </w:r>
+      <w:r>
+        <w:t xml:space="preserve"> </w:t>
+      </w:r>
+      <w:r>
+        <w:rPr>
+          <w:rStyle w:val="VerbatimChar"/>
+        </w:rPr>
+        <w:t xml:space="preserve">cocotb</w:t>
+      </w:r>
+      <w:r>
+        <w:t xml:space="preserve"> </w:t>
+      </w:r>
+      <w:r>
+        <w:t xml:space="preserve">PR #8, 04:55–05:28 UTC, 17 Oktober 2026). CI GitHub</w:t>
       </w:r>
       <w:r>
         <w:t xml:space="preserve"> </w:t>

</xml_diff>

<commit_message>
Laporan: status setelah merge PR #8 (main @ 65e3eb8)
Co-Authored-By: Claude Opus 5.5 <noreply@anthropic.com>
Claude-Session: https://claude.ai/code/session_01JWHcwMqQzXkB9LnTCQYUWo
</commit_message>
<xml_diff>
--- a/docs/laporan/Laporan_PADAN.docx
+++ b/docs/laporan/Laporan_PADAN.docx
@@ -107,7 +107,7 @@
         <w:t xml:space="preserve"> </w:t>
       </w:r>
       <w:r>
-        <w:t xml:space="preserve">17</w:t>
+        <w:t xml:space="preserve">18</w:t>
       </w:r>
       <w:r>
         <w:t xml:space="preserve"> </w:t>
@@ -155,31 +155,7 @@
         <w:t xml:space="preserve"> </w:t>
       </w:r>
       <w:r>
-        <w:t xml:space="preserve">89875e3</w:t>
-      </w:r>
-      <w:r>
-        <w:t xml:space="preserve"> </w:t>
-      </w:r>
-      <w:r>
-        <w:t xml:space="preserve">+</w:t>
-      </w:r>
-      <w:r>
-        <w:t xml:space="preserve"> </w:t>
-      </w:r>
-      <w:r>
-        <w:t xml:space="preserve">port</w:t>
-      </w:r>
-      <w:r>
-        <w:t xml:space="preserve"> </w:t>
-      </w:r>
-      <w:r>
-        <w:t xml:space="preserve">KV260</w:t>
-      </w:r>
-      <w:r>
-        <w:t xml:space="preserve"> </w:t>
-      </w:r>
-      <w:r>
-        <w:t xml:space="preserve">(PR</w:t>
+        <w:t xml:space="preserve">65e3eb8</w:t>
       </w:r>
     </w:p>
     <w:bookmarkStart w:id="21" w:name="ringkasan"/>
@@ -434,7 +410,7 @@
         <w:t xml:space="preserve"> </w:t>
       </w:r>
       <w:r>
-        <w:t xml:space="preserve">7 PR sudah di-merge ke main; port KV260 diajukan sebagai PR #8.</w:t>
+        <w:t xml:space="preserve">8 PR sudah di-merge ke main, terakhir port KV260 (PR #8, 65e3eb8).</w:t>
       </w:r>
       <w:r>
         <w:t xml:space="preserve"> </w:t>
@@ -651,7 +627,7 @@
         <w:pStyle w:val="FirstParagraph"/>
       </w:pPr>
       <w:r>
-        <w:t xml:space="preserve">Tahap 1–10 dilakukan pada 6 Oktober 2026, tahap 11 pada 17 Oktober 2026.</w:t>
+        <w:t xml:space="preserve">Tahap 1–10 dilakukan pada 6 Oktober 2026, tahap 11 pada 17–18 Oktober 2026.</w:t>
       </w:r>
       <w:r>
         <w:t xml:space="preserve"> </w:t>
@@ -1210,7 +1186,7 @@
               <w:jc w:val="left"/>
             </w:pPr>
             <w:r>
-              <w:t xml:space="preserve">PR #8</w:t>
+              <w:t xml:space="preserve">65e3eb8 (PR #8)</w:t>
             </w:r>
           </w:p>
         </w:tc>

</xml_diff>

<commit_message>
Laporan: status per main @ da3e2ee (PR #10: perkakas make)
Co-Authored-By: Claude Opus 5.5 <noreply@anthropic.com>
Claude-Session: https://claude.ai/code/session_01JWHcwMqQzXkB9LnTCQYUWo
</commit_message>
<xml_diff>
--- a/docs/laporan/Laporan_PADAN.docx
+++ b/docs/laporan/Laporan_PADAN.docx
@@ -107,7 +107,7 @@
         <w:t xml:space="preserve"> </w:t>
       </w:r>
       <w:r>
-        <w:t xml:space="preserve">18</w:t>
+        <w:t xml:space="preserve">19</w:t>
       </w:r>
       <w:r>
         <w:t xml:space="preserve"> </w:t>
@@ -155,7 +155,7 @@
         <w:t xml:space="preserve"> </w:t>
       </w:r>
       <w:r>
-        <w:t xml:space="preserve">65e3eb8</w:t>
+        <w:t xml:space="preserve">da3e2ee</w:t>
       </w:r>
     </w:p>
     <w:bookmarkStart w:id="21" w:name="ringkasan"/>
@@ -410,7 +410,25 @@
         <w:t xml:space="preserve"> </w:t>
       </w:r>
       <w:r>
-        <w:t xml:space="preserve">8 PR sudah di-merge ke main, terakhir port KV260 (PR #8, 65e3eb8).</w:t>
+        <w:t xml:space="preserve">10 PR sudah di-merge ke main. Kode terakhir berubah di port KV260</w:t>
+      </w:r>
+      <w:r>
+        <w:t xml:space="preserve"> </w:t>
+      </w:r>
+      <w:r>
+        <w:t xml:space="preserve">(PR #8, 65e3eb8); PR #9 dan #10 hanya laporan dan perkakas</w:t>
+      </w:r>
+      <w:r>
+        <w:t xml:space="preserve"> </w:t>
+      </w:r>
+      <w:r>
+        <w:rPr>
+          <w:rStyle w:val="VerbatimChar"/>
+        </w:rPr>
+        <w:t xml:space="preserve">make</w:t>
+      </w:r>
+      <w:r>
+        <w:t xml:space="preserve">.</w:t>
       </w:r>
       <w:r>
         <w:t xml:space="preserve"> </w:t>
@@ -627,7 +645,7 @@
         <w:pStyle w:val="FirstParagraph"/>
       </w:pPr>
       <w:r>
-        <w:t xml:space="preserve">Tahap 1–10 dilakukan pada 6 Oktober 2026, tahap 11 pada 17–18 Oktober 2026.</w:t>
+        <w:t xml:space="preserve">Tahap 1–10 dilakukan pada 6 Oktober 2026, tahap 11–12 pada 17–19 Oktober 2026.</w:t>
       </w:r>
       <w:r>
         <w:t xml:space="preserve"> </w:t>
@@ -1220,6 +1238,68 @@
             </w:r>
             <w:r>
               <w:t xml:space="preserve">; berkas DE10-Nano dihapus</w:t>
+            </w:r>
+          </w:p>
+        </w:tc>
+      </w:tr>
+      <w:tr>
+        <w:tc>
+          <w:tcPr/>
+          <w:p>
+            <w:pPr>
+              <w:pStyle w:val="Compact"/>
+              <w:jc w:val="left"/>
+            </w:pPr>
+            <w:r>
+              <w:t xml:space="preserve">12. Perkakas</w:t>
+            </w:r>
+            <w:r>
+              <w:t xml:space="preserve"> </w:t>
+            </w:r>
+            <w:r>
+              <w:rPr>
+                <w:rStyle w:val="VerbatimChar"/>
+              </w:rPr>
+              <w:t xml:space="preserve">make</w:t>
+            </w:r>
+          </w:p>
+        </w:tc>
+        <w:tc>
+          <w:tcPr/>
+          <w:p>
+            <w:pPr>
+              <w:pStyle w:val="Compact"/>
+              <w:jc w:val="left"/>
+            </w:pPr>
+            <w:r>
+              <w:t xml:space="preserve">da3e2ee (PR #10)</w:t>
+            </w:r>
+          </w:p>
+        </w:tc>
+        <w:tc>
+          <w:tcPr/>
+          <w:p>
+            <w:pPr>
+              <w:pStyle w:val="Compact"/>
+              <w:jc w:val="left"/>
+            </w:pPr>
+            <w:r>
+              <w:t xml:space="preserve">Pesan jelas bila cocotb belum terpasang; self-test</w:t>
+            </w:r>
+            <w:r>
+              <w:t xml:space="preserve"> </w:t>
+            </w:r>
+            <w:r>
+              <w:rPr>
+                <w:rStyle w:val="VerbatimChar"/>
+              </w:rPr>
+              <w:t xml:space="preserve">check_reports.py</w:t>
+            </w:r>
+            <w:r>
+              <w:t xml:space="preserve"> </w:t>
+            </w:r>
+            <w:r>
+              <w:t xml:space="preserve">tanpa baris FAIL palsu</w:t>
             </w:r>
           </w:p>
         </w:tc>
@@ -4714,6 +4794,56 @@
       </w:r>
       <w:r>
         <w:t xml:space="preserve">dilakukan setelah CI hijau dan log-nya diperiksa.</w:t>
+      </w:r>
+    </w:p>
+    <w:p>
+      <w:pPr>
+        <w:pStyle w:val="BodyText"/>
+      </w:pPr>
+      <w:r>
+        <w:t xml:space="preserve">Di luar CI,</w:t>
+      </w:r>
+      <w:r>
+        <w:t xml:space="preserve"> </w:t>
+      </w:r>
+      <w:r>
+        <w:rPr>
+          <w:rStyle w:val="VerbatimChar"/>
+        </w:rPr>
+        <w:t xml:space="preserve">make test</w:t>
+      </w:r>
+      <w:r>
+        <w:t xml:space="preserve"> </w:t>
+      </w:r>
+      <w:r>
+        <w:t xml:space="preserve">butuh</w:t>
+      </w:r>
+      <w:r>
+        <w:t xml:space="preserve"> </w:t>
+      </w:r>
+      <w:r>
+        <w:rPr>
+          <w:rStyle w:val="VerbatimChar"/>
+        </w:rPr>
+        <w:t xml:space="preserve">python3 -m pip install -r requirements.txt</w:t>
+      </w:r>
+      <w:r>
+        <w:t xml:space="preserve"> </w:t>
+      </w:r>
+      <w:r>
+        <w:t xml:space="preserve">(cocotb 1.8.1, numpy) serta Icarus Verilog, Yosys, tclsh, dan pandoc. Tanpa</w:t>
+      </w:r>
+      <w:r>
+        <w:t xml:space="preserve"> </w:t>
+      </w:r>
+      <w:r>
+        <w:t xml:space="preserve">cocotb, setiap target simulasi berhenti dengan pesan yang menyebut perintah</w:t>
+      </w:r>
+      <w:r>
+        <w:t xml:space="preserve"> </w:t>
+      </w:r>
+      <w:r>
+        <w:t xml:space="preserve">pemasangan itu (PR #10).</w:t>
       </w:r>
     </w:p>
     <w:tbl>

</xml_diff>

<commit_message>
Laporan: uji make test di luar CI; cara membaca baris FAIL yang disengaja
Acuan laporan kini 'kode terakhir berubah di da3e2ee', bukan hash main,
supaya PR yang hanya berisi laporan tidak membuatnya usang.

Co-Authored-By: Claude Opus 5.5 <noreply@anthropic.com>
Claude-Session: https://claude.ai/code/session_01JWHcwMqQzXkB9LnTCQYUWo
</commit_message>
<xml_diff>
--- a/docs/laporan/Laporan_PADAN.docx
+++ b/docs/laporan/Laporan_PADAN.docx
@@ -107,7 +107,7 @@
         <w:t xml:space="preserve"> </w:t>
       </w:r>
       <w:r>
-        <w:t xml:space="preserve">19</w:t>
+        <w:t xml:space="preserve">20</w:t>
       </w:r>
       <w:r>
         <w:t xml:space="preserve"> </w:t>
@@ -143,13 +143,25 @@
         <w:t xml:space="preserve"> </w:t>
       </w:r>
       <w:r>
-        <w:t xml:space="preserve">main</w:t>
-      </w:r>
-      <w:r>
-        <w:t xml:space="preserve"> </w:t>
-      </w:r>
-      <w:r>
-        <w:t xml:space="preserve">@</w:t>
+        <w:t xml:space="preserve">kode</w:t>
+      </w:r>
+      <w:r>
+        <w:t xml:space="preserve"> </w:t>
+      </w:r>
+      <w:r>
+        <w:t xml:space="preserve">terakhir</w:t>
+      </w:r>
+      <w:r>
+        <w:t xml:space="preserve"> </w:t>
+      </w:r>
+      <w:r>
+        <w:t xml:space="preserve">berubah</w:t>
+      </w:r>
+      <w:r>
+        <w:t xml:space="preserve"> </w:t>
+      </w:r>
+      <w:r>
+        <w:t xml:space="preserve">di</w:t>
       </w:r>
       <w:r>
         <w:t xml:space="preserve"> </w:t>
@@ -410,13 +422,13 @@
         <w:t xml:space="preserve"> </w:t>
       </w:r>
       <w:r>
-        <w:t xml:space="preserve">10 PR sudah di-merge ke main. Kode terakhir berubah di port KV260</w:t>
-      </w:r>
-      <w:r>
-        <w:t xml:space="preserve"> </w:t>
-      </w:r>
-      <w:r>
-        <w:t xml:space="preserve">(PR #8, 65e3eb8); PR #9 dan #10 hanya laporan dan perkakas</w:t>
+        <w:t xml:space="preserve">Kode RTL terakhir berubah di port KV260 (PR #8, 65e3eb8);</w:t>
+      </w:r>
+      <w:r>
+        <w:t xml:space="preserve"> </w:t>
+      </w:r>
+      <w:r>
+        <w:t xml:space="preserve">sesudahnya hanya perkakas</w:t>
       </w:r>
       <w:r>
         <w:t xml:space="preserve"> </w:t>
@@ -428,13 +440,37 @@
         <w:t xml:space="preserve">make</w:t>
       </w:r>
       <w:r>
-        <w:t xml:space="preserve">.</w:t>
-      </w:r>
-      <w:r>
-        <w:t xml:space="preserve"> </w:t>
-      </w:r>
-      <w:r>
-        <w:t xml:space="preserve">Setiap merge dilakukan setelah CI hijau dan log-nya diperiksa.</w:t>
+        <w:t xml:space="preserve"> </w:t>
+      </w:r>
+      <w:r>
+        <w:t xml:space="preserve">(PR #10, da3e2ee) dan laporan. Setiap merge</w:t>
+      </w:r>
+      <w:r>
+        <w:t xml:space="preserve"> </w:t>
+      </w:r>
+      <w:r>
+        <w:t xml:space="preserve">dilakukan setelah CI hijau dan log-nya diperiksa.</w:t>
+      </w:r>
+      <w:r>
+        <w:t xml:space="preserve"> </w:t>
+      </w:r>
+      <w:r>
+        <w:rPr>
+          <w:rStyle w:val="VerbatimChar"/>
+        </w:rPr>
+        <w:t xml:space="preserve">make test</w:t>
+      </w:r>
+      <w:r>
+        <w:t xml:space="preserve"> </w:t>
+      </w:r>
+      <w:r>
+        <w:t xml:space="preserve">juga lulus</w:t>
+      </w:r>
+      <w:r>
+        <w:t xml:space="preserve"> </w:t>
+      </w:r>
+      <w:r>
+        <w:t xml:space="preserve">(exit 0) di laptop pengguna (WSL), di luar CI.</w:t>
       </w:r>
     </w:p>
     <w:bookmarkStart w:id="20" w:name="cara-membaca-label"/>
@@ -645,7 +681,7 @@
         <w:pStyle w:val="FirstParagraph"/>
       </w:pPr>
       <w:r>
-        <w:t xml:space="preserve">Tahap 1–10 dilakukan pada 6 Oktober 2026, tahap 11–12 pada 17–19 Oktober 2026.</w:t>
+        <w:t xml:space="preserve">Tahap 1–10 dilakukan pada 6 Oktober 2026, tahap 11–13 pada 17–20 Oktober 2026.</w:t>
       </w:r>
       <w:r>
         <w:t xml:space="preserve"> </w:t>
@@ -1300,6 +1336,68 @@
             </w:r>
             <w:r>
               <w:t xml:space="preserve">tanpa baris FAIL palsu</w:t>
+            </w:r>
+          </w:p>
+        </w:tc>
+      </w:tr>
+      <w:tr>
+        <w:tc>
+          <w:tcPr/>
+          <w:p>
+            <w:pPr>
+              <w:pStyle w:val="Compact"/>
+              <w:jc w:val="left"/>
+            </w:pPr>
+            <w:r>
+              <w:t xml:space="preserve">13. Uji di luar CI</w:t>
+            </w:r>
+          </w:p>
+        </w:tc>
+        <w:tc>
+          <w:tcPr/>
+          <w:p>
+            <w:pPr>
+              <w:pStyle w:val="Compact"/>
+              <w:jc w:val="left"/>
+            </w:pPr>
+            <w:r>
+              <w:t xml:space="preserve">(tanpa commit)</w:t>
+            </w:r>
+          </w:p>
+        </w:tc>
+        <w:tc>
+          <w:tcPr/>
+          <w:p>
+            <w:pPr>
+              <w:pStyle w:val="Compact"/>
+              <w:jc w:val="left"/>
+            </w:pPr>
+            <w:r>
+              <w:rPr>
+                <w:rStyle w:val="VerbatimChar"/>
+              </w:rPr>
+              <w:t xml:space="preserve">make test</w:t>
+            </w:r>
+            <w:r>
+              <w:t xml:space="preserve"> </w:t>
+            </w:r>
+            <w:r>
+              <w:t xml:space="preserve">exit 0 di laptop pengguna (WSL) setelah</w:t>
+            </w:r>
+            <w:r>
+              <w:t xml:space="preserve"> </w:t>
+            </w:r>
+            <w:r>
+              <w:rPr>
+                <w:rStyle w:val="VerbatimChar"/>
+              </w:rPr>
+              <w:t xml:space="preserve">git pull</w:t>
+            </w:r>
+            <w:r>
+              <w:t xml:space="preserve"> </w:t>
+            </w:r>
+            <w:r>
+              <w:t xml:space="preserve">ke main yang memuat PR #10</w:t>
             </w:r>
           </w:p>
         </w:tc>
@@ -4846,6 +4944,274 @@
         <w:t xml:space="preserve">pemasangan itu (PR #10).</w:t>
       </w:r>
     </w:p>
+    <w:p>
+      <w:pPr>
+        <w:pStyle w:val="BodyText"/>
+      </w:pPr>
+      <w:r>
+        <w:t xml:space="preserve">Pada 20 Oktober 2026</w:t>
+      </w:r>
+      <w:r>
+        <w:t xml:space="preserve"> </w:t>
+      </w:r>
+      <w:r>
+        <w:rPr>
+          <w:rStyle w:val="VerbatimChar"/>
+        </w:rPr>
+        <w:t xml:space="preserve">make test</w:t>
+      </w:r>
+      <w:r>
+        <w:t xml:space="preserve"> </w:t>
+      </w:r>
+      <w:r>
+        <w:t xml:space="preserve">dijalankan di laptop pengguna (WSL, venv</w:t>
+      </w:r>
+      <w:r>
+        <w:t xml:space="preserve"> </w:t>
+      </w:r>
+      <w:r>
+        <w:t xml:space="preserve">Python) dan selesai dengan exit 0. Ini mereproduksi hasil CI di mesin kedua,</w:t>
+      </w:r>
+      <w:r>
+        <w:t xml:space="preserve"> </w:t>
+      </w:r>
+      <w:r>
+        <w:t xml:space="preserve">bukan bukti Vivado atau board.</w:t>
+      </w:r>
+    </w:p>
+    <w:p>
+      <w:pPr>
+        <w:pStyle w:val="BodyText"/>
+      </w:pPr>
+      <w:r>
+        <w:rPr>
+          <w:bCs/>
+          <w:b/>
+        </w:rPr>
+        <w:t xml:space="preserve">Cara membaca output.</w:t>
+      </w:r>
+      <w:r>
+        <w:t xml:space="preserve"> </w:t>
+      </w:r>
+      <w:r>
+        <w:t xml:space="preserve">Ukurannya adalah exit code</w:t>
+      </w:r>
+      <w:r>
+        <w:t xml:space="preserve"> </w:t>
+      </w:r>
+      <w:r>
+        <w:rPr>
+          <w:rStyle w:val="VerbatimChar"/>
+        </w:rPr>
+        <w:t xml:space="preserve">make test</w:t>
+      </w:r>
+      <w:r>
+        <w:t xml:space="preserve"> </w:t>
+      </w:r>
+      <w:r>
+        <w:t xml:space="preserve">(0 = semua</w:t>
+      </w:r>
+      <w:r>
+        <w:t xml:space="preserve"> </w:t>
+      </w:r>
+      <w:r>
+        <w:t xml:space="preserve">target lulus), bukan ada atau tidaknya kata</w:t>
+      </w:r>
+      <w:r>
+        <w:t xml:space="preserve"> </w:t>
+      </w:r>
+      <w:r>
+        <w:t xml:space="preserve">“</w:t>
+      </w:r>
+      <w:r>
+        <w:t xml:space="preserve">FAIL</w:t>
+      </w:r>
+      <w:r>
+        <w:t xml:space="preserve">”</w:t>
+      </w:r>
+      <w:r>
+        <w:t xml:space="preserve">. Kata itu memang muncul pada</w:t>
+      </w:r>
+      <w:r>
+        <w:t xml:space="preserve"> </w:t>
+      </w:r>
+      <w:r>
+        <w:t xml:space="preserve">hasil yang benar:</w:t>
+      </w:r>
+    </w:p>
+    <w:p>
+      <w:pPr>
+        <w:numPr>
+          <w:ilvl w:val="0"/>
+          <w:numId w:val="1009"/>
+        </w:numPr>
+        <w:pStyle w:val="Compact"/>
+      </w:pPr>
+      <w:r>
+        <w:t xml:space="preserve">di kepala tabel ringkasan cocotb (</w:t>
+      </w:r>
+      <w:r>
+        <w:rPr>
+          <w:rStyle w:val="VerbatimChar"/>
+        </w:rPr>
+        <w:t xml:space="preserve">FAIL=0</w:t>
+      </w:r>
+      <w:r>
+        <w:t xml:space="preserve">);</w:t>
+      </w:r>
+    </w:p>
+    <w:p>
+      <w:pPr>
+        <w:numPr>
+          <w:ilvl w:val="0"/>
+          <w:numId w:val="1009"/>
+        </w:numPr>
+        <w:pStyle w:val="Compact"/>
+      </w:pPr>
+      <w:r>
+        <w:t xml:space="preserve">pada log test negatif</w:t>
+      </w:r>
+      <w:r>
+        <w:t xml:space="preserve"> </w:t>
+      </w:r>
+      <w:r>
+        <w:rPr>
+          <w:rStyle w:val="VerbatimChar"/>
+        </w:rPr>
+        <w:t xml:space="preserve">tb/kv260</w:t>
+      </w:r>
+      <w:r>
+        <w:t xml:space="preserve">, yang sengaja membuat skrip host gagal</w:t>
+      </w:r>
+      <w:r>
+        <w:t xml:space="preserve"> </w:t>
+      </w:r>
+      <w:r>
+        <w:t xml:space="preserve">(memori dibalik →</w:t>
+      </w:r>
+      <w:r>
+        <w:t xml:space="preserve"> </w:t>
+      </w:r>
+      <w:r>
+        <w:rPr>
+          <w:rStyle w:val="VerbatimChar"/>
+        </w:rPr>
+        <w:t xml:space="preserve">PADAN KV260: FAIL … HALT</w:t>
+      </w:r>
+      <w:r>
+        <w:t xml:space="preserve">; guard LOCKD → skrip menolak);</w:t>
+      </w:r>
+      <w:r>
+        <w:t xml:space="preserve"> </w:t>
+      </w:r>
+      <w:r>
+        <w:t xml:space="preserve">test-nya sendiri lulus bila skrip melaporkan FAIL.</w:t>
+      </w:r>
+    </w:p>
+    <w:p>
+      <w:pPr>
+        <w:pStyle w:val="FirstParagraph"/>
+      </w:pPr>
+      <w:r>
+        <w:rPr>
+          <w:rStyle w:val="VerbatimChar"/>
+        </w:rPr>
+        <w:t xml:space="preserve">SKIP=1</w:t>
+      </w:r>
+      <w:r>
+        <w:t xml:space="preserve"> </w:t>
+      </w:r>
+      <w:r>
+        <w:t xml:space="preserve">pada dua audit gate-level (</w:t>
+      </w:r>
+      <w:r>
+        <w:rPr>
+          <w:rStyle w:val="VerbatimChar"/>
+        </w:rPr>
+        <w:t xml:space="preserve">tinytpu</w:t>
+      </w:r>
+      <w:r>
+        <w:t xml:space="preserve">,</w:t>
+      </w:r>
+      <w:r>
+        <w:t xml:space="preserve"> </w:t>
+      </w:r>
+      <w:r>
+        <w:rPr>
+          <w:rStyle w:val="VerbatimChar"/>
+        </w:rPr>
+        <w:t xml:space="preserve">iterative_mac</w:t>
+      </w:r>
+      <w:r>
+        <w:t xml:space="preserve">) juga wajar: test</w:t>
+      </w:r>
+      <w:r>
+        <w:t xml:space="preserve"> </w:t>
+      </w:r>
+      <w:r>
+        <w:t xml:space="preserve">yang membaca sinyal internal RTL dilewati karena sinyal itu tidak ada di</w:t>
+      </w:r>
+      <w:r>
+        <w:t xml:space="preserve"> </w:t>
+      </w:r>
+      <w:r>
+        <w:t xml:space="preserve">netlist. Baris yang diawali</w:t>
+      </w:r>
+      <w:r>
+        <w:t xml:space="preserve"> </w:t>
+      </w:r>
+      <w:r>
+        <w:rPr>
+          <w:rStyle w:val="VerbatimChar"/>
+        </w:rPr>
+        <w:t xml:space="preserve">FAIL</w:t>
+      </w:r>
+      <w:r>
+        <w:t xml:space="preserve"> </w:t>
+      </w:r>
+      <w:r>
+        <w:t xml:space="preserve">di awal baris (</w:t>
+      </w:r>
+      <w:r>
+        <w:rPr>
+          <w:rStyle w:val="VerbatimChar"/>
+        </w:rPr>
+        <w:t xml:space="preserve">grep "^FAIL"</w:t>
+      </w:r>
+      <w:r>
+        <w:t xml:space="preserve">) tidak boleh</w:t>
+      </w:r>
+      <w:r>
+        <w:t xml:space="preserve"> </w:t>
+      </w:r>
+      <w:r>
+        <w:t xml:space="preserve">ada. Kode sebelum PR #10 masih mencetak lima baris seperti itu dari kasus</w:t>
+      </w:r>
+      <w:r>
+        <w:t xml:space="preserve"> </w:t>
+      </w:r>
+      <w:r>
+        <w:t xml:space="preserve">negatif self-test</w:t>
+      </w:r>
+      <w:r>
+        <w:t xml:space="preserve"> </w:t>
+      </w:r>
+      <w:r>
+        <w:rPr>
+          <w:rStyle w:val="VerbatimChar"/>
+        </w:rPr>
+        <w:t xml:space="preserve">check_reports.py</w:t>
+      </w:r>
+      <w:r>
+        <w:t xml:space="preserve">; bila muncul, salinan lokal belum</w:t>
+      </w:r>
+      <w:r>
+        <w:t xml:space="preserve"> </w:t>
+      </w:r>
+      <w:r>
+        <w:t xml:space="preserve">diperbarui.</w:t>
+      </w:r>
+    </w:p>
     <w:tbl>
       <w:tblPr>
         <w:tblStyle w:val="Table"/>
@@ -5455,7 +5821,7 @@
       <w:pPr>
         <w:numPr>
           <w:ilvl w:val="0"/>
-          <w:numId w:val="1009"/>
+          <w:numId w:val="1010"/>
         </w:numPr>
         <w:pStyle w:val="Compact"/>
       </w:pPr>
@@ -5483,310 +5849,6 @@
       </w:r>
       <w:r>
         <w:t xml:space="preserve">safe-state baru terbukti untuk Yosys. Timing 100 MHz belum diketahui.</w:t>
-      </w:r>
-    </w:p>
-    <w:p>
-      <w:pPr>
-        <w:numPr>
-          <w:ilvl w:val="0"/>
-          <w:numId w:val="1009"/>
-        </w:numPr>
-        <w:pStyle w:val="Compact"/>
-      </w:pPr>
-      <w:r>
-        <w:rPr>
-          <w:bCs/>
-          <w:b/>
-        </w:rPr>
-        <w:t xml:space="preserve">Pemuatan bitstream di Linux KV260</w:t>
-      </w:r>
-      <w:r>
-        <w:t xml:space="preserve"> </w:t>
-      </w:r>
-      <w:r>
-        <w:t xml:space="preserve">(overlay device tree,</w:t>
-      </w:r>
-      <w:r>
-        <w:t xml:space="preserve"> </w:t>
-      </w:r>
-      <w:r>
-        <w:rPr>
-          <w:rStyle w:val="VerbatimChar"/>
-        </w:rPr>
-        <w:t xml:space="preserve">xmutil</w:t>
-      </w:r>
-      <w:r>
-        <w:t xml:space="preserve">) adalah</w:t>
-      </w:r>
-      <w:r>
-        <w:t xml:space="preserve"> </w:t>
-      </w:r>
-      <w:r>
-        <w:t xml:space="preserve">bagian paling tidak pasti; tanpa overlay</w:t>
-      </w:r>
-      <w:r>
-        <w:t xml:space="preserve"> </w:t>
-      </w:r>
-      <w:r>
-        <w:rPr>
-          <w:rStyle w:val="VerbatimChar"/>
-        </w:rPr>
-        <w:t xml:space="preserve">pl_clk0</w:t>
-      </w:r>
-      <w:r>
-        <w:t xml:space="preserve"> </w:t>
-      </w:r>
-      <w:r>
-        <w:t xml:space="preserve">mungkin mati dan akses</w:t>
-      </w:r>
-      <w:r>
-        <w:t xml:space="preserve"> </w:t>
-      </w:r>
-      <w:r>
-        <w:t xml:space="preserve">AXI menggantung. [Menebak]</w:t>
-      </w:r>
-    </w:p>
-    <w:p>
-      <w:pPr>
-        <w:numPr>
-          <w:ilvl w:val="0"/>
-          <w:numId w:val="1009"/>
-        </w:numPr>
-        <w:pStyle w:val="Compact"/>
-      </w:pPr>
-      <w:r>
-        <w:rPr>
-          <w:bCs/>
-          <w:b/>
-        </w:rPr>
-        <w:t xml:space="preserve">Template selalu ada di luar chip.</w:t>
-      </w:r>
-      <w:r>
-        <w:t xml:space="preserve"> </w:t>
-      </w:r>
-      <w:r>
-        <w:t xml:space="preserve">Keadaan guard volatil dan setiap reset</w:t>
-      </w:r>
-      <w:r>
-        <w:t xml:space="preserve"> </w:t>
-      </w:r>
-      <w:r>
-        <w:t xml:space="preserve">menghapus template, jadi host harus mengirim ulang template setiap boot.</w:t>
-      </w:r>
-    </w:p>
-    <w:p>
-      <w:pPr>
-        <w:numPr>
-          <w:ilvl w:val="0"/>
-          <w:numId w:val="1009"/>
-        </w:numPr>
-        <w:pStyle w:val="Compact"/>
-      </w:pPr>
-      <w:r>
-        <w:rPr>
-          <w:bCs/>
-          <w:b/>
-        </w:rPr>
-        <w:t xml:space="preserve">Pembatas hanya menghitung kegagalan berturut-turut.</w:t>
-      </w:r>
-      <w:r>
-        <w:t xml:space="preserve"> </w:t>
-      </w:r>
-      <w:r>
-        <w:t xml:space="preserve">Penyerang dengan satu</w:t>
-      </w:r>
-      <w:r>
-        <w:t xml:space="preserve"> </w:t>
-      </w:r>
-      <w:r>
-        <w:t xml:space="preserve">probe sah bisa menyelipkannya setiap 4 percobaan.</w:t>
-      </w:r>
-    </w:p>
-    <w:p>
-      <w:pPr>
-        <w:numPr>
-          <w:ilvl w:val="0"/>
-          <w:numId w:val="1009"/>
-        </w:numPr>
-        <w:pStyle w:val="Compact"/>
-      </w:pPr>
-      <w:r>
-        <w:rPr>
-          <w:bCs/>
-          <w:b/>
-        </w:rPr>
-        <w:t xml:space="preserve">Fault kendali belum disimulasikan:</w:t>
-      </w:r>
-      <w:r>
-        <w:t xml:space="preserve"> </w:t>
-      </w:r>
-      <w:r>
-        <w:t xml:space="preserve">sequencer, tag baris, FSM. Flip pada</w:t>
-      </w:r>
-      <w:r>
-        <w:t xml:space="preserve"> </w:t>
-      </w:r>
-      <w:r>
-        <w:t xml:space="preserve">tag baris bisa membuat ABFT dan kedua komparator salah secara konsisten.</w:t>
-      </w:r>
-      <w:r>
-        <w:t xml:space="preserve"> </w:t>
-      </w:r>
-      <w:r>
-        <w:t xml:space="preserve">[Kemungkinan Besar]</w:t>
-      </w:r>
-    </w:p>
-    <w:p>
-      <w:pPr>
-        <w:numPr>
-          <w:ilvl w:val="0"/>
-          <w:numId w:val="1009"/>
-        </w:numPr>
-        <w:pStyle w:val="Compact"/>
-      </w:pPr>
-      <w:r>
-        <w:rPr>
-          <w:bCs/>
-          <w:b/>
-        </w:rPr>
-        <w:t xml:space="preserve">Fault ganda</w:t>
-      </w:r>
-      <w:r>
-        <w:t xml:space="preserve"> </w:t>
-      </w:r>
-      <w:r>
-        <w:t xml:space="preserve">bisa salah lokalisasi; lokalisasi tidak boleh dipakai untuk</w:t>
-      </w:r>
-      <w:r>
-        <w:t xml:space="preserve"> </w:t>
-      </w:r>
-      <w:r>
-        <w:t xml:space="preserve">koreksi otomatis.</w:t>
-      </w:r>
-    </w:p>
-    <w:p>
-      <w:pPr>
-        <w:numPr>
-          <w:ilvl w:val="0"/>
-          <w:numId w:val="1009"/>
-        </w:numPr>
-        <w:pStyle w:val="Compact"/>
-      </w:pPr>
-      <w:r>
-        <w:rPr>
-          <w:bCs/>
-          <w:b/>
-        </w:rPr>
-        <w:t xml:space="preserve">Flip dua bit</w:t>
-      </w:r>
-      <w:r>
-        <w:t xml:space="preserve"> </w:t>
-      </w:r>
-      <w:r>
-        <w:t xml:space="preserve">bisa membawa LOCKD ke OPEN; flip satu bit selalu tertangkap.</w:t>
-      </w:r>
-    </w:p>
-    <w:p>
-      <w:pPr>
-        <w:numPr>
-          <w:ilvl w:val="0"/>
-          <w:numId w:val="1009"/>
-        </w:numPr>
-        <w:pStyle w:val="Compact"/>
-      </w:pPr>
-      <w:r>
-        <w:rPr>
-          <w:bCs/>
-          <w:b/>
-        </w:rPr>
-        <w:t xml:space="preserve">Bitstream debug adalah alat DoS</w:t>
-      </w:r>
-      <w:r>
-        <w:t xml:space="preserve"> </w:t>
-      </w:r>
-      <w:r>
-        <w:t xml:space="preserve">dan bisa dibangun lewat</w:t>
-      </w:r>
-      <w:r>
-        <w:t xml:space="preserve"> </w:t>
-      </w:r>
-      <w:r>
-        <w:rPr>
-          <w:rStyle w:val="VerbatimChar"/>
-        </w:rPr>
-        <w:t xml:space="preserve">verilog_define</w:t>
-      </w:r>
-      <w:r>
-        <w:t xml:space="preserve"> </w:t>
-      </w:r>
-      <w:r>
-        <w:t xml:space="preserve">Vivado di luar repo. Penandanya STATUS[31] = 1.</w:t>
-      </w:r>
-    </w:p>
-    <w:p>
-      <w:pPr>
-        <w:numPr>
-          <w:ilvl w:val="0"/>
-          <w:numId w:val="1009"/>
-        </w:numPr>
-        <w:pStyle w:val="Compact"/>
-      </w:pPr>
-      <w:r>
-        <w:rPr>
-          <w:bCs/>
-          <w:b/>
-        </w:rPr>
-        <w:t xml:space="preserve">Tamper PMOD dengan pull-up internal</w:t>
-      </w:r>
-      <w:r>
-        <w:t xml:space="preserve"> </w:t>
-      </w:r>
-      <w:r>
-        <w:t xml:space="preserve">peka terhadap kabel lepas atau</w:t>
-      </w:r>
-      <w:r>
-        <w:t xml:space="preserve"> </w:t>
-      </w:r>
-      <w:r>
-        <w:t xml:space="preserve">sentuhan ke GND; satu glitch sudah menghapus enrollment.</w:t>
-      </w:r>
-    </w:p>
-    <w:p>
-      <w:pPr>
-        <w:numPr>
-          <w:ilvl w:val="0"/>
-          <w:numId w:val="1009"/>
-        </w:numPr>
-        <w:pStyle w:val="Compact"/>
-      </w:pPr>
-      <w:r>
-        <w:rPr>
-          <w:bCs/>
-          <w:b/>
-        </w:rPr>
-        <w:t xml:space="preserve">Hasil INT8 vs float memakai data sintetis;</w:t>
-      </w:r>
-      <w:r>
-        <w:t xml:space="preserve"> </w:t>
-      </w:r>
-      <w:r>
-        <w:t xml:space="preserve">tidak ada klaim akurasi</w:t>
-      </w:r>
-      <w:r>
-        <w:t xml:space="preserve"> </w:t>
-      </w:r>
-      <w:r>
-        <w:t xml:space="preserve">biometrik nyata.</w:t>
-      </w:r>
-    </w:p>
-    <w:bookmarkEnd w:id="32"/>
-    <w:bookmarkStart w:id="33" w:name="langkah-berikutnya"/>
-    <w:p>
-      <w:pPr>
-        <w:pStyle w:val="Heading1"/>
-      </w:pPr>
-      <w:r>
-        <w:t xml:space="preserve">11. Langkah berikutnya</w:t>
       </w:r>
     </w:p>
     <w:p>
@@ -5802,13 +5864,13 @@
           <w:bCs/>
           <w:b/>
         </w:rPr>
-        <w:t xml:space="preserve">Buat proyek dan build di Vivado</w:t>
-      </w:r>
-      <w:r>
-        <w:t xml:space="preserve"> </w:t>
-      </w:r>
-      <w:r>
-        <w:t xml:space="preserve">mengikuti</w:t>
+        <w:t xml:space="preserve">Pemuatan bitstream di Linux KV260</w:t>
+      </w:r>
+      <w:r>
+        <w:t xml:space="preserve"> </w:t>
+      </w:r>
+      <w:r>
+        <w:t xml:space="preserve">(overlay device tree,</w:t>
       </w:r>
       <w:r>
         <w:t xml:space="preserve"> </w:t>
@@ -5817,16 +5879,16 @@
         <w:rPr>
           <w:rStyle w:val="VerbatimChar"/>
         </w:rPr>
-        <w:t xml:space="preserve">docs/fpga_howto.md</w:t>
-      </w:r>
-      <w:r>
-        <w:t xml:space="preserve">, lalu</w:t>
-      </w:r>
-      <w:r>
-        <w:t xml:space="preserve"> </w:t>
-      </w:r>
-      <w:r>
-        <w:t xml:space="preserve">jalankan</w:t>
+        <w:t xml:space="preserve">xmutil</w:t>
+      </w:r>
+      <w:r>
+        <w:t xml:space="preserve">) adalah</w:t>
+      </w:r>
+      <w:r>
+        <w:t xml:space="preserve"> </w:t>
+      </w:r>
+      <w:r>
+        <w:t xml:space="preserve">bagian paling tidak pasti; tanpa overlay</w:t>
       </w:r>
       <w:r>
         <w:t xml:space="preserve"> </w:t>
@@ -5835,40 +5897,19 @@
         <w:rPr>
           <w:rStyle w:val="VerbatimChar"/>
         </w:rPr>
-        <w:t xml:space="preserve">check_reports.py</w:t>
-      </w:r>
-      <w:r>
-        <w:t xml:space="preserve">: RAMB18 16, DSP 16, FF</w:t>
-      </w:r>
-      <w:r>
-        <w:t xml:space="preserve"> </w:t>
-      </w:r>
-      <w:r>
-        <w:rPr>
-          <w:rStyle w:val="VerbatimChar"/>
-        </w:rPr>
-        <w:t xml:space="preserve">decision</w:t>
-      </w:r>
-      <w:r>
-        <w:t xml:space="preserve"> </w:t>
-      </w:r>
-      <w:r>
-        <w:t xml:space="preserve">151 dan</w:t>
-      </w:r>
-      <w:r>
-        <w:t xml:space="preserve"> </w:t>
-      </w:r>
-      <w:r>
-        <w:rPr>
-          <w:rStyle w:val="VerbatimChar"/>
-        </w:rPr>
-        <w:t xml:space="preserve">guard</w:t>
-      </w:r>
-      <w:r>
-        <w:t xml:space="preserve"> </w:t>
-      </w:r>
-      <w:r>
-        <w:t xml:space="preserve">103, FSM guard tidak dikode ulang, WNS/WHS/WPWS ≥ 0 pada 100 MHz.</w:t>
+        <w:t xml:space="preserve">pl_clk0</w:t>
+      </w:r>
+      <w:r>
+        <w:t xml:space="preserve"> </w:t>
+      </w:r>
+      <w:r>
+        <w:t xml:space="preserve">mungkin mati dan akses</w:t>
+      </w:r>
+      <w:r>
+        <w:t xml:space="preserve"> </w:t>
+      </w:r>
+      <w:r>
+        <w:t xml:space="preserve">AXI menggantung. [Menebak]</w:t>
       </w:r>
     </w:p>
     <w:p>
@@ -5884,19 +5925,19 @@
           <w:bCs/>
           <w:b/>
         </w:rPr>
-        <w:t xml:space="preserve">Cek pin H12 = PMOD J2 pin 1</w:t>
-      </w:r>
-      <w:r>
-        <w:t xml:space="preserve"> </w:t>
-      </w:r>
-      <w:r>
-        <w:t xml:space="preserve">di skematik carrier KV260 sebelum menyambung</w:t>
-      </w:r>
-      <w:r>
-        <w:t xml:space="preserve"> </w:t>
-      </w:r>
-      <w:r>
-        <w:t xml:space="preserve">kabel tamper.</w:t>
+        <w:t xml:space="preserve">Template selalu ada di luar chip.</w:t>
+      </w:r>
+      <w:r>
+        <w:t xml:space="preserve"> </w:t>
+      </w:r>
+      <w:r>
+        <w:t xml:space="preserve">Keadaan guard volatil dan setiap reset</w:t>
+      </w:r>
+      <w:r>
+        <w:t xml:space="preserve"> </w:t>
+      </w:r>
+      <w:r>
+        <w:t xml:space="preserve">menghapus template, jadi host harus mengirim ulang template setiap boot.</w:t>
       </w:r>
     </w:p>
     <w:p>
@@ -5912,40 +5953,19 @@
           <w:bCs/>
           <w:b/>
         </w:rPr>
-        <w:t xml:space="preserve">Uji di board:</w:t>
-      </w:r>
-      <w:r>
-        <w:t xml:space="preserve"> </w:t>
-      </w:r>
-      <w:r>
-        <w:t xml:space="preserve">muat bitstream dengan overlay, jalankan</w:t>
-      </w:r>
-      <w:r>
-        <w:t xml:space="preserve"> </w:t>
-      </w:r>
-      <w:r>
-        <w:rPr>
-          <w:rStyle w:val="VerbatimChar"/>
-        </w:rPr>
-        <w:t xml:space="preserve">padan_test.py</w:t>
-      </w:r>
-      <w:r>
-        <w:t xml:space="preserve"> </w:t>
-      </w:r>
-      <w:r>
-        <w:t xml:space="preserve">(target</w:t>
-      </w:r>
-      <w:r>
-        <w:t xml:space="preserve"> </w:t>
-      </w:r>
-      <w:r>
-        <w:rPr>
-          <w:rStyle w:val="VerbatimChar"/>
-        </w:rPr>
-        <w:t xml:space="preserve">PADAN KV260: PASS (46 kasus ...)</w:t>
-      </w:r>
-      <w:r>
-        <w:t xml:space="preserve">), lalu uji tamper PMOD manual.</w:t>
+        <w:t xml:space="preserve">Pembatas hanya menghitung kegagalan berturut-turut.</w:t>
+      </w:r>
+      <w:r>
+        <w:t xml:space="preserve"> </w:t>
+      </w:r>
+      <w:r>
+        <w:t xml:space="preserve">Penyerang dengan satu</w:t>
+      </w:r>
+      <w:r>
+        <w:t xml:space="preserve"> </w:t>
+      </w:r>
+      <w:r>
+        <w:t xml:space="preserve">probe sah bisa menyelipkannya setiap 4 percobaan.</w:t>
       </w:r>
     </w:p>
     <w:p>
@@ -5961,19 +5981,25 @@
           <w:bCs/>
           <w:b/>
         </w:rPr>
-        <w:t xml:space="preserve">Pertimbangkan penghitung kegagalan total atau pembatas laju</w:t>
-      </w:r>
-      <w:r>
-        <w:t xml:space="preserve"> </w:t>
-      </w:r>
-      <w:r>
-        <w:t xml:space="preserve">bila ancaman</w:t>
-      </w:r>
-      <w:r>
-        <w:t xml:space="preserve"> </w:t>
-      </w:r>
-      <w:r>
-        <w:t xml:space="preserve">probe sah relevan.</w:t>
+        <w:t xml:space="preserve">Fault kendali belum disimulasikan:</w:t>
+      </w:r>
+      <w:r>
+        <w:t xml:space="preserve"> </w:t>
+      </w:r>
+      <w:r>
+        <w:t xml:space="preserve">sequencer, tag baris, FSM. Flip pada</w:t>
+      </w:r>
+      <w:r>
+        <w:t xml:space="preserve"> </w:t>
+      </w:r>
+      <w:r>
+        <w:t xml:space="preserve">tag baris bisa membuat ABFT dan kedua komparator salah secara konsisten.</w:t>
+      </w:r>
+      <w:r>
+        <w:t xml:space="preserve"> </w:t>
+      </w:r>
+      <w:r>
+        <w:t xml:space="preserve">[Kemungkinan Besar]</w:t>
       </w:r>
     </w:p>
     <w:p>
@@ -5981,6 +6007,346 @@
         <w:numPr>
           <w:ilvl w:val="0"/>
           <w:numId w:val="1010"/>
+        </w:numPr>
+        <w:pStyle w:val="Compact"/>
+      </w:pPr>
+      <w:r>
+        <w:rPr>
+          <w:bCs/>
+          <w:b/>
+        </w:rPr>
+        <w:t xml:space="preserve">Fault ganda</w:t>
+      </w:r>
+      <w:r>
+        <w:t xml:space="preserve"> </w:t>
+      </w:r>
+      <w:r>
+        <w:t xml:space="preserve">bisa salah lokalisasi; lokalisasi tidak boleh dipakai untuk</w:t>
+      </w:r>
+      <w:r>
+        <w:t xml:space="preserve"> </w:t>
+      </w:r>
+      <w:r>
+        <w:t xml:space="preserve">koreksi otomatis.</w:t>
+      </w:r>
+    </w:p>
+    <w:p>
+      <w:pPr>
+        <w:numPr>
+          <w:ilvl w:val="0"/>
+          <w:numId w:val="1010"/>
+        </w:numPr>
+        <w:pStyle w:val="Compact"/>
+      </w:pPr>
+      <w:r>
+        <w:rPr>
+          <w:bCs/>
+          <w:b/>
+        </w:rPr>
+        <w:t xml:space="preserve">Flip dua bit</w:t>
+      </w:r>
+      <w:r>
+        <w:t xml:space="preserve"> </w:t>
+      </w:r>
+      <w:r>
+        <w:t xml:space="preserve">bisa membawa LOCKD ke OPEN; flip satu bit selalu tertangkap.</w:t>
+      </w:r>
+    </w:p>
+    <w:p>
+      <w:pPr>
+        <w:numPr>
+          <w:ilvl w:val="0"/>
+          <w:numId w:val="1010"/>
+        </w:numPr>
+        <w:pStyle w:val="Compact"/>
+      </w:pPr>
+      <w:r>
+        <w:rPr>
+          <w:bCs/>
+          <w:b/>
+        </w:rPr>
+        <w:t xml:space="preserve">Bitstream debug adalah alat DoS</w:t>
+      </w:r>
+      <w:r>
+        <w:t xml:space="preserve"> </w:t>
+      </w:r>
+      <w:r>
+        <w:t xml:space="preserve">dan bisa dibangun lewat</w:t>
+      </w:r>
+      <w:r>
+        <w:t xml:space="preserve"> </w:t>
+      </w:r>
+      <w:r>
+        <w:rPr>
+          <w:rStyle w:val="VerbatimChar"/>
+        </w:rPr>
+        <w:t xml:space="preserve">verilog_define</w:t>
+      </w:r>
+      <w:r>
+        <w:t xml:space="preserve"> </w:t>
+      </w:r>
+      <w:r>
+        <w:t xml:space="preserve">Vivado di luar repo. Penandanya STATUS[31] = 1.</w:t>
+      </w:r>
+    </w:p>
+    <w:p>
+      <w:pPr>
+        <w:numPr>
+          <w:ilvl w:val="0"/>
+          <w:numId w:val="1010"/>
+        </w:numPr>
+        <w:pStyle w:val="Compact"/>
+      </w:pPr>
+      <w:r>
+        <w:rPr>
+          <w:bCs/>
+          <w:b/>
+        </w:rPr>
+        <w:t xml:space="preserve">Tamper PMOD dengan pull-up internal</w:t>
+      </w:r>
+      <w:r>
+        <w:t xml:space="preserve"> </w:t>
+      </w:r>
+      <w:r>
+        <w:t xml:space="preserve">peka terhadap kabel lepas atau</w:t>
+      </w:r>
+      <w:r>
+        <w:t xml:space="preserve"> </w:t>
+      </w:r>
+      <w:r>
+        <w:t xml:space="preserve">sentuhan ke GND; satu glitch sudah menghapus enrollment.</w:t>
+      </w:r>
+    </w:p>
+    <w:p>
+      <w:pPr>
+        <w:numPr>
+          <w:ilvl w:val="0"/>
+          <w:numId w:val="1010"/>
+        </w:numPr>
+        <w:pStyle w:val="Compact"/>
+      </w:pPr>
+      <w:r>
+        <w:rPr>
+          <w:bCs/>
+          <w:b/>
+        </w:rPr>
+        <w:t xml:space="preserve">Hasil INT8 vs float memakai data sintetis;</w:t>
+      </w:r>
+      <w:r>
+        <w:t xml:space="preserve"> </w:t>
+      </w:r>
+      <w:r>
+        <w:t xml:space="preserve">tidak ada klaim akurasi</w:t>
+      </w:r>
+      <w:r>
+        <w:t xml:space="preserve"> </w:t>
+      </w:r>
+      <w:r>
+        <w:t xml:space="preserve">biometrik nyata.</w:t>
+      </w:r>
+    </w:p>
+    <w:bookmarkEnd w:id="32"/>
+    <w:bookmarkStart w:id="33" w:name="langkah-berikutnya"/>
+    <w:p>
+      <w:pPr>
+        <w:pStyle w:val="Heading1"/>
+      </w:pPr>
+      <w:r>
+        <w:t xml:space="preserve">11. Langkah berikutnya</w:t>
+      </w:r>
+    </w:p>
+    <w:p>
+      <w:pPr>
+        <w:numPr>
+          <w:ilvl w:val="0"/>
+          <w:numId w:val="1011"/>
+        </w:numPr>
+        <w:pStyle w:val="Compact"/>
+      </w:pPr>
+      <w:r>
+        <w:rPr>
+          <w:bCs/>
+          <w:b/>
+        </w:rPr>
+        <w:t xml:space="preserve">Buat proyek dan build di Vivado</w:t>
+      </w:r>
+      <w:r>
+        <w:t xml:space="preserve"> </w:t>
+      </w:r>
+      <w:r>
+        <w:t xml:space="preserve">mengikuti</w:t>
+      </w:r>
+      <w:r>
+        <w:t xml:space="preserve"> </w:t>
+      </w:r>
+      <w:r>
+        <w:rPr>
+          <w:rStyle w:val="VerbatimChar"/>
+        </w:rPr>
+        <w:t xml:space="preserve">docs/fpga_howto.md</w:t>
+      </w:r>
+      <w:r>
+        <w:t xml:space="preserve">, lalu</w:t>
+      </w:r>
+      <w:r>
+        <w:t xml:space="preserve"> </w:t>
+      </w:r>
+      <w:r>
+        <w:t xml:space="preserve">jalankan</w:t>
+      </w:r>
+      <w:r>
+        <w:t xml:space="preserve"> </w:t>
+      </w:r>
+      <w:r>
+        <w:rPr>
+          <w:rStyle w:val="VerbatimChar"/>
+        </w:rPr>
+        <w:t xml:space="preserve">check_reports.py</w:t>
+      </w:r>
+      <w:r>
+        <w:t xml:space="preserve">: RAMB18 16, DSP 16, FF</w:t>
+      </w:r>
+      <w:r>
+        <w:t xml:space="preserve"> </w:t>
+      </w:r>
+      <w:r>
+        <w:rPr>
+          <w:rStyle w:val="VerbatimChar"/>
+        </w:rPr>
+        <w:t xml:space="preserve">decision</w:t>
+      </w:r>
+      <w:r>
+        <w:t xml:space="preserve"> </w:t>
+      </w:r>
+      <w:r>
+        <w:t xml:space="preserve">151 dan</w:t>
+      </w:r>
+      <w:r>
+        <w:t xml:space="preserve"> </w:t>
+      </w:r>
+      <w:r>
+        <w:rPr>
+          <w:rStyle w:val="VerbatimChar"/>
+        </w:rPr>
+        <w:t xml:space="preserve">guard</w:t>
+      </w:r>
+      <w:r>
+        <w:t xml:space="preserve"> </w:t>
+      </w:r>
+      <w:r>
+        <w:t xml:space="preserve">103, FSM guard tidak dikode ulang, WNS/WHS/WPWS ≥ 0 pada 100 MHz.</w:t>
+      </w:r>
+    </w:p>
+    <w:p>
+      <w:pPr>
+        <w:numPr>
+          <w:ilvl w:val="0"/>
+          <w:numId w:val="1011"/>
+        </w:numPr>
+        <w:pStyle w:val="Compact"/>
+      </w:pPr>
+      <w:r>
+        <w:rPr>
+          <w:bCs/>
+          <w:b/>
+        </w:rPr>
+        <w:t xml:space="preserve">Cek pin H12 = PMOD J2 pin 1</w:t>
+      </w:r>
+      <w:r>
+        <w:t xml:space="preserve"> </w:t>
+      </w:r>
+      <w:r>
+        <w:t xml:space="preserve">di skematik carrier KV260 sebelum menyambung</w:t>
+      </w:r>
+      <w:r>
+        <w:t xml:space="preserve"> </w:t>
+      </w:r>
+      <w:r>
+        <w:t xml:space="preserve">kabel tamper.</w:t>
+      </w:r>
+    </w:p>
+    <w:p>
+      <w:pPr>
+        <w:numPr>
+          <w:ilvl w:val="0"/>
+          <w:numId w:val="1011"/>
+        </w:numPr>
+        <w:pStyle w:val="Compact"/>
+      </w:pPr>
+      <w:r>
+        <w:rPr>
+          <w:bCs/>
+          <w:b/>
+        </w:rPr>
+        <w:t xml:space="preserve">Uji di board:</w:t>
+      </w:r>
+      <w:r>
+        <w:t xml:space="preserve"> </w:t>
+      </w:r>
+      <w:r>
+        <w:t xml:space="preserve">muat bitstream dengan overlay, jalankan</w:t>
+      </w:r>
+      <w:r>
+        <w:t xml:space="preserve"> </w:t>
+      </w:r>
+      <w:r>
+        <w:rPr>
+          <w:rStyle w:val="VerbatimChar"/>
+        </w:rPr>
+        <w:t xml:space="preserve">padan_test.py</w:t>
+      </w:r>
+      <w:r>
+        <w:t xml:space="preserve"> </w:t>
+      </w:r>
+      <w:r>
+        <w:t xml:space="preserve">(target</w:t>
+      </w:r>
+      <w:r>
+        <w:t xml:space="preserve"> </w:t>
+      </w:r>
+      <w:r>
+        <w:rPr>
+          <w:rStyle w:val="VerbatimChar"/>
+        </w:rPr>
+        <w:t xml:space="preserve">PADAN KV260: PASS (46 kasus ...)</w:t>
+      </w:r>
+      <w:r>
+        <w:t xml:space="preserve">), lalu uji tamper PMOD manual.</w:t>
+      </w:r>
+    </w:p>
+    <w:p>
+      <w:pPr>
+        <w:numPr>
+          <w:ilvl w:val="0"/>
+          <w:numId w:val="1011"/>
+        </w:numPr>
+        <w:pStyle w:val="Compact"/>
+      </w:pPr>
+      <w:r>
+        <w:rPr>
+          <w:bCs/>
+          <w:b/>
+        </w:rPr>
+        <w:t xml:space="preserve">Pertimbangkan penghitung kegagalan total atau pembatas laju</w:t>
+      </w:r>
+      <w:r>
+        <w:t xml:space="preserve"> </w:t>
+      </w:r>
+      <w:r>
+        <w:t xml:space="preserve">bila ancaman</w:t>
+      </w:r>
+      <w:r>
+        <w:t xml:space="preserve"> </w:t>
+      </w:r>
+      <w:r>
+        <w:t xml:space="preserve">probe sah relevan.</w:t>
+      </w:r>
+    </w:p>
+    <w:p>
+      <w:pPr>
+        <w:numPr>
+          <w:ilvl w:val="0"/>
+          <w:numId w:val="1011"/>
         </w:numPr>
         <w:pStyle w:val="Compact"/>
       </w:pPr>
@@ -6303,6 +6669,9 @@
     <w:abstractNumId w:val="991"/>
   </w:num>
   <w:num w:numId="1009">
+    <w:abstractNumId w:val="991"/>
+  </w:num>
+  <w:num w:numId="1010">
     <w:abstractNumId w:val="99411"/>
     <w:lvlOverride w:ilvl="0">
       <w:startOverride w:val="1"/>
@@ -6332,7 +6701,7 @@
       <w:startOverride w:val="1"/>
     </w:lvlOverride>
   </w:num>
-  <w:num w:numId="1010">
+  <w:num w:numId="1011">
     <w:abstractNumId w:val="99411"/>
     <w:lvlOverride w:ilvl="0">
       <w:startOverride w:val="1"/>

</xml_diff>

<commit_message>
Panduan KV260: nama .bit.bin = firmware-name di pl.dtsi; isi pl.dtsi yang sudah dicek
pl.dtsi dari XSA memakai firmware-name padan_kv260.bit.bin, sedangkan panduan
menyalin bitstream sebagai padan.bit.bin.

Co-Authored-By: Claude Opus 5.5 <noreply@anthropic.com>
Claude-Session: https://claude.ai/code/session_01JWHcwMqQzXkB9LnTCQYUWo
</commit_message>
<xml_diff>
--- a/docs/laporan/Laporan_PADAN.docx
+++ b/docs/laporan/Laporan_PADAN.docx
@@ -5910,6 +5910,96 @@
       </w:r>
       <w:r>
         <w:t xml:space="preserve">AXI menggantung. [Menebak]</w:t>
+      </w:r>
+      <w:r>
+        <w:t xml:space="preserve"> </w:t>
+      </w:r>
+      <w:r>
+        <w:rPr>
+          <w:rStyle w:val="VerbatimChar"/>
+        </w:rPr>
+        <w:t xml:space="preserve">pl.dtsi</w:t>
+      </w:r>
+      <w:r>
+        <w:t xml:space="preserve"> </w:t>
+      </w:r>
+      <w:r>
+        <w:t xml:space="preserve">hasil XSA sudah dicek (21 Oktober</w:t>
+      </w:r>
+      <w:r>
+        <w:t xml:space="preserve"> </w:t>
+      </w:r>
+      <w:r>
+        <w:t xml:space="preserve">2026): alamat,</w:t>
+      </w:r>
+      <w:r>
+        <w:t xml:space="preserve"> </w:t>
+      </w:r>
+      <w:r>
+        <w:rPr>
+          <w:rStyle w:val="VerbatimChar"/>
+        </w:rPr>
+        <w:t xml:space="preserve">pl_clk0</w:t>
+      </w:r>
+      <w:r>
+        <w:t xml:space="preserve"> </w:t>
+      </w:r>
+      <w:r>
+        <w:t xml:space="preserve">(node</w:t>
+      </w:r>
+      <w:r>
+        <w:t xml:space="preserve"> </w:t>
+      </w:r>
+      <w:r>
+        <w:rPr>
+          <w:rStyle w:val="VerbatimChar"/>
+        </w:rPr>
+        <w:t xml:space="preserve">fclk</w:t>
+      </w:r>
+      <w:r>
+        <w:t xml:space="preserve">, sekitar 99,999 MHz), dan parameter</w:t>
+      </w:r>
+      <w:r>
+        <w:t xml:space="preserve"> </w:t>
+      </w:r>
+      <w:r>
+        <w:t xml:space="preserve">guard cocok dengan repo.</w:t>
+      </w:r>
+      <w:r>
+        <w:t xml:space="preserve"> </w:t>
+      </w:r>
+      <w:r>
+        <w:rPr>
+          <w:rStyle w:val="VerbatimChar"/>
+        </w:rPr>
+        <w:t xml:space="preserve">firmware-name</w:t>
+      </w:r>
+      <w:r>
+        <w:t xml:space="preserve"> </w:t>
+      </w:r>
+      <w:r>
+        <w:t xml:space="preserve">di sana (</w:t>
+      </w:r>
+      <w:r>
+        <w:rPr>
+          <w:rStyle w:val="VerbatimChar"/>
+        </w:rPr>
+        <w:t xml:space="preserve">padan_kv260.bit.bin</w:t>
+      </w:r>
+      <w:r>
+        <w:t xml:space="preserve">)</w:t>
+      </w:r>
+      <w:r>
+        <w:t xml:space="preserve"> </w:t>
+      </w:r>
+      <w:r>
+        <w:t xml:space="preserve">berbeda dari nama di panduan lama, dan panduan sudah diperbaiki. Pemuatan</w:t>
+      </w:r>
+      <w:r>
+        <w:t xml:space="preserve"> </w:t>
+      </w:r>
+      <w:r>
+        <w:t xml:space="preserve">di board belum dicoba.</w:t>
       </w:r>
     </w:p>
     <w:p>

</xml_diff>

<commit_message>
check_reports.py: diuji terhadap laporan asli Vivado 2026.1; periksa clock, CDC, dan FSM
Hasil build Vivado pengguna (21 Oktober 2026):
- DSP mac_array = 18. Ada 16 DSP lane, yang lewat kaskade juga menyerap g_sum4,
  ditambah 2 DSP untuk adder tree. Tidak ada pengali yang dipecah, jadi
  harapan diubah menjadi 16..18.
- Pemeriksaan baru: clk_pl_0 berperiode 10 ns; report_cdc hanya memuat
  tamper_n; runme.log semua run tidak boleh mengekstrak FSM guard/decision.
  FSM padan_axil ada di run padan_bd_padan_0_0_synth_1, bukan synth_1.
- Data uji: laporan asli (Host dan path disamarkan), plus 13 kasus negatif.
- check_tcl.py: build.tcl harus menulis cdc.rpt.
- Laporan dan panduan: hasil Vivado, dan temuan bahwa 4 FSM lain dikode
  ulang (cabang default kemungkinan hilang; keputusan fsm_encoding terbuka).

Co-Authored-By: Claude Opus 5.5 <noreply@anthropic.com>
Claude-Session: https://claude.ai/code/session_01JWHcwMqQzXkB9LnTCQYUWo
</commit_message>
<xml_diff>
--- a/docs/laporan/Laporan_PADAN.docx
+++ b/docs/laporan/Laporan_PADAN.docx
@@ -107,7 +107,7 @@
         <w:t xml:space="preserve"> </w:t>
       </w:r>
       <w:r>
-        <w:t xml:space="preserve">20</w:t>
+        <w:t xml:space="preserve">22</w:t>
       </w:r>
       <w:r>
         <w:t xml:space="preserve"> </w:t>
@@ -228,7 +228,7 @@
           <w:bCs/>
           <w:b/>
         </w:rPr>
-        <w:t xml:space="preserve">Belum ada satu pun hasil Vivado,</w:t>
+        <w:t xml:space="preserve">Build Vivado 2026.1 sudah dijalankan</w:t>
       </w:r>
       <w:r>
         <w:rPr>
@@ -242,13 +242,32 @@
           <w:bCs/>
           <w:b/>
         </w:rPr>
-        <w:t xml:space="preserve">timing, atau board.</w:t>
-      </w:r>
-      <w:r>
-        <w:t xml:space="preserve"> </w:t>
-      </w:r>
-      <w:r>
-        <w:t xml:space="preserve">Itu adalah risiko terbesar proyek saat ini.</w:t>
+        <w:t xml:space="preserve">pengguna</w:t>
+      </w:r>
+      <w:r>
+        <w:t xml:space="preserve"> </w:t>
+      </w:r>
+      <w:r>
+        <w:t xml:space="preserve">dan lulus semua pemeriksaan laporan.</w:t>
+      </w:r>
+      <w:r>
+        <w:t xml:space="preserve"> </w:t>
+      </w:r>
+      <w:r>
+        <w:rPr>
+          <w:bCs/>
+          <w:b/>
+        </w:rPr>
+        <w:t xml:space="preserve">Belum ada hasil board</w:t>
+      </w:r>
+      <w:r>
+        <w:t xml:space="preserve">, dan</w:t>
+      </w:r>
+      <w:r>
+        <w:t xml:space="preserve"> </w:t>
+      </w:r>
+      <w:r>
+        <w:t xml:space="preserve">itu sekarang risiko terbesar proyek.</w:t>
       </w:r>
     </w:p>
     <w:p>
@@ -382,25 +401,154 @@
           <w:bCs/>
           <w:b/>
         </w:rPr>
-        <w:t xml:space="preserve">Temuan saat port:</w:t>
-      </w:r>
-      <w:r>
-        <w:t xml:space="preserve"> </w:t>
-      </w:r>
-      <w:r>
-        <w:t xml:space="preserve">Yosys untuk Xilinx menggabungkan FF kode STATUS</w:t>
-      </w:r>
-      <w:r>
-        <w:t xml:space="preserve"> </w:t>
-      </w:r>
-      <w:r>
-        <w:t xml:space="preserve">sehingga jarak NO_MATCH → MATCH turun dari 4 ke 2 flip FF. Sudah diperbaiki</w:t>
-      </w:r>
-      <w:r>
-        <w:t xml:space="preserve"> </w:t>
-      </w:r>
-      <w:r>
-        <w:t xml:space="preserve">(bagian 4).</w:t>
+        <w:t xml:space="preserve">Hasil Vivado 2026.1 (build pengguna, 21 Oktober 2026):</w:t>
+      </w:r>
+    </w:p>
+    <w:p>
+      <w:pPr>
+        <w:numPr>
+          <w:ilvl w:val="1"/>
+          <w:numId w:val="1002"/>
+        </w:numPr>
+        <w:pStyle w:val="Compact"/>
+      </w:pPr>
+      <w:r>
+        <w:t xml:space="preserve">Timing 100 MHz terpenuhi: WNS +3,68 ns, WHS +0,025 ns.</w:t>
+      </w:r>
+    </w:p>
+    <w:p>
+      <w:pPr>
+        <w:numPr>
+          <w:ilvl w:val="1"/>
+          <w:numId w:val="1002"/>
+        </w:numPr>
+        <w:pStyle w:val="Compact"/>
+      </w:pPr>
+      <w:r>
+        <w:rPr>
+          <w:rStyle w:val="VerbatimChar"/>
+        </w:rPr>
+        <w:t xml:space="preserve">padan_axil</w:t>
+      </w:r>
+      <w:r>
+        <w:t xml:space="preserve"> </w:t>
+      </w:r>
+      <w:r>
+        <w:t xml:space="preserve">memakai 1.559 LUT, 2.009 FF, 16 RAMB18, dan 21 DSP48E2.</w:t>
+      </w:r>
+    </w:p>
+    <w:p>
+      <w:pPr>
+        <w:numPr>
+          <w:ilvl w:val="1"/>
+          <w:numId w:val="1002"/>
+        </w:numPr>
+        <w:pStyle w:val="Compact"/>
+      </w:pPr>
+      <w:r>
+        <w:t xml:space="preserve">FF</w:t>
+      </w:r>
+      <w:r>
+        <w:t xml:space="preserve"> </w:t>
+      </w:r>
+      <w:r>
+        <w:rPr>
+          <w:rStyle w:val="VerbatimChar"/>
+        </w:rPr>
+        <w:t xml:space="preserve">decision</w:t>
+      </w:r>
+      <w:r>
+        <w:t xml:space="preserve"> </w:t>
+      </w:r>
+      <w:r>
+        <w:t xml:space="preserve">151 dan</w:t>
+      </w:r>
+      <w:r>
+        <w:t xml:space="preserve"> </w:t>
+      </w:r>
+      <w:r>
+        <w:rPr>
+          <w:rStyle w:val="VerbatimChar"/>
+        </w:rPr>
+        <w:t xml:space="preserve">guard</w:t>
+      </w:r>
+      <w:r>
+        <w:t xml:space="preserve"> </w:t>
+      </w:r>
+      <w:r>
+        <w:t xml:space="preserve">103; FSM</w:t>
+      </w:r>
+      <w:r>
+        <w:t xml:space="preserve"> </w:t>
+      </w:r>
+      <w:r>
+        <w:rPr>
+          <w:rStyle w:val="VerbatimChar"/>
+        </w:rPr>
+        <w:t xml:space="preserve">guard</w:t>
+      </w:r>
+      <w:r>
+        <w:t xml:space="preserve"> </w:t>
+      </w:r>
+      <w:r>
+        <w:t xml:space="preserve">tidak dikode ulang.</w:t>
+      </w:r>
+    </w:p>
+    <w:p>
+      <w:pPr>
+        <w:numPr>
+          <w:ilvl w:val="1"/>
+          <w:numId w:val="1002"/>
+        </w:numPr>
+        <w:pStyle w:val="Compact"/>
+      </w:pPr>
+      <w:r>
+        <w:t xml:space="preserve">CDC hanya ada pada</w:t>
+      </w:r>
+      <w:r>
+        <w:t xml:space="preserve"> </w:t>
+      </w:r>
+      <w:r>
+        <w:rPr>
+          <w:rStyle w:val="VerbatimChar"/>
+        </w:rPr>
+        <w:t xml:space="preserve">tamper_n</w:t>
+      </w:r>
+      <w:r>
+        <w:t xml:space="preserve">.</w:t>
+      </w:r>
+    </w:p>
+    <w:p>
+      <w:pPr>
+        <w:numPr>
+          <w:ilvl w:val="0"/>
+          <w:numId w:val="1000"/>
+        </w:numPr>
+        <w:pStyle w:val="Compact"/>
+      </w:pPr>
+      <w:r>
+        <w:t xml:space="preserve">Ada dua temuan:</w:t>
+      </w:r>
+      <w:r>
+        <w:t xml:space="preserve"> </w:t>
+      </w:r>
+      <w:r>
+        <w:rPr>
+          <w:rStyle w:val="VerbatimChar"/>
+        </w:rPr>
+        <w:t xml:space="preserve">mac_array</w:t>
+      </w:r>
+      <w:r>
+        <w:t xml:space="preserve"> </w:t>
+      </w:r>
+      <w:r>
+        <w:t xml:space="preserve">memakai 18 DSP, bukan 16 (bagian 8), dan empat</w:t>
+      </w:r>
+      <w:r>
+        <w:t xml:space="preserve"> </w:t>
+      </w:r>
+      <w:r>
+        <w:t xml:space="preserve">FSM lain dikode ulang Vivado (risiko 5).</w:t>
       </w:r>
     </w:p>
     <w:p>
@@ -416,6 +564,40 @@
           <w:bCs/>
           <w:b/>
         </w:rPr>
+        <w:t xml:space="preserve">Temuan saat port:</w:t>
+      </w:r>
+      <w:r>
+        <w:t xml:space="preserve"> </w:t>
+      </w:r>
+      <w:r>
+        <w:t xml:space="preserve">Yosys untuk Xilinx menggabungkan FF kode STATUS</w:t>
+      </w:r>
+      <w:r>
+        <w:t xml:space="preserve"> </w:t>
+      </w:r>
+      <w:r>
+        <w:t xml:space="preserve">sehingga jarak NO_MATCH → MATCH turun dari 4 ke 2 flip FF. Sudah diperbaiki</w:t>
+      </w:r>
+      <w:r>
+        <w:t xml:space="preserve"> </w:t>
+      </w:r>
+      <w:r>
+        <w:t xml:space="preserve">(bagian 4).</w:t>
+      </w:r>
+    </w:p>
+    <w:p>
+      <w:pPr>
+        <w:numPr>
+          <w:ilvl w:val="0"/>
+          <w:numId w:val="1001"/>
+        </w:numPr>
+        <w:pStyle w:val="Compact"/>
+      </w:pPr>
+      <w:r>
+        <w:rPr>
+          <w:bCs/>
+          <w:b/>
+        </w:rPr>
         <w:t xml:space="preserve">Status:</w:t>
       </w:r>
       <w:r>
@@ -443,7 +625,13 @@
         <w:t xml:space="preserve"> </w:t>
       </w:r>
       <w:r>
-        <w:t xml:space="preserve">(PR #10, da3e2ee) dan laporan. Setiap merge</w:t>
+        <w:t xml:space="preserve">(PR #10, da3e2ee), pemeriksa laporan Vivado,</w:t>
+      </w:r>
+      <w:r>
+        <w:t xml:space="preserve"> </w:t>
+      </w:r>
+      <w:r>
+        <w:t xml:space="preserve">dan dokumentasi. Setiap merge</w:t>
       </w:r>
       <w:r>
         <w:t xml:space="preserve"> </w:t>
@@ -681,7 +869,7 @@
         <w:pStyle w:val="FirstParagraph"/>
       </w:pPr>
       <w:r>
-        <w:t xml:space="preserve">Tahap 1–10 dilakukan pada 6 Oktober 2026, tahap 11–13 pada 17–20 Oktober 2026.</w:t>
+        <w:t xml:space="preserve">Tahap 1–10 dilakukan pada 6 Oktober 2026, tahap 11–14 pada 17–22 Oktober 2026.</w:t>
       </w:r>
       <w:r>
         <w:t xml:space="preserve"> </w:t>
@@ -1398,6 +1586,71 @@
             </w:r>
             <w:r>
               <w:t xml:space="preserve">ke main yang memuat PR #10</w:t>
+            </w:r>
+          </w:p>
+        </w:tc>
+      </w:tr>
+      <w:tr>
+        <w:tc>
+          <w:tcPr/>
+          <w:p>
+            <w:pPr>
+              <w:pStyle w:val="Compact"/>
+              <w:jc w:val="left"/>
+            </w:pPr>
+            <w:r>
+              <w:t xml:space="preserve">14. Build Vivado pengguna</w:t>
+            </w:r>
+          </w:p>
+        </w:tc>
+        <w:tc>
+          <w:tcPr/>
+          <w:p>
+            <w:pPr>
+              <w:pStyle w:val="Compact"/>
+              <w:jc w:val="left"/>
+            </w:pPr>
+            <w:r>
+              <w:t xml:space="preserve">(laporan di</w:t>
+            </w:r>
+            <w:r>
+              <w:t xml:space="preserve"> </w:t>
+            </w:r>
+            <w:r>
+              <w:rPr>
+                <w:rStyle w:val="VerbatimChar"/>
+              </w:rPr>
+              <w:t xml:space="preserve">fpga/kv260/testdata</w:t>
+            </w:r>
+            <w:r>
+              <w:t xml:space="preserve">)</w:t>
+            </w:r>
+          </w:p>
+        </w:tc>
+        <w:tc>
+          <w:tcPr/>
+          <w:p>
+            <w:pPr>
+              <w:pStyle w:val="Compact"/>
+              <w:jc w:val="left"/>
+            </w:pPr>
+            <w:r>
+              <w:t xml:space="preserve">Vivado 2026.1: semua pemeriksaan laporan lulus;</w:t>
+            </w:r>
+            <w:r>
+              <w:t xml:space="preserve"> </w:t>
+            </w:r>
+            <w:r>
+              <w:rPr>
+                <w:rStyle w:val="VerbatimChar"/>
+              </w:rPr>
+              <w:t xml:space="preserve">check_reports.py</w:t>
+            </w:r>
+            <w:r>
+              <w:t xml:space="preserve"> </w:t>
+            </w:r>
+            <w:r>
+              <w:t xml:space="preserve">kini juga memeriksa clock, CDC, dan FSM, dan diuji terhadap laporan asli</w:t>
             </w:r>
           </w:p>
         </w:tc>
@@ -1858,7 +2111,7 @@
       <w:pPr>
         <w:numPr>
           <w:ilvl w:val="0"/>
-          <w:numId w:val="1002"/>
+          <w:numId w:val="1003"/>
         </w:numPr>
         <w:pStyle w:val="Compact"/>
       </w:pPr>
@@ -1892,7 +2145,7 @@
       <w:pPr>
         <w:numPr>
           <w:ilvl w:val="0"/>
-          <w:numId w:val="1002"/>
+          <w:numId w:val="1003"/>
         </w:numPr>
         <w:pStyle w:val="Compact"/>
       </w:pPr>
@@ -1920,7 +2173,7 @@
       <w:pPr>
         <w:numPr>
           <w:ilvl w:val="0"/>
-          <w:numId w:val="1002"/>
+          <w:numId w:val="1003"/>
         </w:numPr>
         <w:pStyle w:val="Compact"/>
       </w:pPr>
@@ -1954,7 +2207,7 @@
       <w:pPr>
         <w:numPr>
           <w:ilvl w:val="0"/>
-          <w:numId w:val="1002"/>
+          <w:numId w:val="1003"/>
         </w:numPr>
         <w:pStyle w:val="Compact"/>
       </w:pPr>
@@ -1988,7 +2241,7 @@
       <w:pPr>
         <w:numPr>
           <w:ilvl w:val="0"/>
-          <w:numId w:val="1002"/>
+          <w:numId w:val="1003"/>
         </w:numPr>
         <w:pStyle w:val="Compact"/>
       </w:pPr>
@@ -2022,7 +2275,7 @@
       <w:pPr>
         <w:numPr>
           <w:ilvl w:val="0"/>
-          <w:numId w:val="1002"/>
+          <w:numId w:val="1003"/>
         </w:numPr>
         <w:pStyle w:val="Compact"/>
       </w:pPr>
@@ -2217,7 +2470,7 @@
       <w:pPr>
         <w:numPr>
           <w:ilvl w:val="0"/>
-          <w:numId w:val="1003"/>
+          <w:numId w:val="1004"/>
         </w:numPr>
         <w:pStyle w:val="Compact"/>
       </w:pPr>
@@ -2245,7 +2498,7 @@
       <w:pPr>
         <w:numPr>
           <w:ilvl w:val="0"/>
-          <w:numId w:val="1003"/>
+          <w:numId w:val="1004"/>
         </w:numPr>
         <w:pStyle w:val="Compact"/>
       </w:pPr>
@@ -2267,7 +2520,7 @@
       <w:pPr>
         <w:numPr>
           <w:ilvl w:val="0"/>
-          <w:numId w:val="1003"/>
+          <w:numId w:val="1004"/>
         </w:numPr>
         <w:pStyle w:val="Compact"/>
       </w:pPr>
@@ -2611,7 +2864,7 @@
       <w:pPr>
         <w:numPr>
           <w:ilvl w:val="0"/>
-          <w:numId w:val="1004"/>
+          <w:numId w:val="1005"/>
         </w:numPr>
         <w:pStyle w:val="Compact"/>
       </w:pPr>
@@ -2633,7 +2886,7 @@
       <w:pPr>
         <w:numPr>
           <w:ilvl w:val="0"/>
-          <w:numId w:val="1004"/>
+          <w:numId w:val="1005"/>
         </w:numPr>
         <w:pStyle w:val="Compact"/>
       </w:pPr>
@@ -2661,7 +2914,7 @@
       <w:pPr>
         <w:numPr>
           <w:ilvl w:val="0"/>
-          <w:numId w:val="1004"/>
+          <w:numId w:val="1005"/>
         </w:numPr>
         <w:pStyle w:val="Compact"/>
       </w:pPr>
@@ -2689,7 +2942,7 @@
       <w:pPr>
         <w:numPr>
           <w:ilvl w:val="0"/>
-          <w:numId w:val="1004"/>
+          <w:numId w:val="1005"/>
         </w:numPr>
         <w:pStyle w:val="Compact"/>
       </w:pPr>
@@ -2732,7 +2985,7 @@
       <w:pPr>
         <w:numPr>
           <w:ilvl w:val="0"/>
-          <w:numId w:val="1004"/>
+          <w:numId w:val="1005"/>
         </w:numPr>
         <w:pStyle w:val="Compact"/>
       </w:pPr>
@@ -2876,7 +3129,13 @@
         <w:t xml:space="preserve"> </w:t>
       </w:r>
       <w:r>
-        <w:t xml:space="preserve">(tahap 6) dihapus. Paket KV260</w:t>
+        <w:t xml:space="preserve">(tahap 6) dihapus. Build Vivado 2026.1 sudah dijalankan pengguna (21 Oktober</w:t>
+      </w:r>
+      <w:r>
+        <w:t xml:space="preserve"> </w:t>
+      </w:r>
+      <w:r>
+        <w:t xml:space="preserve">2026). Paket ini</w:t>
       </w:r>
       <w:r>
         <w:t xml:space="preserve"> </w:t>
@@ -2886,24 +3145,16 @@
           <w:bCs/>
           <w:b/>
         </w:rPr>
-        <w:t xml:space="preserve">belum pernah dijalankan di Vivado atau di</w:t>
-      </w:r>
-      <w:r>
-        <w:rPr>
-          <w:bCs/>
-          <w:b/>
-        </w:rPr>
-        <w:t xml:space="preserve"> </w:t>
-      </w:r>
-      <w:r>
-        <w:rPr>
-          <w:bCs/>
-          <w:b/>
-        </w:rPr>
-        <w:t xml:space="preserve">board</w:t>
-      </w:r>
-      <w:r>
-        <w:t xml:space="preserve">. Tidak ada klaim hasil board (</w:t>
+        <w:t xml:space="preserve">belum pernah dijalankan di board</w:t>
+      </w:r>
+      <w:r>
+        <w:t xml:space="preserve">, dan tidak ada klaim hasil</w:t>
+      </w:r>
+      <w:r>
+        <w:t xml:space="preserve"> </w:t>
+      </w:r>
+      <w:r>
+        <w:t xml:space="preserve">board (</w:t>
       </w:r>
       <w:r>
         <w:rPr>
@@ -3186,7 +3437,22 @@
               <w:jc w:val="left"/>
             </w:pPr>
             <w:r>
-              <w:t xml:space="preserve">Bitstream, laporan, XSA; pemeriksaan RAMB18 16, DSP 16, FF</w:t>
+              <w:t xml:space="preserve">Bitstream, laporan, XSA; pemeriksaan RAMB18 16, DSP</w:t>
+            </w:r>
+            <w:r>
+              <w:t xml:space="preserve"> </w:t>
+            </w:r>
+            <w:r>
+              <w:rPr>
+                <w:rStyle w:val="VerbatimChar"/>
+              </w:rPr>
+              <w:t xml:space="preserve">mac_array</w:t>
+            </w:r>
+            <w:r>
+              <w:t xml:space="preserve"> </w:t>
+            </w:r>
+            <w:r>
+              <w:t xml:space="preserve">16–18, FF</w:t>
             </w:r>
             <w:r>
               <w:t xml:space="preserve"> </w:t>
@@ -3216,7 +3482,58 @@
               <w:t xml:space="preserve"> </w:t>
             </w:r>
             <w:r>
-              <w:t xml:space="preserve">103, WNS/WHS/WPWS ≥ 0.</w:t>
+              <w:t xml:space="preserve">103, WNS/WHS/WPWS ≥ 0,</w:t>
+            </w:r>
+            <w:r>
+              <w:t xml:space="preserve"> </w:t>
+            </w:r>
+            <w:r>
+              <w:rPr>
+                <w:rStyle w:val="VerbatimChar"/>
+              </w:rPr>
+              <w:t xml:space="preserve">clk_pl_0</w:t>
+            </w:r>
+            <w:r>
+              <w:t xml:space="preserve"> </w:t>
+            </w:r>
+            <w:r>
+              <w:t xml:space="preserve">10 ns, CDC hanya</w:t>
+            </w:r>
+            <w:r>
+              <w:t xml:space="preserve"> </w:t>
+            </w:r>
+            <w:r>
+              <w:rPr>
+                <w:rStyle w:val="VerbatimChar"/>
+              </w:rPr>
+              <w:t xml:space="preserve">tamper_n</w:t>
+            </w:r>
+            <w:r>
+              <w:t xml:space="preserve">, FSM</w:t>
+            </w:r>
+            <w:r>
+              <w:t xml:space="preserve"> </w:t>
+            </w:r>
+            <w:r>
+              <w:rPr>
+                <w:rStyle w:val="VerbatimChar"/>
+              </w:rPr>
+              <w:t xml:space="preserve">guard</w:t>
+            </w:r>
+            <w:r>
+              <w:t xml:space="preserve">/</w:t>
+            </w:r>
+            <w:r>
+              <w:rPr>
+                <w:rStyle w:val="VerbatimChar"/>
+              </w:rPr>
+              <w:t xml:space="preserve">decision</w:t>
+            </w:r>
+            <w:r>
+              <w:t xml:space="preserve"> </w:t>
+            </w:r>
+            <w:r>
+              <w:t xml:space="preserve">tidak dikode ulang.</w:t>
             </w:r>
           </w:p>
         </w:tc>
@@ -3270,102 +3587,142 @@
       <w:pPr>
         <w:numPr>
           <w:ilvl w:val="0"/>
-          <w:numId w:val="1005"/>
-        </w:numPr>
-        <w:pStyle w:val="Compact"/>
-      </w:pPr>
-      <w:r>
-        <w:rPr>
-          <w:bCs/>
-          <w:b/>
-        </w:rPr>
-        <w:t xml:space="preserve">Yang diuji di CI tanpa Vivado dan board:</w:t>
-      </w:r>
-    </w:p>
-    <w:p>
-      <w:pPr>
-        <w:numPr>
-          <w:ilvl w:val="1"/>
           <w:numId w:val="1006"/>
         </w:numPr>
         <w:pStyle w:val="Compact"/>
       </w:pPr>
       <w:r>
         <w:rPr>
-          <w:rStyle w:val="VerbatimChar"/>
-        </w:rPr>
-        <w:t xml:space="preserve">padan_axil</w:t>
-      </w:r>
-      <w:r>
-        <w:t xml:space="preserve">: 6 test protokol (urutan AW/W, backpressure B/R, SLVERR, AR</w:t>
-      </w:r>
-      <w:r>
-        <w:t xml:space="preserve"> </w:t>
-      </w:r>
-      <w:r>
-        <w:t xml:space="preserve">bersamaan, tamper) dan 8 mutan, semua terbunuh. [Pasti]</w:t>
+          <w:bCs/>
+          <w:b/>
+        </w:rPr>
+        <w:t xml:space="preserve">Yang diuji di CI tanpa Vivado dan board:</w:t>
       </w:r>
     </w:p>
     <w:p>
       <w:pPr>
         <w:numPr>
           <w:ilvl w:val="1"/>
+          <w:numId w:val="1007"/>
+        </w:numPr>
+        <w:pStyle w:val="Compact"/>
+      </w:pPr>
+      <w:r>
+        <w:rPr>
+          <w:rStyle w:val="VerbatimChar"/>
+        </w:rPr>
+        <w:t xml:space="preserve">padan_axil</w:t>
+      </w:r>
+      <w:r>
+        <w:t xml:space="preserve">: 6 test protokol (urutan AW/W, backpressure B/R, SLVERR, AR</w:t>
+      </w:r>
+      <w:r>
+        <w:t xml:space="preserve"> </w:t>
+      </w:r>
+      <w:r>
+        <w:t xml:space="preserve">bersamaan, tamper) dan 8 mutan, semua terbunuh. [Pasti]</w:t>
+      </w:r>
+    </w:p>
+    <w:p>
+      <w:pPr>
+        <w:numPr>
+          <w:ilvl w:val="1"/>
+          <w:numId w:val="1007"/>
+        </w:numPr>
+        <w:pStyle w:val="Compact"/>
+      </w:pPr>
+      <w:r>
+        <w:rPr>
+          <w:rStyle w:val="VerbatimChar"/>
+        </w:rPr>
+        <w:t xml:space="preserve">padan_test.py</w:t>
+      </w:r>
+      <w:r>
+        <w:t xml:space="preserve"> </w:t>
+      </w:r>
+      <w:r>
+        <w:t xml:space="preserve">tanpa diubah melawan RTL lewat AXI: 46/46 PASS tanpa</w:t>
+      </w:r>
+      <w:r>
+        <w:t xml:space="preserve"> </w:t>
+      </w:r>
+      <w:r>
+        <w:t xml:space="preserve">pelanggaran protokol; fault memori terdeteksi dan HALT setelah FAULT ke-3;</w:t>
+      </w:r>
+      <w:r>
+        <w:t xml:space="preserve"> </w:t>
+      </w:r>
+      <w:r>
+        <w:t xml:space="preserve">base salah tidak menulis apa pun. [Pasti, simulasi]</w:t>
+      </w:r>
+    </w:p>
+    <w:p>
+      <w:pPr>
+        <w:numPr>
+          <w:ilvl w:val="1"/>
+          <w:numId w:val="1007"/>
+        </w:numPr>
+        <w:pStyle w:val="Compact"/>
+      </w:pPr>
+      <w:r>
+        <w:t xml:space="preserve">Skrip Vivado di tclsh dengan stub: nilai kunci konsisten dengan RTL dan</w:t>
+      </w:r>
+      <w:r>
+        <w:t xml:space="preserve"> </w:t>
+      </w:r>
+      <w:r>
+        <w:t xml:space="preserve">host, 4 kondisi error memberi pesan jelas.</w:t>
+      </w:r>
+    </w:p>
+    <w:p>
+      <w:pPr>
+        <w:numPr>
+          <w:ilvl w:val="0"/>
           <w:numId w:val="1006"/>
         </w:numPr>
         <w:pStyle w:val="Compact"/>
       </w:pPr>
       <w:r>
         <w:rPr>
+          <w:bCs/>
+          <w:b/>
+        </w:rPr>
+        <w:t xml:space="preserve">Dijalankan pengguna di luar CI:</w:t>
+      </w:r>
+      <w:r>
+        <w:t xml:space="preserve"> </w:t>
+      </w:r>
+      <w:r>
+        <w:t xml:space="preserve">build Vivado 2026.1 (lulus) dan</w:t>
+      </w:r>
+      <w:r>
+        <w:t xml:space="preserve"> </w:t>
+      </w:r>
+      <w:r>
+        <w:t xml:space="preserve">pembangkitan</w:t>
+      </w:r>
+      <w:r>
+        <w:t xml:space="preserve"> </w:t>
+      </w:r>
+      <w:r>
+        <w:rPr>
           <w:rStyle w:val="VerbatimChar"/>
         </w:rPr>
-        <w:t xml:space="preserve">padan_test.py</w:t>
-      </w:r>
-      <w:r>
-        <w:t xml:space="preserve"> </w:t>
-      </w:r>
-      <w:r>
-        <w:t xml:space="preserve">tanpa diubah melawan RTL lewat AXI: 46/46 PASS tanpa</w:t>
-      </w:r>
-      <w:r>
-        <w:t xml:space="preserve"> </w:t>
-      </w:r>
-      <w:r>
-        <w:t xml:space="preserve">pelanggaran protokol; fault memori terdeteksi dan HALT setelah FAULT ke-3;</w:t>
-      </w:r>
-      <w:r>
-        <w:t xml:space="preserve"> </w:t>
-      </w:r>
-      <w:r>
-        <w:t xml:space="preserve">base salah tidak menulis apa pun. [Pasti, simulasi]</w:t>
+        <w:t xml:space="preserve">pl.dtsi</w:t>
+      </w:r>
+      <w:r>
+        <w:t xml:space="preserve">.</w:t>
       </w:r>
     </w:p>
     <w:p>
       <w:pPr>
         <w:numPr>
-          <w:ilvl w:val="1"/>
+          <w:ilvl w:val="0"/>
           <w:numId w:val="1006"/>
         </w:numPr>
         <w:pStyle w:val="Compact"/>
       </w:pPr>
       <w:r>
-        <w:t xml:space="preserve">Skrip Vivado di tclsh dengan stub: nilai kunci konsisten dengan RTL dan</w:t>
-      </w:r>
-      <w:r>
-        <w:t xml:space="preserve"> </w:t>
-      </w:r>
-      <w:r>
-        <w:t xml:space="preserve">host, 4 kondisi error memberi pesan jelas.</w:t>
-      </w:r>
-    </w:p>
-    <w:p>
-      <w:pPr>
-        <w:numPr>
-          <w:ilvl w:val="0"/>
-          <w:numId w:val="1005"/>
-        </w:numPr>
-        <w:pStyle w:val="Compact"/>
-      </w:pPr>
-      <w:r>
         <w:rPr>
           <w:bCs/>
           <w:b/>
@@ -3376,18 +3733,6 @@
         <w:t xml:space="preserve"> </w:t>
       </w:r>
       <w:r>
-        <w:t xml:space="preserve">Vivado sungguhan (otomasi block design, pengenalan</w:t>
-      </w:r>
-      <w:r>
-        <w:t xml:space="preserve"> </w:t>
-      </w:r>
-      <w:r>
-        <w:t xml:space="preserve">interface AXI),</w:t>
-      </w:r>
-      <w:r>
-        <w:t xml:space="preserve"> </w:t>
-      </w:r>
-      <w:r>
         <w:rPr>
           <w:rStyle w:val="VerbatimChar"/>
         </w:rPr>
@@ -3397,7 +3742,13 @@
         <w:t xml:space="preserve"> </w:t>
       </w:r>
       <w:r>
-        <w:t xml:space="preserve">dan PS, overlay device tree, timing.</w:t>
+        <w:t xml:space="preserve">dan PS, pemuatan overlay, dan semua perilaku</w:t>
+      </w:r>
+      <w:r>
+        <w:t xml:space="preserve"> </w:t>
+      </w:r>
+      <w:r>
+        <w:t xml:space="preserve">di board.</w:t>
       </w:r>
     </w:p>
     <w:bookmarkEnd w:id="27"/>
@@ -3673,7 +4024,7 @@
       <w:pPr>
         <w:numPr>
           <w:ilvl w:val="0"/>
-          <w:numId w:val="1007"/>
+          <w:numId w:val="1008"/>
         </w:numPr>
         <w:pStyle w:val="Compact"/>
       </w:pPr>
@@ -3685,105 +4036,6 @@
       </w:r>
       <w:r>
         <w:t xml:space="preserve">16 × 144 word memori dan register probe di simulasi.</w:t>
-      </w:r>
-    </w:p>
-    <w:p>
-      <w:pPr>
-        <w:numPr>
-          <w:ilvl w:val="0"/>
-          <w:numId w:val="1007"/>
-        </w:numPr>
-        <w:pStyle w:val="Compact"/>
-      </w:pPr>
-      <w:r>
-        <w:t xml:space="preserve">Bukti SAT Yosys setelah sintesis: setiap state ilegal mematikan semua izin dan</w:t>
-      </w:r>
-      <w:r>
-        <w:t xml:space="preserve"> </w:t>
-      </w:r>
-      <w:r>
-        <w:t xml:space="preserve">menuju zeroize; ada kontrol negatif.</w:t>
-      </w:r>
-    </w:p>
-    <w:p>
-      <w:pPr>
-        <w:numPr>
-          <w:ilvl w:val="0"/>
-          <w:numId w:val="1007"/>
-        </w:numPr>
-        <w:pStyle w:val="Compact"/>
-      </w:pPr>
-      <w:r>
-        <w:t xml:space="preserve">12 mutan guard terbunuh, termasuk clear yang melewatkan baris checksum dan</w:t>
-      </w:r>
-      <w:r>
-        <w:t xml:space="preserve"> </w:t>
-      </w:r>
-      <w:r>
-        <w:t xml:space="preserve">sinkronisasi tamper 1-FF.</w:t>
-      </w:r>
-    </w:p>
-    <w:bookmarkEnd w:id="28"/>
-    <w:bookmarkStart w:id="29" w:name="injeksi-fault-debug-debug_fault"/>
-    <w:p>
-      <w:pPr>
-        <w:pStyle w:val="Heading1"/>
-      </w:pPr>
-      <w:r>
-        <w:t xml:space="preserve">7. Injeksi fault debug (DEBUG_FAULT)</w:t>
-      </w:r>
-    </w:p>
-    <w:p>
-      <w:pPr>
-        <w:pStyle w:val="FirstParagraph"/>
-      </w:pPr>
-      <w:r>
-        <w:t xml:space="preserve">Build debug punya register DBG_FAULT untuk menambahkan delta ke produk satu</w:t>
-      </w:r>
-      <w:r>
-        <w:t xml:space="preserve"> </w:t>
-      </w:r>
-      <w:r>
-        <w:t xml:space="preserve">lane, serta DBG_ABFT untuk membaca hasil lokalisasi. Build rilis</w:t>
-      </w:r>
-      <w:r>
-        <w:t xml:space="preserve"> </w:t>
-      </w:r>
-      <w:r>
-        <w:rPr>
-          <w:bCs/>
-          <w:b/>
-        </w:rPr>
-        <w:t xml:space="preserve">tidak</w:t>
-      </w:r>
-      <w:r>
-        <w:rPr>
-          <w:bCs/>
-          <w:b/>
-        </w:rPr>
-        <w:t xml:space="preserve"> </w:t>
-      </w:r>
-      <w:r>
-        <w:rPr>
-          <w:bCs/>
-          <w:b/>
-        </w:rPr>
-        <w:t xml:space="preserve">memuat</w:t>
-      </w:r>
-      <w:r>
-        <w:t xml:space="preserve"> </w:t>
-      </w:r>
-      <w:r>
-        <w:t xml:space="preserve">port, register, atau logikanya (</w:t>
-      </w:r>
-      <w:r>
-        <w:rPr>
-          <w:rStyle w:val="VerbatimChar"/>
-        </w:rPr>
-        <w:t xml:space="preserve">docs/rtl_debug_fault.md</w:t>
-      </w:r>
-      <w:r>
-        <w:t xml:space="preserve">).</w:t>
       </w:r>
     </w:p>
     <w:p>
@@ -3795,29 +4047,13 @@
         <w:pStyle w:val="Compact"/>
       </w:pPr>
       <w:r>
-        <w:rPr>
-          <w:bCs/>
-          <w:b/>
-        </w:rPr>
-        <w:t xml:space="preserve">Delta aditif, bukan pengganti.</w:t>
-      </w:r>
-      <w:r>
-        <w:t xml:space="preserve"> </w:t>
-      </w:r>
-      <w:r>
-        <w:t xml:space="preserve">Dengan delta aditif, residu ABFT hanya</w:t>
-      </w:r>
-      <w:r>
-        <w:t xml:space="preserve"> </w:t>
-      </w:r>
-      <w:r>
-        <w:t xml:space="preserve">bergantung pada delta dan baris. Dengan nilai pengganti, residu membocorkan</w:t>
-      </w:r>
-      <w:r>
-        <w:t xml:space="preserve"> </w:t>
-      </w:r>
-      <w:r>
-        <w:t xml:space="preserve">T·p. [Pasti, aljabar]</w:t>
+        <w:t xml:space="preserve">Bukti SAT Yosys setelah sintesis: setiap state ilegal mematikan semua izin dan</w:t>
+      </w:r>
+      <w:r>
+        <w:t xml:space="preserve"> </w:t>
+      </w:r>
+      <w:r>
+        <w:t xml:space="preserve">menuju zeroize; ada kontrol negatif.</w:t>
       </w:r>
     </w:p>
     <w:p>
@@ -3829,20 +4065,135 @@
         <w:pStyle w:val="Compact"/>
       </w:pPr>
       <w:r>
-        <w:t xml:space="preserve">288 injeksi (16 lane × 18 baris): semuanya FAULT; 256 dilokalisasi ke</w:t>
-      </w:r>
-      <w:r>
-        <w:t xml:space="preserve"> </w:t>
-      </w:r>
-      <w:r>
-        <w:t xml:space="preserve">barisnya, 32 terdeteksi di baris checksum.</w:t>
+        <w:t xml:space="preserve">12 mutan guard terbunuh, termasuk clear yang melewatkan baris checksum dan</w:t>
+      </w:r>
+      <w:r>
+        <w:t xml:space="preserve"> </w:t>
+      </w:r>
+      <w:r>
+        <w:t xml:space="preserve">sinkronisasi tamper 1-FF.</w:t>
+      </w:r>
+    </w:p>
+    <w:bookmarkEnd w:id="28"/>
+    <w:bookmarkStart w:id="29" w:name="injeksi-fault-debug-debug_fault"/>
+    <w:p>
+      <w:pPr>
+        <w:pStyle w:val="Heading1"/>
+      </w:pPr>
+      <w:r>
+        <w:t xml:space="preserve">7. Injeksi fault debug (DEBUG_FAULT)</w:t>
+      </w:r>
+    </w:p>
+    <w:p>
+      <w:pPr>
+        <w:pStyle w:val="FirstParagraph"/>
+      </w:pPr>
+      <w:r>
+        <w:t xml:space="preserve">Build debug punya register DBG_FAULT untuk menambahkan delta ke produk satu</w:t>
+      </w:r>
+      <w:r>
+        <w:t xml:space="preserve"> </w:t>
+      </w:r>
+      <w:r>
+        <w:t xml:space="preserve">lane, serta DBG_ABFT untuk membaca hasil lokalisasi. Build rilis</w:t>
+      </w:r>
+      <w:r>
+        <w:t xml:space="preserve"> </w:t>
+      </w:r>
+      <w:r>
+        <w:rPr>
+          <w:bCs/>
+          <w:b/>
+        </w:rPr>
+        <w:t xml:space="preserve">tidak</w:t>
+      </w:r>
+      <w:r>
+        <w:rPr>
+          <w:bCs/>
+          <w:b/>
+        </w:rPr>
+        <w:t xml:space="preserve"> </w:t>
+      </w:r>
+      <w:r>
+        <w:rPr>
+          <w:bCs/>
+          <w:b/>
+        </w:rPr>
+        <w:t xml:space="preserve">memuat</w:t>
+      </w:r>
+      <w:r>
+        <w:t xml:space="preserve"> </w:t>
+      </w:r>
+      <w:r>
+        <w:t xml:space="preserve">port, register, atau logikanya (</w:t>
+      </w:r>
+      <w:r>
+        <w:rPr>
+          <w:rStyle w:val="VerbatimChar"/>
+        </w:rPr>
+        <w:t xml:space="preserve">docs/rtl_debug_fault.md</w:t>
+      </w:r>
+      <w:r>
+        <w:t xml:space="preserve">).</w:t>
       </w:r>
     </w:p>
     <w:p>
       <w:pPr>
         <w:numPr>
           <w:ilvl w:val="0"/>
-          <w:numId w:val="1008"/>
+          <w:numId w:val="1009"/>
+        </w:numPr>
+        <w:pStyle w:val="Compact"/>
+      </w:pPr>
+      <w:r>
+        <w:rPr>
+          <w:bCs/>
+          <w:b/>
+        </w:rPr>
+        <w:t xml:space="preserve">Delta aditif, bukan pengganti.</w:t>
+      </w:r>
+      <w:r>
+        <w:t xml:space="preserve"> </w:t>
+      </w:r>
+      <w:r>
+        <w:t xml:space="preserve">Dengan delta aditif, residu ABFT hanya</w:t>
+      </w:r>
+      <w:r>
+        <w:t xml:space="preserve"> </w:t>
+      </w:r>
+      <w:r>
+        <w:t xml:space="preserve">bergantung pada delta dan baris. Dengan nilai pengganti, residu membocorkan</w:t>
+      </w:r>
+      <w:r>
+        <w:t xml:space="preserve"> </w:t>
+      </w:r>
+      <w:r>
+        <w:t xml:space="preserve">T·p. [Pasti, aljabar]</w:t>
+      </w:r>
+    </w:p>
+    <w:p>
+      <w:pPr>
+        <w:numPr>
+          <w:ilvl w:val="0"/>
+          <w:numId w:val="1009"/>
+        </w:numPr>
+        <w:pStyle w:val="Compact"/>
+      </w:pPr>
+      <w:r>
+        <w:t xml:space="preserve">288 injeksi (16 lane × 18 baris): semuanya FAULT; 256 dilokalisasi ke</w:t>
+      </w:r>
+      <w:r>
+        <w:t xml:space="preserve"> </w:t>
+      </w:r>
+      <w:r>
+        <w:t xml:space="preserve">barisnya, 32 terdeteksi di baris checksum.</w:t>
+      </w:r>
+    </w:p>
+    <w:p>
+      <w:pPr>
+        <w:numPr>
+          <w:ilvl w:val="0"/>
+          <w:numId w:val="1009"/>
         </w:numPr>
         <w:pStyle w:val="Compact"/>
       </w:pPr>
@@ -4825,13 +5176,853 @@
         <w:pStyle w:val="BodyText"/>
       </w:pPr>
       <w:r>
-        <w:t xml:space="preserve">Angka Vivado bisa berbeda. Angka yang dikunci CI adalah jumlah primitif keras</w:t>
-      </w:r>
-      <w:r>
-        <w:t xml:space="preserve"> </w:t>
-      </w:r>
-      <w:r>
-        <w:t xml:space="preserve">dan FF register redundan, bukan LUT.</w:t>
+        <w:t xml:space="preserve">Angka yang dikunci CI adalah jumlah primitif keras dan FF register redundan,</w:t>
+      </w:r>
+      <w:r>
+        <w:t xml:space="preserve"> </w:t>
+      </w:r>
+      <w:r>
+        <w:t xml:space="preserve">bukan LUT.</w:t>
+      </w:r>
+    </w:p>
+    <w:p>
+      <w:pPr>
+        <w:pStyle w:val="BodyText"/>
+      </w:pPr>
+      <w:r>
+        <w:rPr>
+          <w:bCs/>
+          <w:b/>
+        </w:rPr>
+        <w:t xml:space="preserve">Hasil Vivado 2026.1</w:t>
+      </w:r>
+      <w:r>
+        <w:t xml:space="preserve"> </w:t>
+      </w:r>
+      <w:r>
+        <w:t xml:space="preserve">(build pengguna, 21 Oktober 2026; laporan asli di</w:t>
+      </w:r>
+      <w:r>
+        <w:t xml:space="preserve"> </w:t>
+      </w:r>
+      <w:r>
+        <w:rPr>
+          <w:rStyle w:val="VerbatimChar"/>
+        </w:rPr>
+        <w:t xml:space="preserve">fpga/kv260/testdata/vivado_2026.1</w:t>
+      </w:r>
+      <w:r>
+        <w:t xml:space="preserve">) [Pasti untuk build itu]:</w:t>
+      </w:r>
+    </w:p>
+    <w:tbl>
+      <w:tblPr>
+        <w:tblStyle w:val="Table"/>
+        <w:tblW w:type="pct" w:w="5000"/>
+        <w:tblLook w:firstRow="1" w:lastRow="0" w:firstColumn="0" w:lastColumn="0" w:noHBand="0" w:noVBand="0" w:val="0020"/>
+        <w:jc w:val="start"/>
+      </w:tblPr>
+      <w:tblGrid>
+        <w:gridCol w:w="1584"/>
+        <w:gridCol w:w="1584"/>
+        <w:gridCol w:w="1584"/>
+        <w:gridCol w:w="1584"/>
+        <w:gridCol w:w="1584"/>
+      </w:tblGrid>
+      <w:tr>
+        <w:trPr>
+          <w:tblHeader w:val="true"/>
+        </w:trPr>
+        <w:tc>
+          <w:tcPr/>
+          <w:p>
+            <w:pPr>
+              <w:pStyle w:val="Compact"/>
+              <w:jc w:val="left"/>
+            </w:pPr>
+            <w:r>
+              <w:t xml:space="preserve">Modul</w:t>
+            </w:r>
+          </w:p>
+        </w:tc>
+        <w:tc>
+          <w:tcPr/>
+          <w:p>
+            <w:pPr>
+              <w:pStyle w:val="Compact"/>
+              <w:jc w:val="left"/>
+            </w:pPr>
+            <w:r>
+              <w:t xml:space="preserve">LUT</w:t>
+            </w:r>
+          </w:p>
+        </w:tc>
+        <w:tc>
+          <w:tcPr/>
+          <w:p>
+            <w:pPr>
+              <w:pStyle w:val="Compact"/>
+              <w:jc w:val="left"/>
+            </w:pPr>
+            <w:r>
+              <w:t xml:space="preserve">FF</w:t>
+            </w:r>
+          </w:p>
+        </w:tc>
+        <w:tc>
+          <w:tcPr/>
+          <w:p>
+            <w:pPr>
+              <w:pStyle w:val="Compact"/>
+              <w:jc w:val="left"/>
+            </w:pPr>
+            <w:r>
+              <w:t xml:space="preserve">DSP48E2</w:t>
+            </w:r>
+          </w:p>
+        </w:tc>
+        <w:tc>
+          <w:tcPr/>
+          <w:p>
+            <w:pPr>
+              <w:pStyle w:val="Compact"/>
+              <w:jc w:val="left"/>
+            </w:pPr>
+            <w:r>
+              <w:t xml:space="preserve">Block RAM</w:t>
+            </w:r>
+          </w:p>
+        </w:tc>
+      </w:tr>
+      <w:tr>
+        <w:tc>
+          <w:tcPr/>
+          <w:p>
+            <w:pPr>
+              <w:pStyle w:val="Compact"/>
+              <w:jc w:val="left"/>
+            </w:pPr>
+            <w:r>
+              <w:rPr>
+                <w:rStyle w:val="VerbatimChar"/>
+              </w:rPr>
+              <w:t xml:space="preserve">mac_array</w:t>
+            </w:r>
+          </w:p>
+        </w:tc>
+        <w:tc>
+          <w:tcPr/>
+          <w:p>
+            <w:pPr>
+              <w:pStyle w:val="Compact"/>
+              <w:jc w:val="left"/>
+            </w:pPr>
+            <w:r>
+              <w:t xml:space="preserve">520</w:t>
+            </w:r>
+          </w:p>
+        </w:tc>
+        <w:tc>
+          <w:tcPr/>
+          <w:p>
+            <w:pPr>
+              <w:pStyle w:val="Compact"/>
+              <w:jc w:val="left"/>
+            </w:pPr>
+            <w:r>
+              <w:t xml:space="preserve">1.237 (+11 SRL)</w:t>
+            </w:r>
+          </w:p>
+        </w:tc>
+        <w:tc>
+          <w:tcPr/>
+          <w:p>
+            <w:pPr>
+              <w:pStyle w:val="Compact"/>
+              <w:jc w:val="left"/>
+            </w:pPr>
+            <w:r>
+              <w:t xml:space="preserve">18</w:t>
+            </w:r>
+          </w:p>
+        </w:tc>
+        <w:tc>
+          <w:tcPr/>
+          <w:p>
+            <w:pPr>
+              <w:pStyle w:val="Compact"/>
+              <w:jc w:val="left"/>
+            </w:pPr>
+            <w:r>
+              <w:t xml:space="preserve">–</w:t>
+            </w:r>
+          </w:p>
+        </w:tc>
+      </w:tr>
+      <w:tr>
+        <w:tc>
+          <w:tcPr/>
+          <w:p>
+            <w:pPr>
+              <w:pStyle w:val="Compact"/>
+              <w:jc w:val="left"/>
+            </w:pPr>
+            <w:r>
+              <w:rPr>
+                <w:rStyle w:val="VerbatimChar"/>
+              </w:rPr>
+              <w:t xml:space="preserve">abft_check</w:t>
+            </w:r>
+          </w:p>
+        </w:tc>
+        <w:tc>
+          <w:tcPr/>
+          <w:p>
+            <w:pPr>
+              <w:pStyle w:val="Compact"/>
+              <w:jc w:val="left"/>
+            </w:pPr>
+            <w:r>
+              <w:t xml:space="preserve">240</w:t>
+            </w:r>
+          </w:p>
+        </w:tc>
+        <w:tc>
+          <w:tcPr/>
+          <w:p>
+            <w:pPr>
+              <w:pStyle w:val="Compact"/>
+              <w:jc w:val="left"/>
+            </w:pPr>
+            <w:r>
+              <w:t xml:space="preserve">280</w:t>
+            </w:r>
+          </w:p>
+        </w:tc>
+        <w:tc>
+          <w:tcPr/>
+          <w:p>
+            <w:pPr>
+              <w:pStyle w:val="Compact"/>
+              <w:jc w:val="left"/>
+            </w:pPr>
+            <w:r>
+              <w:t xml:space="preserve">2</w:t>
+            </w:r>
+          </w:p>
+        </w:tc>
+        <w:tc>
+          <w:tcPr/>
+          <w:p>
+            <w:pPr>
+              <w:pStyle w:val="Compact"/>
+              <w:jc w:val="left"/>
+            </w:pPr>
+            <w:r>
+              <w:t xml:space="preserve">–</w:t>
+            </w:r>
+          </w:p>
+        </w:tc>
+      </w:tr>
+      <w:tr>
+        <w:tc>
+          <w:tcPr/>
+          <w:p>
+            <w:pPr>
+              <w:pStyle w:val="Compact"/>
+              <w:jc w:val="left"/>
+            </w:pPr>
+            <w:r>
+              <w:rPr>
+                <w:rStyle w:val="VerbatimChar"/>
+              </w:rPr>
+              <w:t xml:space="preserve">template_mem</w:t>
+            </w:r>
+          </w:p>
+        </w:tc>
+        <w:tc>
+          <w:tcPr/>
+          <w:p>
+            <w:pPr>
+              <w:pStyle w:val="Compact"/>
+              <w:jc w:val="left"/>
+            </w:pPr>
+            <w:r>
+              <w:t xml:space="preserve">197</w:t>
+            </w:r>
+          </w:p>
+        </w:tc>
+        <w:tc>
+          <w:tcPr/>
+          <w:p>
+            <w:pPr>
+              <w:pStyle w:val="Compact"/>
+              <w:jc w:val="left"/>
+            </w:pPr>
+            <w:r>
+              <w:t xml:space="preserve">86</w:t>
+            </w:r>
+          </w:p>
+        </w:tc>
+        <w:tc>
+          <w:tcPr/>
+          <w:p>
+            <w:pPr>
+              <w:pStyle w:val="Compact"/>
+              <w:jc w:val="left"/>
+            </w:pPr>
+            <w:r>
+              <w:t xml:space="preserve">1</w:t>
+            </w:r>
+          </w:p>
+        </w:tc>
+        <w:tc>
+          <w:tcPr/>
+          <w:p>
+            <w:pPr>
+              <w:pStyle w:val="Compact"/>
+              <w:jc w:val="left"/>
+            </w:pPr>
+            <w:r>
+              <w:t xml:space="preserve">16 RAMB18</w:t>
+            </w:r>
+          </w:p>
+        </w:tc>
+      </w:tr>
+      <w:tr>
+        <w:tc>
+          <w:tcPr/>
+          <w:p>
+            <w:pPr>
+              <w:pStyle w:val="Compact"/>
+              <w:jc w:val="left"/>
+            </w:pPr>
+            <w:r>
+              <w:rPr>
+                <w:rStyle w:val="VerbatimChar"/>
+              </w:rPr>
+              <w:t xml:space="preserve">decision</w:t>
+            </w:r>
+          </w:p>
+        </w:tc>
+        <w:tc>
+          <w:tcPr/>
+          <w:p>
+            <w:pPr>
+              <w:pStyle w:val="Compact"/>
+              <w:jc w:val="left"/>
+            </w:pPr>
+            <w:r>
+              <w:t xml:space="preserve">165</w:t>
+            </w:r>
+          </w:p>
+        </w:tc>
+        <w:tc>
+          <w:tcPr/>
+          <w:p>
+            <w:pPr>
+              <w:pStyle w:val="Compact"/>
+              <w:jc w:val="left"/>
+            </w:pPr>
+            <w:r>
+              <w:t xml:space="preserve">151</w:t>
+            </w:r>
+          </w:p>
+        </w:tc>
+        <w:tc>
+          <w:tcPr/>
+          <w:p>
+            <w:pPr>
+              <w:pStyle w:val="Compact"/>
+              <w:jc w:val="left"/>
+            </w:pPr>
+            <w:r>
+              <w:t xml:space="preserve">–</w:t>
+            </w:r>
+          </w:p>
+        </w:tc>
+        <w:tc>
+          <w:tcPr/>
+          <w:p>
+            <w:pPr>
+              <w:pStyle w:val="Compact"/>
+              <w:jc w:val="left"/>
+            </w:pPr>
+            <w:r>
+              <w:t xml:space="preserve">–</w:t>
+            </w:r>
+          </w:p>
+        </w:tc>
+      </w:tr>
+      <w:tr>
+        <w:tc>
+          <w:tcPr/>
+          <w:p>
+            <w:pPr>
+              <w:pStyle w:val="Compact"/>
+              <w:jc w:val="left"/>
+            </w:pPr>
+            <w:r>
+              <w:rPr>
+                <w:rStyle w:val="VerbatimChar"/>
+              </w:rPr>
+              <w:t xml:space="preserve">guard</w:t>
+            </w:r>
+          </w:p>
+        </w:tc>
+        <w:tc>
+          <w:tcPr/>
+          <w:p>
+            <w:pPr>
+              <w:pStyle w:val="Compact"/>
+              <w:jc w:val="left"/>
+            </w:pPr>
+            <w:r>
+              <w:t xml:space="preserve">424</w:t>
+            </w:r>
+          </w:p>
+        </w:tc>
+        <w:tc>
+          <w:tcPr/>
+          <w:p>
+            <w:pPr>
+              <w:pStyle w:val="Compact"/>
+              <w:jc w:val="left"/>
+            </w:pPr>
+            <w:r>
+              <w:t xml:space="preserve">103</w:t>
+            </w:r>
+          </w:p>
+        </w:tc>
+        <w:tc>
+          <w:tcPr/>
+          <w:p>
+            <w:pPr>
+              <w:pStyle w:val="Compact"/>
+              <w:jc w:val="left"/>
+            </w:pPr>
+            <w:r>
+              <w:t xml:space="preserve">–</w:t>
+            </w:r>
+          </w:p>
+        </w:tc>
+        <w:tc>
+          <w:tcPr/>
+          <w:p>
+            <w:pPr>
+              <w:pStyle w:val="Compact"/>
+              <w:jc w:val="left"/>
+            </w:pPr>
+            <w:r>
+              <w:t xml:space="preserve">–</w:t>
+            </w:r>
+          </w:p>
+        </w:tc>
+      </w:tr>
+      <w:tr>
+        <w:tc>
+          <w:tcPr/>
+          <w:p>
+            <w:pPr>
+              <w:pStyle w:val="Compact"/>
+              <w:jc w:val="left"/>
+            </w:pPr>
+            <w:r>
+              <w:rPr>
+                <w:rStyle w:val="VerbatimChar"/>
+                <w:bCs/>
+                <w:b/>
+              </w:rPr>
+              <w:t xml:space="preserve">padan_axil</w:t>
+            </w:r>
+          </w:p>
+        </w:tc>
+        <w:tc>
+          <w:tcPr/>
+          <w:p>
+            <w:pPr>
+              <w:pStyle w:val="Compact"/>
+              <w:jc w:val="left"/>
+            </w:pPr>
+            <w:r>
+              <w:rPr>
+                <w:bCs/>
+                <w:b/>
+              </w:rPr>
+              <w:t xml:space="preserve">1.559</w:t>
+            </w:r>
+          </w:p>
+        </w:tc>
+        <w:tc>
+          <w:tcPr/>
+          <w:p>
+            <w:pPr>
+              <w:pStyle w:val="Compact"/>
+              <w:jc w:val="left"/>
+            </w:pPr>
+            <w:r>
+              <w:rPr>
+                <w:bCs/>
+                <w:b/>
+              </w:rPr>
+              <w:t xml:space="preserve">2.009</w:t>
+            </w:r>
+          </w:p>
+        </w:tc>
+        <w:tc>
+          <w:tcPr/>
+          <w:p>
+            <w:pPr>
+              <w:pStyle w:val="Compact"/>
+              <w:jc w:val="left"/>
+            </w:pPr>
+            <w:r>
+              <w:rPr>
+                <w:bCs/>
+                <w:b/>
+              </w:rPr>
+              <w:t xml:space="preserve">21</w:t>
+            </w:r>
+          </w:p>
+        </w:tc>
+        <w:tc>
+          <w:tcPr/>
+          <w:p>
+            <w:pPr>
+              <w:pStyle w:val="Compact"/>
+              <w:jc w:val="left"/>
+            </w:pPr>
+            <w:r>
+              <w:rPr>
+                <w:bCs/>
+                <w:b/>
+              </w:rPr>
+              <w:t xml:space="preserve">16 RAMB18</w:t>
+            </w:r>
+          </w:p>
+        </w:tc>
+      </w:tr>
+      <w:tr>
+        <w:tc>
+          <w:tcPr/>
+          <w:p>
+            <w:pPr>
+              <w:pStyle w:val="Compact"/>
+              <w:jc w:val="left"/>
+            </w:pPr>
+            <w:r>
+              <w:t xml:space="preserve">Seluruh desain (dengan SmartConnect)</w:t>
+            </w:r>
+          </w:p>
+        </w:tc>
+        <w:tc>
+          <w:tcPr/>
+          <w:p>
+            <w:pPr>
+              <w:pStyle w:val="Compact"/>
+              <w:jc w:val="left"/>
+            </w:pPr>
+            <w:r>
+              <w:t xml:space="preserve">1.996</w:t>
+            </w:r>
+          </w:p>
+        </w:tc>
+        <w:tc>
+          <w:tcPr/>
+          <w:p>
+            <w:pPr>
+              <w:pStyle w:val="Compact"/>
+              <w:jc w:val="left"/>
+            </w:pPr>
+            <w:r>
+              <w:t xml:space="preserve">2.459</w:t>
+            </w:r>
+          </w:p>
+        </w:tc>
+        <w:tc>
+          <w:tcPr/>
+          <w:p>
+            <w:pPr>
+              <w:pStyle w:val="Compact"/>
+              <w:jc w:val="left"/>
+            </w:pPr>
+            <w:r>
+              <w:t xml:space="preserve">21</w:t>
+            </w:r>
+          </w:p>
+        </w:tc>
+        <w:tc>
+          <w:tcPr/>
+          <w:p>
+            <w:pPr>
+              <w:pStyle w:val="Compact"/>
+              <w:jc w:val="left"/>
+            </w:pPr>
+            <w:r>
+              <w:t xml:space="preserve">16 RAMB18</w:t>
+            </w:r>
+          </w:p>
+        </w:tc>
+      </w:tr>
+    </w:tbl>
+    <w:p>
+      <w:pPr>
+        <w:numPr>
+          <w:ilvl w:val="0"/>
+          <w:numId w:val="1010"/>
+        </w:numPr>
+        <w:pStyle w:val="Compact"/>
+      </w:pPr>
+      <w:r>
+        <w:rPr>
+          <w:bCs/>
+          <w:b/>
+        </w:rPr>
+        <w:t xml:space="preserve">DSP</w:t>
+      </w:r>
+      <w:r>
+        <w:rPr>
+          <w:bCs/>
+          <w:b/>
+        </w:rPr>
+        <w:t xml:space="preserve"> </w:t>
+      </w:r>
+      <w:r>
+        <w:rPr>
+          <w:rStyle w:val="VerbatimChar"/>
+          <w:bCs/>
+          <w:b/>
+        </w:rPr>
+        <w:t xml:space="preserve">mac_array</w:t>
+      </w:r>
+      <w:r>
+        <w:rPr>
+          <w:bCs/>
+          <w:b/>
+        </w:rPr>
+        <w:t xml:space="preserve"> </w:t>
+      </w:r>
+      <w:r>
+        <w:rPr>
+          <w:bCs/>
+          <w:b/>
+        </w:rPr>
+        <w:t xml:space="preserve">= 18, bukan 16 seperti Yosys.</w:t>
+      </w:r>
+    </w:p>
+    <w:p>
+      <w:pPr>
+        <w:numPr>
+          <w:ilvl w:val="1"/>
+          <w:numId w:val="1011"/>
+        </w:numPr>
+        <w:pStyle w:val="Compact"/>
+      </w:pPr>
+      <w:r>
+        <w:t xml:space="preserve">Daftar sel DSP menunjukkan 16 DSP lane yang menyerap</w:t>
+      </w:r>
+      <w:r>
+        <w:t xml:space="preserve"> </w:t>
+      </w:r>
+      <w:r>
+        <w:rPr>
+          <w:rStyle w:val="VerbatimChar"/>
+        </w:rPr>
+        <w:t xml:space="preserve">g_sum4[*].sum</w:t>
+      </w:r>
+      <w:r>
+        <w:t xml:space="preserve"> </w:t>
+      </w:r>
+      <w:r>
+        <w:t xml:space="preserve">lewat</w:t>
+      </w:r>
+      <w:r>
+        <w:t xml:space="preserve"> </w:t>
+      </w:r>
+      <w:r>
+        <w:t xml:space="preserve">kaskade, ditambah 2 DSP (</w:t>
+      </w:r>
+      <w:r>
+        <w:rPr>
+          <w:rStyle w:val="VerbatimChar"/>
+        </w:rPr>
+        <w:t xml:space="preserve">tree0</w:t>
+      </w:r>
+      <w:r>
+        <w:t xml:space="preserve">,</w:t>
+      </w:r>
+      <w:r>
+        <w:t xml:space="preserve"> </w:t>
+      </w:r>
+      <w:r>
+        <w:rPr>
+          <w:rStyle w:val="VerbatimChar"/>
+        </w:rPr>
+        <w:t xml:space="preserve">tree_reg</w:t>
+      </w:r>
+      <w:r>
+        <w:t xml:space="preserve">) sebagai adder</w:t>
+      </w:r>
+      <w:r>
+        <w:t xml:space="preserve"> </w:t>
+      </w:r>
+      <w:r>
+        <w:rPr>
+          <w:rStyle w:val="VerbatimChar"/>
+        </w:rPr>
+        <w:t xml:space="preserve">tree</w:t>
+      </w:r>
+      <w:r>
+        <w:t xml:space="preserve">.</w:t>
+      </w:r>
+    </w:p>
+    <w:p>
+      <w:pPr>
+        <w:numPr>
+          <w:ilvl w:val="1"/>
+          <w:numId w:val="1011"/>
+        </w:numPr>
+        <w:pStyle w:val="Compact"/>
+      </w:pPr>
+      <w:r>
+        <w:t xml:space="preserve">Akumulator</w:t>
+      </w:r>
+      <w:r>
+        <w:t xml:space="preserve"> </w:t>
+      </w:r>
+      <w:r>
+        <w:rPr>
+          <w:rStyle w:val="VerbatimChar"/>
+        </w:rPr>
+        <w:t xml:space="preserve">acc</w:t>
+      </w:r>
+      <w:r>
+        <w:t xml:space="preserve"> </w:t>
+      </w:r>
+      <w:r>
+        <w:t xml:space="preserve">tetap di fabric.</w:t>
+      </w:r>
+    </w:p>
+    <w:p>
+      <w:pPr>
+        <w:numPr>
+          <w:ilvl w:val="1"/>
+          <w:numId w:val="1011"/>
+        </w:numPr>
+        <w:pStyle w:val="Compact"/>
+      </w:pPr>
+      <w:r>
+        <w:t xml:space="preserve">Tidak ada pengali yang dipecah, jadi tidak ada yang perlu diubah di RTL.</w:t>
+      </w:r>
+      <w:r>
+        <w:t xml:space="preserve"> </w:t>
+      </w:r>
+      <w:r>
+        <w:rPr>
+          <w:rStyle w:val="VerbatimChar"/>
+        </w:rPr>
+        <w:t xml:space="preserve">check_reports.py</w:t>
+      </w:r>
+      <w:r>
+        <w:t xml:space="preserve"> </w:t>
+      </w:r>
+      <w:r>
+        <w:t xml:space="preserve">kini menerima 16–18 DSP.</w:t>
+      </w:r>
+    </w:p>
+    <w:p>
+      <w:pPr>
+        <w:numPr>
+          <w:ilvl w:val="0"/>
+          <w:numId w:val="1010"/>
+        </w:numPr>
+        <w:pStyle w:val="Compact"/>
+      </w:pPr>
+      <w:r>
+        <w:rPr>
+          <w:rStyle w:val="VerbatimChar"/>
+          <w:bCs/>
+          <w:b/>
+        </w:rPr>
+        <w:t xml:space="preserve">guard</w:t>
+      </w:r>
+      <w:r>
+        <w:rPr>
+          <w:bCs/>
+          <w:b/>
+        </w:rPr>
+        <w:t xml:space="preserve"> </w:t>
+      </w:r>
+      <w:r>
+        <w:rPr>
+          <w:bCs/>
+          <w:b/>
+        </w:rPr>
+        <w:t xml:space="preserve">memakai 424 LUT di Vivado, sedangkan Yosys 169.</w:t>
+      </w:r>
+      <w:r>
+        <w:t xml:space="preserve"> </w:t>
+      </w:r>
+      <w:r>
+        <w:t xml:space="preserve">Netlistnya jelas</w:t>
+      </w:r>
+      <w:r>
+        <w:t xml:space="preserve"> </w:t>
+      </w:r>
+      <w:r>
+        <w:t xml:space="preserve">berbeda, dan bukti SAT safe-state hanya berlaku untuk netlist Yosys</w:t>
+      </w:r>
+      <w:r>
+        <w:t xml:space="preserve"> </w:t>
+      </w:r>
+      <w:r>
+        <w:t xml:space="preserve">(risiko 1).</w:t>
+      </w:r>
+    </w:p>
+    <w:p>
+      <w:pPr>
+        <w:numPr>
+          <w:ilvl w:val="0"/>
+          <w:numId w:val="1010"/>
+        </w:numPr>
+        <w:pStyle w:val="Compact"/>
+      </w:pPr>
+      <w:r>
+        <w:rPr>
+          <w:bCs/>
+          <w:b/>
+        </w:rPr>
+        <w:t xml:space="preserve">Timing.</w:t>
+      </w:r>
+      <w:r>
+        <w:t xml:space="preserve"> </w:t>
+      </w:r>
+      <w:r>
+        <w:t xml:space="preserve">Jalur terlambat ada di</w:t>
+      </w:r>
+      <w:r>
+        <w:t xml:space="preserve"> </w:t>
+      </w:r>
+      <w:r>
+        <w:rPr>
+          <w:rStyle w:val="VerbatimChar"/>
+        </w:rPr>
+        <w:t xml:space="preserve">template_mem</w:t>
+      </w:r>
+      <w:r>
+        <w:t xml:space="preserve">, dari block RAM ke DSP</w:t>
+      </w:r>
+      <w:r>
+        <w:t xml:space="preserve"> </w:t>
+      </w:r>
+      <w:r>
+        <w:rPr>
+          <w:rStyle w:val="VerbatimChar"/>
+        </w:rPr>
+        <w:t xml:space="preserve">g_wdelta</w:t>
+      </w:r>
+      <w:r>
+        <w:t xml:space="preserve">, dengan slack 3,68 ns pada 10 ns.</w:t>
       </w:r>
     </w:p>
     <w:bookmarkEnd w:id="30"/>
@@ -5043,7 +6234,7 @@
       <w:pPr>
         <w:numPr>
           <w:ilvl w:val="0"/>
-          <w:numId w:val="1009"/>
+          <w:numId w:val="1012"/>
         </w:numPr>
         <w:pStyle w:val="Compact"/>
       </w:pPr>
@@ -5064,7 +6255,7 @@
       <w:pPr>
         <w:numPr>
           <w:ilvl w:val="0"/>
-          <w:numId w:val="1009"/>
+          <w:numId w:val="1012"/>
         </w:numPr>
         <w:pStyle w:val="Compact"/>
       </w:pPr>
@@ -5789,7 +6980,7 @@
               <w:jc w:val="left"/>
             </w:pPr>
             <w:r>
-              <w:t xml:space="preserve">Skrip Vivado (stub), parser laporan, host KV260 vs RTL lewat AXI</w:t>
+              <w:t xml:space="preserve">Skrip Vivado (stub), parser laporan (laporan asli Vivado 2026.1 + 13 kasus negatif), host KV260 vs RTL lewat AXI</w:t>
             </w:r>
           </w:p>
         </w:tc>
@@ -5821,7 +7012,7 @@
       <w:pPr>
         <w:numPr>
           <w:ilvl w:val="0"/>
-          <w:numId w:val="1010"/>
+          <w:numId w:val="1013"/>
         </w:numPr>
         <w:pStyle w:val="Compact"/>
       </w:pPr>
@@ -5830,32 +7021,86 @@
           <w:bCs/>
           <w:b/>
         </w:rPr>
-        <w:t xml:space="preserve">Belum ada Vivado, timing, atau board.</w:t>
-      </w:r>
-      <w:r>
-        <w:t xml:space="preserve"> </w:t>
-      </w:r>
-      <w:r>
-        <w:t xml:space="preserve">Semua klaim fungsional berlaku</w:t>
-      </w:r>
-      <w:r>
-        <w:t xml:space="preserve"> </w:t>
-      </w:r>
-      <w:r>
-        <w:t xml:space="preserve">untuk simulasi RTL. Inferensi block RAM/DSP, register redundan, dan logika</w:t>
-      </w:r>
-      <w:r>
-        <w:t xml:space="preserve"> </w:t>
-      </w:r>
-      <w:r>
-        <w:t xml:space="preserve">safe-state baru terbukti untuk Yosys. Timing 100 MHz belum diketahui.</w:t>
+        <w:t xml:space="preserve">Belum ada board.</w:t>
+      </w:r>
+      <w:r>
+        <w:t xml:space="preserve"> </w:t>
+      </w:r>
+      <w:r>
+        <w:t xml:space="preserve">Semua klaim fungsional berlaku untuk simulasi RTL.</w:t>
+      </w:r>
+    </w:p>
+    <w:p>
+      <w:pPr>
+        <w:numPr>
+          <w:ilvl w:val="1"/>
+          <w:numId w:val="1014"/>
+        </w:numPr>
+        <w:pStyle w:val="Compact"/>
+      </w:pPr>
+      <w:r>
+        <w:t xml:space="preserve">Build Vivado 2026.1 sudah memastikan beberapa hal: timing 100 MHz, jumlah</w:t>
+      </w:r>
+      <w:r>
+        <w:t xml:space="preserve"> </w:t>
+      </w:r>
+      <w:r>
+        <w:t xml:space="preserve">FF register redundan, block RAM/DSP, dan FSM</w:t>
+      </w:r>
+      <w:r>
+        <w:t xml:space="preserve"> </w:t>
+      </w:r>
+      <w:r>
+        <w:rPr>
+          <w:rStyle w:val="VerbatimChar"/>
+        </w:rPr>
+        <w:t xml:space="preserve">guard</w:t>
+      </w:r>
+      <w:r>
+        <w:t xml:space="preserve"> </w:t>
+      </w:r>
+      <w:r>
+        <w:t xml:space="preserve">yang tidak dikode</w:t>
+      </w:r>
+      <w:r>
+        <w:t xml:space="preserve"> </w:t>
+      </w:r>
+      <w:r>
+        <w:t xml:space="preserve">ulang.</w:t>
+      </w:r>
+    </w:p>
+    <w:p>
+      <w:pPr>
+        <w:numPr>
+          <w:ilvl w:val="1"/>
+          <w:numId w:val="1014"/>
+        </w:numPr>
+        <w:pStyle w:val="Compact"/>
+      </w:pPr>
+      <w:r>
+        <w:t xml:space="preserve">Logika safe-state baru dibuktikan dengan SAT pada netlist Yosys. Netlist</w:t>
+      </w:r>
+      <w:r>
+        <w:t xml:space="preserve"> </w:t>
+      </w:r>
+      <w:r>
+        <w:rPr>
+          <w:rStyle w:val="VerbatimChar"/>
+        </w:rPr>
+        <w:t xml:space="preserve">guard</w:t>
+      </w:r>
+      <w:r>
+        <w:t xml:space="preserve"> </w:t>
+      </w:r>
+      <w:r>
+        <w:t xml:space="preserve">di Vivado berbeda (424 LUT, Yosys 169).</w:t>
       </w:r>
     </w:p>
     <w:p>
       <w:pPr>
         <w:numPr>
           <w:ilvl w:val="0"/>
-          <w:numId w:val="1010"/>
+          <w:numId w:val="1013"/>
         </w:numPr>
         <w:pStyle w:val="Compact"/>
       </w:pPr>
@@ -6006,7 +7251,7 @@
       <w:pPr>
         <w:numPr>
           <w:ilvl w:val="0"/>
-          <w:numId w:val="1010"/>
+          <w:numId w:val="1013"/>
         </w:numPr>
         <w:pStyle w:val="Compact"/>
       </w:pPr>
@@ -6034,7 +7279,7 @@
       <w:pPr>
         <w:numPr>
           <w:ilvl w:val="0"/>
-          <w:numId w:val="1010"/>
+          <w:numId w:val="1013"/>
         </w:numPr>
         <w:pStyle w:val="Compact"/>
       </w:pPr>
@@ -6062,7 +7307,7 @@
       <w:pPr>
         <w:numPr>
           <w:ilvl w:val="0"/>
-          <w:numId w:val="1010"/>
+          <w:numId w:val="1013"/>
         </w:numPr>
         <w:pStyle w:val="Compact"/>
       </w:pPr>
@@ -6095,12 +7340,162 @@
     <w:p>
       <w:pPr>
         <w:numPr>
-          <w:ilvl w:val="0"/>
-          <w:numId w:val="1010"/>
+          <w:ilvl w:val="1"/>
+          <w:numId w:val="1015"/>
         </w:numPr>
         <w:pStyle w:val="Compact"/>
       </w:pPr>
       <w:r>
+        <w:t xml:space="preserve">Vivado 2026.1 mengode ulang FSM</w:t>
+      </w:r>
+      <w:r>
+        <w:t xml:space="preserve"> </w:t>
+      </w:r>
+      <w:r>
+        <w:rPr>
+          <w:rStyle w:val="VerbatimChar"/>
+        </w:rPr>
+        <w:t xml:space="preserve">template_mem</w:t>
+      </w:r>
+      <w:r>
+        <w:t xml:space="preserve"> </w:t>
+      </w:r>
+      <w:r>
+        <w:t xml:space="preserve">dan</w:t>
+      </w:r>
+      <w:r>
+        <w:t xml:space="preserve"> </w:t>
+      </w:r>
+      <w:r>
+        <w:rPr>
+          <w:rStyle w:val="VerbatimChar"/>
+        </w:rPr>
+        <w:t xml:space="preserve">abft_check</w:t>
+      </w:r>
+      <w:r>
+        <w:t xml:space="preserve"> </w:t>
+      </w:r>
+      <w:r>
+        <w:t xml:space="preserve">(sequential) serta</w:t>
+      </w:r>
+      <w:r>
+        <w:t xml:space="preserve"> </w:t>
+      </w:r>
+      <w:r>
+        <w:rPr>
+          <w:rStyle w:val="VerbatimChar"/>
+        </w:rPr>
+        <w:t xml:space="preserve">padan_avmm</w:t>
+      </w:r>
+      <w:r>
+        <w:t xml:space="preserve"> </w:t>
+      </w:r>
+      <w:r>
+        <w:t xml:space="preserve">dan</w:t>
+      </w:r>
+      <w:r>
+        <w:t xml:space="preserve"> </w:t>
+      </w:r>
+      <w:r>
+        <w:rPr>
+          <w:rStyle w:val="VerbatimChar"/>
+        </w:rPr>
+        <w:t xml:space="preserve">padan_axil</w:t>
+      </w:r>
+      <w:r>
+        <w:t xml:space="preserve"> </w:t>
+      </w:r>
+      <w:r>
+        <w:t xml:space="preserve">(one-hot) [Pasti, log</w:t>
+      </w:r>
+      <w:r>
+        <w:t xml:space="preserve"> </w:t>
+      </w:r>
+      <w:r>
+        <w:t xml:space="preserve">sintesis].</w:t>
+      </w:r>
+    </w:p>
+    <w:p>
+      <w:pPr>
+        <w:numPr>
+          <w:ilvl w:val="1"/>
+          <w:numId w:val="1015"/>
+        </w:numPr>
+        <w:pStyle w:val="Compact"/>
+      </w:pPr>
+      <w:r>
+        <w:t xml:space="preserve">Cabang</w:t>
+      </w:r>
+      <w:r>
+        <w:t xml:space="preserve"> </w:t>
+      </w:r>
+      <w:r>
+        <w:rPr>
+          <w:rStyle w:val="VerbatimChar"/>
+        </w:rPr>
+        <w:t xml:space="preserve">default</w:t>
+      </w:r>
+      <w:r>
+        <w:t xml:space="preserve"> </w:t>
+      </w:r>
+      <w:r>
+        <w:t xml:space="preserve">di RTL, yaitu jalan pulang ke IDLE dari state ilegal,</w:t>
+      </w:r>
+      <w:r>
+        <w:t xml:space="preserve"> </w:t>
+      </w:r>
+      <w:r>
+        <w:t xml:space="preserve">kemungkinan besar hilang. Satu flip pada register one-hot bisa membuat bus</w:t>
+      </w:r>
+      <w:r>
+        <w:t xml:space="preserve"> </w:t>
+      </w:r>
+      <w:r>
+        <w:t xml:space="preserve">atau sequencer macet sampai reset [Kemungkinan Besar].</w:t>
+      </w:r>
+    </w:p>
+    <w:p>
+      <w:pPr>
+        <w:numPr>
+          <w:ilvl w:val="1"/>
+          <w:numId w:val="1015"/>
+        </w:numPr>
+        <w:pStyle w:val="Compact"/>
+      </w:pPr>
+      <w:r>
+        <w:t xml:space="preserve">Opsi perbaikannya:</w:t>
+      </w:r>
+      <w:r>
+        <w:t xml:space="preserve"> </w:t>
+      </w:r>
+      <w:r>
+        <w:rPr>
+          <w:rStyle w:val="VerbatimChar"/>
+        </w:rPr>
+        <w:t xml:space="preserve">fsm_encoding = "none"</w:t>
+      </w:r>
+      <w:r>
+        <w:t xml:space="preserve"> </w:t>
+      </w:r>
+      <w:r>
+        <w:t xml:space="preserve">pada keempat register itu.</w:t>
+      </w:r>
+      <w:r>
+        <w:t xml:space="preserve"> </w:t>
+      </w:r>
+      <w:r>
+        <w:t xml:space="preserve">Keputusannya belum diambil.</w:t>
+      </w:r>
+    </w:p>
+    <w:p>
+      <w:pPr>
+        <w:numPr>
+          <w:ilvl w:val="0"/>
+          <w:numId w:val="1013"/>
+        </w:numPr>
+        <w:pStyle w:val="Compact"/>
+      </w:pPr>
+      <w:r>
         <w:rPr>
           <w:bCs/>
           <w:b/>
@@ -6124,7 +7519,7 @@
       <w:pPr>
         <w:numPr>
           <w:ilvl w:val="0"/>
-          <w:numId w:val="1010"/>
+          <w:numId w:val="1013"/>
         </w:numPr>
         <w:pStyle w:val="Compact"/>
       </w:pPr>
@@ -6146,7 +7541,7 @@
       <w:pPr>
         <w:numPr>
           <w:ilvl w:val="0"/>
-          <w:numId w:val="1010"/>
+          <w:numId w:val="1013"/>
         </w:numPr>
         <w:pStyle w:val="Compact"/>
       </w:pPr>
@@ -6183,7 +7578,7 @@
       <w:pPr>
         <w:numPr>
           <w:ilvl w:val="0"/>
-          <w:numId w:val="1010"/>
+          <w:numId w:val="1013"/>
         </w:numPr>
         <w:pStyle w:val="Compact"/>
       </w:pPr>
@@ -6211,7 +7606,7 @@
       <w:pPr>
         <w:numPr>
           <w:ilvl w:val="0"/>
-          <w:numId w:val="1010"/>
+          <w:numId w:val="1013"/>
         </w:numPr>
         <w:pStyle w:val="Compact"/>
       </w:pPr>
@@ -6249,7 +7644,7 @@
       <w:pPr>
         <w:numPr>
           <w:ilvl w:val="0"/>
-          <w:numId w:val="1011"/>
+          <w:numId w:val="1016"/>
         </w:numPr>
         <w:pStyle w:val="Compact"/>
       </w:pPr>
@@ -6258,31 +7653,48 @@
           <w:bCs/>
           <w:b/>
         </w:rPr>
-        <w:t xml:space="preserve">Buat proyek dan build di Vivado</w:t>
-      </w:r>
-      <w:r>
-        <w:t xml:space="preserve"> </w:t>
-      </w:r>
-      <w:r>
-        <w:t xml:space="preserve">mengikuti</w:t>
-      </w:r>
-      <w:r>
+        <w:t xml:space="preserve">Putuskan</w:t>
+      </w:r>
+      <w:r>
+        <w:rPr>
+          <w:bCs/>
+          <w:b/>
+        </w:rPr>
         <w:t xml:space="preserve"> </w:t>
       </w:r>
       <w:r>
         <w:rPr>
           <w:rStyle w:val="VerbatimChar"/>
-        </w:rPr>
-        <w:t xml:space="preserve">docs/fpga_howto.md</w:t>
-      </w:r>
-      <w:r>
-        <w:t xml:space="preserve">, lalu</w:t>
-      </w:r>
-      <w:r>
-        <w:t xml:space="preserve"> </w:t>
-      </w:r>
-      <w:r>
-        <w:t xml:space="preserve">jalankan</w:t>
+          <w:bCs/>
+          <w:b/>
+        </w:rPr>
+        <w:t xml:space="preserve">fsm_encoding = "none"</w:t>
+      </w:r>
+      <w:r>
+        <w:rPr>
+          <w:bCs/>
+          <w:b/>
+        </w:rPr>
+        <w:t xml:space="preserve"> </w:t>
+      </w:r>
+      <w:r>
+        <w:rPr>
+          <w:bCs/>
+          <w:b/>
+        </w:rPr>
+        <w:t xml:space="preserve">untuk empat FSM</w:t>
+      </w:r>
+      <w:r>
+        <w:t xml:space="preserve"> </w:t>
+      </w:r>
+      <w:r>
+        <w:t xml:space="preserve">yang dikode ulang</w:t>
+      </w:r>
+      <w:r>
+        <w:t xml:space="preserve"> </w:t>
+      </w:r>
+      <w:r>
+        <w:t xml:space="preserve">Vivado (risiko 5). Bila dipasang, build ulang dan jalankan lagi</w:t>
       </w:r>
       <w:r>
         <w:t xml:space="preserve"> </w:t>
@@ -6294,44 +7706,14 @@
         <w:t xml:space="preserve">check_reports.py</w:t>
       </w:r>
       <w:r>
-        <w:t xml:space="preserve">: RAMB18 16, DSP 16, FF</w:t>
-      </w:r>
-      <w:r>
-        <w:t xml:space="preserve"> </w:t>
-      </w:r>
-      <w:r>
-        <w:rPr>
-          <w:rStyle w:val="VerbatimChar"/>
-        </w:rPr>
-        <w:t xml:space="preserve">decision</w:t>
-      </w:r>
-      <w:r>
-        <w:t xml:space="preserve"> </w:t>
-      </w:r>
-      <w:r>
-        <w:t xml:space="preserve">151 dan</w:t>
-      </w:r>
-      <w:r>
-        <w:t xml:space="preserve"> </w:t>
-      </w:r>
-      <w:r>
-        <w:rPr>
-          <w:rStyle w:val="VerbatimChar"/>
-        </w:rPr>
-        <w:t xml:space="preserve">guard</w:t>
-      </w:r>
-      <w:r>
-        <w:t xml:space="preserve"> </w:t>
-      </w:r>
-      <w:r>
-        <w:t xml:space="preserve">103, FSM guard tidak dikode ulang, WNS/WHS/WPWS ≥ 0 pada 100 MHz.</w:t>
+        <w:t xml:space="preserve">; keempatnya tidak boleh lagi muncul sebagai INFO.</w:t>
       </w:r>
     </w:p>
     <w:p>
       <w:pPr>
         <w:numPr>
           <w:ilvl w:val="0"/>
-          <w:numId w:val="1011"/>
+          <w:numId w:val="1016"/>
         </w:numPr>
         <w:pStyle w:val="Compact"/>
       </w:pPr>
@@ -6359,7 +7741,7 @@
       <w:pPr>
         <w:numPr>
           <w:ilvl w:val="0"/>
-          <w:numId w:val="1011"/>
+          <w:numId w:val="1016"/>
         </w:numPr>
         <w:pStyle w:val="Compact"/>
       </w:pPr>
@@ -6408,7 +7790,7 @@
       <w:pPr>
         <w:numPr>
           <w:ilvl w:val="0"/>
-          <w:numId w:val="1011"/>
+          <w:numId w:val="1016"/>
         </w:numPr>
         <w:pStyle w:val="Compact"/>
       </w:pPr>
@@ -6436,7 +7818,7 @@
       <w:pPr>
         <w:numPr>
           <w:ilvl w:val="0"/>
-          <w:numId w:val="1011"/>
+          <w:numId w:val="1016"/>
         </w:numPr>
         <w:pStyle w:val="Compact"/>
       </w:pPr>
@@ -6762,6 +8144,15 @@
     <w:abstractNumId w:val="991"/>
   </w:num>
   <w:num w:numId="1010">
+    <w:abstractNumId w:val="991"/>
+  </w:num>
+  <w:num w:numId="1011">
+    <w:abstractNumId w:val="991"/>
+  </w:num>
+  <w:num w:numId="1012">
+    <w:abstractNumId w:val="991"/>
+  </w:num>
+  <w:num w:numId="1013">
     <w:abstractNumId w:val="99411"/>
     <w:lvlOverride w:ilvl="0">
       <w:startOverride w:val="1"/>
@@ -6791,7 +8182,13 @@
       <w:startOverride w:val="1"/>
     </w:lvlOverride>
   </w:num>
-  <w:num w:numId="1011">
+  <w:num w:numId="1014">
+    <w:abstractNumId w:val="991"/>
+  </w:num>
+  <w:num w:numId="1015">
+    <w:abstractNumId w:val="991"/>
+  </w:num>
+  <w:num w:numId="1016">
     <w:abstractNumId w:val="99411"/>
     <w:lvlOverride w:ilvl="0">
       <w:startOverride w:val="1"/>

</xml_diff>

<commit_message>
RTL: fsm_encoding = "none" pada state template_mem, abft_check, padan_avmm, padan_axil
Vivado 2026.1 mengode ulang keempat FSM ini (sequential/one-hot), sehingga
cabang default untuk pulih dari state ilegal kemungkinan besar hilang.
Atribut ini menjaga netlist tetap sama dengan RTL yang diuji. Logika tidak
berubah. Yosys juga mematuhinya: estimasi padan_axil 4.248 -> 4.358 LUT,
sedangkan DSP/BRAM/FF redundan tetap.

check_reports.py: tidak ada FSM modul PADAN yang boleh diekstrak. Log FSM
build pertama (RTL lama) kini menjadi kasus negatif asli di self-test.

Diuji: check-rtl-infer, check-rtl-release, check-rtl-guard-safe,
test-rtl-axil, test-rtl-mutation (26/26), check_reports --self-test,
check_tcl.py, check-laporan.

Co-Authored-By: Claude Opus 5.5 <noreply@anthropic.com>
Claude-Session: https://claude.ai/code/session_01JWHcwMqQzXkB9LnTCQYUWo
</commit_message>
<xml_diff>
--- a/docs/laporan/Laporan_PADAN.docx
+++ b/docs/laporan/Laporan_PADAN.docx
@@ -143,7 +143,7 @@
         <w:t xml:space="preserve"> </w:t>
       </w:r>
       <w:r>
-        <w:t xml:space="preserve">kode</w:t>
+        <w:t xml:space="preserve">RTL</w:t>
       </w:r>
       <w:r>
         <w:t xml:space="preserve"> </w:t>
@@ -161,13 +161,31 @@
         <w:t xml:space="preserve"> </w:t>
       </w:r>
       <w:r>
-        <w:t xml:space="preserve">di</w:t>
-      </w:r>
-      <w:r>
-        <w:t xml:space="preserve"> </w:t>
-      </w:r>
-      <w:r>
-        <w:t xml:space="preserve">da3e2ee</w:t>
+        <w:t xml:space="preserve">22</w:t>
+      </w:r>
+      <w:r>
+        <w:t xml:space="preserve"> </w:t>
+      </w:r>
+      <w:r>
+        <w:t xml:space="preserve">Oktober</w:t>
+      </w:r>
+      <w:r>
+        <w:t xml:space="preserve"> </w:t>
+      </w:r>
+      <w:r>
+        <w:t xml:space="preserve">2026</w:t>
+      </w:r>
+      <w:r>
+        <w:t xml:space="preserve"> </w:t>
+      </w:r>
+      <w:r>
+        <w:t xml:space="preserve">(atribut</w:t>
+      </w:r>
+      <w:r>
+        <w:t xml:space="preserve"> </w:t>
+      </w:r>
+      <w:r>
+        <w:t xml:space="preserve">fsm_encoding)</w:t>
       </w:r>
     </w:p>
     <w:bookmarkStart w:id="21" w:name="ringkasan"/>
@@ -248,7 +266,13 @@
         <w:t xml:space="preserve"> </w:t>
       </w:r>
       <w:r>
-        <w:t xml:space="preserve">dan lulus semua pemeriksaan laporan.</w:t>
+        <w:t xml:space="preserve">dan lulus pemeriksaan timing, register redundan, dan CDC. Empat FSM</w:t>
+      </w:r>
+      <w:r>
+        <w:t xml:space="preserve"> </w:t>
+      </w:r>
+      <w:r>
+        <w:t xml:space="preserve">yang dikode ulang sudah diperbaiki di RTL, tetapi belum di-build ulang.</w:t>
       </w:r>
       <w:r>
         <w:t xml:space="preserve"> </w:t>
@@ -529,9 +553,15 @@
       <w:r>
         <w:t xml:space="preserve">Ada dua temuan:</w:t>
       </w:r>
-      <w:r>
-        <w:t xml:space="preserve"> </w:t>
-      </w:r>
+    </w:p>
+    <w:p>
+      <w:pPr>
+        <w:numPr>
+          <w:ilvl w:val="1"/>
+          <w:numId w:val="1003"/>
+        </w:numPr>
+        <w:pStyle w:val="Compact"/>
+      </w:pPr>
       <w:r>
         <w:rPr>
           <w:rStyle w:val="VerbatimChar"/>
@@ -542,13 +572,34 @@
         <w:t xml:space="preserve"> </w:t>
       </w:r>
       <w:r>
-        <w:t xml:space="preserve">memakai 18 DSP, bukan 16 (bagian 8), dan empat</w:t>
-      </w:r>
-      <w:r>
-        <w:t xml:space="preserve"> </w:t>
-      </w:r>
-      <w:r>
-        <w:t xml:space="preserve">FSM lain dikode ulang Vivado (risiko 5).</w:t>
+        <w:t xml:space="preserve">memakai 18 DSP, bukan 16 (bagian 8).</w:t>
+      </w:r>
+    </w:p>
+    <w:p>
+      <w:pPr>
+        <w:numPr>
+          <w:ilvl w:val="1"/>
+          <w:numId w:val="1003"/>
+        </w:numPr>
+        <w:pStyle w:val="Compact"/>
+      </w:pPr>
+      <w:r>
+        <w:t xml:space="preserve">Empat FSM lain dikode ulang Vivado. Sebagai tanggapan,</w:t>
+      </w:r>
+      <w:r>
+        <w:t xml:space="preserve"> </w:t>
+      </w:r>
+      <w:r>
+        <w:rPr>
+          <w:rStyle w:val="VerbatimChar"/>
+        </w:rPr>
+        <w:t xml:space="preserve">fsm_encoding =   "none"</w:t>
+      </w:r>
+      <w:r>
+        <w:t xml:space="preserve"> </w:t>
+      </w:r>
+      <w:r>
+        <w:t xml:space="preserve">sudah dipasang, tetapi belum di-build ulang (risiko 5).</w:t>
       </w:r>
     </w:p>
     <w:p>
@@ -604,13 +655,7 @@
         <w:t xml:space="preserve"> </w:t>
       </w:r>
       <w:r>
-        <w:t xml:space="preserve">Kode RTL terakhir berubah di port KV260 (PR #8, 65e3eb8);</w:t>
-      </w:r>
-      <w:r>
-        <w:t xml:space="preserve"> </w:t>
-      </w:r>
-      <w:r>
-        <w:t xml:space="preserve">sesudahnya hanya perkakas</w:t>
+        <w:t xml:space="preserve">RTL terakhir berubah pada 22 Oktober 2026, yaitu atribut</w:t>
       </w:r>
       <w:r>
         <w:t xml:space="preserve"> </w:t>
@@ -619,19 +664,19 @@
         <w:rPr>
           <w:rStyle w:val="VerbatimChar"/>
         </w:rPr>
-        <w:t xml:space="preserve">make</w:t>
-      </w:r>
-      <w:r>
-        <w:t xml:space="preserve"> </w:t>
-      </w:r>
-      <w:r>
-        <w:t xml:space="preserve">(PR #10, da3e2ee), pemeriksa laporan Vivado,</w:t>
-      </w:r>
-      <w:r>
-        <w:t xml:space="preserve"> </w:t>
-      </w:r>
-      <w:r>
-        <w:t xml:space="preserve">dan dokumentasi. Setiap merge</w:t>
+        <w:t xml:space="preserve">fsm_encoding = "none"</w:t>
+      </w:r>
+      <w:r>
+        <w:t xml:space="preserve"> </w:t>
+      </w:r>
+      <w:r>
+        <w:t xml:space="preserve">di empat FSM. Logikanya tidak berubah. Sebelumnya RTL</w:t>
+      </w:r>
+      <w:r>
+        <w:t xml:space="preserve"> </w:t>
+      </w:r>
+      <w:r>
+        <w:t xml:space="preserve">berubah di port KV260 (PR #8, 65e3eb8). Setiap merge</w:t>
       </w:r>
       <w:r>
         <w:t xml:space="preserve"> </w:t>
@@ -1635,7 +1680,22 @@
               <w:jc w:val="left"/>
             </w:pPr>
             <w:r>
-              <w:t xml:space="preserve">Vivado 2026.1: semua pemeriksaan laporan lulus;</w:t>
+              <w:t xml:space="preserve">Vivado 2026.1: timing, clock, register redundan, dan CDC lulus; 4 FSM dikode ulang, lalu</w:t>
+            </w:r>
+            <w:r>
+              <w:t xml:space="preserve"> </w:t>
+            </w:r>
+            <w:r>
+              <w:rPr>
+                <w:rStyle w:val="VerbatimChar"/>
+              </w:rPr>
+              <w:t xml:space="preserve">fsm_encoding = "none"</w:t>
+            </w:r>
+            <w:r>
+              <w:t xml:space="preserve"> </w:t>
+            </w:r>
+            <w:r>
+              <w:t xml:space="preserve">dipasang;</w:t>
             </w:r>
             <w:r>
               <w:t xml:space="preserve"> </w:t>
@@ -2111,7 +2171,7 @@
       <w:pPr>
         <w:numPr>
           <w:ilvl w:val="0"/>
-          <w:numId w:val="1003"/>
+          <w:numId w:val="1004"/>
         </w:numPr>
         <w:pStyle w:val="Compact"/>
       </w:pPr>
@@ -2145,7 +2205,7 @@
       <w:pPr>
         <w:numPr>
           <w:ilvl w:val="0"/>
-          <w:numId w:val="1003"/>
+          <w:numId w:val="1004"/>
         </w:numPr>
         <w:pStyle w:val="Compact"/>
       </w:pPr>
@@ -2173,7 +2233,7 @@
       <w:pPr>
         <w:numPr>
           <w:ilvl w:val="0"/>
-          <w:numId w:val="1003"/>
+          <w:numId w:val="1004"/>
         </w:numPr>
         <w:pStyle w:val="Compact"/>
       </w:pPr>
@@ -2207,7 +2267,7 @@
       <w:pPr>
         <w:numPr>
           <w:ilvl w:val="0"/>
-          <w:numId w:val="1003"/>
+          <w:numId w:val="1004"/>
         </w:numPr>
         <w:pStyle w:val="Compact"/>
       </w:pPr>
@@ -2241,7 +2301,7 @@
       <w:pPr>
         <w:numPr>
           <w:ilvl w:val="0"/>
-          <w:numId w:val="1003"/>
+          <w:numId w:val="1004"/>
         </w:numPr>
         <w:pStyle w:val="Compact"/>
       </w:pPr>
@@ -2275,7 +2335,7 @@
       <w:pPr>
         <w:numPr>
           <w:ilvl w:val="0"/>
-          <w:numId w:val="1003"/>
+          <w:numId w:val="1004"/>
         </w:numPr>
         <w:pStyle w:val="Compact"/>
       </w:pPr>
@@ -2470,7 +2530,7 @@
       <w:pPr>
         <w:numPr>
           <w:ilvl w:val="0"/>
-          <w:numId w:val="1004"/>
+          <w:numId w:val="1005"/>
         </w:numPr>
         <w:pStyle w:val="Compact"/>
       </w:pPr>
@@ -2498,7 +2558,7 @@
       <w:pPr>
         <w:numPr>
           <w:ilvl w:val="0"/>
-          <w:numId w:val="1004"/>
+          <w:numId w:val="1005"/>
         </w:numPr>
         <w:pStyle w:val="Compact"/>
       </w:pPr>
@@ -2520,7 +2580,7 @@
       <w:pPr>
         <w:numPr>
           <w:ilvl w:val="0"/>
-          <w:numId w:val="1004"/>
+          <w:numId w:val="1005"/>
         </w:numPr>
         <w:pStyle w:val="Compact"/>
       </w:pPr>
@@ -2864,7 +2924,7 @@
       <w:pPr>
         <w:numPr>
           <w:ilvl w:val="0"/>
-          <w:numId w:val="1005"/>
+          <w:numId w:val="1006"/>
         </w:numPr>
         <w:pStyle w:val="Compact"/>
       </w:pPr>
@@ -2886,7 +2946,7 @@
       <w:pPr>
         <w:numPr>
           <w:ilvl w:val="0"/>
-          <w:numId w:val="1005"/>
+          <w:numId w:val="1006"/>
         </w:numPr>
         <w:pStyle w:val="Compact"/>
       </w:pPr>
@@ -2914,7 +2974,7 @@
       <w:pPr>
         <w:numPr>
           <w:ilvl w:val="0"/>
-          <w:numId w:val="1005"/>
+          <w:numId w:val="1006"/>
         </w:numPr>
         <w:pStyle w:val="Compact"/>
       </w:pPr>
@@ -2942,7 +3002,7 @@
       <w:pPr>
         <w:numPr>
           <w:ilvl w:val="0"/>
-          <w:numId w:val="1005"/>
+          <w:numId w:val="1006"/>
         </w:numPr>
         <w:pStyle w:val="Compact"/>
       </w:pPr>
@@ -2985,7 +3045,7 @@
       <w:pPr>
         <w:numPr>
           <w:ilvl w:val="0"/>
-          <w:numId w:val="1005"/>
+          <w:numId w:val="1006"/>
         </w:numPr>
         <w:pStyle w:val="Compact"/>
       </w:pPr>
@@ -3587,138 +3647,138 @@
       <w:pPr>
         <w:numPr>
           <w:ilvl w:val="0"/>
-          <w:numId w:val="1006"/>
-        </w:numPr>
-        <w:pStyle w:val="Compact"/>
-      </w:pPr>
-      <w:r>
-        <w:rPr>
-          <w:bCs/>
-          <w:b/>
-        </w:rPr>
-        <w:t xml:space="preserve">Yang diuji di CI tanpa Vivado dan board:</w:t>
-      </w:r>
-    </w:p>
-    <w:p>
-      <w:pPr>
-        <w:numPr>
-          <w:ilvl w:val="1"/>
           <w:numId w:val="1007"/>
         </w:numPr>
         <w:pStyle w:val="Compact"/>
       </w:pPr>
       <w:r>
         <w:rPr>
-          <w:rStyle w:val="VerbatimChar"/>
-        </w:rPr>
-        <w:t xml:space="preserve">padan_axil</w:t>
-      </w:r>
-      <w:r>
-        <w:t xml:space="preserve">: 6 test protokol (urutan AW/W, backpressure B/R, SLVERR, AR</w:t>
-      </w:r>
-      <w:r>
-        <w:t xml:space="preserve"> </w:t>
-      </w:r>
-      <w:r>
-        <w:t xml:space="preserve">bersamaan, tamper) dan 8 mutan, semua terbunuh. [Pasti]</w:t>
+          <w:bCs/>
+          <w:b/>
+        </w:rPr>
+        <w:t xml:space="preserve">Yang diuji di CI tanpa Vivado dan board:</w:t>
       </w:r>
     </w:p>
     <w:p>
       <w:pPr>
         <w:numPr>
           <w:ilvl w:val="1"/>
+          <w:numId w:val="1008"/>
+        </w:numPr>
+        <w:pStyle w:val="Compact"/>
+      </w:pPr>
+      <w:r>
+        <w:rPr>
+          <w:rStyle w:val="VerbatimChar"/>
+        </w:rPr>
+        <w:t xml:space="preserve">padan_axil</w:t>
+      </w:r>
+      <w:r>
+        <w:t xml:space="preserve">: 6 test protokol (urutan AW/W, backpressure B/R, SLVERR, AR</w:t>
+      </w:r>
+      <w:r>
+        <w:t xml:space="preserve"> </w:t>
+      </w:r>
+      <w:r>
+        <w:t xml:space="preserve">bersamaan, tamper) dan 8 mutan, semua terbunuh. [Pasti]</w:t>
+      </w:r>
+    </w:p>
+    <w:p>
+      <w:pPr>
+        <w:numPr>
+          <w:ilvl w:val="1"/>
+          <w:numId w:val="1008"/>
+        </w:numPr>
+        <w:pStyle w:val="Compact"/>
+      </w:pPr>
+      <w:r>
+        <w:rPr>
+          <w:rStyle w:val="VerbatimChar"/>
+        </w:rPr>
+        <w:t xml:space="preserve">padan_test.py</w:t>
+      </w:r>
+      <w:r>
+        <w:t xml:space="preserve"> </w:t>
+      </w:r>
+      <w:r>
+        <w:t xml:space="preserve">tanpa diubah melawan RTL lewat AXI: 46/46 PASS tanpa</w:t>
+      </w:r>
+      <w:r>
+        <w:t xml:space="preserve"> </w:t>
+      </w:r>
+      <w:r>
+        <w:t xml:space="preserve">pelanggaran protokol; fault memori terdeteksi dan HALT setelah FAULT ke-3;</w:t>
+      </w:r>
+      <w:r>
+        <w:t xml:space="preserve"> </w:t>
+      </w:r>
+      <w:r>
+        <w:t xml:space="preserve">base salah tidak menulis apa pun. [Pasti, simulasi]</w:t>
+      </w:r>
+    </w:p>
+    <w:p>
+      <w:pPr>
+        <w:numPr>
+          <w:ilvl w:val="1"/>
+          <w:numId w:val="1008"/>
+        </w:numPr>
+        <w:pStyle w:val="Compact"/>
+      </w:pPr>
+      <w:r>
+        <w:t xml:space="preserve">Skrip Vivado di tclsh dengan stub: nilai kunci konsisten dengan RTL dan</w:t>
+      </w:r>
+      <w:r>
+        <w:t xml:space="preserve"> </w:t>
+      </w:r>
+      <w:r>
+        <w:t xml:space="preserve">host, 4 kondisi error memberi pesan jelas.</w:t>
+      </w:r>
+    </w:p>
+    <w:p>
+      <w:pPr>
+        <w:numPr>
+          <w:ilvl w:val="0"/>
           <w:numId w:val="1007"/>
         </w:numPr>
         <w:pStyle w:val="Compact"/>
       </w:pPr>
       <w:r>
         <w:rPr>
+          <w:bCs/>
+          <w:b/>
+        </w:rPr>
+        <w:t xml:space="preserve">Dijalankan pengguna di luar CI:</w:t>
+      </w:r>
+      <w:r>
+        <w:t xml:space="preserve"> </w:t>
+      </w:r>
+      <w:r>
+        <w:t xml:space="preserve">build Vivado 2026.1 (lulus) dan</w:t>
+      </w:r>
+      <w:r>
+        <w:t xml:space="preserve"> </w:t>
+      </w:r>
+      <w:r>
+        <w:t xml:space="preserve">pembangkitan</w:t>
+      </w:r>
+      <w:r>
+        <w:t xml:space="preserve"> </w:t>
+      </w:r>
+      <w:r>
+        <w:rPr>
           <w:rStyle w:val="VerbatimChar"/>
         </w:rPr>
-        <w:t xml:space="preserve">padan_test.py</w:t>
-      </w:r>
-      <w:r>
-        <w:t xml:space="preserve"> </w:t>
-      </w:r>
-      <w:r>
-        <w:t xml:space="preserve">tanpa diubah melawan RTL lewat AXI: 46/46 PASS tanpa</w:t>
-      </w:r>
-      <w:r>
-        <w:t xml:space="preserve"> </w:t>
-      </w:r>
-      <w:r>
-        <w:t xml:space="preserve">pelanggaran protokol; fault memori terdeteksi dan HALT setelah FAULT ke-3;</w:t>
-      </w:r>
-      <w:r>
-        <w:t xml:space="preserve"> </w:t>
-      </w:r>
-      <w:r>
-        <w:t xml:space="preserve">base salah tidak menulis apa pun. [Pasti, simulasi]</w:t>
-      </w:r>
-    </w:p>
-    <w:p>
-      <w:pPr>
-        <w:numPr>
-          <w:ilvl w:val="1"/>
-          <w:numId w:val="1007"/>
-        </w:numPr>
-        <w:pStyle w:val="Compact"/>
-      </w:pPr>
-      <w:r>
-        <w:t xml:space="preserve">Skrip Vivado di tclsh dengan stub: nilai kunci konsisten dengan RTL dan</w:t>
-      </w:r>
-      <w:r>
-        <w:t xml:space="preserve"> </w:t>
-      </w:r>
-      <w:r>
-        <w:t xml:space="preserve">host, 4 kondisi error memberi pesan jelas.</w:t>
+        <w:t xml:space="preserve">pl.dtsi</w:t>
+      </w:r>
+      <w:r>
+        <w:t xml:space="preserve">.</w:t>
       </w:r>
     </w:p>
     <w:p>
       <w:pPr>
         <w:numPr>
           <w:ilvl w:val="0"/>
-          <w:numId w:val="1006"/>
-        </w:numPr>
-        <w:pStyle w:val="Compact"/>
-      </w:pPr>
-      <w:r>
-        <w:rPr>
-          <w:bCs/>
-          <w:b/>
-        </w:rPr>
-        <w:t xml:space="preserve">Dijalankan pengguna di luar CI:</w:t>
-      </w:r>
-      <w:r>
-        <w:t xml:space="preserve"> </w:t>
-      </w:r>
-      <w:r>
-        <w:t xml:space="preserve">build Vivado 2026.1 (lulus) dan</w:t>
-      </w:r>
-      <w:r>
-        <w:t xml:space="preserve"> </w:t>
-      </w:r>
-      <w:r>
-        <w:t xml:space="preserve">pembangkitan</w:t>
-      </w:r>
-      <w:r>
-        <w:t xml:space="preserve"> </w:t>
-      </w:r>
-      <w:r>
-        <w:rPr>
-          <w:rStyle w:val="VerbatimChar"/>
-        </w:rPr>
-        <w:t xml:space="preserve">pl.dtsi</w:t>
-      </w:r>
-      <w:r>
-        <w:t xml:space="preserve">.</w:t>
-      </w:r>
-    </w:p>
-    <w:p>
-      <w:pPr>
-        <w:numPr>
-          <w:ilvl w:val="0"/>
-          <w:numId w:val="1006"/>
+          <w:numId w:val="1007"/>
         </w:numPr>
         <w:pStyle w:val="Compact"/>
       </w:pPr>
@@ -4024,7 +4084,7 @@
       <w:pPr>
         <w:numPr>
           <w:ilvl w:val="0"/>
-          <w:numId w:val="1008"/>
+          <w:numId w:val="1009"/>
         </w:numPr>
         <w:pStyle w:val="Compact"/>
       </w:pPr>
@@ -4036,105 +4096,6 @@
       </w:r>
       <w:r>
         <w:t xml:space="preserve">16 × 144 word memori dan register probe di simulasi.</w:t>
-      </w:r>
-    </w:p>
-    <w:p>
-      <w:pPr>
-        <w:numPr>
-          <w:ilvl w:val="0"/>
-          <w:numId w:val="1008"/>
-        </w:numPr>
-        <w:pStyle w:val="Compact"/>
-      </w:pPr>
-      <w:r>
-        <w:t xml:space="preserve">Bukti SAT Yosys setelah sintesis: setiap state ilegal mematikan semua izin dan</w:t>
-      </w:r>
-      <w:r>
-        <w:t xml:space="preserve"> </w:t>
-      </w:r>
-      <w:r>
-        <w:t xml:space="preserve">menuju zeroize; ada kontrol negatif.</w:t>
-      </w:r>
-    </w:p>
-    <w:p>
-      <w:pPr>
-        <w:numPr>
-          <w:ilvl w:val="0"/>
-          <w:numId w:val="1008"/>
-        </w:numPr>
-        <w:pStyle w:val="Compact"/>
-      </w:pPr>
-      <w:r>
-        <w:t xml:space="preserve">12 mutan guard terbunuh, termasuk clear yang melewatkan baris checksum dan</w:t>
-      </w:r>
-      <w:r>
-        <w:t xml:space="preserve"> </w:t>
-      </w:r>
-      <w:r>
-        <w:t xml:space="preserve">sinkronisasi tamper 1-FF.</w:t>
-      </w:r>
-    </w:p>
-    <w:bookmarkEnd w:id="28"/>
-    <w:bookmarkStart w:id="29" w:name="injeksi-fault-debug-debug_fault"/>
-    <w:p>
-      <w:pPr>
-        <w:pStyle w:val="Heading1"/>
-      </w:pPr>
-      <w:r>
-        <w:t xml:space="preserve">7. Injeksi fault debug (DEBUG_FAULT)</w:t>
-      </w:r>
-    </w:p>
-    <w:p>
-      <w:pPr>
-        <w:pStyle w:val="FirstParagraph"/>
-      </w:pPr>
-      <w:r>
-        <w:t xml:space="preserve">Build debug punya register DBG_FAULT untuk menambahkan delta ke produk satu</w:t>
-      </w:r>
-      <w:r>
-        <w:t xml:space="preserve"> </w:t>
-      </w:r>
-      <w:r>
-        <w:t xml:space="preserve">lane, serta DBG_ABFT untuk membaca hasil lokalisasi. Build rilis</w:t>
-      </w:r>
-      <w:r>
-        <w:t xml:space="preserve"> </w:t>
-      </w:r>
-      <w:r>
-        <w:rPr>
-          <w:bCs/>
-          <w:b/>
-        </w:rPr>
-        <w:t xml:space="preserve">tidak</w:t>
-      </w:r>
-      <w:r>
-        <w:rPr>
-          <w:bCs/>
-          <w:b/>
-        </w:rPr>
-        <w:t xml:space="preserve"> </w:t>
-      </w:r>
-      <w:r>
-        <w:rPr>
-          <w:bCs/>
-          <w:b/>
-        </w:rPr>
-        <w:t xml:space="preserve">memuat</w:t>
-      </w:r>
-      <w:r>
-        <w:t xml:space="preserve"> </w:t>
-      </w:r>
-      <w:r>
-        <w:t xml:space="preserve">port, register, atau logikanya (</w:t>
-      </w:r>
-      <w:r>
-        <w:rPr>
-          <w:rStyle w:val="VerbatimChar"/>
-        </w:rPr>
-        <w:t xml:space="preserve">docs/rtl_debug_fault.md</w:t>
-      </w:r>
-      <w:r>
-        <w:t xml:space="preserve">).</w:t>
       </w:r>
     </w:p>
     <w:p>
@@ -4146,29 +4107,13 @@
         <w:pStyle w:val="Compact"/>
       </w:pPr>
       <w:r>
-        <w:rPr>
-          <w:bCs/>
-          <w:b/>
-        </w:rPr>
-        <w:t xml:space="preserve">Delta aditif, bukan pengganti.</w:t>
-      </w:r>
-      <w:r>
-        <w:t xml:space="preserve"> </w:t>
-      </w:r>
-      <w:r>
-        <w:t xml:space="preserve">Dengan delta aditif, residu ABFT hanya</w:t>
-      </w:r>
-      <w:r>
-        <w:t xml:space="preserve"> </w:t>
-      </w:r>
-      <w:r>
-        <w:t xml:space="preserve">bergantung pada delta dan baris. Dengan nilai pengganti, residu membocorkan</w:t>
-      </w:r>
-      <w:r>
-        <w:t xml:space="preserve"> </w:t>
-      </w:r>
-      <w:r>
-        <w:t xml:space="preserve">T·p. [Pasti, aljabar]</w:t>
+        <w:t xml:space="preserve">Bukti SAT Yosys setelah sintesis: setiap state ilegal mematikan semua izin dan</w:t>
+      </w:r>
+      <w:r>
+        <w:t xml:space="preserve"> </w:t>
+      </w:r>
+      <w:r>
+        <w:t xml:space="preserve">menuju zeroize; ada kontrol negatif.</w:t>
       </w:r>
     </w:p>
     <w:p>
@@ -4180,20 +4125,135 @@
         <w:pStyle w:val="Compact"/>
       </w:pPr>
       <w:r>
-        <w:t xml:space="preserve">288 injeksi (16 lane × 18 baris): semuanya FAULT; 256 dilokalisasi ke</w:t>
-      </w:r>
-      <w:r>
-        <w:t xml:space="preserve"> </w:t>
-      </w:r>
-      <w:r>
-        <w:t xml:space="preserve">barisnya, 32 terdeteksi di baris checksum.</w:t>
+        <w:t xml:space="preserve">12 mutan guard terbunuh, termasuk clear yang melewatkan baris checksum dan</w:t>
+      </w:r>
+      <w:r>
+        <w:t xml:space="preserve"> </w:t>
+      </w:r>
+      <w:r>
+        <w:t xml:space="preserve">sinkronisasi tamper 1-FF.</w:t>
+      </w:r>
+    </w:p>
+    <w:bookmarkEnd w:id="28"/>
+    <w:bookmarkStart w:id="29" w:name="injeksi-fault-debug-debug_fault"/>
+    <w:p>
+      <w:pPr>
+        <w:pStyle w:val="Heading1"/>
+      </w:pPr>
+      <w:r>
+        <w:t xml:space="preserve">7. Injeksi fault debug (DEBUG_FAULT)</w:t>
+      </w:r>
+    </w:p>
+    <w:p>
+      <w:pPr>
+        <w:pStyle w:val="FirstParagraph"/>
+      </w:pPr>
+      <w:r>
+        <w:t xml:space="preserve">Build debug punya register DBG_FAULT untuk menambahkan delta ke produk satu</w:t>
+      </w:r>
+      <w:r>
+        <w:t xml:space="preserve"> </w:t>
+      </w:r>
+      <w:r>
+        <w:t xml:space="preserve">lane, serta DBG_ABFT untuk membaca hasil lokalisasi. Build rilis</w:t>
+      </w:r>
+      <w:r>
+        <w:t xml:space="preserve"> </w:t>
+      </w:r>
+      <w:r>
+        <w:rPr>
+          <w:bCs/>
+          <w:b/>
+        </w:rPr>
+        <w:t xml:space="preserve">tidak</w:t>
+      </w:r>
+      <w:r>
+        <w:rPr>
+          <w:bCs/>
+          <w:b/>
+        </w:rPr>
+        <w:t xml:space="preserve"> </w:t>
+      </w:r>
+      <w:r>
+        <w:rPr>
+          <w:bCs/>
+          <w:b/>
+        </w:rPr>
+        <w:t xml:space="preserve">memuat</w:t>
+      </w:r>
+      <w:r>
+        <w:t xml:space="preserve"> </w:t>
+      </w:r>
+      <w:r>
+        <w:t xml:space="preserve">port, register, atau logikanya (</w:t>
+      </w:r>
+      <w:r>
+        <w:rPr>
+          <w:rStyle w:val="VerbatimChar"/>
+        </w:rPr>
+        <w:t xml:space="preserve">docs/rtl_debug_fault.md</w:t>
+      </w:r>
+      <w:r>
+        <w:t xml:space="preserve">).</w:t>
       </w:r>
     </w:p>
     <w:p>
       <w:pPr>
         <w:numPr>
           <w:ilvl w:val="0"/>
-          <w:numId w:val="1009"/>
+          <w:numId w:val="1010"/>
+        </w:numPr>
+        <w:pStyle w:val="Compact"/>
+      </w:pPr>
+      <w:r>
+        <w:rPr>
+          <w:bCs/>
+          <w:b/>
+        </w:rPr>
+        <w:t xml:space="preserve">Delta aditif, bukan pengganti.</w:t>
+      </w:r>
+      <w:r>
+        <w:t xml:space="preserve"> </w:t>
+      </w:r>
+      <w:r>
+        <w:t xml:space="preserve">Dengan delta aditif, residu ABFT hanya</w:t>
+      </w:r>
+      <w:r>
+        <w:t xml:space="preserve"> </w:t>
+      </w:r>
+      <w:r>
+        <w:t xml:space="preserve">bergantung pada delta dan baris. Dengan nilai pengganti, residu membocorkan</w:t>
+      </w:r>
+      <w:r>
+        <w:t xml:space="preserve"> </w:t>
+      </w:r>
+      <w:r>
+        <w:t xml:space="preserve">T·p. [Pasti, aljabar]</w:t>
+      </w:r>
+    </w:p>
+    <w:p>
+      <w:pPr>
+        <w:numPr>
+          <w:ilvl w:val="0"/>
+          <w:numId w:val="1010"/>
+        </w:numPr>
+        <w:pStyle w:val="Compact"/>
+      </w:pPr>
+      <w:r>
+        <w:t xml:space="preserve">288 injeksi (16 lane × 18 baris): semuanya FAULT; 256 dilokalisasi ke</w:t>
+      </w:r>
+      <w:r>
+        <w:t xml:space="preserve"> </w:t>
+      </w:r>
+      <w:r>
+        <w:t xml:space="preserve">barisnya, 32 terdeteksi di baris checksum.</w:t>
+      </w:r>
+    </w:p>
+    <w:p>
+      <w:pPr>
+        <w:numPr>
+          <w:ilvl w:val="0"/>
+          <w:numId w:val="1010"/>
         </w:numPr>
         <w:pStyle w:val="Compact"/>
       </w:pPr>
@@ -4432,19 +4492,19 @@
               <w:jc w:val="left"/>
             </w:pPr>
             <w:r>
-              <w:t xml:space="preserve">472</w:t>
-            </w:r>
-          </w:p>
-        </w:tc>
-        <w:tc>
-          <w:tcPr/>
-          <w:p>
-            <w:pPr>
-              <w:pStyle w:val="Compact"/>
-              <w:jc w:val="left"/>
-            </w:pPr>
-            <w:r>
-              <w:t xml:space="preserve">291</w:t>
+              <w:t xml:space="preserve">474</w:t>
+            </w:r>
+          </w:p>
+        </w:tc>
+        <w:tc>
+          <w:tcPr/>
+          <w:p>
+            <w:pPr>
+              <w:pStyle w:val="Compact"/>
+              <w:jc w:val="left"/>
+            </w:pPr>
+            <w:r>
+              <w:t xml:space="preserve">290</w:t>
             </w:r>
           </w:p>
         </w:tc>
@@ -4698,19 +4758,19 @@
               <w:jc w:val="left"/>
             </w:pPr>
             <w:r>
-              <w:t xml:space="preserve">4.130</w:t>
-            </w:r>
-          </w:p>
-        </w:tc>
-        <w:tc>
-          <w:tcPr/>
-          <w:p>
-            <w:pPr>
-              <w:pStyle w:val="Compact"/>
-              <w:jc w:val="left"/>
-            </w:pPr>
-            <w:r>
-              <w:t xml:space="preserve">2.560</w:t>
+              <w:t xml:space="preserve">4.309</w:t>
+            </w:r>
+          </w:p>
+        </w:tc>
+        <w:tc>
+          <w:tcPr/>
+          <w:p>
+            <w:pPr>
+              <w:pStyle w:val="Compact"/>
+              <w:jc w:val="left"/>
+            </w:pPr>
+            <w:r>
+              <w:t xml:space="preserve">2.559</w:t>
             </w:r>
           </w:p>
         </w:tc>
@@ -4783,7 +4843,7 @@
                 <w:bCs/>
                 <w:b/>
               </w:rPr>
-              <w:t xml:space="preserve">4.248</w:t>
+              <w:t xml:space="preserve">4.358</w:t>
             </w:r>
           </w:p>
         </w:tc>
@@ -4799,7 +4859,7 @@
                 <w:bCs/>
                 <w:b/>
               </w:rPr>
-              <w:t xml:space="preserve">2.632</w:t>
+              <w:t xml:space="preserve">2.631</w:t>
             </w:r>
           </w:p>
         </w:tc>
@@ -4925,7 +4985,7 @@
               <w:jc w:val="left"/>
             </w:pPr>
             <w:r>
-              <w:t xml:space="preserve">4.248</w:t>
+              <w:t xml:space="preserve">4.358</w:t>
             </w:r>
           </w:p>
         </w:tc>
@@ -4949,7 +5009,7 @@
               <w:jc w:val="left"/>
             </w:pPr>
             <w:r>
-              <w:t xml:space="preserve">3,6%</w:t>
+              <w:t xml:space="preserve">3,7%</w:t>
             </w:r>
           </w:p>
         </w:tc>
@@ -4975,7 +5035,7 @@
               <w:jc w:val="left"/>
             </w:pPr>
             <w:r>
-              <w:t xml:space="preserve">2.632</w:t>
+              <w:t xml:space="preserve">2.631</w:t>
             </w:r>
           </w:p>
         </w:tc>
@@ -5769,7 +5829,7 @@
       <w:pPr>
         <w:numPr>
           <w:ilvl w:val="0"/>
-          <w:numId w:val="1010"/>
+          <w:numId w:val="1011"/>
         </w:numPr>
         <w:pStyle w:val="Compact"/>
       </w:pPr>
@@ -5814,78 +5874,191 @@
       <w:pPr>
         <w:numPr>
           <w:ilvl w:val="1"/>
+          <w:numId w:val="1012"/>
+        </w:numPr>
+        <w:pStyle w:val="Compact"/>
+      </w:pPr>
+      <w:r>
+        <w:t xml:space="preserve">Daftar sel DSP menunjukkan 16 DSP lane yang menyerap</w:t>
+      </w:r>
+      <w:r>
+        <w:t xml:space="preserve"> </w:t>
+      </w:r>
+      <w:r>
+        <w:rPr>
+          <w:rStyle w:val="VerbatimChar"/>
+        </w:rPr>
+        <w:t xml:space="preserve">g_sum4[*].sum</w:t>
+      </w:r>
+      <w:r>
+        <w:t xml:space="preserve"> </w:t>
+      </w:r>
+      <w:r>
+        <w:t xml:space="preserve">lewat</w:t>
+      </w:r>
+      <w:r>
+        <w:t xml:space="preserve"> </w:t>
+      </w:r>
+      <w:r>
+        <w:t xml:space="preserve">kaskade, ditambah 2 DSP (</w:t>
+      </w:r>
+      <w:r>
+        <w:rPr>
+          <w:rStyle w:val="VerbatimChar"/>
+        </w:rPr>
+        <w:t xml:space="preserve">tree0</w:t>
+      </w:r>
+      <w:r>
+        <w:t xml:space="preserve">,</w:t>
+      </w:r>
+      <w:r>
+        <w:t xml:space="preserve"> </w:t>
+      </w:r>
+      <w:r>
+        <w:rPr>
+          <w:rStyle w:val="VerbatimChar"/>
+        </w:rPr>
+        <w:t xml:space="preserve">tree_reg</w:t>
+      </w:r>
+      <w:r>
+        <w:t xml:space="preserve">) sebagai adder</w:t>
+      </w:r>
+      <w:r>
+        <w:t xml:space="preserve"> </w:t>
+      </w:r>
+      <w:r>
+        <w:rPr>
+          <w:rStyle w:val="VerbatimChar"/>
+        </w:rPr>
+        <w:t xml:space="preserve">tree</w:t>
+      </w:r>
+      <w:r>
+        <w:t xml:space="preserve">.</w:t>
+      </w:r>
+    </w:p>
+    <w:p>
+      <w:pPr>
+        <w:numPr>
+          <w:ilvl w:val="1"/>
+          <w:numId w:val="1012"/>
+        </w:numPr>
+        <w:pStyle w:val="Compact"/>
+      </w:pPr>
+      <w:r>
+        <w:t xml:space="preserve">Akumulator</w:t>
+      </w:r>
+      <w:r>
+        <w:t xml:space="preserve"> </w:t>
+      </w:r>
+      <w:r>
+        <w:rPr>
+          <w:rStyle w:val="VerbatimChar"/>
+        </w:rPr>
+        <w:t xml:space="preserve">acc</w:t>
+      </w:r>
+      <w:r>
+        <w:t xml:space="preserve"> </w:t>
+      </w:r>
+      <w:r>
+        <w:t xml:space="preserve">tetap di fabric.</w:t>
+      </w:r>
+    </w:p>
+    <w:p>
+      <w:pPr>
+        <w:numPr>
+          <w:ilvl w:val="1"/>
+          <w:numId w:val="1012"/>
+        </w:numPr>
+        <w:pStyle w:val="Compact"/>
+      </w:pPr>
+      <w:r>
+        <w:t xml:space="preserve">Tidak ada pengali yang dipecah, jadi tidak ada yang perlu diubah di RTL.</w:t>
+      </w:r>
+      <w:r>
+        <w:t xml:space="preserve"> </w:t>
+      </w:r>
+      <w:r>
+        <w:rPr>
+          <w:rStyle w:val="VerbatimChar"/>
+        </w:rPr>
+        <w:t xml:space="preserve">check_reports.py</w:t>
+      </w:r>
+      <w:r>
+        <w:t xml:space="preserve"> </w:t>
+      </w:r>
+      <w:r>
+        <w:t xml:space="preserve">kini menerima 16–18 DSP.</w:t>
+      </w:r>
+    </w:p>
+    <w:p>
+      <w:pPr>
+        <w:numPr>
+          <w:ilvl w:val="0"/>
           <w:numId w:val="1011"/>
         </w:numPr>
         <w:pStyle w:val="Compact"/>
       </w:pPr>
       <w:r>
-        <w:t xml:space="preserve">Daftar sel DSP menunjukkan 16 DSP lane yang menyerap</w:t>
-      </w:r>
-      <w:r>
-        <w:t xml:space="preserve"> </w:t>
-      </w:r>
-      <w:r>
         <w:rPr>
           <w:rStyle w:val="VerbatimChar"/>
-        </w:rPr>
-        <w:t xml:space="preserve">g_sum4[*].sum</w:t>
-      </w:r>
-      <w:r>
-        <w:t xml:space="preserve"> </w:t>
-      </w:r>
-      <w:r>
-        <w:t xml:space="preserve">lewat</w:t>
-      </w:r>
-      <w:r>
-        <w:t xml:space="preserve"> </w:t>
-      </w:r>
-      <w:r>
-        <w:t xml:space="preserve">kaskade, ditambah 2 DSP (</w:t>
-      </w:r>
-      <w:r>
-        <w:rPr>
-          <w:rStyle w:val="VerbatimChar"/>
-        </w:rPr>
-        <w:t xml:space="preserve">tree0</w:t>
-      </w:r>
-      <w:r>
-        <w:t xml:space="preserve">,</w:t>
-      </w:r>
-      <w:r>
-        <w:t xml:space="preserve"> </w:t>
-      </w:r>
-      <w:r>
-        <w:rPr>
-          <w:rStyle w:val="VerbatimChar"/>
-        </w:rPr>
-        <w:t xml:space="preserve">tree_reg</w:t>
-      </w:r>
-      <w:r>
-        <w:t xml:space="preserve">) sebagai adder</w:t>
-      </w:r>
-      <w:r>
-        <w:t xml:space="preserve"> </w:t>
-      </w:r>
-      <w:r>
-        <w:rPr>
-          <w:rStyle w:val="VerbatimChar"/>
-        </w:rPr>
-        <w:t xml:space="preserve">tree</w:t>
-      </w:r>
-      <w:r>
-        <w:t xml:space="preserve">.</w:t>
+          <w:bCs/>
+          <w:b/>
+        </w:rPr>
+        <w:t xml:space="preserve">guard</w:t>
+      </w:r>
+      <w:r>
+        <w:rPr>
+          <w:bCs/>
+          <w:b/>
+        </w:rPr>
+        <w:t xml:space="preserve"> </w:t>
+      </w:r>
+      <w:r>
+        <w:rPr>
+          <w:bCs/>
+          <w:b/>
+        </w:rPr>
+        <w:t xml:space="preserve">memakai 424 LUT di Vivado, sedangkan Yosys 169.</w:t>
+      </w:r>
+      <w:r>
+        <w:t xml:space="preserve"> </w:t>
+      </w:r>
+      <w:r>
+        <w:t xml:space="preserve">Netlistnya jelas</w:t>
+      </w:r>
+      <w:r>
+        <w:t xml:space="preserve"> </w:t>
+      </w:r>
+      <w:r>
+        <w:t xml:space="preserve">berbeda, dan bukti SAT safe-state hanya berlaku untuk netlist Yosys</w:t>
+      </w:r>
+      <w:r>
+        <w:t xml:space="preserve"> </w:t>
+      </w:r>
+      <w:r>
+        <w:t xml:space="preserve">(risiko 1).</w:t>
       </w:r>
     </w:p>
     <w:p>
       <w:pPr>
         <w:numPr>
-          <w:ilvl w:val="1"/>
+          <w:ilvl w:val="0"/>
           <w:numId w:val="1011"/>
         </w:numPr>
         <w:pStyle w:val="Compact"/>
       </w:pPr>
       <w:r>
-        <w:t xml:space="preserve">Akumulator</w:t>
+        <w:rPr>
+          <w:bCs/>
+          <w:b/>
+        </w:rPr>
+        <w:t xml:space="preserve">Timing.</w:t>
+      </w:r>
+      <w:r>
+        <w:t xml:space="preserve"> </w:t>
+      </w:r>
+      <w:r>
+        <w:t xml:space="preserve">Jalur terlambat ada di</w:t>
       </w:r>
       <w:r>
         <w:t xml:space="preserve"> </w:t>
@@ -5894,368 +6067,255 @@
         <w:rPr>
           <w:rStyle w:val="VerbatimChar"/>
         </w:rPr>
-        <w:t xml:space="preserve">acc</w:t>
-      </w:r>
-      <w:r>
-        <w:t xml:space="preserve"> </w:t>
-      </w:r>
-      <w:r>
-        <w:t xml:space="preserve">tetap di fabric.</w:t>
+        <w:t xml:space="preserve">template_mem</w:t>
+      </w:r>
+      <w:r>
+        <w:t xml:space="preserve">, dari block RAM ke DSP</w:t>
+      </w:r>
+      <w:r>
+        <w:t xml:space="preserve"> </w:t>
+      </w:r>
+      <w:r>
+        <w:rPr>
+          <w:rStyle w:val="VerbatimChar"/>
+        </w:rPr>
+        <w:t xml:space="preserve">g_wdelta</w:t>
+      </w:r>
+      <w:r>
+        <w:t xml:space="preserve">, dengan slack 3,68 ns pada 10 ns.</w:t>
+      </w:r>
+    </w:p>
+    <w:bookmarkEnd w:id="30"/>
+    <w:bookmarkStart w:id="31" w:name="verifikasi-dan-ci"/>
+    <w:p>
+      <w:pPr>
+        <w:pStyle w:val="Heading1"/>
+      </w:pPr>
+      <w:r>
+        <w:t xml:space="preserve">9. Verifikasi dan CI</w:t>
+      </w:r>
+    </w:p>
+    <w:p>
+      <w:pPr>
+        <w:pStyle w:val="FirstParagraph"/>
+      </w:pPr>
+      <w:r>
+        <w:rPr>
+          <w:rStyle w:val="VerbatimChar"/>
+        </w:rPr>
+        <w:t xml:space="preserve">make test</w:t>
+      </w:r>
+      <w:r>
+        <w:t xml:space="preserve"> </w:t>
+      </w:r>
+      <w:r>
+        <w:t xml:space="preserve">menjalankan semua target di bawah: 30 menit lokal, 33 menit di CI</w:t>
+      </w:r>
+      <w:r>
+        <w:t xml:space="preserve"> </w:t>
+      </w:r>
+      <w:r>
+        <w:t xml:space="preserve">(job</w:t>
+      </w:r>
+      <w:r>
+        <w:t xml:space="preserve"> </w:t>
+      </w:r>
+      <w:r>
+        <w:rPr>
+          <w:rStyle w:val="VerbatimChar"/>
+        </w:rPr>
+        <w:t xml:space="preserve">cocotb</w:t>
+      </w:r>
+      <w:r>
+        <w:t xml:space="preserve"> </w:t>
+      </w:r>
+      <w:r>
+        <w:t xml:space="preserve">PR #8, 04:55–05:28 UTC, 17 Oktober 2026). CI GitHub</w:t>
+      </w:r>
+      <w:r>
+        <w:t xml:space="preserve"> </w:t>
+      </w:r>
+      <w:r>
+        <w:t xml:space="preserve">Actions menjalankannya di setiap PR dan setiap push ke main. Setiap merge</w:t>
+      </w:r>
+      <w:r>
+        <w:t xml:space="preserve"> </w:t>
+      </w:r>
+      <w:r>
+        <w:t xml:space="preserve">dilakukan setelah CI hijau dan log-nya diperiksa.</w:t>
+      </w:r>
+    </w:p>
+    <w:p>
+      <w:pPr>
+        <w:pStyle w:val="BodyText"/>
+      </w:pPr>
+      <w:r>
+        <w:t xml:space="preserve">Di luar CI,</w:t>
+      </w:r>
+      <w:r>
+        <w:t xml:space="preserve"> </w:t>
+      </w:r>
+      <w:r>
+        <w:rPr>
+          <w:rStyle w:val="VerbatimChar"/>
+        </w:rPr>
+        <w:t xml:space="preserve">make test</w:t>
+      </w:r>
+      <w:r>
+        <w:t xml:space="preserve"> </w:t>
+      </w:r>
+      <w:r>
+        <w:t xml:space="preserve">butuh</w:t>
+      </w:r>
+      <w:r>
+        <w:t xml:space="preserve"> </w:t>
+      </w:r>
+      <w:r>
+        <w:rPr>
+          <w:rStyle w:val="VerbatimChar"/>
+        </w:rPr>
+        <w:t xml:space="preserve">python3 -m pip install -r requirements.txt</w:t>
+      </w:r>
+      <w:r>
+        <w:t xml:space="preserve"> </w:t>
+      </w:r>
+      <w:r>
+        <w:t xml:space="preserve">(cocotb 1.8.1, numpy) serta Icarus Verilog, Yosys, tclsh, dan pandoc. Tanpa</w:t>
+      </w:r>
+      <w:r>
+        <w:t xml:space="preserve"> </w:t>
+      </w:r>
+      <w:r>
+        <w:t xml:space="preserve">cocotb, setiap target simulasi berhenti dengan pesan yang menyebut perintah</w:t>
+      </w:r>
+      <w:r>
+        <w:t xml:space="preserve"> </w:t>
+      </w:r>
+      <w:r>
+        <w:t xml:space="preserve">pemasangan itu (PR #10).</w:t>
+      </w:r>
+    </w:p>
+    <w:p>
+      <w:pPr>
+        <w:pStyle w:val="BodyText"/>
+      </w:pPr>
+      <w:r>
+        <w:t xml:space="preserve">Pada 20 Oktober 2026</w:t>
+      </w:r>
+      <w:r>
+        <w:t xml:space="preserve"> </w:t>
+      </w:r>
+      <w:r>
+        <w:rPr>
+          <w:rStyle w:val="VerbatimChar"/>
+        </w:rPr>
+        <w:t xml:space="preserve">make test</w:t>
+      </w:r>
+      <w:r>
+        <w:t xml:space="preserve"> </w:t>
+      </w:r>
+      <w:r>
+        <w:t xml:space="preserve">dijalankan di laptop pengguna (WSL, venv</w:t>
+      </w:r>
+      <w:r>
+        <w:t xml:space="preserve"> </w:t>
+      </w:r>
+      <w:r>
+        <w:t xml:space="preserve">Python) dan selesai dengan exit 0. Ini mereproduksi hasil CI di mesin kedua,</w:t>
+      </w:r>
+      <w:r>
+        <w:t xml:space="preserve"> </w:t>
+      </w:r>
+      <w:r>
+        <w:t xml:space="preserve">bukan bukti Vivado atau board.</w:t>
+      </w:r>
+    </w:p>
+    <w:p>
+      <w:pPr>
+        <w:pStyle w:val="BodyText"/>
+      </w:pPr>
+      <w:r>
+        <w:rPr>
+          <w:bCs/>
+          <w:b/>
+        </w:rPr>
+        <w:t xml:space="preserve">Cara membaca output.</w:t>
+      </w:r>
+      <w:r>
+        <w:t xml:space="preserve"> </w:t>
+      </w:r>
+      <w:r>
+        <w:t xml:space="preserve">Ukurannya adalah exit code</w:t>
+      </w:r>
+      <w:r>
+        <w:t xml:space="preserve"> </w:t>
+      </w:r>
+      <w:r>
+        <w:rPr>
+          <w:rStyle w:val="VerbatimChar"/>
+        </w:rPr>
+        <w:t xml:space="preserve">make test</w:t>
+      </w:r>
+      <w:r>
+        <w:t xml:space="preserve"> </w:t>
+      </w:r>
+      <w:r>
+        <w:t xml:space="preserve">(0 = semua</w:t>
+      </w:r>
+      <w:r>
+        <w:t xml:space="preserve"> </w:t>
+      </w:r>
+      <w:r>
+        <w:t xml:space="preserve">target lulus), bukan ada atau tidaknya kata</w:t>
+      </w:r>
+      <w:r>
+        <w:t xml:space="preserve"> </w:t>
+      </w:r>
+      <w:r>
+        <w:t xml:space="preserve">“</w:t>
+      </w:r>
+      <w:r>
+        <w:t xml:space="preserve">FAIL</w:t>
+      </w:r>
+      <w:r>
+        <w:t xml:space="preserve">”</w:t>
+      </w:r>
+      <w:r>
+        <w:t xml:space="preserve">. Kata itu memang muncul pada</w:t>
+      </w:r>
+      <w:r>
+        <w:t xml:space="preserve"> </w:t>
+      </w:r>
+      <w:r>
+        <w:t xml:space="preserve">hasil yang benar:</w:t>
       </w:r>
     </w:p>
     <w:p>
       <w:pPr>
         <w:numPr>
-          <w:ilvl w:val="1"/>
-          <w:numId w:val="1011"/>
+          <w:ilvl w:val="0"/>
+          <w:numId w:val="1013"/>
         </w:numPr>
         <w:pStyle w:val="Compact"/>
       </w:pPr>
       <w:r>
-        <w:t xml:space="preserve">Tidak ada pengali yang dipecah, jadi tidak ada yang perlu diubah di RTL.</w:t>
-      </w:r>
-      <w:r>
-        <w:t xml:space="preserve"> </w:t>
+        <w:t xml:space="preserve">di kepala tabel ringkasan cocotb (</w:t>
       </w:r>
       <w:r>
         <w:rPr>
           <w:rStyle w:val="VerbatimChar"/>
         </w:rPr>
-        <w:t xml:space="preserve">check_reports.py</w:t>
-      </w:r>
-      <w:r>
-        <w:t xml:space="preserve"> </w:t>
-      </w:r>
-      <w:r>
-        <w:t xml:space="preserve">kini menerima 16–18 DSP.</w:t>
+        <w:t xml:space="preserve">FAIL=0</w:t>
+      </w:r>
+      <w:r>
+        <w:t xml:space="preserve">);</w:t>
       </w:r>
     </w:p>
     <w:p>
       <w:pPr>
         <w:numPr>
           <w:ilvl w:val="0"/>
-          <w:numId w:val="1010"/>
-        </w:numPr>
-        <w:pStyle w:val="Compact"/>
-      </w:pPr>
-      <w:r>
-        <w:rPr>
-          <w:rStyle w:val="VerbatimChar"/>
-          <w:bCs/>
-          <w:b/>
-        </w:rPr>
-        <w:t xml:space="preserve">guard</w:t>
-      </w:r>
-      <w:r>
-        <w:rPr>
-          <w:bCs/>
-          <w:b/>
-        </w:rPr>
-        <w:t xml:space="preserve"> </w:t>
-      </w:r>
-      <w:r>
-        <w:rPr>
-          <w:bCs/>
-          <w:b/>
-        </w:rPr>
-        <w:t xml:space="preserve">memakai 424 LUT di Vivado, sedangkan Yosys 169.</w:t>
-      </w:r>
-      <w:r>
-        <w:t xml:space="preserve"> </w:t>
-      </w:r>
-      <w:r>
-        <w:t xml:space="preserve">Netlistnya jelas</w:t>
-      </w:r>
-      <w:r>
-        <w:t xml:space="preserve"> </w:t>
-      </w:r>
-      <w:r>
-        <w:t xml:space="preserve">berbeda, dan bukti SAT safe-state hanya berlaku untuk netlist Yosys</w:t>
-      </w:r>
-      <w:r>
-        <w:t xml:space="preserve"> </w:t>
-      </w:r>
-      <w:r>
-        <w:t xml:space="preserve">(risiko 1).</w:t>
-      </w:r>
-    </w:p>
-    <w:p>
-      <w:pPr>
-        <w:numPr>
-          <w:ilvl w:val="0"/>
-          <w:numId w:val="1010"/>
-        </w:numPr>
-        <w:pStyle w:val="Compact"/>
-      </w:pPr>
-      <w:r>
-        <w:rPr>
-          <w:bCs/>
-          <w:b/>
-        </w:rPr>
-        <w:t xml:space="preserve">Timing.</w:t>
-      </w:r>
-      <w:r>
-        <w:t xml:space="preserve"> </w:t>
-      </w:r>
-      <w:r>
-        <w:t xml:space="preserve">Jalur terlambat ada di</w:t>
-      </w:r>
-      <w:r>
-        <w:t xml:space="preserve"> </w:t>
-      </w:r>
-      <w:r>
-        <w:rPr>
-          <w:rStyle w:val="VerbatimChar"/>
-        </w:rPr>
-        <w:t xml:space="preserve">template_mem</w:t>
-      </w:r>
-      <w:r>
-        <w:t xml:space="preserve">, dari block RAM ke DSP</w:t>
-      </w:r>
-      <w:r>
-        <w:t xml:space="preserve"> </w:t>
-      </w:r>
-      <w:r>
-        <w:rPr>
-          <w:rStyle w:val="VerbatimChar"/>
-        </w:rPr>
-        <w:t xml:space="preserve">g_wdelta</w:t>
-      </w:r>
-      <w:r>
-        <w:t xml:space="preserve">, dengan slack 3,68 ns pada 10 ns.</w:t>
-      </w:r>
-    </w:p>
-    <w:bookmarkEnd w:id="30"/>
-    <w:bookmarkStart w:id="31" w:name="verifikasi-dan-ci"/>
-    <w:p>
-      <w:pPr>
-        <w:pStyle w:val="Heading1"/>
-      </w:pPr>
-      <w:r>
-        <w:t xml:space="preserve">9. Verifikasi dan CI</w:t>
-      </w:r>
-    </w:p>
-    <w:p>
-      <w:pPr>
-        <w:pStyle w:val="FirstParagraph"/>
-      </w:pPr>
-      <w:r>
-        <w:rPr>
-          <w:rStyle w:val="VerbatimChar"/>
-        </w:rPr>
-        <w:t xml:space="preserve">make test</w:t>
-      </w:r>
-      <w:r>
-        <w:t xml:space="preserve"> </w:t>
-      </w:r>
-      <w:r>
-        <w:t xml:space="preserve">menjalankan semua target di bawah: 30 menit lokal, 33 menit di CI</w:t>
-      </w:r>
-      <w:r>
-        <w:t xml:space="preserve"> </w:t>
-      </w:r>
-      <w:r>
-        <w:t xml:space="preserve">(job</w:t>
-      </w:r>
-      <w:r>
-        <w:t xml:space="preserve"> </w:t>
-      </w:r>
-      <w:r>
-        <w:rPr>
-          <w:rStyle w:val="VerbatimChar"/>
-        </w:rPr>
-        <w:t xml:space="preserve">cocotb</w:t>
-      </w:r>
-      <w:r>
-        <w:t xml:space="preserve"> </w:t>
-      </w:r>
-      <w:r>
-        <w:t xml:space="preserve">PR #8, 04:55–05:28 UTC, 17 Oktober 2026). CI GitHub</w:t>
-      </w:r>
-      <w:r>
-        <w:t xml:space="preserve"> </w:t>
-      </w:r>
-      <w:r>
-        <w:t xml:space="preserve">Actions menjalankannya di setiap PR dan setiap push ke main. Setiap merge</w:t>
-      </w:r>
-      <w:r>
-        <w:t xml:space="preserve"> </w:t>
-      </w:r>
-      <w:r>
-        <w:t xml:space="preserve">dilakukan setelah CI hijau dan log-nya diperiksa.</w:t>
-      </w:r>
-    </w:p>
-    <w:p>
-      <w:pPr>
-        <w:pStyle w:val="BodyText"/>
-      </w:pPr>
-      <w:r>
-        <w:t xml:space="preserve">Di luar CI,</w:t>
-      </w:r>
-      <w:r>
-        <w:t xml:space="preserve"> </w:t>
-      </w:r>
-      <w:r>
-        <w:rPr>
-          <w:rStyle w:val="VerbatimChar"/>
-        </w:rPr>
-        <w:t xml:space="preserve">make test</w:t>
-      </w:r>
-      <w:r>
-        <w:t xml:space="preserve"> </w:t>
-      </w:r>
-      <w:r>
-        <w:t xml:space="preserve">butuh</w:t>
-      </w:r>
-      <w:r>
-        <w:t xml:space="preserve"> </w:t>
-      </w:r>
-      <w:r>
-        <w:rPr>
-          <w:rStyle w:val="VerbatimChar"/>
-        </w:rPr>
-        <w:t xml:space="preserve">python3 -m pip install -r requirements.txt</w:t>
-      </w:r>
-      <w:r>
-        <w:t xml:space="preserve"> </w:t>
-      </w:r>
-      <w:r>
-        <w:t xml:space="preserve">(cocotb 1.8.1, numpy) serta Icarus Verilog, Yosys, tclsh, dan pandoc. Tanpa</w:t>
-      </w:r>
-      <w:r>
-        <w:t xml:space="preserve"> </w:t>
-      </w:r>
-      <w:r>
-        <w:t xml:space="preserve">cocotb, setiap target simulasi berhenti dengan pesan yang menyebut perintah</w:t>
-      </w:r>
-      <w:r>
-        <w:t xml:space="preserve"> </w:t>
-      </w:r>
-      <w:r>
-        <w:t xml:space="preserve">pemasangan itu (PR #10).</w:t>
-      </w:r>
-    </w:p>
-    <w:p>
-      <w:pPr>
-        <w:pStyle w:val="BodyText"/>
-      </w:pPr>
-      <w:r>
-        <w:t xml:space="preserve">Pada 20 Oktober 2026</w:t>
-      </w:r>
-      <w:r>
-        <w:t xml:space="preserve"> </w:t>
-      </w:r>
-      <w:r>
-        <w:rPr>
-          <w:rStyle w:val="VerbatimChar"/>
-        </w:rPr>
-        <w:t xml:space="preserve">make test</w:t>
-      </w:r>
-      <w:r>
-        <w:t xml:space="preserve"> </w:t>
-      </w:r>
-      <w:r>
-        <w:t xml:space="preserve">dijalankan di laptop pengguna (WSL, venv</w:t>
-      </w:r>
-      <w:r>
-        <w:t xml:space="preserve"> </w:t>
-      </w:r>
-      <w:r>
-        <w:t xml:space="preserve">Python) dan selesai dengan exit 0. Ini mereproduksi hasil CI di mesin kedua,</w:t>
-      </w:r>
-      <w:r>
-        <w:t xml:space="preserve"> </w:t>
-      </w:r>
-      <w:r>
-        <w:t xml:space="preserve">bukan bukti Vivado atau board.</w:t>
-      </w:r>
-    </w:p>
-    <w:p>
-      <w:pPr>
-        <w:pStyle w:val="BodyText"/>
-      </w:pPr>
-      <w:r>
-        <w:rPr>
-          <w:bCs/>
-          <w:b/>
-        </w:rPr>
-        <w:t xml:space="preserve">Cara membaca output.</w:t>
-      </w:r>
-      <w:r>
-        <w:t xml:space="preserve"> </w:t>
-      </w:r>
-      <w:r>
-        <w:t xml:space="preserve">Ukurannya adalah exit code</w:t>
-      </w:r>
-      <w:r>
-        <w:t xml:space="preserve"> </w:t>
-      </w:r>
-      <w:r>
-        <w:rPr>
-          <w:rStyle w:val="VerbatimChar"/>
-        </w:rPr>
-        <w:t xml:space="preserve">make test</w:t>
-      </w:r>
-      <w:r>
-        <w:t xml:space="preserve"> </w:t>
-      </w:r>
-      <w:r>
-        <w:t xml:space="preserve">(0 = semua</w:t>
-      </w:r>
-      <w:r>
-        <w:t xml:space="preserve"> </w:t>
-      </w:r>
-      <w:r>
-        <w:t xml:space="preserve">target lulus), bukan ada atau tidaknya kata</w:t>
-      </w:r>
-      <w:r>
-        <w:t xml:space="preserve"> </w:t>
-      </w:r>
-      <w:r>
-        <w:t xml:space="preserve">“</w:t>
-      </w:r>
-      <w:r>
-        <w:t xml:space="preserve">FAIL</w:t>
-      </w:r>
-      <w:r>
-        <w:t xml:space="preserve">”</w:t>
-      </w:r>
-      <w:r>
-        <w:t xml:space="preserve">. Kata itu memang muncul pada</w:t>
-      </w:r>
-      <w:r>
-        <w:t xml:space="preserve"> </w:t>
-      </w:r>
-      <w:r>
-        <w:t xml:space="preserve">hasil yang benar:</w:t>
-      </w:r>
-    </w:p>
-    <w:p>
-      <w:pPr>
-        <w:numPr>
-          <w:ilvl w:val="0"/>
-          <w:numId w:val="1012"/>
-        </w:numPr>
-        <w:pStyle w:val="Compact"/>
-      </w:pPr>
-      <w:r>
-        <w:t xml:space="preserve">di kepala tabel ringkasan cocotb (</w:t>
-      </w:r>
-      <w:r>
-        <w:rPr>
-          <w:rStyle w:val="VerbatimChar"/>
-        </w:rPr>
-        <w:t xml:space="preserve">FAIL=0</w:t>
-      </w:r>
-      <w:r>
-        <w:t xml:space="preserve">);</w:t>
-      </w:r>
-    </w:p>
-    <w:p>
-      <w:pPr>
-        <w:numPr>
-          <w:ilvl w:val="0"/>
-          <w:numId w:val="1012"/>
+          <w:numId w:val="1013"/>
         </w:numPr>
         <w:pStyle w:val="Compact"/>
       </w:pPr>
@@ -7012,329 +7072,22 @@
       <w:pPr>
         <w:numPr>
           <w:ilvl w:val="0"/>
-          <w:numId w:val="1013"/>
-        </w:numPr>
-        <w:pStyle w:val="Compact"/>
-      </w:pPr>
-      <w:r>
-        <w:rPr>
-          <w:bCs/>
-          <w:b/>
-        </w:rPr>
-        <w:t xml:space="preserve">Belum ada board.</w:t>
-      </w:r>
-      <w:r>
-        <w:t xml:space="preserve"> </w:t>
-      </w:r>
-      <w:r>
-        <w:t xml:space="preserve">Semua klaim fungsional berlaku untuk simulasi RTL.</w:t>
-      </w:r>
-    </w:p>
-    <w:p>
-      <w:pPr>
-        <w:numPr>
-          <w:ilvl w:val="1"/>
           <w:numId w:val="1014"/>
         </w:numPr>
         <w:pStyle w:val="Compact"/>
       </w:pPr>
       <w:r>
-        <w:t xml:space="preserve">Build Vivado 2026.1 sudah memastikan beberapa hal: timing 100 MHz, jumlah</w:t>
-      </w:r>
-      <w:r>
-        <w:t xml:space="preserve"> </w:t>
-      </w:r>
-      <w:r>
-        <w:t xml:space="preserve">FF register redundan, block RAM/DSP, dan FSM</w:t>
-      </w:r>
-      <w:r>
-        <w:t xml:space="preserve"> </w:t>
-      </w:r>
-      <w:r>
-        <w:rPr>
-          <w:rStyle w:val="VerbatimChar"/>
-        </w:rPr>
-        <w:t xml:space="preserve">guard</w:t>
-      </w:r>
-      <w:r>
-        <w:t xml:space="preserve"> </w:t>
-      </w:r>
-      <w:r>
-        <w:t xml:space="preserve">yang tidak dikode</w:t>
-      </w:r>
-      <w:r>
-        <w:t xml:space="preserve"> </w:t>
-      </w:r>
-      <w:r>
-        <w:t xml:space="preserve">ulang.</w:t>
-      </w:r>
-    </w:p>
-    <w:p>
-      <w:pPr>
-        <w:numPr>
-          <w:ilvl w:val="1"/>
-          <w:numId w:val="1014"/>
-        </w:numPr>
-        <w:pStyle w:val="Compact"/>
-      </w:pPr>
-      <w:r>
-        <w:t xml:space="preserve">Logika safe-state baru dibuktikan dengan SAT pada netlist Yosys. Netlist</w:t>
-      </w:r>
-      <w:r>
-        <w:t xml:space="preserve"> </w:t>
-      </w:r>
-      <w:r>
-        <w:rPr>
-          <w:rStyle w:val="VerbatimChar"/>
-        </w:rPr>
-        <w:t xml:space="preserve">guard</w:t>
-      </w:r>
-      <w:r>
-        <w:t xml:space="preserve"> </w:t>
-      </w:r>
-      <w:r>
-        <w:t xml:space="preserve">di Vivado berbeda (424 LUT, Yosys 169).</w:t>
-      </w:r>
-    </w:p>
-    <w:p>
-      <w:pPr>
-        <w:numPr>
-          <w:ilvl w:val="0"/>
-          <w:numId w:val="1013"/>
-        </w:numPr>
-        <w:pStyle w:val="Compact"/>
-      </w:pPr>
-      <w:r>
         <w:rPr>
           <w:bCs/>
           <w:b/>
         </w:rPr>
-        <w:t xml:space="preserve">Pemuatan bitstream di Linux KV260</w:t>
-      </w:r>
-      <w:r>
-        <w:t xml:space="preserve"> </w:t>
-      </w:r>
-      <w:r>
-        <w:t xml:space="preserve">(overlay device tree,</w:t>
-      </w:r>
-      <w:r>
-        <w:t xml:space="preserve"> </w:t>
-      </w:r>
-      <w:r>
-        <w:rPr>
-          <w:rStyle w:val="VerbatimChar"/>
-        </w:rPr>
-        <w:t xml:space="preserve">xmutil</w:t>
-      </w:r>
-      <w:r>
-        <w:t xml:space="preserve">) adalah</w:t>
-      </w:r>
-      <w:r>
-        <w:t xml:space="preserve"> </w:t>
-      </w:r>
-      <w:r>
-        <w:t xml:space="preserve">bagian paling tidak pasti; tanpa overlay</w:t>
-      </w:r>
-      <w:r>
-        <w:t xml:space="preserve"> </w:t>
-      </w:r>
-      <w:r>
-        <w:rPr>
-          <w:rStyle w:val="VerbatimChar"/>
-        </w:rPr>
-        <w:t xml:space="preserve">pl_clk0</w:t>
-      </w:r>
-      <w:r>
-        <w:t xml:space="preserve"> </w:t>
-      </w:r>
-      <w:r>
-        <w:t xml:space="preserve">mungkin mati dan akses</w:t>
-      </w:r>
-      <w:r>
-        <w:t xml:space="preserve"> </w:t>
-      </w:r>
-      <w:r>
-        <w:t xml:space="preserve">AXI menggantung. [Menebak]</w:t>
-      </w:r>
-      <w:r>
-        <w:t xml:space="preserve"> </w:t>
-      </w:r>
-      <w:r>
-        <w:rPr>
-          <w:rStyle w:val="VerbatimChar"/>
-        </w:rPr>
-        <w:t xml:space="preserve">pl.dtsi</w:t>
-      </w:r>
-      <w:r>
-        <w:t xml:space="preserve"> </w:t>
-      </w:r>
-      <w:r>
-        <w:t xml:space="preserve">hasil XSA sudah dicek (21 Oktober</w:t>
-      </w:r>
-      <w:r>
-        <w:t xml:space="preserve"> </w:t>
-      </w:r>
-      <w:r>
-        <w:t xml:space="preserve">2026): alamat,</w:t>
-      </w:r>
-      <w:r>
-        <w:t xml:space="preserve"> </w:t>
-      </w:r>
-      <w:r>
-        <w:rPr>
-          <w:rStyle w:val="VerbatimChar"/>
-        </w:rPr>
-        <w:t xml:space="preserve">pl_clk0</w:t>
-      </w:r>
-      <w:r>
-        <w:t xml:space="preserve"> </w:t>
-      </w:r>
-      <w:r>
-        <w:t xml:space="preserve">(node</w:t>
-      </w:r>
-      <w:r>
-        <w:t xml:space="preserve"> </w:t>
-      </w:r>
-      <w:r>
-        <w:rPr>
-          <w:rStyle w:val="VerbatimChar"/>
-        </w:rPr>
-        <w:t xml:space="preserve">fclk</w:t>
-      </w:r>
-      <w:r>
-        <w:t xml:space="preserve">, sekitar 99,999 MHz), dan parameter</w:t>
-      </w:r>
-      <w:r>
-        <w:t xml:space="preserve"> </w:t>
-      </w:r>
-      <w:r>
-        <w:t xml:space="preserve">guard cocok dengan repo.</w:t>
-      </w:r>
-      <w:r>
-        <w:t xml:space="preserve"> </w:t>
-      </w:r>
-      <w:r>
-        <w:rPr>
-          <w:rStyle w:val="VerbatimChar"/>
-        </w:rPr>
-        <w:t xml:space="preserve">firmware-name</w:t>
-      </w:r>
-      <w:r>
-        <w:t xml:space="preserve"> </w:t>
-      </w:r>
-      <w:r>
-        <w:t xml:space="preserve">di sana (</w:t>
-      </w:r>
-      <w:r>
-        <w:rPr>
-          <w:rStyle w:val="VerbatimChar"/>
-        </w:rPr>
-        <w:t xml:space="preserve">padan_kv260.bit.bin</w:t>
-      </w:r>
-      <w:r>
-        <w:t xml:space="preserve">)</w:t>
-      </w:r>
-      <w:r>
-        <w:t xml:space="preserve"> </w:t>
-      </w:r>
-      <w:r>
-        <w:t xml:space="preserve">berbeda dari nama di panduan lama, dan panduan sudah diperbaiki. Pemuatan</w:t>
-      </w:r>
-      <w:r>
-        <w:t xml:space="preserve"> </w:t>
-      </w:r>
-      <w:r>
-        <w:t xml:space="preserve">di board belum dicoba.</w:t>
-      </w:r>
-    </w:p>
-    <w:p>
-      <w:pPr>
-        <w:numPr>
-          <w:ilvl w:val="0"/>
-          <w:numId w:val="1013"/>
-        </w:numPr>
-        <w:pStyle w:val="Compact"/>
-      </w:pPr>
-      <w:r>
-        <w:rPr>
-          <w:bCs/>
-          <w:b/>
-        </w:rPr>
-        <w:t xml:space="preserve">Template selalu ada di luar chip.</w:t>
-      </w:r>
-      <w:r>
-        <w:t xml:space="preserve"> </w:t>
-      </w:r>
-      <w:r>
-        <w:t xml:space="preserve">Keadaan guard volatil dan setiap reset</w:t>
-      </w:r>
-      <w:r>
-        <w:t xml:space="preserve"> </w:t>
-      </w:r>
-      <w:r>
-        <w:t xml:space="preserve">menghapus template, jadi host harus mengirim ulang template setiap boot.</w:t>
-      </w:r>
-    </w:p>
-    <w:p>
-      <w:pPr>
-        <w:numPr>
-          <w:ilvl w:val="0"/>
-          <w:numId w:val="1013"/>
-        </w:numPr>
-        <w:pStyle w:val="Compact"/>
-      </w:pPr>
-      <w:r>
-        <w:rPr>
-          <w:bCs/>
-          <w:b/>
-        </w:rPr>
-        <w:t xml:space="preserve">Pembatas hanya menghitung kegagalan berturut-turut.</w:t>
-      </w:r>
-      <w:r>
-        <w:t xml:space="preserve"> </w:t>
-      </w:r>
-      <w:r>
-        <w:t xml:space="preserve">Penyerang dengan satu</w:t>
-      </w:r>
-      <w:r>
-        <w:t xml:space="preserve"> </w:t>
-      </w:r>
-      <w:r>
-        <w:t xml:space="preserve">probe sah bisa menyelipkannya setiap 4 percobaan.</w:t>
-      </w:r>
-    </w:p>
-    <w:p>
-      <w:pPr>
-        <w:numPr>
-          <w:ilvl w:val="0"/>
-          <w:numId w:val="1013"/>
-        </w:numPr>
-        <w:pStyle w:val="Compact"/>
-      </w:pPr>
-      <w:r>
-        <w:rPr>
-          <w:bCs/>
-          <w:b/>
-        </w:rPr>
-        <w:t xml:space="preserve">Fault kendali belum disimulasikan:</w:t>
-      </w:r>
-      <w:r>
-        <w:t xml:space="preserve"> </w:t>
-      </w:r>
-      <w:r>
-        <w:t xml:space="preserve">sequencer, tag baris, FSM. Flip pada</w:t>
-      </w:r>
-      <w:r>
-        <w:t xml:space="preserve"> </w:t>
-      </w:r>
-      <w:r>
-        <w:t xml:space="preserve">tag baris bisa membuat ABFT dan kedua komparator salah secara konsisten.</w:t>
-      </w:r>
-      <w:r>
-        <w:t xml:space="preserve"> </w:t>
-      </w:r>
-      <w:r>
-        <w:t xml:space="preserve">[Kemungkinan Besar]</w:t>
+        <w:t xml:space="preserve">Belum ada board.</w:t>
+      </w:r>
+      <w:r>
+        <w:t xml:space="preserve"> </w:t>
+      </w:r>
+      <w:r>
+        <w:t xml:space="preserve">Semua klaim fungsional berlaku untuk simulasi RTL.</w:t>
       </w:r>
     </w:p>
     <w:p>
@@ -7346,7 +7099,13 @@
         <w:pStyle w:val="Compact"/>
       </w:pPr>
       <w:r>
-        <w:t xml:space="preserve">Vivado 2026.1 mengode ulang FSM</w:t>
+        <w:t xml:space="preserve">Build Vivado 2026.1 sudah memastikan beberapa hal: timing 100 MHz, jumlah</w:t>
+      </w:r>
+      <w:r>
+        <w:t xml:space="preserve"> </w:t>
+      </w:r>
+      <w:r>
+        <w:t xml:space="preserve">FF register redundan, block RAM/DSP, dan FSM</w:t>
       </w:r>
       <w:r>
         <w:t xml:space="preserve"> </w:t>
@@ -7355,64 +7114,19 @@
         <w:rPr>
           <w:rStyle w:val="VerbatimChar"/>
         </w:rPr>
-        <w:t xml:space="preserve">template_mem</w:t>
-      </w:r>
-      <w:r>
-        <w:t xml:space="preserve"> </w:t>
-      </w:r>
-      <w:r>
-        <w:t xml:space="preserve">dan</w:t>
-      </w:r>
-      <w:r>
-        <w:t xml:space="preserve"> </w:t>
-      </w:r>
-      <w:r>
-        <w:rPr>
-          <w:rStyle w:val="VerbatimChar"/>
-        </w:rPr>
-        <w:t xml:space="preserve">abft_check</w:t>
-      </w:r>
-      <w:r>
-        <w:t xml:space="preserve"> </w:t>
-      </w:r>
-      <w:r>
-        <w:t xml:space="preserve">(sequential) serta</w:t>
-      </w:r>
-      <w:r>
-        <w:t xml:space="preserve"> </w:t>
-      </w:r>
-      <w:r>
-        <w:rPr>
-          <w:rStyle w:val="VerbatimChar"/>
-        </w:rPr>
-        <w:t xml:space="preserve">padan_avmm</w:t>
-      </w:r>
-      <w:r>
-        <w:t xml:space="preserve"> </w:t>
-      </w:r>
-      <w:r>
-        <w:t xml:space="preserve">dan</w:t>
-      </w:r>
-      <w:r>
-        <w:t xml:space="preserve"> </w:t>
-      </w:r>
-      <w:r>
-        <w:rPr>
-          <w:rStyle w:val="VerbatimChar"/>
-        </w:rPr>
-        <w:t xml:space="preserve">padan_axil</w:t>
-      </w:r>
-      <w:r>
-        <w:t xml:space="preserve"> </w:t>
-      </w:r>
-      <w:r>
-        <w:t xml:space="preserve">(one-hot) [Pasti, log</w:t>
-      </w:r>
-      <w:r>
-        <w:t xml:space="preserve"> </w:t>
-      </w:r>
-      <w:r>
-        <w:t xml:space="preserve">sintesis].</w:t>
+        <w:t xml:space="preserve">guard</w:t>
+      </w:r>
+      <w:r>
+        <w:t xml:space="preserve"> </w:t>
+      </w:r>
+      <w:r>
+        <w:t xml:space="preserve">yang tidak dikode</w:t>
+      </w:r>
+      <w:r>
+        <w:t xml:space="preserve"> </w:t>
+      </w:r>
+      <w:r>
+        <w:t xml:space="preserve">ulang.</w:t>
       </w:r>
     </w:p>
     <w:p>
@@ -7424,7 +7138,7 @@
         <w:pStyle w:val="Compact"/>
       </w:pPr>
       <w:r>
-        <w:t xml:space="preserve">Cabang</w:t>
+        <w:t xml:space="preserve">Logika safe-state baru dibuktikan dengan SAT pada netlist Yosys. Netlist</w:t>
       </w:r>
       <w:r>
         <w:t xml:space="preserve"> </w:t>
@@ -7433,268 +7147,281 @@
         <w:rPr>
           <w:rStyle w:val="VerbatimChar"/>
         </w:rPr>
-        <w:t xml:space="preserve">default</w:t>
-      </w:r>
-      <w:r>
-        <w:t xml:space="preserve"> </w:t>
-      </w:r>
-      <w:r>
-        <w:t xml:space="preserve">di RTL, yaitu jalan pulang ke IDLE dari state ilegal,</w:t>
-      </w:r>
-      <w:r>
-        <w:t xml:space="preserve"> </w:t>
-      </w:r>
-      <w:r>
-        <w:t xml:space="preserve">kemungkinan besar hilang. Satu flip pada register one-hot bisa membuat bus</w:t>
-      </w:r>
-      <w:r>
-        <w:t xml:space="preserve"> </w:t>
-      </w:r>
-      <w:r>
-        <w:t xml:space="preserve">atau sequencer macet sampai reset [Kemungkinan Besar].</w:t>
+        <w:t xml:space="preserve">guard</w:t>
+      </w:r>
+      <w:r>
+        <w:t xml:space="preserve"> </w:t>
+      </w:r>
+      <w:r>
+        <w:t xml:space="preserve">di Vivado berbeda (424 LUT, Yosys 169).</w:t>
+      </w:r>
+    </w:p>
+    <w:p>
+      <w:pPr>
+        <w:numPr>
+          <w:ilvl w:val="0"/>
+          <w:numId w:val="1014"/>
+        </w:numPr>
+        <w:pStyle w:val="Compact"/>
+      </w:pPr>
+      <w:r>
+        <w:rPr>
+          <w:bCs/>
+          <w:b/>
+        </w:rPr>
+        <w:t xml:space="preserve">Pemuatan bitstream di Linux KV260</w:t>
+      </w:r>
+      <w:r>
+        <w:t xml:space="preserve"> </w:t>
+      </w:r>
+      <w:r>
+        <w:t xml:space="preserve">(overlay device tree,</w:t>
+      </w:r>
+      <w:r>
+        <w:t xml:space="preserve"> </w:t>
+      </w:r>
+      <w:r>
+        <w:rPr>
+          <w:rStyle w:val="VerbatimChar"/>
+        </w:rPr>
+        <w:t xml:space="preserve">xmutil</w:t>
+      </w:r>
+      <w:r>
+        <w:t xml:space="preserve">) adalah</w:t>
+      </w:r>
+      <w:r>
+        <w:t xml:space="preserve"> </w:t>
+      </w:r>
+      <w:r>
+        <w:t xml:space="preserve">bagian paling tidak pasti; tanpa overlay</w:t>
+      </w:r>
+      <w:r>
+        <w:t xml:space="preserve"> </w:t>
+      </w:r>
+      <w:r>
+        <w:rPr>
+          <w:rStyle w:val="VerbatimChar"/>
+        </w:rPr>
+        <w:t xml:space="preserve">pl_clk0</w:t>
+      </w:r>
+      <w:r>
+        <w:t xml:space="preserve"> </w:t>
+      </w:r>
+      <w:r>
+        <w:t xml:space="preserve">mungkin mati dan akses</w:t>
+      </w:r>
+      <w:r>
+        <w:t xml:space="preserve"> </w:t>
+      </w:r>
+      <w:r>
+        <w:t xml:space="preserve">AXI menggantung. [Menebak]</w:t>
+      </w:r>
+      <w:r>
+        <w:t xml:space="preserve"> </w:t>
+      </w:r>
+      <w:r>
+        <w:rPr>
+          <w:rStyle w:val="VerbatimChar"/>
+        </w:rPr>
+        <w:t xml:space="preserve">pl.dtsi</w:t>
+      </w:r>
+      <w:r>
+        <w:t xml:space="preserve"> </w:t>
+      </w:r>
+      <w:r>
+        <w:t xml:space="preserve">hasil XSA sudah dicek (21 Oktober</w:t>
+      </w:r>
+      <w:r>
+        <w:t xml:space="preserve"> </w:t>
+      </w:r>
+      <w:r>
+        <w:t xml:space="preserve">2026): alamat,</w:t>
+      </w:r>
+      <w:r>
+        <w:t xml:space="preserve"> </w:t>
+      </w:r>
+      <w:r>
+        <w:rPr>
+          <w:rStyle w:val="VerbatimChar"/>
+        </w:rPr>
+        <w:t xml:space="preserve">pl_clk0</w:t>
+      </w:r>
+      <w:r>
+        <w:t xml:space="preserve"> </w:t>
+      </w:r>
+      <w:r>
+        <w:t xml:space="preserve">(node</w:t>
+      </w:r>
+      <w:r>
+        <w:t xml:space="preserve"> </w:t>
+      </w:r>
+      <w:r>
+        <w:rPr>
+          <w:rStyle w:val="VerbatimChar"/>
+        </w:rPr>
+        <w:t xml:space="preserve">fclk</w:t>
+      </w:r>
+      <w:r>
+        <w:t xml:space="preserve">, sekitar 99,999 MHz), dan parameter</w:t>
+      </w:r>
+      <w:r>
+        <w:t xml:space="preserve"> </w:t>
+      </w:r>
+      <w:r>
+        <w:t xml:space="preserve">guard cocok dengan repo.</w:t>
+      </w:r>
+      <w:r>
+        <w:t xml:space="preserve"> </w:t>
+      </w:r>
+      <w:r>
+        <w:rPr>
+          <w:rStyle w:val="VerbatimChar"/>
+        </w:rPr>
+        <w:t xml:space="preserve">firmware-name</w:t>
+      </w:r>
+      <w:r>
+        <w:t xml:space="preserve"> </w:t>
+      </w:r>
+      <w:r>
+        <w:t xml:space="preserve">di sana (</w:t>
+      </w:r>
+      <w:r>
+        <w:rPr>
+          <w:rStyle w:val="VerbatimChar"/>
+        </w:rPr>
+        <w:t xml:space="preserve">padan_kv260.bit.bin</w:t>
+      </w:r>
+      <w:r>
+        <w:t xml:space="preserve">)</w:t>
+      </w:r>
+      <w:r>
+        <w:t xml:space="preserve"> </w:t>
+      </w:r>
+      <w:r>
+        <w:t xml:space="preserve">berbeda dari nama di panduan lama, dan panduan sudah diperbaiki. Pemuatan</w:t>
+      </w:r>
+      <w:r>
+        <w:t xml:space="preserve"> </w:t>
+      </w:r>
+      <w:r>
+        <w:t xml:space="preserve">di board belum dicoba.</w:t>
+      </w:r>
+    </w:p>
+    <w:p>
+      <w:pPr>
+        <w:numPr>
+          <w:ilvl w:val="0"/>
+          <w:numId w:val="1014"/>
+        </w:numPr>
+        <w:pStyle w:val="Compact"/>
+      </w:pPr>
+      <w:r>
+        <w:rPr>
+          <w:bCs/>
+          <w:b/>
+        </w:rPr>
+        <w:t xml:space="preserve">Template selalu ada di luar chip.</w:t>
+      </w:r>
+      <w:r>
+        <w:t xml:space="preserve"> </w:t>
+      </w:r>
+      <w:r>
+        <w:t xml:space="preserve">Keadaan guard volatil dan setiap reset</w:t>
+      </w:r>
+      <w:r>
+        <w:t xml:space="preserve"> </w:t>
+      </w:r>
+      <w:r>
+        <w:t xml:space="preserve">menghapus template, jadi host harus mengirim ulang template setiap boot.</w:t>
+      </w:r>
+    </w:p>
+    <w:p>
+      <w:pPr>
+        <w:numPr>
+          <w:ilvl w:val="0"/>
+          <w:numId w:val="1014"/>
+        </w:numPr>
+        <w:pStyle w:val="Compact"/>
+      </w:pPr>
+      <w:r>
+        <w:rPr>
+          <w:bCs/>
+          <w:b/>
+        </w:rPr>
+        <w:t xml:space="preserve">Pembatas hanya menghitung kegagalan berturut-turut.</w:t>
+      </w:r>
+      <w:r>
+        <w:t xml:space="preserve"> </w:t>
+      </w:r>
+      <w:r>
+        <w:t xml:space="preserve">Penyerang dengan satu</w:t>
+      </w:r>
+      <w:r>
+        <w:t xml:space="preserve"> </w:t>
+      </w:r>
+      <w:r>
+        <w:t xml:space="preserve">probe sah bisa menyelipkannya setiap 4 percobaan.</w:t>
+      </w:r>
+    </w:p>
+    <w:p>
+      <w:pPr>
+        <w:numPr>
+          <w:ilvl w:val="0"/>
+          <w:numId w:val="1014"/>
+        </w:numPr>
+        <w:pStyle w:val="Compact"/>
+      </w:pPr>
+      <w:r>
+        <w:rPr>
+          <w:bCs/>
+          <w:b/>
+        </w:rPr>
+        <w:t xml:space="preserve">Fault kendali belum disimulasikan:</w:t>
+      </w:r>
+      <w:r>
+        <w:t xml:space="preserve"> </w:t>
+      </w:r>
+      <w:r>
+        <w:t xml:space="preserve">sequencer, tag baris, FSM. Flip pada</w:t>
+      </w:r>
+      <w:r>
+        <w:t xml:space="preserve"> </w:t>
+      </w:r>
+      <w:r>
+        <w:t xml:space="preserve">tag baris bisa membuat ABFT dan kedua komparator salah secara konsisten.</w:t>
+      </w:r>
+      <w:r>
+        <w:t xml:space="preserve"> </w:t>
+      </w:r>
+      <w:r>
+        <w:t xml:space="preserve">[Kemungkinan Besar]</w:t>
       </w:r>
     </w:p>
     <w:p>
       <w:pPr>
         <w:numPr>
           <w:ilvl w:val="1"/>
-          <w:numId w:val="1015"/>
-        </w:numPr>
-        <w:pStyle w:val="Compact"/>
-      </w:pPr>
-      <w:r>
-        <w:t xml:space="preserve">Opsi perbaikannya:</w:t>
-      </w:r>
-      <w:r>
-        <w:t xml:space="preserve"> </w:t>
-      </w:r>
-      <w:r>
-        <w:rPr>
-          <w:rStyle w:val="VerbatimChar"/>
-        </w:rPr>
-        <w:t xml:space="preserve">fsm_encoding = "none"</w:t>
-      </w:r>
-      <w:r>
-        <w:t xml:space="preserve"> </w:t>
-      </w:r>
-      <w:r>
-        <w:t xml:space="preserve">pada keempat register itu.</w:t>
-      </w:r>
-      <w:r>
-        <w:t xml:space="preserve"> </w:t>
-      </w:r>
-      <w:r>
-        <w:t xml:space="preserve">Keputusannya belum diambil.</w:t>
-      </w:r>
-    </w:p>
-    <w:p>
-      <w:pPr>
-        <w:numPr>
-          <w:ilvl w:val="0"/>
-          <w:numId w:val="1013"/>
-        </w:numPr>
-        <w:pStyle w:val="Compact"/>
-      </w:pPr>
-      <w:r>
-        <w:rPr>
-          <w:bCs/>
-          <w:b/>
-        </w:rPr>
-        <w:t xml:space="preserve">Fault ganda</w:t>
-      </w:r>
-      <w:r>
-        <w:t xml:space="preserve"> </w:t>
-      </w:r>
-      <w:r>
-        <w:t xml:space="preserve">bisa salah lokalisasi; lokalisasi tidak boleh dipakai untuk</w:t>
-      </w:r>
-      <w:r>
-        <w:t xml:space="preserve"> </w:t>
-      </w:r>
-      <w:r>
-        <w:t xml:space="preserve">koreksi otomatis.</w:t>
-      </w:r>
-    </w:p>
-    <w:p>
-      <w:pPr>
-        <w:numPr>
-          <w:ilvl w:val="0"/>
-          <w:numId w:val="1013"/>
-        </w:numPr>
-        <w:pStyle w:val="Compact"/>
-      </w:pPr>
-      <w:r>
-        <w:rPr>
-          <w:bCs/>
-          <w:b/>
-        </w:rPr>
-        <w:t xml:space="preserve">Flip dua bit</w:t>
-      </w:r>
-      <w:r>
-        <w:t xml:space="preserve"> </w:t>
-      </w:r>
-      <w:r>
-        <w:t xml:space="preserve">bisa membawa LOCKD ke OPEN; flip satu bit selalu tertangkap.</w:t>
-      </w:r>
-    </w:p>
-    <w:p>
-      <w:pPr>
-        <w:numPr>
-          <w:ilvl w:val="0"/>
-          <w:numId w:val="1013"/>
-        </w:numPr>
-        <w:pStyle w:val="Compact"/>
-      </w:pPr>
-      <w:r>
-        <w:rPr>
-          <w:bCs/>
-          <w:b/>
-        </w:rPr>
-        <w:t xml:space="preserve">Bitstream debug adalah alat DoS</w:t>
-      </w:r>
-      <w:r>
-        <w:t xml:space="preserve"> </w:t>
-      </w:r>
-      <w:r>
-        <w:t xml:space="preserve">dan bisa dibangun lewat</w:t>
-      </w:r>
-      <w:r>
-        <w:t xml:space="preserve"> </w:t>
-      </w:r>
-      <w:r>
-        <w:rPr>
-          <w:rStyle w:val="VerbatimChar"/>
-        </w:rPr>
-        <w:t xml:space="preserve">verilog_define</w:t>
-      </w:r>
-      <w:r>
-        <w:t xml:space="preserve"> </w:t>
-      </w:r>
-      <w:r>
-        <w:t xml:space="preserve">Vivado di luar repo. Penandanya STATUS[31] = 1.</w:t>
-      </w:r>
-    </w:p>
-    <w:p>
-      <w:pPr>
-        <w:numPr>
-          <w:ilvl w:val="0"/>
-          <w:numId w:val="1013"/>
-        </w:numPr>
-        <w:pStyle w:val="Compact"/>
-      </w:pPr>
-      <w:r>
-        <w:rPr>
-          <w:bCs/>
-          <w:b/>
-        </w:rPr>
-        <w:t xml:space="preserve">Tamper PMOD dengan pull-up internal</w:t>
-      </w:r>
-      <w:r>
-        <w:t xml:space="preserve"> </w:t>
-      </w:r>
-      <w:r>
-        <w:t xml:space="preserve">peka terhadap kabel lepas atau</w:t>
-      </w:r>
-      <w:r>
-        <w:t xml:space="preserve"> </w:t>
-      </w:r>
-      <w:r>
-        <w:t xml:space="preserve">sentuhan ke GND; satu glitch sudah menghapus enrollment.</w:t>
-      </w:r>
-    </w:p>
-    <w:p>
-      <w:pPr>
-        <w:numPr>
-          <w:ilvl w:val="0"/>
-          <w:numId w:val="1013"/>
-        </w:numPr>
-        <w:pStyle w:val="Compact"/>
-      </w:pPr>
-      <w:r>
-        <w:rPr>
-          <w:bCs/>
-          <w:b/>
-        </w:rPr>
-        <w:t xml:space="preserve">Hasil INT8 vs float memakai data sintetis;</w:t>
-      </w:r>
-      <w:r>
-        <w:t xml:space="preserve"> </w:t>
-      </w:r>
-      <w:r>
-        <w:t xml:space="preserve">tidak ada klaim akurasi</w:t>
-      </w:r>
-      <w:r>
-        <w:t xml:space="preserve"> </w:t>
-      </w:r>
-      <w:r>
-        <w:t xml:space="preserve">biometrik nyata.</w:t>
-      </w:r>
-    </w:p>
-    <w:bookmarkEnd w:id="32"/>
-    <w:bookmarkStart w:id="33" w:name="langkah-berikutnya"/>
-    <w:p>
-      <w:pPr>
-        <w:pStyle w:val="Heading1"/>
-      </w:pPr>
-      <w:r>
-        <w:t xml:space="preserve">11. Langkah berikutnya</w:t>
-      </w:r>
-    </w:p>
-    <w:p>
-      <w:pPr>
-        <w:numPr>
-          <w:ilvl w:val="0"/>
           <w:numId w:val="1016"/>
         </w:numPr>
         <w:pStyle w:val="Compact"/>
       </w:pPr>
       <w:r>
-        <w:rPr>
-          <w:bCs/>
-          <w:b/>
-        </w:rPr>
-        <w:t xml:space="preserve">Putuskan</w:t>
-      </w:r>
-      <w:r>
-        <w:rPr>
-          <w:bCs/>
-          <w:b/>
-        </w:rPr>
+        <w:t xml:space="preserve">Vivado 2026.1 mengode ulang FSM</w:t>
+      </w:r>
+      <w:r>
         <w:t xml:space="preserve"> </w:t>
       </w:r>
       <w:r>
         <w:rPr>
           <w:rStyle w:val="VerbatimChar"/>
-          <w:bCs/>
-          <w:b/>
-        </w:rPr>
-        <w:t xml:space="preserve">fsm_encoding = "none"</w:t>
-      </w:r>
-      <w:r>
-        <w:rPr>
-          <w:bCs/>
-          <w:b/>
-        </w:rPr>
-        <w:t xml:space="preserve"> </w:t>
-      </w:r>
-      <w:r>
-        <w:rPr>
-          <w:bCs/>
-          <w:b/>
-        </w:rPr>
-        <w:t xml:space="preserve">untuk empat FSM</w:t>
-      </w:r>
-      <w:r>
-        <w:t xml:space="preserve"> </w:t>
-      </w:r>
-      <w:r>
-        <w:t xml:space="preserve">yang dikode ulang</w:t>
-      </w:r>
-      <w:r>
-        <w:t xml:space="preserve"> </w:t>
-      </w:r>
-      <w:r>
-        <w:t xml:space="preserve">Vivado (risiko 5). Bila dipasang, build ulang dan jalankan lagi</w:t>
+        </w:rPr>
+        <w:t xml:space="preserve">template_mem</w:t>
+      </w:r>
+      <w:r>
+        <w:t xml:space="preserve"> </w:t>
+      </w:r>
+      <w:r>
+        <w:t xml:space="preserve">dan</w:t>
       </w:r>
       <w:r>
         <w:t xml:space="preserve"> </w:t>
@@ -7703,60 +7430,100 @@
         <w:rPr>
           <w:rStyle w:val="VerbatimChar"/>
         </w:rPr>
-        <w:t xml:space="preserve">check_reports.py</w:t>
-      </w:r>
-      <w:r>
-        <w:t xml:space="preserve">; keempatnya tidak boleh lagi muncul sebagai INFO.</w:t>
+        <w:t xml:space="preserve">abft_check</w:t>
+      </w:r>
+      <w:r>
+        <w:t xml:space="preserve"> </w:t>
+      </w:r>
+      <w:r>
+        <w:t xml:space="preserve">(sequential) serta</w:t>
+      </w:r>
+      <w:r>
+        <w:t xml:space="preserve"> </w:t>
+      </w:r>
+      <w:r>
+        <w:rPr>
+          <w:rStyle w:val="VerbatimChar"/>
+        </w:rPr>
+        <w:t xml:space="preserve">padan_avmm</w:t>
+      </w:r>
+      <w:r>
+        <w:t xml:space="preserve"> </w:t>
+      </w:r>
+      <w:r>
+        <w:t xml:space="preserve">dan</w:t>
+      </w:r>
+      <w:r>
+        <w:t xml:space="preserve"> </w:t>
+      </w:r>
+      <w:r>
+        <w:rPr>
+          <w:rStyle w:val="VerbatimChar"/>
+        </w:rPr>
+        <w:t xml:space="preserve">padan_axil</w:t>
+      </w:r>
+      <w:r>
+        <w:t xml:space="preserve"> </w:t>
+      </w:r>
+      <w:r>
+        <w:t xml:space="preserve">(one-hot) [Pasti, log</w:t>
+      </w:r>
+      <w:r>
+        <w:t xml:space="preserve"> </w:t>
+      </w:r>
+      <w:r>
+        <w:t xml:space="preserve">sintesis].</w:t>
       </w:r>
     </w:p>
     <w:p>
       <w:pPr>
         <w:numPr>
-          <w:ilvl w:val="0"/>
+          <w:ilvl w:val="1"/>
           <w:numId w:val="1016"/>
         </w:numPr>
         <w:pStyle w:val="Compact"/>
       </w:pPr>
       <w:r>
-        <w:rPr>
-          <w:bCs/>
-          <w:b/>
-        </w:rPr>
-        <w:t xml:space="preserve">Cek pin H12 = PMOD J2 pin 1</w:t>
-      </w:r>
-      <w:r>
-        <w:t xml:space="preserve"> </w:t>
-      </w:r>
-      <w:r>
-        <w:t xml:space="preserve">di skematik carrier KV260 sebelum menyambung</w:t>
-      </w:r>
-      <w:r>
-        <w:t xml:space="preserve"> </w:t>
-      </w:r>
-      <w:r>
-        <w:t xml:space="preserve">kabel tamper.</w:t>
+        <w:t xml:space="preserve">Cabang</w:t>
+      </w:r>
+      <w:r>
+        <w:t xml:space="preserve"> </w:t>
+      </w:r>
+      <w:r>
+        <w:rPr>
+          <w:rStyle w:val="VerbatimChar"/>
+        </w:rPr>
+        <w:t xml:space="preserve">default</w:t>
+      </w:r>
+      <w:r>
+        <w:t xml:space="preserve"> </w:t>
+      </w:r>
+      <w:r>
+        <w:t xml:space="preserve">di RTL, yaitu jalan pulang ke IDLE dari state ilegal,</w:t>
+      </w:r>
+      <w:r>
+        <w:t xml:space="preserve"> </w:t>
+      </w:r>
+      <w:r>
+        <w:t xml:space="preserve">kemungkinan besar hilang. Satu flip pada register one-hot bisa membuat bus</w:t>
+      </w:r>
+      <w:r>
+        <w:t xml:space="preserve"> </w:t>
+      </w:r>
+      <w:r>
+        <w:t xml:space="preserve">atau sequencer macet sampai reset [Kemungkinan Besar].</w:t>
       </w:r>
     </w:p>
     <w:p>
       <w:pPr>
         <w:numPr>
-          <w:ilvl w:val="0"/>
+          <w:ilvl w:val="1"/>
           <w:numId w:val="1016"/>
         </w:numPr>
         <w:pStyle w:val="Compact"/>
       </w:pPr>
       <w:r>
-        <w:rPr>
-          <w:bCs/>
-          <w:b/>
-        </w:rPr>
-        <w:t xml:space="preserve">Uji di board:</w:t>
-      </w:r>
-      <w:r>
-        <w:t xml:space="preserve"> </w:t>
-      </w:r>
-      <w:r>
-        <w:t xml:space="preserve">muat bitstream dengan overlay, jalankan</w:t>
+        <w:t xml:space="preserve">Perbaikannya:</w:t>
       </w:r>
       <w:r>
         <w:t xml:space="preserve"> </w:t>
@@ -7765,13 +7532,25 @@
         <w:rPr>
           <w:rStyle w:val="VerbatimChar"/>
         </w:rPr>
-        <w:t xml:space="preserve">padan_test.py</w:t>
-      </w:r>
-      <w:r>
-        <w:t xml:space="preserve"> </w:t>
-      </w:r>
-      <w:r>
-        <w:t xml:space="preserve">(target</w:t>
+        <w:t xml:space="preserve">fsm_encoding = "none"</w:t>
+      </w:r>
+      <w:r>
+        <w:t xml:space="preserve"> </w:t>
+      </w:r>
+      <w:r>
+        <w:t xml:space="preserve">dipasang pada keempat register</w:t>
+      </w:r>
+      <w:r>
+        <w:t xml:space="preserve"> </w:t>
+      </w:r>
+      <w:r>
+        <w:t xml:space="preserve">(22 Oktober 2026). Simulasi tidak terpengaruh. Yosys juga mematuhinya:</w:t>
+      </w:r>
+      <w:r>
+        <w:t xml:space="preserve"> </w:t>
+      </w:r>
+      <w:r>
+        <w:t xml:space="preserve">estimasi</w:t>
       </w:r>
       <w:r>
         <w:t xml:space="preserve"> </w:t>
@@ -7780,45 +7559,357 @@
         <w:rPr>
           <w:rStyle w:val="VerbatimChar"/>
         </w:rPr>
-        <w:t xml:space="preserve">PADAN KV260: PASS (46 kasus ...)</w:t>
-      </w:r>
-      <w:r>
-        <w:t xml:space="preserve">), lalu uji tamper PMOD manual.</w:t>
+        <w:t xml:space="preserve">padan_axil</w:t>
+      </w:r>
+      <w:r>
+        <w:t xml:space="preserve"> </w:t>
+      </w:r>
+      <w:r>
+        <w:t xml:space="preserve">naik dari 4.248 menjadi 4.358 LUT, dan jumlah DSP,</w:t>
+      </w:r>
+      <w:r>
+        <w:t xml:space="preserve"> </w:t>
+      </w:r>
+      <w:r>
+        <w:t xml:space="preserve">block RAM, serta FF register redundan tidak berubah [Pasti].</w:t>
       </w:r>
     </w:p>
     <w:p>
       <w:pPr>
         <w:numPr>
-          <w:ilvl w:val="0"/>
+          <w:ilvl w:val="1"/>
           <w:numId w:val="1016"/>
         </w:numPr>
         <w:pStyle w:val="Compact"/>
       </w:pPr>
       <w:r>
+        <w:t xml:space="preserve">Efeknya di Vivado belum diverifikasi; perlu build ulang.</w:t>
+      </w:r>
+    </w:p>
+    <w:p>
+      <w:pPr>
+        <w:numPr>
+          <w:ilvl w:val="0"/>
+          <w:numId w:val="1014"/>
+        </w:numPr>
+        <w:pStyle w:val="Compact"/>
+      </w:pPr>
+      <w:r>
         <w:rPr>
           <w:bCs/>
           <w:b/>
         </w:rPr>
-        <w:t xml:space="preserve">Pertimbangkan penghitung kegagalan total atau pembatas laju</w:t>
-      </w:r>
-      <w:r>
-        <w:t xml:space="preserve"> </w:t>
-      </w:r>
-      <w:r>
-        <w:t xml:space="preserve">bila ancaman</w:t>
-      </w:r>
-      <w:r>
-        <w:t xml:space="preserve"> </w:t>
-      </w:r>
-      <w:r>
-        <w:t xml:space="preserve">probe sah relevan.</w:t>
+        <w:t xml:space="preserve">Fault ganda</w:t>
+      </w:r>
+      <w:r>
+        <w:t xml:space="preserve"> </w:t>
+      </w:r>
+      <w:r>
+        <w:t xml:space="preserve">bisa salah lokalisasi; lokalisasi tidak boleh dipakai untuk</w:t>
+      </w:r>
+      <w:r>
+        <w:t xml:space="preserve"> </w:t>
+      </w:r>
+      <w:r>
+        <w:t xml:space="preserve">koreksi otomatis.</w:t>
       </w:r>
     </w:p>
     <w:p>
       <w:pPr>
         <w:numPr>
           <w:ilvl w:val="0"/>
-          <w:numId w:val="1016"/>
+          <w:numId w:val="1014"/>
+        </w:numPr>
+        <w:pStyle w:val="Compact"/>
+      </w:pPr>
+      <w:r>
+        <w:rPr>
+          <w:bCs/>
+          <w:b/>
+        </w:rPr>
+        <w:t xml:space="preserve">Flip dua bit</w:t>
+      </w:r>
+      <w:r>
+        <w:t xml:space="preserve"> </w:t>
+      </w:r>
+      <w:r>
+        <w:t xml:space="preserve">bisa membawa LOCKD ke OPEN; flip satu bit selalu tertangkap.</w:t>
+      </w:r>
+    </w:p>
+    <w:p>
+      <w:pPr>
+        <w:numPr>
+          <w:ilvl w:val="0"/>
+          <w:numId w:val="1014"/>
+        </w:numPr>
+        <w:pStyle w:val="Compact"/>
+      </w:pPr>
+      <w:r>
+        <w:rPr>
+          <w:bCs/>
+          <w:b/>
+        </w:rPr>
+        <w:t xml:space="preserve">Bitstream debug adalah alat DoS</w:t>
+      </w:r>
+      <w:r>
+        <w:t xml:space="preserve"> </w:t>
+      </w:r>
+      <w:r>
+        <w:t xml:space="preserve">dan bisa dibangun lewat</w:t>
+      </w:r>
+      <w:r>
+        <w:t xml:space="preserve"> </w:t>
+      </w:r>
+      <w:r>
+        <w:rPr>
+          <w:rStyle w:val="VerbatimChar"/>
+        </w:rPr>
+        <w:t xml:space="preserve">verilog_define</w:t>
+      </w:r>
+      <w:r>
+        <w:t xml:space="preserve"> </w:t>
+      </w:r>
+      <w:r>
+        <w:t xml:space="preserve">Vivado di luar repo. Penandanya STATUS[31] = 1.</w:t>
+      </w:r>
+    </w:p>
+    <w:p>
+      <w:pPr>
+        <w:numPr>
+          <w:ilvl w:val="0"/>
+          <w:numId w:val="1014"/>
+        </w:numPr>
+        <w:pStyle w:val="Compact"/>
+      </w:pPr>
+      <w:r>
+        <w:rPr>
+          <w:bCs/>
+          <w:b/>
+        </w:rPr>
+        <w:t xml:space="preserve">Tamper PMOD dengan pull-up internal</w:t>
+      </w:r>
+      <w:r>
+        <w:t xml:space="preserve"> </w:t>
+      </w:r>
+      <w:r>
+        <w:t xml:space="preserve">peka terhadap kabel lepas atau</w:t>
+      </w:r>
+      <w:r>
+        <w:t xml:space="preserve"> </w:t>
+      </w:r>
+      <w:r>
+        <w:t xml:space="preserve">sentuhan ke GND; satu glitch sudah menghapus enrollment.</w:t>
+      </w:r>
+    </w:p>
+    <w:p>
+      <w:pPr>
+        <w:numPr>
+          <w:ilvl w:val="0"/>
+          <w:numId w:val="1014"/>
+        </w:numPr>
+        <w:pStyle w:val="Compact"/>
+      </w:pPr>
+      <w:r>
+        <w:rPr>
+          <w:bCs/>
+          <w:b/>
+        </w:rPr>
+        <w:t xml:space="preserve">Hasil INT8 vs float memakai data sintetis;</w:t>
+      </w:r>
+      <w:r>
+        <w:t xml:space="preserve"> </w:t>
+      </w:r>
+      <w:r>
+        <w:t xml:space="preserve">tidak ada klaim akurasi</w:t>
+      </w:r>
+      <w:r>
+        <w:t xml:space="preserve"> </w:t>
+      </w:r>
+      <w:r>
+        <w:t xml:space="preserve">biometrik nyata.</w:t>
+      </w:r>
+    </w:p>
+    <w:bookmarkEnd w:id="32"/>
+    <w:bookmarkStart w:id="33" w:name="langkah-berikutnya"/>
+    <w:p>
+      <w:pPr>
+        <w:pStyle w:val="Heading1"/>
+      </w:pPr>
+      <w:r>
+        <w:t xml:space="preserve">11. Langkah berikutnya</w:t>
+      </w:r>
+    </w:p>
+    <w:p>
+      <w:pPr>
+        <w:numPr>
+          <w:ilvl w:val="0"/>
+          <w:numId w:val="1017"/>
+        </w:numPr>
+        <w:pStyle w:val="Compact"/>
+      </w:pPr>
+      <w:r>
+        <w:rPr>
+          <w:bCs/>
+          <w:b/>
+        </w:rPr>
+        <w:t xml:space="preserve">Build ulang di Vivado</w:t>
+      </w:r>
+      <w:r>
+        <w:t xml:space="preserve"> </w:t>
+      </w:r>
+      <w:r>
+        <w:t xml:space="preserve">setelah</w:t>
+      </w:r>
+      <w:r>
+        <w:t xml:space="preserve"> </w:t>
+      </w:r>
+      <w:r>
+        <w:rPr>
+          <w:rStyle w:val="VerbatimChar"/>
+        </w:rPr>
+        <w:t xml:space="preserve">fsm_encoding = "none"</w:t>
+      </w:r>
+      <w:r>
+        <w:t xml:space="preserve"> </w:t>
+      </w:r>
+      <w:r>
+        <w:t xml:space="preserve">dipasang di empat</w:t>
+      </w:r>
+      <w:r>
+        <w:t xml:space="preserve"> </w:t>
+      </w:r>
+      <w:r>
+        <w:t xml:space="preserve">FSM (risiko 5), lalu jalankan</w:t>
+      </w:r>
+      <w:r>
+        <w:t xml:space="preserve"> </w:t>
+      </w:r>
+      <w:r>
+        <w:rPr>
+          <w:rStyle w:val="VerbatimChar"/>
+        </w:rPr>
+        <w:t xml:space="preserve">check_reports.py</w:t>
+      </w:r>
+      <w:r>
+        <w:t xml:space="preserve">. Pemeriksaan FSM harus</w:t>
+      </w:r>
+      <w:r>
+        <w:t xml:space="preserve"> </w:t>
+      </w:r>
+      <w:r>
+        <w:t xml:space="preserve">PASS, dan angka utilisasi serta timing dibandingkan dengan build pertama.</w:t>
+      </w:r>
+    </w:p>
+    <w:p>
+      <w:pPr>
+        <w:numPr>
+          <w:ilvl w:val="0"/>
+          <w:numId w:val="1017"/>
+        </w:numPr>
+        <w:pStyle w:val="Compact"/>
+      </w:pPr>
+      <w:r>
+        <w:rPr>
+          <w:bCs/>
+          <w:b/>
+        </w:rPr>
+        <w:t xml:space="preserve">Cek pin H12 = PMOD J2 pin 1</w:t>
+      </w:r>
+      <w:r>
+        <w:t xml:space="preserve"> </w:t>
+      </w:r>
+      <w:r>
+        <w:t xml:space="preserve">di skematik carrier KV260 sebelum menyambung</w:t>
+      </w:r>
+      <w:r>
+        <w:t xml:space="preserve"> </w:t>
+      </w:r>
+      <w:r>
+        <w:t xml:space="preserve">kabel tamper.</w:t>
+      </w:r>
+    </w:p>
+    <w:p>
+      <w:pPr>
+        <w:numPr>
+          <w:ilvl w:val="0"/>
+          <w:numId w:val="1017"/>
+        </w:numPr>
+        <w:pStyle w:val="Compact"/>
+      </w:pPr>
+      <w:r>
+        <w:rPr>
+          <w:bCs/>
+          <w:b/>
+        </w:rPr>
+        <w:t xml:space="preserve">Uji di board:</w:t>
+      </w:r>
+      <w:r>
+        <w:t xml:space="preserve"> </w:t>
+      </w:r>
+      <w:r>
+        <w:t xml:space="preserve">muat bitstream dengan overlay, jalankan</w:t>
+      </w:r>
+      <w:r>
+        <w:t xml:space="preserve"> </w:t>
+      </w:r>
+      <w:r>
+        <w:rPr>
+          <w:rStyle w:val="VerbatimChar"/>
+        </w:rPr>
+        <w:t xml:space="preserve">padan_test.py</w:t>
+      </w:r>
+      <w:r>
+        <w:t xml:space="preserve"> </w:t>
+      </w:r>
+      <w:r>
+        <w:t xml:space="preserve">(target</w:t>
+      </w:r>
+      <w:r>
+        <w:t xml:space="preserve"> </w:t>
+      </w:r>
+      <w:r>
+        <w:rPr>
+          <w:rStyle w:val="VerbatimChar"/>
+        </w:rPr>
+        <w:t xml:space="preserve">PADAN KV260: PASS (46 kasus ...)</w:t>
+      </w:r>
+      <w:r>
+        <w:t xml:space="preserve">), lalu uji tamper PMOD manual.</w:t>
+      </w:r>
+    </w:p>
+    <w:p>
+      <w:pPr>
+        <w:numPr>
+          <w:ilvl w:val="0"/>
+          <w:numId w:val="1017"/>
+        </w:numPr>
+        <w:pStyle w:val="Compact"/>
+      </w:pPr>
+      <w:r>
+        <w:rPr>
+          <w:bCs/>
+          <w:b/>
+        </w:rPr>
+        <w:t xml:space="preserve">Pertimbangkan penghitung kegagalan total atau pembatas laju</w:t>
+      </w:r>
+      <w:r>
+        <w:t xml:space="preserve"> </w:t>
+      </w:r>
+      <w:r>
+        <w:t xml:space="preserve">bila ancaman</w:t>
+      </w:r>
+      <w:r>
+        <w:t xml:space="preserve"> </w:t>
+      </w:r>
+      <w:r>
+        <w:t xml:space="preserve">probe sah relevan.</w:t>
+      </w:r>
+    </w:p>
+    <w:p>
+      <w:pPr>
+        <w:numPr>
+          <w:ilvl w:val="0"/>
+          <w:numId w:val="1017"/>
         </w:numPr>
         <w:pStyle w:val="Compact"/>
       </w:pPr>
@@ -8153,6 +8244,9 @@
     <w:abstractNumId w:val="991"/>
   </w:num>
   <w:num w:numId="1013">
+    <w:abstractNumId w:val="991"/>
+  </w:num>
+  <w:num w:numId="1014">
     <w:abstractNumId w:val="99411"/>
     <w:lvlOverride w:ilvl="0">
       <w:startOverride w:val="1"/>
@@ -8182,13 +8276,13 @@
       <w:startOverride w:val="1"/>
     </w:lvlOverride>
   </w:num>
-  <w:num w:numId="1014">
-    <w:abstractNumId w:val="991"/>
-  </w:num>
   <w:num w:numId="1015">
     <w:abstractNumId w:val="991"/>
   </w:num>
   <w:num w:numId="1016">
+    <w:abstractNumId w:val="991"/>
+  </w:num>
+  <w:num w:numId="1017">
     <w:abstractNumId w:val="99411"/>
     <w:lvlOverride w:ilvl="0">
       <w:startOverride w:val="1"/>

</xml_diff>

<commit_message>
Laporan: hasil board KV260 pertama; panduan: tanpa devmem2, cek listapps dan clock
Hasil board yang dilaporkan pengguna (22 Oktober 2026, bitstream build
pertama): xmutil loadapp padan di slot 0, pl0_ref 99.999.999 Hz (error
divider -13 tidak berdampak), GUARD_STATUS 0x503, padan_test.py PASS 46/46
dua kali (exit 0). Uji tamper dan bitstream RTL terbaru belum dijalankan.

Panduan: devmem2 tidak ada di image Ubuntu Kria, jadi diganti fungsi baca
Python 32 bit. Ditambahkan juga langkah listapps (k26-starter-kits aktif saat
boot) dan cek clk_summary, serta nilai GUARD_STATUS yang diharapkan pada uji
tamper.

Co-Authored-By: Claude Opus 5.5 <noreply@anthropic.com>
Claude-Session: https://claude.ai/code/session_01JWHcwMqQzXkB9LnTCQYUWo
</commit_message>
<xml_diff>
--- a/docs/laporan/Laporan_PADAN.docx
+++ b/docs/laporan/Laporan_PADAN.docx
@@ -161,31 +161,13 @@
         <w:t xml:space="preserve"> </w:t>
       </w:r>
       <w:r>
-        <w:t xml:space="preserve">22</w:t>
-      </w:r>
-      <w:r>
-        <w:t xml:space="preserve"> </w:t>
-      </w:r>
-      <w:r>
-        <w:t xml:space="preserve">Oktober</w:t>
-      </w:r>
-      <w:r>
-        <w:t xml:space="preserve"> </w:t>
-      </w:r>
-      <w:r>
-        <w:t xml:space="preserve">2026</w:t>
-      </w:r>
-      <w:r>
-        <w:t xml:space="preserve"> </w:t>
-      </w:r>
-      <w:r>
-        <w:t xml:space="preserve">(atribut</w:t>
-      </w:r>
-      <w:r>
-        <w:t xml:space="preserve"> </w:t>
-      </w:r>
-      <w:r>
-        <w:t xml:space="preserve">fsm_encoding)</w:t>
+        <w:t xml:space="preserve">di</w:t>
+      </w:r>
+      <w:r>
+        <w:t xml:space="preserve"> </w:t>
+      </w:r>
+      <w:r>
+        <w:t xml:space="preserve">PR</w:t>
       </w:r>
     </w:p>
     <w:bookmarkStart w:id="21" w:name="ringkasan"/>
@@ -282,16 +264,34 @@
           <w:bCs/>
           <w:b/>
         </w:rPr>
-        <w:t xml:space="preserve">Belum ada hasil board</w:t>
-      </w:r>
-      <w:r>
-        <w:t xml:space="preserve">, dan</w:t>
-      </w:r>
-      <w:r>
-        <w:t xml:space="preserve"> </w:t>
-      </w:r>
-      <w:r>
-        <w:t xml:space="preserve">itu sekarang risiko terbesar proyek.</w:t>
+        <w:t xml:space="preserve">Hasil board pertama</w:t>
+      </w:r>
+      <w:r>
+        <w:t xml:space="preserve"> </w:t>
+      </w:r>
+      <w:r>
+        <w:t xml:space="preserve">(dilaporkan pengguna, bitstream build pertama):</w:t>
+      </w:r>
+      <w:r>
+        <w:t xml:space="preserve"> </w:t>
+      </w:r>
+      <w:r>
+        <w:rPr>
+          <w:rStyle w:val="VerbatimChar"/>
+        </w:rPr>
+        <w:t xml:space="preserve">padan_test.py</w:t>
+      </w:r>
+      <w:r>
+        <w:t xml:space="preserve"> </w:t>
+      </w:r>
+      <w:r>
+        <w:t xml:space="preserve">lulus 46/46 di KV260, dua kali berturut-turut. Uji tamper PMOD dan</w:t>
+      </w:r>
+      <w:r>
+        <w:t xml:space="preserve"> </w:t>
+      </w:r>
+      <w:r>
+        <w:t xml:space="preserve">bitstream dengan RTL terbaru belum dijalankan di board.</w:t>
       </w:r>
     </w:p>
     <w:p>
@@ -615,25 +615,115 @@
           <w:bCs/>
           <w:b/>
         </w:rPr>
-        <w:t xml:space="preserve">Temuan saat port:</w:t>
-      </w:r>
-      <w:r>
-        <w:t xml:space="preserve"> </w:t>
-      </w:r>
-      <w:r>
-        <w:t xml:space="preserve">Yosys untuk Xilinx menggabungkan FF kode STATUS</w:t>
-      </w:r>
-      <w:r>
-        <w:t xml:space="preserve"> </w:t>
-      </w:r>
-      <w:r>
-        <w:t xml:space="preserve">sehingga jarak NO_MATCH → MATCH turun dari 4 ke 2 flip FF. Sudah diperbaiki</w:t>
-      </w:r>
-      <w:r>
-        <w:t xml:space="preserve"> </w:t>
-      </w:r>
-      <w:r>
-        <w:t xml:space="preserve">(bagian 4).</w:t>
+        <w:t xml:space="preserve">Hasil board KV260 (22 Oktober 2026, dilaporkan pengguna):</w:t>
+      </w:r>
+    </w:p>
+    <w:p>
+      <w:pPr>
+        <w:numPr>
+          <w:ilvl w:val="1"/>
+          <w:numId w:val="1004"/>
+        </w:numPr>
+        <w:pStyle w:val="Compact"/>
+      </w:pPr>
+      <w:r>
+        <w:t xml:space="preserve">Bitstream termuat lewat</w:t>
+      </w:r>
+      <w:r>
+        <w:t xml:space="preserve"> </w:t>
+      </w:r>
+      <w:r>
+        <w:rPr>
+          <w:rStyle w:val="VerbatimChar"/>
+        </w:rPr>
+        <w:t xml:space="preserve">xmutil loadapp padan</w:t>
+      </w:r>
+      <w:r>
+        <w:t xml:space="preserve">.</w:t>
+      </w:r>
+    </w:p>
+    <w:p>
+      <w:pPr>
+        <w:numPr>
+          <w:ilvl w:val="1"/>
+          <w:numId w:val="1004"/>
+        </w:numPr>
+        <w:pStyle w:val="Compact"/>
+      </w:pPr>
+      <w:r>
+        <w:rPr>
+          <w:rStyle w:val="VerbatimChar"/>
+        </w:rPr>
+        <w:t xml:space="preserve">pl_clk0</w:t>
+      </w:r>
+      <w:r>
+        <w:t xml:space="preserve"> </w:t>
+      </w:r>
+      <w:r>
+        <w:t xml:space="preserve">berjalan pada 99.999.999 Hz.</w:t>
+      </w:r>
+    </w:p>
+    <w:p>
+      <w:pPr>
+        <w:numPr>
+          <w:ilvl w:val="1"/>
+          <w:numId w:val="1004"/>
+        </w:numPr>
+        <w:pStyle w:val="Compact"/>
+      </w:pPr>
+      <w:r>
+        <w:t xml:space="preserve">GUARD_STATUS awal</w:t>
+      </w:r>
+      <w:r>
+        <w:t xml:space="preserve"> </w:t>
+      </w:r>
+      <w:r>
+        <w:rPr>
+          <w:rStyle w:val="VerbatimChar"/>
+        </w:rPr>
+        <w:t xml:space="preserve">0x00000503</w:t>
+      </w:r>
+      <w:r>
+        <w:t xml:space="preserve"> </w:t>
+      </w:r>
+      <w:r>
+        <w:t xml:space="preserve">(OPEN).</w:t>
+      </w:r>
+    </w:p>
+    <w:p>
+      <w:pPr>
+        <w:numPr>
+          <w:ilvl w:val="1"/>
+          <w:numId w:val="1004"/>
+        </w:numPr>
+        <w:pStyle w:val="Compact"/>
+      </w:pPr>
+      <w:r>
+        <w:rPr>
+          <w:rStyle w:val="VerbatimChar"/>
+        </w:rPr>
+        <w:t xml:space="preserve">padan_test.py</w:t>
+      </w:r>
+      <w:r>
+        <w:t xml:space="preserve"> </w:t>
+      </w:r>
+      <w:r>
+        <w:t xml:space="preserve">lulus 46/46, dan hasil yang sama terulang dengan</w:t>
+      </w:r>
+      <w:r>
+        <w:t xml:space="preserve"> </w:t>
+      </w:r>
+      <w:r>
+        <w:rPr>
+          <w:rStyle w:val="VerbatimChar"/>
+        </w:rPr>
+        <w:t xml:space="preserve">exit 0</w:t>
+      </w:r>
+      <w:r>
+        <w:t xml:space="preserve"> </w:t>
+      </w:r>
+      <w:r>
+        <w:t xml:space="preserve">(bagian 5).</w:t>
       </w:r>
     </w:p>
     <w:p>
@@ -649,13 +739,53 @@
           <w:bCs/>
           <w:b/>
         </w:rPr>
+        <w:t xml:space="preserve">Temuan saat port:</w:t>
+      </w:r>
+      <w:r>
+        <w:t xml:space="preserve"> </w:t>
+      </w:r>
+      <w:r>
+        <w:t xml:space="preserve">Yosys untuk Xilinx menggabungkan FF kode STATUS</w:t>
+      </w:r>
+      <w:r>
+        <w:t xml:space="preserve"> </w:t>
+      </w:r>
+      <w:r>
+        <w:t xml:space="preserve">sehingga jarak NO_MATCH → MATCH turun dari 4 ke 2 flip FF. Sudah diperbaiki</w:t>
+      </w:r>
+      <w:r>
+        <w:t xml:space="preserve"> </w:t>
+      </w:r>
+      <w:r>
+        <w:t xml:space="preserve">(bagian 4).</w:t>
+      </w:r>
+    </w:p>
+    <w:p>
+      <w:pPr>
+        <w:numPr>
+          <w:ilvl w:val="0"/>
+          <w:numId w:val="1001"/>
+        </w:numPr>
+        <w:pStyle w:val="Compact"/>
+      </w:pPr>
+      <w:r>
+        <w:rPr>
+          <w:bCs/>
+          <w:b/>
+        </w:rPr>
         <w:t xml:space="preserve">Status:</w:t>
       </w:r>
       <w:r>
         <w:t xml:space="preserve"> </w:t>
       </w:r>
       <w:r>
-        <w:t xml:space="preserve">RTL terakhir berubah pada 22 Oktober 2026, yaitu atribut</w:t>
+        <w:t xml:space="preserve">RTL terakhir berubah di PR #13 (5b854d6, 22 Oktober 2026), yaitu</w:t>
+      </w:r>
+      <w:r>
+        <w:t xml:space="preserve"> </w:t>
+      </w:r>
+      <w:r>
+        <w:t xml:space="preserve">atribut</w:t>
       </w:r>
       <w:r>
         <w:t xml:space="preserve"> </w:t>
@@ -914,7 +1044,7 @@
         <w:pStyle w:val="FirstParagraph"/>
       </w:pPr>
       <w:r>
-        <w:t xml:space="preserve">Tahap 1–10 dilakukan pada 6 Oktober 2026, tahap 11–14 pada 17–22 Oktober 2026.</w:t>
+        <w:t xml:space="preserve">Tahap 1–10 dilakukan pada 6 Oktober 2026, tahap 11–15 pada 17–22 Oktober 2026.</w:t>
       </w:r>
       <w:r>
         <w:t xml:space="preserve"> </w:t>
@@ -1656,7 +1786,7 @@
               <w:jc w:val="left"/>
             </w:pPr>
             <w:r>
-              <w:t xml:space="preserve">(laporan di</w:t>
+              <w:t xml:space="preserve">5b854d6 (PR #13); laporan di</w:t>
             </w:r>
             <w:r>
               <w:t xml:space="preserve"> </w:t>
@@ -1667,9 +1797,6 @@
               </w:rPr>
               <w:t xml:space="preserve">fpga/kv260/testdata</w:t>
             </w:r>
-            <w:r>
-              <w:t xml:space="preserve">)</w:t>
-            </w:r>
           </w:p>
         </w:tc>
         <w:tc>
@@ -1711,6 +1838,86 @@
             </w:r>
             <w:r>
               <w:t xml:space="preserve">kini juga memeriksa clock, CDC, dan FSM, dan diuji terhadap laporan asli</w:t>
+            </w:r>
+          </w:p>
+        </w:tc>
+      </w:tr>
+      <w:tr>
+        <w:tc>
+          <w:tcPr/>
+          <w:p>
+            <w:pPr>
+              <w:pStyle w:val="Compact"/>
+              <w:jc w:val="left"/>
+            </w:pPr>
+            <w:r>
+              <w:t xml:space="preserve">15. Board KV260 pertama</w:t>
+            </w:r>
+          </w:p>
+        </w:tc>
+        <w:tc>
+          <w:tcPr/>
+          <w:p>
+            <w:pPr>
+              <w:pStyle w:val="Compact"/>
+              <w:jc w:val="left"/>
+            </w:pPr>
+            <w:r>
+              <w:t xml:space="preserve">(tanpa commit; dilaporkan pengguna)</w:t>
+            </w:r>
+          </w:p>
+        </w:tc>
+        <w:tc>
+          <w:tcPr/>
+          <w:p>
+            <w:pPr>
+              <w:pStyle w:val="Compact"/>
+              <w:jc w:val="left"/>
+            </w:pPr>
+            <w:r>
+              <w:t xml:space="preserve">Bitstream build pertama:</w:t>
+            </w:r>
+            <w:r>
+              <w:t xml:space="preserve"> </w:t>
+            </w:r>
+            <w:r>
+              <w:rPr>
+                <w:rStyle w:val="VerbatimChar"/>
+              </w:rPr>
+              <w:t xml:space="preserve">xmutil loadapp</w:t>
+            </w:r>
+            <w:r>
+              <w:t xml:space="preserve">,</w:t>
+            </w:r>
+            <w:r>
+              <w:t xml:space="preserve"> </w:t>
+            </w:r>
+            <w:r>
+              <w:rPr>
+                <w:rStyle w:val="VerbatimChar"/>
+              </w:rPr>
+              <w:t xml:space="preserve">pl_clk0</w:t>
+            </w:r>
+            <w:r>
+              <w:t xml:space="preserve"> </w:t>
+            </w:r>
+            <w:r>
+              <w:t xml:space="preserve">99.999.999 Hz,</w:t>
+            </w:r>
+            <w:r>
+              <w:t xml:space="preserve"> </w:t>
+            </w:r>
+            <w:r>
+              <w:rPr>
+                <w:rStyle w:val="VerbatimChar"/>
+              </w:rPr>
+              <w:t xml:space="preserve">padan_test.py</w:t>
+            </w:r>
+            <w:r>
+              <w:t xml:space="preserve"> </w:t>
+            </w:r>
+            <w:r>
+              <w:t xml:space="preserve">PASS 46/46 dua kali</w:t>
             </w:r>
           </w:p>
         </w:tc>
@@ -2171,7 +2378,7 @@
       <w:pPr>
         <w:numPr>
           <w:ilvl w:val="0"/>
-          <w:numId w:val="1004"/>
+          <w:numId w:val="1005"/>
         </w:numPr>
         <w:pStyle w:val="Compact"/>
       </w:pPr>
@@ -2205,7 +2412,7 @@
       <w:pPr>
         <w:numPr>
           <w:ilvl w:val="0"/>
-          <w:numId w:val="1004"/>
+          <w:numId w:val="1005"/>
         </w:numPr>
         <w:pStyle w:val="Compact"/>
       </w:pPr>
@@ -2233,7 +2440,7 @@
       <w:pPr>
         <w:numPr>
           <w:ilvl w:val="0"/>
-          <w:numId w:val="1004"/>
+          <w:numId w:val="1005"/>
         </w:numPr>
         <w:pStyle w:val="Compact"/>
       </w:pPr>
@@ -2267,7 +2474,7 @@
       <w:pPr>
         <w:numPr>
           <w:ilvl w:val="0"/>
-          <w:numId w:val="1004"/>
+          <w:numId w:val="1005"/>
         </w:numPr>
         <w:pStyle w:val="Compact"/>
       </w:pPr>
@@ -2301,7 +2508,7 @@
       <w:pPr>
         <w:numPr>
           <w:ilvl w:val="0"/>
-          <w:numId w:val="1004"/>
+          <w:numId w:val="1005"/>
         </w:numPr>
         <w:pStyle w:val="Compact"/>
       </w:pPr>
@@ -2335,7 +2542,7 @@
       <w:pPr>
         <w:numPr>
           <w:ilvl w:val="0"/>
-          <w:numId w:val="1004"/>
+          <w:numId w:val="1005"/>
         </w:numPr>
         <w:pStyle w:val="Compact"/>
       </w:pPr>
@@ -2530,7 +2737,7 @@
       <w:pPr>
         <w:numPr>
           <w:ilvl w:val="0"/>
-          <w:numId w:val="1005"/>
+          <w:numId w:val="1006"/>
         </w:numPr>
         <w:pStyle w:val="Compact"/>
       </w:pPr>
@@ -2558,7 +2765,7 @@
       <w:pPr>
         <w:numPr>
           <w:ilvl w:val="0"/>
-          <w:numId w:val="1005"/>
+          <w:numId w:val="1006"/>
         </w:numPr>
         <w:pStyle w:val="Compact"/>
       </w:pPr>
@@ -2580,7 +2787,7 @@
       <w:pPr>
         <w:numPr>
           <w:ilvl w:val="0"/>
-          <w:numId w:val="1005"/>
+          <w:numId w:val="1006"/>
         </w:numPr>
         <w:pStyle w:val="Compact"/>
       </w:pPr>
@@ -2924,7 +3131,7 @@
       <w:pPr>
         <w:numPr>
           <w:ilvl w:val="0"/>
-          <w:numId w:val="1006"/>
+          <w:numId w:val="1007"/>
         </w:numPr>
         <w:pStyle w:val="Compact"/>
       </w:pPr>
@@ -2946,7 +3153,7 @@
       <w:pPr>
         <w:numPr>
           <w:ilvl w:val="0"/>
-          <w:numId w:val="1006"/>
+          <w:numId w:val="1007"/>
         </w:numPr>
         <w:pStyle w:val="Compact"/>
       </w:pPr>
@@ -2974,7 +3181,7 @@
       <w:pPr>
         <w:numPr>
           <w:ilvl w:val="0"/>
-          <w:numId w:val="1006"/>
+          <w:numId w:val="1007"/>
         </w:numPr>
         <w:pStyle w:val="Compact"/>
       </w:pPr>
@@ -3002,7 +3209,7 @@
       <w:pPr>
         <w:numPr>
           <w:ilvl w:val="0"/>
-          <w:numId w:val="1006"/>
+          <w:numId w:val="1007"/>
         </w:numPr>
         <w:pStyle w:val="Compact"/>
       </w:pPr>
@@ -3045,7 +3252,7 @@
       <w:pPr>
         <w:numPr>
           <w:ilvl w:val="0"/>
-          <w:numId w:val="1006"/>
+          <w:numId w:val="1007"/>
         </w:numPr>
         <w:pStyle w:val="Compact"/>
       </w:pPr>
@@ -3195,35 +3402,13 @@
         <w:t xml:space="preserve"> </w:t>
       </w:r>
       <w:r>
-        <w:t xml:space="preserve">2026). Paket ini</w:t>
-      </w:r>
-      <w:r>
-        <w:t xml:space="preserve"> </w:t>
-      </w:r>
-      <w:r>
-        <w:rPr>
-          <w:bCs/>
-          <w:b/>
-        </w:rPr>
-        <w:t xml:space="preserve">belum pernah dijalankan di board</w:t>
-      </w:r>
-      <w:r>
-        <w:t xml:space="preserve">, dan tidak ada klaim hasil</w:t>
-      </w:r>
-      <w:r>
-        <w:t xml:space="preserve"> </w:t>
-      </w:r>
-      <w:r>
-        <w:t xml:space="preserve">board (</w:t>
-      </w:r>
-      <w:r>
-        <w:rPr>
-          <w:rStyle w:val="VerbatimChar"/>
-        </w:rPr>
-        <w:t xml:space="preserve">docs/fpga_howto.md</w:t>
-      </w:r>
-      <w:r>
-        <w:t xml:space="preserve">).</w:t>
+        <w:t xml:space="preserve">2026), dan bitstream-nya sudah diuji di board KV260 oleh pengguna (22 Oktober</w:t>
+      </w:r>
+      <w:r>
+        <w:t xml:space="preserve"> </w:t>
+      </w:r>
+      <w:r>
+        <w:t xml:space="preserve">2026, hasil di bawah).</w:t>
       </w:r>
     </w:p>
     <w:tbl>
@@ -3569,31 +3754,7 @@
               <w:t xml:space="preserve">tamper_n</w:t>
             </w:r>
             <w:r>
-              <w:t xml:space="preserve">, FSM</w:t>
-            </w:r>
-            <w:r>
-              <w:t xml:space="preserve"> </w:t>
-            </w:r>
-            <w:r>
-              <w:rPr>
-                <w:rStyle w:val="VerbatimChar"/>
-              </w:rPr>
-              <w:t xml:space="preserve">guard</w:t>
-            </w:r>
-            <w:r>
-              <w:t xml:space="preserve">/</w:t>
-            </w:r>
-            <w:r>
-              <w:rPr>
-                <w:rStyle w:val="VerbatimChar"/>
-              </w:rPr>
-              <w:t xml:space="preserve">decision</w:t>
-            </w:r>
-            <w:r>
-              <w:t xml:space="preserve"> </w:t>
-            </w:r>
-            <w:r>
-              <w:t xml:space="preserve">tidak dikode ulang.</w:t>
+              <w:t xml:space="preserve">, tidak ada FSM modul PADAN yang dikode ulang.</w:t>
             </w:r>
           </w:p>
         </w:tc>
@@ -3647,103 +3808,103 @@
       <w:pPr>
         <w:numPr>
           <w:ilvl w:val="0"/>
-          <w:numId w:val="1007"/>
-        </w:numPr>
-        <w:pStyle w:val="Compact"/>
-      </w:pPr>
-      <w:r>
-        <w:rPr>
-          <w:bCs/>
-          <w:b/>
-        </w:rPr>
-        <w:t xml:space="preserve">Yang diuji di CI tanpa Vivado dan board:</w:t>
-      </w:r>
-    </w:p>
-    <w:p>
-      <w:pPr>
-        <w:numPr>
-          <w:ilvl w:val="1"/>
           <w:numId w:val="1008"/>
         </w:numPr>
         <w:pStyle w:val="Compact"/>
       </w:pPr>
       <w:r>
         <w:rPr>
-          <w:rStyle w:val="VerbatimChar"/>
-        </w:rPr>
-        <w:t xml:space="preserve">padan_axil</w:t>
-      </w:r>
-      <w:r>
-        <w:t xml:space="preserve">: 6 test protokol (urutan AW/W, backpressure B/R, SLVERR, AR</w:t>
-      </w:r>
-      <w:r>
-        <w:t xml:space="preserve"> </w:t>
-      </w:r>
-      <w:r>
-        <w:t xml:space="preserve">bersamaan, tamper) dan 8 mutan, semua terbunuh. [Pasti]</w:t>
+          <w:bCs/>
+          <w:b/>
+        </w:rPr>
+        <w:t xml:space="preserve">Yang diuji di CI tanpa Vivado dan board:</w:t>
       </w:r>
     </w:p>
     <w:p>
       <w:pPr>
         <w:numPr>
           <w:ilvl w:val="1"/>
+          <w:numId w:val="1009"/>
+        </w:numPr>
+        <w:pStyle w:val="Compact"/>
+      </w:pPr>
+      <w:r>
+        <w:rPr>
+          <w:rStyle w:val="VerbatimChar"/>
+        </w:rPr>
+        <w:t xml:space="preserve">padan_axil</w:t>
+      </w:r>
+      <w:r>
+        <w:t xml:space="preserve">: 6 test protokol (urutan AW/W, backpressure B/R, SLVERR, AR</w:t>
+      </w:r>
+      <w:r>
+        <w:t xml:space="preserve"> </w:t>
+      </w:r>
+      <w:r>
+        <w:t xml:space="preserve">bersamaan, tamper) dan 8 mutan, semua terbunuh. [Pasti]</w:t>
+      </w:r>
+    </w:p>
+    <w:p>
+      <w:pPr>
+        <w:numPr>
+          <w:ilvl w:val="1"/>
+          <w:numId w:val="1009"/>
+        </w:numPr>
+        <w:pStyle w:val="Compact"/>
+      </w:pPr>
+      <w:r>
+        <w:rPr>
+          <w:rStyle w:val="VerbatimChar"/>
+        </w:rPr>
+        <w:t xml:space="preserve">padan_test.py</w:t>
+      </w:r>
+      <w:r>
+        <w:t xml:space="preserve"> </w:t>
+      </w:r>
+      <w:r>
+        <w:t xml:space="preserve">tanpa diubah melawan RTL lewat AXI: 46/46 PASS tanpa</w:t>
+      </w:r>
+      <w:r>
+        <w:t xml:space="preserve"> </w:t>
+      </w:r>
+      <w:r>
+        <w:t xml:space="preserve">pelanggaran protokol; fault memori terdeteksi dan HALT setelah FAULT ke-3;</w:t>
+      </w:r>
+      <w:r>
+        <w:t xml:space="preserve"> </w:t>
+      </w:r>
+      <w:r>
+        <w:t xml:space="preserve">base salah tidak menulis apa pun. [Pasti, simulasi]</w:t>
+      </w:r>
+    </w:p>
+    <w:p>
+      <w:pPr>
+        <w:numPr>
+          <w:ilvl w:val="1"/>
+          <w:numId w:val="1009"/>
+        </w:numPr>
+        <w:pStyle w:val="Compact"/>
+      </w:pPr>
+      <w:r>
+        <w:t xml:space="preserve">Skrip Vivado di tclsh dengan stub: nilai kunci konsisten dengan RTL dan</w:t>
+      </w:r>
+      <w:r>
+        <w:t xml:space="preserve"> </w:t>
+      </w:r>
+      <w:r>
+        <w:t xml:space="preserve">host, 4 kondisi error memberi pesan jelas.</w:t>
+      </w:r>
+    </w:p>
+    <w:p>
+      <w:pPr>
+        <w:numPr>
+          <w:ilvl w:val="0"/>
           <w:numId w:val="1008"/>
         </w:numPr>
         <w:pStyle w:val="Compact"/>
       </w:pPr>
       <w:r>
         <w:rPr>
-          <w:rStyle w:val="VerbatimChar"/>
-        </w:rPr>
-        <w:t xml:space="preserve">padan_test.py</w:t>
-      </w:r>
-      <w:r>
-        <w:t xml:space="preserve"> </w:t>
-      </w:r>
-      <w:r>
-        <w:t xml:space="preserve">tanpa diubah melawan RTL lewat AXI: 46/46 PASS tanpa</w:t>
-      </w:r>
-      <w:r>
-        <w:t xml:space="preserve"> </w:t>
-      </w:r>
-      <w:r>
-        <w:t xml:space="preserve">pelanggaran protokol; fault memori terdeteksi dan HALT setelah FAULT ke-3;</w:t>
-      </w:r>
-      <w:r>
-        <w:t xml:space="preserve"> </w:t>
-      </w:r>
-      <w:r>
-        <w:t xml:space="preserve">base salah tidak menulis apa pun. [Pasti, simulasi]</w:t>
-      </w:r>
-    </w:p>
-    <w:p>
-      <w:pPr>
-        <w:numPr>
-          <w:ilvl w:val="1"/>
-          <w:numId w:val="1008"/>
-        </w:numPr>
-        <w:pStyle w:val="Compact"/>
-      </w:pPr>
-      <w:r>
-        <w:t xml:space="preserve">Skrip Vivado di tclsh dengan stub: nilai kunci konsisten dengan RTL dan</w:t>
-      </w:r>
-      <w:r>
-        <w:t xml:space="preserve"> </w:t>
-      </w:r>
-      <w:r>
-        <w:t xml:space="preserve">host, 4 kondisi error memberi pesan jelas.</w:t>
-      </w:r>
-    </w:p>
-    <w:p>
-      <w:pPr>
-        <w:numPr>
-          <w:ilvl w:val="0"/>
-          <w:numId w:val="1007"/>
-        </w:numPr>
-        <w:pStyle w:val="Compact"/>
-      </w:pPr>
-      <w:r>
-        <w:rPr>
           <w:bCs/>
           <w:b/>
         </w:rPr>
@@ -3753,7 +3914,7 @@
         <w:t xml:space="preserve"> </w:t>
       </w:r>
       <w:r>
-        <w:t xml:space="preserve">build Vivado 2026.1 (lulus) dan</w:t>
+        <w:t xml:space="preserve">build Vivado 2026.1 (lulus),</w:t>
       </w:r>
       <w:r>
         <w:t xml:space="preserve"> </w:t>
@@ -3771,23 +3932,31 @@
         <w:t xml:space="preserve">pl.dtsi</w:t>
       </w:r>
       <w:r>
-        <w:t xml:space="preserve">.</w:t>
-      </w:r>
-    </w:p>
-    <w:p>
-      <w:pPr>
-        <w:numPr>
-          <w:ilvl w:val="0"/>
-          <w:numId w:val="1007"/>
-        </w:numPr>
-        <w:pStyle w:val="Compact"/>
+        <w:t xml:space="preserve">, dan uji di board (tabel berikut).</w:t>
+      </w:r>
+    </w:p>
+    <w:p>
+      <w:pPr>
+        <w:pStyle w:val="FirstParagraph"/>
       </w:pPr>
       <w:r>
         <w:rPr>
           <w:bCs/>
           <w:b/>
         </w:rPr>
-        <w:t xml:space="preserve">Tidak tercakup:</w:t>
+        <w:t xml:space="preserve">Hasil board KV260</w:t>
+      </w:r>
+      <w:r>
+        <w:t xml:space="preserve"> </w:t>
+      </w:r>
+      <w:r>
+        <w:t xml:space="preserve">(22 Oktober 2026; dijalankan dan dilaporkan pengguna;</w:t>
+      </w:r>
+      <w:r>
+        <w:t xml:space="preserve"> </w:t>
+      </w:r>
+      <w:r>
+        <w:t xml:space="preserve">bitstream build pertama, sebelum</w:t>
       </w:r>
       <w:r>
         <w:t xml:space="preserve"> </w:t>
@@ -3796,61 +3965,19 @@
         <w:rPr>
           <w:rStyle w:val="VerbatimChar"/>
         </w:rPr>
-        <w:t xml:space="preserve">/dev/mem</w:t>
-      </w:r>
-      <w:r>
-        <w:t xml:space="preserve"> </w:t>
-      </w:r>
-      <w:r>
-        <w:t xml:space="preserve">dan PS, pemuatan overlay, dan semua perilaku</w:t>
-      </w:r>
-      <w:r>
-        <w:t xml:space="preserve"> </w:t>
-      </w:r>
-      <w:r>
-        <w:t xml:space="preserve">di board.</w:t>
-      </w:r>
-    </w:p>
-    <w:bookmarkEnd w:id="27"/>
-    <w:bookmarkStart w:id="28" w:name="guard-keamanan-di-tingkat-sistem"/>
-    <w:p>
-      <w:pPr>
-        <w:pStyle w:val="Heading1"/>
-      </w:pPr>
-      <w:r>
-        <w:t xml:space="preserve">6. Guard: keamanan di tingkat sistem</w:t>
-      </w:r>
-    </w:p>
-    <w:p>
-      <w:pPr>
-        <w:pStyle w:val="FirstParagraph"/>
-      </w:pPr>
-      <w:r>
-        <w:rPr>
-          <w:rStyle w:val="VerbatimChar"/>
-        </w:rPr>
-        <w:t xml:space="preserve">guard.v</w:t>
-      </w:r>
-      <w:r>
-        <w:t xml:space="preserve"> </w:t>
-      </w:r>
-      <w:r>
-        <w:t xml:space="preserve">mengendalikan izin bus. Setiap reset melakukan zeroize sebelum</w:t>
-      </w:r>
-      <w:r>
-        <w:t xml:space="preserve"> </w:t>
-      </w:r>
-      <w:r>
-        <w:t xml:space="preserve">perangkat bisa dipakai (</w:t>
-      </w:r>
-      <w:r>
-        <w:rPr>
-          <w:rStyle w:val="VerbatimChar"/>
-        </w:rPr>
-        <w:t xml:space="preserve">docs/rtl_guard.md</w:t>
-      </w:r>
-      <w:r>
-        <w:t xml:space="preserve">).</w:t>
+        <w:t xml:space="preserve">fsm_encoding</w:t>
+      </w:r>
+      <w:r>
+        <w:t xml:space="preserve"> </w:t>
+      </w:r>
+      <w:r>
+        <w:t xml:space="preserve">ditambahkan di PR #13). Output</w:t>
+      </w:r>
+      <w:r>
+        <w:t xml:space="preserve"> </w:t>
+      </w:r>
+      <w:r>
+        <w:t xml:space="preserve">perintah dikutip apa adanya:</w:t>
       </w:r>
     </w:p>
     <w:tbl>
@@ -3876,19 +4003,19 @@
               <w:jc w:val="left"/>
             </w:pPr>
             <w:r>
-              <w:t xml:space="preserve">Fungsi</w:t>
-            </w:r>
-          </w:p>
-        </w:tc>
-        <w:tc>
-          <w:tcPr/>
-          <w:p>
-            <w:pPr>
-              <w:pStyle w:val="Compact"/>
-              <w:jc w:val="left"/>
-            </w:pPr>
-            <w:r>
-              <w:t xml:space="preserve">Perilaku</w:t>
+              <w:t xml:space="preserve">Butir</w:t>
+            </w:r>
+          </w:p>
+        </w:tc>
+        <w:tc>
+          <w:tcPr/>
+          <w:p>
+            <w:pPr>
+              <w:pStyle w:val="Compact"/>
+              <w:jc w:val="left"/>
+            </w:pPr>
+            <w:r>
+              <w:t xml:space="preserve">Hasil</w:t>
             </w:r>
           </w:p>
         </w:tc>
@@ -3902,19 +4029,58 @@
               <w:jc w:val="left"/>
             </w:pPr>
             <w:r>
-              <w:t xml:space="preserve">Pembatas percobaan</w:t>
-            </w:r>
-          </w:p>
-        </w:tc>
-        <w:tc>
-          <w:tcPr/>
-          <w:p>
-            <w:pPr>
-              <w:pStyle w:val="Compact"/>
-              <w:jc w:val="left"/>
-            </w:pPr>
-            <w:r>
-              <w:t xml:space="preserve">K = 5 NO_MATCH berturut-turut → LOUT (keluar hanya lewat reset); MATCH menolkan penghitung</w:t>
+              <w:rPr>
+                <w:rStyle w:val="VerbatimChar"/>
+              </w:rPr>
+              <w:t xml:space="preserve">xmutil loadapp padan</w:t>
+            </w:r>
+          </w:p>
+        </w:tc>
+        <w:tc>
+          <w:tcPr/>
+          <w:p>
+            <w:pPr>
+              <w:pStyle w:val="Compact"/>
+              <w:jc w:val="left"/>
+            </w:pPr>
+            <w:r>
+              <w:rPr>
+                <w:rStyle w:val="VerbatimChar"/>
+              </w:rPr>
+              <w:t xml:space="preserve">padan: loaded to slot 0</w:t>
+            </w:r>
+            <w:r>
+              <w:t xml:space="preserve">;</w:t>
+            </w:r>
+            <w:r>
+              <w:t xml:space="preserve"> </w:t>
+            </w:r>
+            <w:r>
+              <w:rPr>
+                <w:rStyle w:val="VerbatimChar"/>
+              </w:rPr>
+              <w:t xml:space="preserve">listapps</w:t>
+            </w:r>
+            <w:r>
+              <w:t xml:space="preserve"> </w:t>
+            </w:r>
+            <w:r>
+              <w:t xml:space="preserve">menunjukkan</w:t>
+            </w:r>
+            <w:r>
+              <w:t xml:space="preserve"> </w:t>
+            </w:r>
+            <w:r>
+              <w:rPr>
+                <w:rStyle w:val="VerbatimChar"/>
+              </w:rPr>
+              <w:t xml:space="preserve">padan</w:t>
+            </w:r>
+            <w:r>
+              <w:t xml:space="preserve"> </w:t>
+            </w:r>
+            <w:r>
+              <w:t xml:space="preserve">di slot 0</w:t>
             </w:r>
           </w:p>
         </w:tc>
@@ -3928,19 +4094,49 @@
               <w:jc w:val="left"/>
             </w:pPr>
             <w:r>
-              <w:t xml:space="preserve">LOCK</w:t>
-            </w:r>
-          </w:p>
-        </w:tc>
-        <w:tc>
-          <w:tcPr/>
-          <w:p>
-            <w:pPr>
-              <w:pStyle w:val="Compact"/>
-              <w:jc w:val="left"/>
-            </w:pPr>
-            <w:r>
-              <w:t xml:space="preserve">Setelah LOCK, template tidak bisa ditulis atau dihapus; probe dan MATCH tetap bisa</w:t>
+              <w:rPr>
+                <w:rStyle w:val="VerbatimChar"/>
+              </w:rPr>
+              <w:t xml:space="preserve">dmesg</w:t>
+            </w:r>
+          </w:p>
+        </w:tc>
+        <w:tc>
+          <w:tcPr/>
+          <w:p>
+            <w:pPr>
+              <w:pStyle w:val="Compact"/>
+              <w:jc w:val="left"/>
+            </w:pPr>
+            <w:r>
+              <w:t xml:space="preserve">Peringatan overlay</w:t>
+            </w:r>
+            <w:r>
+              <w:t xml:space="preserve"> </w:t>
+            </w:r>
+            <w:r>
+              <w:t xml:space="preserve">“</w:t>
+            </w:r>
+            <w:r>
+              <w:t xml:space="preserve">memory leak will occur if overlay removed</w:t>
+            </w:r>
+            <w:r>
+              <w:t xml:space="preserve">”</w:t>
+            </w:r>
+            <w:r>
+              <w:t xml:space="preserve"> </w:t>
+            </w:r>
+            <w:r>
+              <w:t xml:space="preserve">(umum, tidak berbahaya [Kemungkinan Besar]); pada pemuatan pertama</w:t>
+            </w:r>
+            <w:r>
+              <w:t xml:space="preserve"> </w:t>
+            </w:r>
+            <w:r>
+              <w:rPr>
+                <w:rStyle w:val="VerbatimChar"/>
+              </w:rPr>
+              <w:t xml:space="preserve">set divider failed for pl0_ref_div1, ret = -13</w:t>
             </w:r>
           </w:p>
         </w:tc>
@@ -3954,19 +4150,43 @@
               <w:jc w:val="left"/>
             </w:pPr>
             <w:r>
-              <w:t xml:space="preserve">τ terkunci</w:t>
-            </w:r>
-          </w:p>
-        </w:tc>
-        <w:tc>
-          <w:tcPr/>
-          <w:p>
-            <w:pPr>
-              <w:pStyle w:val="Compact"/>
-              <w:jc w:val="left"/>
-            </w:pPr>
-            <w:r>
-              <w:t xml:space="preserve">Di LOCKD, decision memakai GUARD_TAU, bukan τ dari host</w:t>
+              <w:rPr>
+                <w:rStyle w:val="VerbatimChar"/>
+              </w:rPr>
+              <w:t xml:space="preserve">clk_summary</w:t>
+            </w:r>
+          </w:p>
+        </w:tc>
+        <w:tc>
+          <w:tcPr/>
+          <w:p>
+            <w:pPr>
+              <w:pStyle w:val="Compact"/>
+              <w:jc w:val="left"/>
+            </w:pPr>
+            <w:r>
+              <w:rPr>
+                <w:rStyle w:val="VerbatimChar"/>
+              </w:rPr>
+              <w:t xml:space="preserve">pl0_ref</w:t>
+            </w:r>
+            <w:r>
+              <w:t xml:space="preserve"> </w:t>
+            </w:r>
+            <w:r>
+              <w:t xml:space="preserve">99.999.999 Hz (</w:t>
+            </w:r>
+            <w:r>
+              <w:rPr>
+                <w:rStyle w:val="VerbatimChar"/>
+              </w:rPr>
+              <w:t xml:space="preserve">pl0_ref_mux</w:t>
+            </w:r>
+            <w:r>
+              <w:t xml:space="preserve"> </w:t>
+            </w:r>
+            <w:r>
+              <w:t xml:space="preserve">1.499.999.985 Hz ÷ 15), aktif</w:t>
             </w:r>
           </w:p>
         </w:tc>
@@ -3980,19 +4200,28 @@
               <w:jc w:val="left"/>
             </w:pPr>
             <w:r>
-              <w:t xml:space="preserve">FAULT</w:t>
-            </w:r>
-          </w:p>
-        </w:tc>
-        <w:tc>
-          <w:tcPr/>
-          <w:p>
-            <w:pPr>
-              <w:pStyle w:val="Compact"/>
-              <w:jc w:val="left"/>
-            </w:pPr>
-            <w:r>
-              <w:t xml:space="preserve">Penghitung kumulatif; FAULT ke-3 → zeroize → HALT</w:t>
+              <w:t xml:space="preserve">GUARD_STATUS awal</w:t>
+            </w:r>
+          </w:p>
+        </w:tc>
+        <w:tc>
+          <w:tcPr/>
+          <w:p>
+            <w:pPr>
+              <w:pStyle w:val="Compact"/>
+              <w:jc w:val="left"/>
+            </w:pPr>
+            <w:r>
+              <w:rPr>
+                <w:rStyle w:val="VerbatimChar"/>
+              </w:rPr>
+              <w:t xml:space="preserve">0x00000503</w:t>
+            </w:r>
+            <w:r>
+              <w:t xml:space="preserve"> </w:t>
+            </w:r>
+            <w:r>
+              <w:t xml:space="preserve">(OPEN, gagal 0/5, alasan BOOT)</w:t>
             </w:r>
           </w:p>
         </w:tc>
@@ -4006,19 +4235,31 @@
               <w:jc w:val="left"/>
             </w:pPr>
             <w:r>
-              <w:t xml:space="preserve">Tamper</w:t>
-            </w:r>
-          </w:p>
-        </w:tc>
-        <w:tc>
-          <w:tcPr/>
-          <w:p>
-            <w:pPr>
-              <w:pStyle w:val="Compact"/>
-              <w:jc w:val="left"/>
-            </w:pPr>
-            <w:r>
-              <w:t xml:space="preserve">Pin PMOD J2 (KV260), sinkronisasi 2-FF → zeroize → HALT</w:t>
+              <w:rPr>
+                <w:rStyle w:val="VerbatimChar"/>
+              </w:rPr>
+              <w:t xml:space="preserve">padan_test.py</w:t>
+            </w:r>
+            <w:r>
+              <w:t xml:space="preserve"> </w:t>
+            </w:r>
+            <w:r>
+              <w:t xml:space="preserve">run 1</w:t>
+            </w:r>
+          </w:p>
+        </w:tc>
+        <w:tc>
+          <w:tcPr/>
+          <w:p>
+            <w:pPr>
+              <w:pStyle w:val="Compact"/>
+              <w:jc w:val="left"/>
+            </w:pPr>
+            <w:r>
+              <w:rPr>
+                <w:rStyle w:val="VerbatimChar"/>
+              </w:rPr>
+              <w:t xml:space="preserve">PADAN KV260: PASS (46 kasus, 3 galeri, pindai alamat bersih)</w:t>
             </w:r>
           </w:p>
         </w:tc>
@@ -4032,171 +4273,103 @@
               <w:jc w:val="left"/>
             </w:pPr>
             <w:r>
-              <w:t xml:space="preserve">Safe-state</w:t>
-            </w:r>
-          </w:p>
-        </w:tc>
-        <w:tc>
-          <w:tcPr/>
-          <w:p>
-            <w:pPr>
-              <w:pStyle w:val="Compact"/>
-              <w:jc w:val="left"/>
-            </w:pPr>
-            <w:r>
-              <w:t xml:space="preserve">State 4 bit berparitas genap; kode ilegal atau ketidakcocokan penghitung/komplemen → zeroize → HALT</w:t>
+              <w:rPr>
+                <w:rStyle w:val="VerbatimChar"/>
+              </w:rPr>
+              <w:t xml:space="preserve">padan_test.py</w:t>
+            </w:r>
+            <w:r>
+              <w:t xml:space="preserve"> </w:t>
+            </w:r>
+            <w:r>
+              <w:t xml:space="preserve">run 2 (</w:t>
+            </w:r>
+            <w:r>
+              <w:rPr>
+                <w:rStyle w:val="VerbatimChar"/>
+              </w:rPr>
+              <w:t xml:space="preserve">timeout 120</w:t>
+            </w:r>
+            <w:r>
+              <w:t xml:space="preserve">)</w:t>
+            </w:r>
+          </w:p>
+        </w:tc>
+        <w:tc>
+          <w:tcPr/>
+          <w:p>
+            <w:pPr>
+              <w:pStyle w:val="Compact"/>
+              <w:jc w:val="left"/>
+            </w:pPr>
+            <w:r>
+              <w:t xml:space="preserve">PASS yang sama,</w:t>
+            </w:r>
+            <w:r>
+              <w:t xml:space="preserve"> </w:t>
+            </w:r>
+            <w:r>
+              <w:rPr>
+                <w:rStyle w:val="VerbatimChar"/>
+              </w:rPr>
+              <w:t xml:space="preserve">exit 0</w:t>
+            </w:r>
+          </w:p>
+        </w:tc>
+      </w:tr>
+      <w:tr>
+        <w:tc>
+          <w:tcPr/>
+          <w:p>
+            <w:pPr>
+              <w:pStyle w:val="Compact"/>
+              <w:jc w:val="left"/>
+            </w:pPr>
+            <w:r>
+              <w:t xml:space="preserve">Uji tamper PMOD</w:t>
+            </w:r>
+          </w:p>
+        </w:tc>
+        <w:tc>
+          <w:tcPr/>
+          <w:p>
+            <w:pPr>
+              <w:pStyle w:val="Compact"/>
+              <w:jc w:val="left"/>
+            </w:pPr>
+            <w:r>
+              <w:t xml:space="preserve">belum</w:t>
+            </w:r>
+          </w:p>
+        </w:tc>
+      </w:tr>
+      <w:tr>
+        <w:tc>
+          <w:tcPr/>
+          <w:p>
+            <w:pPr>
+              <w:pStyle w:val="Compact"/>
+              <w:jc w:val="left"/>
+            </w:pPr>
+            <w:r>
+              <w:t xml:space="preserve">Bitstream RTL terbaru (PR #13)</w:t>
+            </w:r>
+          </w:p>
+        </w:tc>
+        <w:tc>
+          <w:tcPr/>
+          <w:p>
+            <w:pPr>
+              <w:pStyle w:val="Compact"/>
+              <w:jc w:val="left"/>
+            </w:pPr>
+            <w:r>
+              <w:t xml:space="preserve">belum</w:t>
             </w:r>
           </w:p>
         </w:tc>
       </w:tr>
     </w:tbl>
-    <w:p>
-      <w:pPr>
-        <w:pStyle w:val="BodyText"/>
-      </w:pPr>
-      <w:r>
-        <w:rPr>
-          <w:bCs/>
-          <w:b/>
-        </w:rPr>
-        <w:t xml:space="preserve">τ terkunci tidak ada di spesifikasi awal.</w:t>
-      </w:r>
-      <w:r>
-        <w:t xml:space="preserve"> </w:t>
-      </w:r>
-      <w:r>
-        <w:t xml:space="preserve">Tanpanya, host cukup menulis</w:t>
-      </w:r>
-      <w:r>
-        <w:t xml:space="preserve"> </w:t>
-      </w:r>
-      <w:r>
-        <w:t xml:space="preserve">τ = −2^31 untuk mendapat MATCH dan menolkan penghitung, sehingga pembatas</w:t>
-      </w:r>
-      <w:r>
-        <w:t xml:space="preserve"> </w:t>
-      </w:r>
-      <w:r>
-        <w:t xml:space="preserve">percobaan tidak berarti. [Pasti]</w:t>
-      </w:r>
-    </w:p>
-    <w:p>
-      <w:pPr>
-        <w:numPr>
-          <w:ilvl w:val="0"/>
-          <w:numId w:val="1009"/>
-        </w:numPr>
-        <w:pStyle w:val="Compact"/>
-      </w:pPr>
-      <w:r>
-        <w:t xml:space="preserve">9 test dengan parameter rilis. Zeroize dibuktikan dengan memindai seluruh</w:t>
-      </w:r>
-      <w:r>
-        <w:t xml:space="preserve"> </w:t>
-      </w:r>
-      <w:r>
-        <w:t xml:space="preserve">16 × 144 word memori dan register probe di simulasi.</w:t>
-      </w:r>
-    </w:p>
-    <w:p>
-      <w:pPr>
-        <w:numPr>
-          <w:ilvl w:val="0"/>
-          <w:numId w:val="1009"/>
-        </w:numPr>
-        <w:pStyle w:val="Compact"/>
-      </w:pPr>
-      <w:r>
-        <w:t xml:space="preserve">Bukti SAT Yosys setelah sintesis: setiap state ilegal mematikan semua izin dan</w:t>
-      </w:r>
-      <w:r>
-        <w:t xml:space="preserve"> </w:t>
-      </w:r>
-      <w:r>
-        <w:t xml:space="preserve">menuju zeroize; ada kontrol negatif.</w:t>
-      </w:r>
-    </w:p>
-    <w:p>
-      <w:pPr>
-        <w:numPr>
-          <w:ilvl w:val="0"/>
-          <w:numId w:val="1009"/>
-        </w:numPr>
-        <w:pStyle w:val="Compact"/>
-      </w:pPr>
-      <w:r>
-        <w:t xml:space="preserve">12 mutan guard terbunuh, termasuk clear yang melewatkan baris checksum dan</w:t>
-      </w:r>
-      <w:r>
-        <w:t xml:space="preserve"> </w:t>
-      </w:r>
-      <w:r>
-        <w:t xml:space="preserve">sinkronisasi tamper 1-FF.</w:t>
-      </w:r>
-    </w:p>
-    <w:bookmarkEnd w:id="28"/>
-    <w:bookmarkStart w:id="29" w:name="injeksi-fault-debug-debug_fault"/>
-    <w:p>
-      <w:pPr>
-        <w:pStyle w:val="Heading1"/>
-      </w:pPr>
-      <w:r>
-        <w:t xml:space="preserve">7. Injeksi fault debug (DEBUG_FAULT)</w:t>
-      </w:r>
-    </w:p>
-    <w:p>
-      <w:pPr>
-        <w:pStyle w:val="FirstParagraph"/>
-      </w:pPr>
-      <w:r>
-        <w:t xml:space="preserve">Build debug punya register DBG_FAULT untuk menambahkan delta ke produk satu</w:t>
-      </w:r>
-      <w:r>
-        <w:t xml:space="preserve"> </w:t>
-      </w:r>
-      <w:r>
-        <w:t xml:space="preserve">lane, serta DBG_ABFT untuk membaca hasil lokalisasi. Build rilis</w:t>
-      </w:r>
-      <w:r>
-        <w:t xml:space="preserve"> </w:t>
-      </w:r>
-      <w:r>
-        <w:rPr>
-          <w:bCs/>
-          <w:b/>
-        </w:rPr>
-        <w:t xml:space="preserve">tidak</w:t>
-      </w:r>
-      <w:r>
-        <w:rPr>
-          <w:bCs/>
-          <w:b/>
-        </w:rPr>
-        <w:t xml:space="preserve"> </w:t>
-      </w:r>
-      <w:r>
-        <w:rPr>
-          <w:bCs/>
-          <w:b/>
-        </w:rPr>
-        <w:t xml:space="preserve">memuat</w:t>
-      </w:r>
-      <w:r>
-        <w:t xml:space="preserve"> </w:t>
-      </w:r>
-      <w:r>
-        <w:t xml:space="preserve">port, register, atau logikanya (</w:t>
-      </w:r>
-      <w:r>
-        <w:rPr>
-          <w:rStyle w:val="VerbatimChar"/>
-        </w:rPr>
-        <w:t xml:space="preserve">docs/rtl_debug_fault.md</w:t>
-      </w:r>
-      <w:r>
-        <w:t xml:space="preserve">).</w:t>
-      </w:r>
-    </w:p>
     <w:p>
       <w:pPr>
         <w:numPr>
@@ -4210,25 +4383,46 @@
           <w:bCs/>
           <w:b/>
         </w:rPr>
-        <w:t xml:space="preserve">Delta aditif, bukan pengganti.</w:t>
-      </w:r>
-      <w:r>
-        <w:t xml:space="preserve"> </w:t>
-      </w:r>
-      <w:r>
-        <w:t xml:space="preserve">Dengan delta aditif, residu ABFT hanya</w:t>
-      </w:r>
-      <w:r>
-        <w:t xml:space="preserve"> </w:t>
-      </w:r>
-      <w:r>
-        <w:t xml:space="preserve">bergantung pada delta dan baris. Dengan nilai pengganti, residu membocorkan</w:t>
-      </w:r>
-      <w:r>
-        <w:t xml:space="preserve"> </w:t>
-      </w:r>
-      <w:r>
-        <w:t xml:space="preserve">T·p. [Pasti, aljabar]</w:t>
+        <w:t xml:space="preserve">Error divider clock tidak berdampak:</w:t>
+      </w:r>
+      <w:r>
+        <w:t xml:space="preserve"> </w:t>
+      </w:r>
+      <w:r>
+        <w:t xml:space="preserve">frekuensi akhirnya sesuai permintaan</w:t>
+      </w:r>
+      <w:r>
+        <w:t xml:space="preserve"> </w:t>
+      </w:r>
+      <w:r>
+        <w:rPr>
+          <w:rStyle w:val="VerbatimChar"/>
+        </w:rPr>
+        <w:t xml:space="preserve">pl.dtsi</w:t>
+      </w:r>
+      <w:r>
+        <w:t xml:space="preserve"> </w:t>
+      </w:r>
+      <w:r>
+        <w:t xml:space="preserve">dan tidak melebihi 100 MHz, sehingga margin timing Vivado tetap</w:t>
+      </w:r>
+      <w:r>
+        <w:t xml:space="preserve"> </w:t>
+      </w:r>
+      <w:r>
+        <w:t xml:space="preserve">berlaku [Pasti, dari</w:t>
+      </w:r>
+      <w:r>
+        <w:t xml:space="preserve"> </w:t>
+      </w:r>
+      <w:r>
+        <w:rPr>
+          <w:rStyle w:val="VerbatimChar"/>
+        </w:rPr>
+        <w:t xml:space="preserve">clk_summary</w:t>
+      </w:r>
+      <w:r>
+        <w:t xml:space="preserve">].</w:t>
       </w:r>
     </w:p>
     <w:p>
@@ -4240,13 +4434,38 @@
         <w:pStyle w:val="Compact"/>
       </w:pPr>
       <w:r>
-        <w:t xml:space="preserve">288 injeksi (16 lane × 18 baris): semuanya FAULT; 256 dilokalisasi ke</w:t>
-      </w:r>
-      <w:r>
-        <w:t xml:space="preserve"> </w:t>
-      </w:r>
-      <w:r>
-        <w:t xml:space="preserve">barisnya, 32 terdeteksi di baris checksum.</w:t>
+        <w:rPr>
+          <w:bCs/>
+          <w:b/>
+        </w:rPr>
+        <w:t xml:space="preserve">Satu run yang dihentikan dengan Ctrl+C</w:t>
+      </w:r>
+      <w:r>
+        <w:t xml:space="preserve"> </w:t>
+      </w:r>
+      <w:r>
+        <w:t xml:space="preserve">(exit 130) tidak dihitung. Run</w:t>
+      </w:r>
+      <w:r>
+        <w:t xml:space="preserve"> </w:t>
+      </w:r>
+      <w:r>
+        <w:t xml:space="preserve">ulang dengan</w:t>
+      </w:r>
+      <w:r>
+        <w:t xml:space="preserve"> </w:t>
+      </w:r>
+      <w:r>
+        <w:rPr>
+          <w:rStyle w:val="VerbatimChar"/>
+        </w:rPr>
+        <w:t xml:space="preserve">timeout</w:t>
+      </w:r>
+      <w:r>
+        <w:t xml:space="preserve"> </w:t>
+      </w:r>
+      <w:r>
+        <w:t xml:space="preserve">lulus.</w:t>
       </w:r>
     </w:p>
     <w:p>
@@ -4254,6 +4473,521 @@
         <w:numPr>
           <w:ilvl w:val="0"/>
           <w:numId w:val="1010"/>
+        </w:numPr>
+        <w:pStyle w:val="Compact"/>
+      </w:pPr>
+      <w:r>
+        <w:rPr>
+          <w:bCs/>
+          <w:b/>
+        </w:rPr>
+        <w:t xml:space="preserve">Yang terbukti:</w:t>
+      </w:r>
+      <w:r>
+        <w:t xml:space="preserve"> </w:t>
+      </w:r>
+      <w:r>
+        <w:t xml:space="preserve">jalur PS → SmartConnect →</w:t>
+      </w:r>
+      <w:r>
+        <w:t xml:space="preserve"> </w:t>
+      </w:r>
+      <w:r>
+        <w:rPr>
+          <w:rStyle w:val="VerbatimChar"/>
+        </w:rPr>
+        <w:t xml:space="preserve">padan_axil</w:t>
+      </w:r>
+      <w:r>
+        <w:t xml:space="preserve"> </w:t>
+      </w:r>
+      <w:r>
+        <w:t xml:space="preserve">→ inti, 46</w:t>
+      </w:r>
+      <w:r>
+        <w:t xml:space="preserve"> </w:t>
+      </w:r>
+      <w:r>
+        <w:t xml:space="preserve">keputusan yang sama dengan model, dan pindai 1.024 alamat yang bersih.</w:t>
+      </w:r>
+      <w:r>
+        <w:t xml:space="preserve"> </w:t>
+      </w:r>
+      <w:r>
+        <w:t xml:space="preserve">Hasilnya hanya berlaku untuk board, bitstream, dan versi repo itu.</w:t>
+      </w:r>
+    </w:p>
+    <w:p>
+      <w:pPr>
+        <w:numPr>
+          <w:ilvl w:val="0"/>
+          <w:numId w:val="1010"/>
+        </w:numPr>
+        <w:pStyle w:val="Compact"/>
+      </w:pPr>
+      <w:r>
+        <w:rPr>
+          <w:bCs/>
+          <w:b/>
+        </w:rPr>
+        <w:t xml:space="preserve">Tidak tercakup:</w:t>
+      </w:r>
+      <w:r>
+        <w:t xml:space="preserve"> </w:t>
+      </w:r>
+      <w:r>
+        <w:t xml:space="preserve">tamper fisik, zeroize memori yang sebenarnya (tidak ada</w:t>
+      </w:r>
+      <w:r>
+        <w:t xml:space="preserve"> </w:t>
+      </w:r>
+      <w:r>
+        <w:t xml:space="preserve">jalur baca template), dan perilaku di bawah fault nyata.</w:t>
+      </w:r>
+    </w:p>
+    <w:bookmarkEnd w:id="27"/>
+    <w:bookmarkStart w:id="28" w:name="guard-keamanan-di-tingkat-sistem"/>
+    <w:p>
+      <w:pPr>
+        <w:pStyle w:val="Heading1"/>
+      </w:pPr>
+      <w:r>
+        <w:t xml:space="preserve">6. Guard: keamanan di tingkat sistem</w:t>
+      </w:r>
+    </w:p>
+    <w:p>
+      <w:pPr>
+        <w:pStyle w:val="FirstParagraph"/>
+      </w:pPr>
+      <w:r>
+        <w:rPr>
+          <w:rStyle w:val="VerbatimChar"/>
+        </w:rPr>
+        <w:t xml:space="preserve">guard.v</w:t>
+      </w:r>
+      <w:r>
+        <w:t xml:space="preserve"> </w:t>
+      </w:r>
+      <w:r>
+        <w:t xml:space="preserve">mengendalikan izin bus. Setiap reset melakukan zeroize sebelum</w:t>
+      </w:r>
+      <w:r>
+        <w:t xml:space="preserve"> </w:t>
+      </w:r>
+      <w:r>
+        <w:t xml:space="preserve">perangkat bisa dipakai (</w:t>
+      </w:r>
+      <w:r>
+        <w:rPr>
+          <w:rStyle w:val="VerbatimChar"/>
+        </w:rPr>
+        <w:t xml:space="preserve">docs/rtl_guard.md</w:t>
+      </w:r>
+      <w:r>
+        <w:t xml:space="preserve">).</w:t>
+      </w:r>
+    </w:p>
+    <w:tbl>
+      <w:tblPr>
+        <w:tblStyle w:val="Table"/>
+        <w:tblW w:type="pct" w:w="5000"/>
+        <w:tblLook w:firstRow="1" w:lastRow="0" w:firstColumn="0" w:lastColumn="0" w:noHBand="0" w:noVBand="0" w:val="0020"/>
+        <w:jc w:val="start"/>
+      </w:tblPr>
+      <w:tblGrid>
+        <w:gridCol w:w="3960"/>
+        <w:gridCol w:w="3960"/>
+      </w:tblGrid>
+      <w:tr>
+        <w:trPr>
+          <w:tblHeader w:val="true"/>
+        </w:trPr>
+        <w:tc>
+          <w:tcPr/>
+          <w:p>
+            <w:pPr>
+              <w:pStyle w:val="Compact"/>
+              <w:jc w:val="left"/>
+            </w:pPr>
+            <w:r>
+              <w:t xml:space="preserve">Fungsi</w:t>
+            </w:r>
+          </w:p>
+        </w:tc>
+        <w:tc>
+          <w:tcPr/>
+          <w:p>
+            <w:pPr>
+              <w:pStyle w:val="Compact"/>
+              <w:jc w:val="left"/>
+            </w:pPr>
+            <w:r>
+              <w:t xml:space="preserve">Perilaku</w:t>
+            </w:r>
+          </w:p>
+        </w:tc>
+      </w:tr>
+      <w:tr>
+        <w:tc>
+          <w:tcPr/>
+          <w:p>
+            <w:pPr>
+              <w:pStyle w:val="Compact"/>
+              <w:jc w:val="left"/>
+            </w:pPr>
+            <w:r>
+              <w:t xml:space="preserve">Pembatas percobaan</w:t>
+            </w:r>
+          </w:p>
+        </w:tc>
+        <w:tc>
+          <w:tcPr/>
+          <w:p>
+            <w:pPr>
+              <w:pStyle w:val="Compact"/>
+              <w:jc w:val="left"/>
+            </w:pPr>
+            <w:r>
+              <w:t xml:space="preserve">K = 5 NO_MATCH berturut-turut → LOUT (keluar hanya lewat reset); MATCH menolkan penghitung</w:t>
+            </w:r>
+          </w:p>
+        </w:tc>
+      </w:tr>
+      <w:tr>
+        <w:tc>
+          <w:tcPr/>
+          <w:p>
+            <w:pPr>
+              <w:pStyle w:val="Compact"/>
+              <w:jc w:val="left"/>
+            </w:pPr>
+            <w:r>
+              <w:t xml:space="preserve">LOCK</w:t>
+            </w:r>
+          </w:p>
+        </w:tc>
+        <w:tc>
+          <w:tcPr/>
+          <w:p>
+            <w:pPr>
+              <w:pStyle w:val="Compact"/>
+              <w:jc w:val="left"/>
+            </w:pPr>
+            <w:r>
+              <w:t xml:space="preserve">Setelah LOCK, template tidak bisa ditulis atau dihapus; probe dan MATCH tetap bisa</w:t>
+            </w:r>
+          </w:p>
+        </w:tc>
+      </w:tr>
+      <w:tr>
+        <w:tc>
+          <w:tcPr/>
+          <w:p>
+            <w:pPr>
+              <w:pStyle w:val="Compact"/>
+              <w:jc w:val="left"/>
+            </w:pPr>
+            <w:r>
+              <w:t xml:space="preserve">τ terkunci</w:t>
+            </w:r>
+          </w:p>
+        </w:tc>
+        <w:tc>
+          <w:tcPr/>
+          <w:p>
+            <w:pPr>
+              <w:pStyle w:val="Compact"/>
+              <w:jc w:val="left"/>
+            </w:pPr>
+            <w:r>
+              <w:t xml:space="preserve">Di LOCKD, decision memakai GUARD_TAU, bukan τ dari host</w:t>
+            </w:r>
+          </w:p>
+        </w:tc>
+      </w:tr>
+      <w:tr>
+        <w:tc>
+          <w:tcPr/>
+          <w:p>
+            <w:pPr>
+              <w:pStyle w:val="Compact"/>
+              <w:jc w:val="left"/>
+            </w:pPr>
+            <w:r>
+              <w:t xml:space="preserve">FAULT</w:t>
+            </w:r>
+          </w:p>
+        </w:tc>
+        <w:tc>
+          <w:tcPr/>
+          <w:p>
+            <w:pPr>
+              <w:pStyle w:val="Compact"/>
+              <w:jc w:val="left"/>
+            </w:pPr>
+            <w:r>
+              <w:t xml:space="preserve">Penghitung kumulatif; FAULT ke-3 → zeroize → HALT</w:t>
+            </w:r>
+          </w:p>
+        </w:tc>
+      </w:tr>
+      <w:tr>
+        <w:tc>
+          <w:tcPr/>
+          <w:p>
+            <w:pPr>
+              <w:pStyle w:val="Compact"/>
+              <w:jc w:val="left"/>
+            </w:pPr>
+            <w:r>
+              <w:t xml:space="preserve">Tamper</w:t>
+            </w:r>
+          </w:p>
+        </w:tc>
+        <w:tc>
+          <w:tcPr/>
+          <w:p>
+            <w:pPr>
+              <w:pStyle w:val="Compact"/>
+              <w:jc w:val="left"/>
+            </w:pPr>
+            <w:r>
+              <w:t xml:space="preserve">Pin PMOD J2 (KV260), sinkronisasi 2-FF → zeroize → HALT</w:t>
+            </w:r>
+          </w:p>
+        </w:tc>
+      </w:tr>
+      <w:tr>
+        <w:tc>
+          <w:tcPr/>
+          <w:p>
+            <w:pPr>
+              <w:pStyle w:val="Compact"/>
+              <w:jc w:val="left"/>
+            </w:pPr>
+            <w:r>
+              <w:t xml:space="preserve">Safe-state</w:t>
+            </w:r>
+          </w:p>
+        </w:tc>
+        <w:tc>
+          <w:tcPr/>
+          <w:p>
+            <w:pPr>
+              <w:pStyle w:val="Compact"/>
+              <w:jc w:val="left"/>
+            </w:pPr>
+            <w:r>
+              <w:t xml:space="preserve">State 4 bit berparitas genap; kode ilegal atau ketidakcocokan penghitung/komplemen → zeroize → HALT</w:t>
+            </w:r>
+          </w:p>
+        </w:tc>
+      </w:tr>
+    </w:tbl>
+    <w:p>
+      <w:pPr>
+        <w:pStyle w:val="BodyText"/>
+      </w:pPr>
+      <w:r>
+        <w:rPr>
+          <w:bCs/>
+          <w:b/>
+        </w:rPr>
+        <w:t xml:space="preserve">τ terkunci tidak ada di spesifikasi awal.</w:t>
+      </w:r>
+      <w:r>
+        <w:t xml:space="preserve"> </w:t>
+      </w:r>
+      <w:r>
+        <w:t xml:space="preserve">Tanpanya, host cukup menulis</w:t>
+      </w:r>
+      <w:r>
+        <w:t xml:space="preserve"> </w:t>
+      </w:r>
+      <w:r>
+        <w:t xml:space="preserve">τ = −2^31 untuk mendapat MATCH dan menolkan penghitung, sehingga pembatas</w:t>
+      </w:r>
+      <w:r>
+        <w:t xml:space="preserve"> </w:t>
+      </w:r>
+      <w:r>
+        <w:t xml:space="preserve">percobaan tidak berarti. [Pasti]</w:t>
+      </w:r>
+    </w:p>
+    <w:p>
+      <w:pPr>
+        <w:numPr>
+          <w:ilvl w:val="0"/>
+          <w:numId w:val="1011"/>
+        </w:numPr>
+        <w:pStyle w:val="Compact"/>
+      </w:pPr>
+      <w:r>
+        <w:t xml:space="preserve">9 test dengan parameter rilis. Zeroize dibuktikan dengan memindai seluruh</w:t>
+      </w:r>
+      <w:r>
+        <w:t xml:space="preserve"> </w:t>
+      </w:r>
+      <w:r>
+        <w:t xml:space="preserve">16 × 144 word memori dan register probe di simulasi.</w:t>
+      </w:r>
+    </w:p>
+    <w:p>
+      <w:pPr>
+        <w:numPr>
+          <w:ilvl w:val="0"/>
+          <w:numId w:val="1011"/>
+        </w:numPr>
+        <w:pStyle w:val="Compact"/>
+      </w:pPr>
+      <w:r>
+        <w:t xml:space="preserve">Bukti SAT Yosys setelah sintesis: setiap state ilegal mematikan semua izin dan</w:t>
+      </w:r>
+      <w:r>
+        <w:t xml:space="preserve"> </w:t>
+      </w:r>
+      <w:r>
+        <w:t xml:space="preserve">menuju zeroize; ada kontrol negatif.</w:t>
+      </w:r>
+    </w:p>
+    <w:p>
+      <w:pPr>
+        <w:numPr>
+          <w:ilvl w:val="0"/>
+          <w:numId w:val="1011"/>
+        </w:numPr>
+        <w:pStyle w:val="Compact"/>
+      </w:pPr>
+      <w:r>
+        <w:t xml:space="preserve">12 mutan guard terbunuh, termasuk clear yang melewatkan baris checksum dan</w:t>
+      </w:r>
+      <w:r>
+        <w:t xml:space="preserve"> </w:t>
+      </w:r>
+      <w:r>
+        <w:t xml:space="preserve">sinkronisasi tamper 1-FF.</w:t>
+      </w:r>
+    </w:p>
+    <w:bookmarkEnd w:id="28"/>
+    <w:bookmarkStart w:id="29" w:name="injeksi-fault-debug-debug_fault"/>
+    <w:p>
+      <w:pPr>
+        <w:pStyle w:val="Heading1"/>
+      </w:pPr>
+      <w:r>
+        <w:t xml:space="preserve">7. Injeksi fault debug (DEBUG_FAULT)</w:t>
+      </w:r>
+    </w:p>
+    <w:p>
+      <w:pPr>
+        <w:pStyle w:val="FirstParagraph"/>
+      </w:pPr>
+      <w:r>
+        <w:t xml:space="preserve">Build debug punya register DBG_FAULT untuk menambahkan delta ke produk satu</w:t>
+      </w:r>
+      <w:r>
+        <w:t xml:space="preserve"> </w:t>
+      </w:r>
+      <w:r>
+        <w:t xml:space="preserve">lane, serta DBG_ABFT untuk membaca hasil lokalisasi. Build rilis</w:t>
+      </w:r>
+      <w:r>
+        <w:t xml:space="preserve"> </w:t>
+      </w:r>
+      <w:r>
+        <w:rPr>
+          <w:bCs/>
+          <w:b/>
+        </w:rPr>
+        <w:t xml:space="preserve">tidak</w:t>
+      </w:r>
+      <w:r>
+        <w:rPr>
+          <w:bCs/>
+          <w:b/>
+        </w:rPr>
+        <w:t xml:space="preserve"> </w:t>
+      </w:r>
+      <w:r>
+        <w:rPr>
+          <w:bCs/>
+          <w:b/>
+        </w:rPr>
+        <w:t xml:space="preserve">memuat</w:t>
+      </w:r>
+      <w:r>
+        <w:t xml:space="preserve"> </w:t>
+      </w:r>
+      <w:r>
+        <w:t xml:space="preserve">port, register, atau logikanya (</w:t>
+      </w:r>
+      <w:r>
+        <w:rPr>
+          <w:rStyle w:val="VerbatimChar"/>
+        </w:rPr>
+        <w:t xml:space="preserve">docs/rtl_debug_fault.md</w:t>
+      </w:r>
+      <w:r>
+        <w:t xml:space="preserve">).</w:t>
+      </w:r>
+    </w:p>
+    <w:p>
+      <w:pPr>
+        <w:numPr>
+          <w:ilvl w:val="0"/>
+          <w:numId w:val="1012"/>
+        </w:numPr>
+        <w:pStyle w:val="Compact"/>
+      </w:pPr>
+      <w:r>
+        <w:rPr>
+          <w:bCs/>
+          <w:b/>
+        </w:rPr>
+        <w:t xml:space="preserve">Delta aditif, bukan pengganti.</w:t>
+      </w:r>
+      <w:r>
+        <w:t xml:space="preserve"> </w:t>
+      </w:r>
+      <w:r>
+        <w:t xml:space="preserve">Dengan delta aditif, residu ABFT hanya</w:t>
+      </w:r>
+      <w:r>
+        <w:t xml:space="preserve"> </w:t>
+      </w:r>
+      <w:r>
+        <w:t xml:space="preserve">bergantung pada delta dan baris. Dengan nilai pengganti, residu membocorkan</w:t>
+      </w:r>
+      <w:r>
+        <w:t xml:space="preserve"> </w:t>
+      </w:r>
+      <w:r>
+        <w:t xml:space="preserve">T·p. [Pasti, aljabar]</w:t>
+      </w:r>
+    </w:p>
+    <w:p>
+      <w:pPr>
+        <w:numPr>
+          <w:ilvl w:val="0"/>
+          <w:numId w:val="1012"/>
+        </w:numPr>
+        <w:pStyle w:val="Compact"/>
+      </w:pPr>
+      <w:r>
+        <w:t xml:space="preserve">288 injeksi (16 lane × 18 baris): semuanya FAULT; 256 dilokalisasi ke</w:t>
+      </w:r>
+      <w:r>
+        <w:t xml:space="preserve"> </w:t>
+      </w:r>
+      <w:r>
+        <w:t xml:space="preserve">barisnya, 32 terdeteksi di baris checksum.</w:t>
+      </w:r>
+    </w:p>
+    <w:p>
+      <w:pPr>
+        <w:numPr>
+          <w:ilvl w:val="0"/>
+          <w:numId w:val="1012"/>
         </w:numPr>
         <w:pStyle w:val="Compact"/>
       </w:pPr>
@@ -5829,7 +6563,7 @@
       <w:pPr>
         <w:numPr>
           <w:ilvl w:val="0"/>
-          <w:numId w:val="1011"/>
+          <w:numId w:val="1013"/>
         </w:numPr>
         <w:pStyle w:val="Compact"/>
       </w:pPr>
@@ -5874,7 +6608,7 @@
       <w:pPr>
         <w:numPr>
           <w:ilvl w:val="1"/>
-          <w:numId w:val="1012"/>
+          <w:numId w:val="1014"/>
         </w:numPr>
         <w:pStyle w:val="Compact"/>
       </w:pPr>
@@ -5940,7 +6674,7 @@
       <w:pPr>
         <w:numPr>
           <w:ilvl w:val="1"/>
-          <w:numId w:val="1012"/>
+          <w:numId w:val="1014"/>
         </w:numPr>
         <w:pStyle w:val="Compact"/>
       </w:pPr>
@@ -5967,7 +6701,7 @@
       <w:pPr>
         <w:numPr>
           <w:ilvl w:val="1"/>
-          <w:numId w:val="1012"/>
+          <w:numId w:val="1014"/>
         </w:numPr>
         <w:pStyle w:val="Compact"/>
       </w:pPr>
@@ -5988,306 +6722,6 @@
       </w:r>
       <w:r>
         <w:t xml:space="preserve">kini menerima 16–18 DSP.</w:t>
-      </w:r>
-    </w:p>
-    <w:p>
-      <w:pPr>
-        <w:numPr>
-          <w:ilvl w:val="0"/>
-          <w:numId w:val="1011"/>
-        </w:numPr>
-        <w:pStyle w:val="Compact"/>
-      </w:pPr>
-      <w:r>
-        <w:rPr>
-          <w:rStyle w:val="VerbatimChar"/>
-          <w:bCs/>
-          <w:b/>
-        </w:rPr>
-        <w:t xml:space="preserve">guard</w:t>
-      </w:r>
-      <w:r>
-        <w:rPr>
-          <w:bCs/>
-          <w:b/>
-        </w:rPr>
-        <w:t xml:space="preserve"> </w:t>
-      </w:r>
-      <w:r>
-        <w:rPr>
-          <w:bCs/>
-          <w:b/>
-        </w:rPr>
-        <w:t xml:space="preserve">memakai 424 LUT di Vivado, sedangkan Yosys 169.</w:t>
-      </w:r>
-      <w:r>
-        <w:t xml:space="preserve"> </w:t>
-      </w:r>
-      <w:r>
-        <w:t xml:space="preserve">Netlistnya jelas</w:t>
-      </w:r>
-      <w:r>
-        <w:t xml:space="preserve"> </w:t>
-      </w:r>
-      <w:r>
-        <w:t xml:space="preserve">berbeda, dan bukti SAT safe-state hanya berlaku untuk netlist Yosys</w:t>
-      </w:r>
-      <w:r>
-        <w:t xml:space="preserve"> </w:t>
-      </w:r>
-      <w:r>
-        <w:t xml:space="preserve">(risiko 1).</w:t>
-      </w:r>
-    </w:p>
-    <w:p>
-      <w:pPr>
-        <w:numPr>
-          <w:ilvl w:val="0"/>
-          <w:numId w:val="1011"/>
-        </w:numPr>
-        <w:pStyle w:val="Compact"/>
-      </w:pPr>
-      <w:r>
-        <w:rPr>
-          <w:bCs/>
-          <w:b/>
-        </w:rPr>
-        <w:t xml:space="preserve">Timing.</w:t>
-      </w:r>
-      <w:r>
-        <w:t xml:space="preserve"> </w:t>
-      </w:r>
-      <w:r>
-        <w:t xml:space="preserve">Jalur terlambat ada di</w:t>
-      </w:r>
-      <w:r>
-        <w:t xml:space="preserve"> </w:t>
-      </w:r>
-      <w:r>
-        <w:rPr>
-          <w:rStyle w:val="VerbatimChar"/>
-        </w:rPr>
-        <w:t xml:space="preserve">template_mem</w:t>
-      </w:r>
-      <w:r>
-        <w:t xml:space="preserve">, dari block RAM ke DSP</w:t>
-      </w:r>
-      <w:r>
-        <w:t xml:space="preserve"> </w:t>
-      </w:r>
-      <w:r>
-        <w:rPr>
-          <w:rStyle w:val="VerbatimChar"/>
-        </w:rPr>
-        <w:t xml:space="preserve">g_wdelta</w:t>
-      </w:r>
-      <w:r>
-        <w:t xml:space="preserve">, dengan slack 3,68 ns pada 10 ns.</w:t>
-      </w:r>
-    </w:p>
-    <w:bookmarkEnd w:id="30"/>
-    <w:bookmarkStart w:id="31" w:name="verifikasi-dan-ci"/>
-    <w:p>
-      <w:pPr>
-        <w:pStyle w:val="Heading1"/>
-      </w:pPr>
-      <w:r>
-        <w:t xml:space="preserve">9. Verifikasi dan CI</w:t>
-      </w:r>
-    </w:p>
-    <w:p>
-      <w:pPr>
-        <w:pStyle w:val="FirstParagraph"/>
-      </w:pPr>
-      <w:r>
-        <w:rPr>
-          <w:rStyle w:val="VerbatimChar"/>
-        </w:rPr>
-        <w:t xml:space="preserve">make test</w:t>
-      </w:r>
-      <w:r>
-        <w:t xml:space="preserve"> </w:t>
-      </w:r>
-      <w:r>
-        <w:t xml:space="preserve">menjalankan semua target di bawah: 30 menit lokal, 33 menit di CI</w:t>
-      </w:r>
-      <w:r>
-        <w:t xml:space="preserve"> </w:t>
-      </w:r>
-      <w:r>
-        <w:t xml:space="preserve">(job</w:t>
-      </w:r>
-      <w:r>
-        <w:t xml:space="preserve"> </w:t>
-      </w:r>
-      <w:r>
-        <w:rPr>
-          <w:rStyle w:val="VerbatimChar"/>
-        </w:rPr>
-        <w:t xml:space="preserve">cocotb</w:t>
-      </w:r>
-      <w:r>
-        <w:t xml:space="preserve"> </w:t>
-      </w:r>
-      <w:r>
-        <w:t xml:space="preserve">PR #8, 04:55–05:28 UTC, 17 Oktober 2026). CI GitHub</w:t>
-      </w:r>
-      <w:r>
-        <w:t xml:space="preserve"> </w:t>
-      </w:r>
-      <w:r>
-        <w:t xml:space="preserve">Actions menjalankannya di setiap PR dan setiap push ke main. Setiap merge</w:t>
-      </w:r>
-      <w:r>
-        <w:t xml:space="preserve"> </w:t>
-      </w:r>
-      <w:r>
-        <w:t xml:space="preserve">dilakukan setelah CI hijau dan log-nya diperiksa.</w:t>
-      </w:r>
-    </w:p>
-    <w:p>
-      <w:pPr>
-        <w:pStyle w:val="BodyText"/>
-      </w:pPr>
-      <w:r>
-        <w:t xml:space="preserve">Di luar CI,</w:t>
-      </w:r>
-      <w:r>
-        <w:t xml:space="preserve"> </w:t>
-      </w:r>
-      <w:r>
-        <w:rPr>
-          <w:rStyle w:val="VerbatimChar"/>
-        </w:rPr>
-        <w:t xml:space="preserve">make test</w:t>
-      </w:r>
-      <w:r>
-        <w:t xml:space="preserve"> </w:t>
-      </w:r>
-      <w:r>
-        <w:t xml:space="preserve">butuh</w:t>
-      </w:r>
-      <w:r>
-        <w:t xml:space="preserve"> </w:t>
-      </w:r>
-      <w:r>
-        <w:rPr>
-          <w:rStyle w:val="VerbatimChar"/>
-        </w:rPr>
-        <w:t xml:space="preserve">python3 -m pip install -r requirements.txt</w:t>
-      </w:r>
-      <w:r>
-        <w:t xml:space="preserve"> </w:t>
-      </w:r>
-      <w:r>
-        <w:t xml:space="preserve">(cocotb 1.8.1, numpy) serta Icarus Verilog, Yosys, tclsh, dan pandoc. Tanpa</w:t>
-      </w:r>
-      <w:r>
-        <w:t xml:space="preserve"> </w:t>
-      </w:r>
-      <w:r>
-        <w:t xml:space="preserve">cocotb, setiap target simulasi berhenti dengan pesan yang menyebut perintah</w:t>
-      </w:r>
-      <w:r>
-        <w:t xml:space="preserve"> </w:t>
-      </w:r>
-      <w:r>
-        <w:t xml:space="preserve">pemasangan itu (PR #10).</w:t>
-      </w:r>
-    </w:p>
-    <w:p>
-      <w:pPr>
-        <w:pStyle w:val="BodyText"/>
-      </w:pPr>
-      <w:r>
-        <w:t xml:space="preserve">Pada 20 Oktober 2026</w:t>
-      </w:r>
-      <w:r>
-        <w:t xml:space="preserve"> </w:t>
-      </w:r>
-      <w:r>
-        <w:rPr>
-          <w:rStyle w:val="VerbatimChar"/>
-        </w:rPr>
-        <w:t xml:space="preserve">make test</w:t>
-      </w:r>
-      <w:r>
-        <w:t xml:space="preserve"> </w:t>
-      </w:r>
-      <w:r>
-        <w:t xml:space="preserve">dijalankan di laptop pengguna (WSL, venv</w:t>
-      </w:r>
-      <w:r>
-        <w:t xml:space="preserve"> </w:t>
-      </w:r>
-      <w:r>
-        <w:t xml:space="preserve">Python) dan selesai dengan exit 0. Ini mereproduksi hasil CI di mesin kedua,</w:t>
-      </w:r>
-      <w:r>
-        <w:t xml:space="preserve"> </w:t>
-      </w:r>
-      <w:r>
-        <w:t xml:space="preserve">bukan bukti Vivado atau board.</w:t>
-      </w:r>
-    </w:p>
-    <w:p>
-      <w:pPr>
-        <w:pStyle w:val="BodyText"/>
-      </w:pPr>
-      <w:r>
-        <w:rPr>
-          <w:bCs/>
-          <w:b/>
-        </w:rPr>
-        <w:t xml:space="preserve">Cara membaca output.</w:t>
-      </w:r>
-      <w:r>
-        <w:t xml:space="preserve"> </w:t>
-      </w:r>
-      <w:r>
-        <w:t xml:space="preserve">Ukurannya adalah exit code</w:t>
-      </w:r>
-      <w:r>
-        <w:t xml:space="preserve"> </w:t>
-      </w:r>
-      <w:r>
-        <w:rPr>
-          <w:rStyle w:val="VerbatimChar"/>
-        </w:rPr>
-        <w:t xml:space="preserve">make test</w:t>
-      </w:r>
-      <w:r>
-        <w:t xml:space="preserve"> </w:t>
-      </w:r>
-      <w:r>
-        <w:t xml:space="preserve">(0 = semua</w:t>
-      </w:r>
-      <w:r>
-        <w:t xml:space="preserve"> </w:t>
-      </w:r>
-      <w:r>
-        <w:t xml:space="preserve">target lulus), bukan ada atau tidaknya kata</w:t>
-      </w:r>
-      <w:r>
-        <w:t xml:space="preserve"> </w:t>
-      </w:r>
-      <w:r>
-        <w:t xml:space="preserve">“</w:t>
-      </w:r>
-      <w:r>
-        <w:t xml:space="preserve">FAIL</w:t>
-      </w:r>
-      <w:r>
-        <w:t xml:space="preserve">”</w:t>
-      </w:r>
-      <w:r>
-        <w:t xml:space="preserve">. Kata itu memang muncul pada</w:t>
-      </w:r>
-      <w:r>
-        <w:t xml:space="preserve"> </w:t>
-      </w:r>
-      <w:r>
-        <w:t xml:space="preserve">hasil yang benar:</w:t>
       </w:r>
     </w:p>
     <w:p>
@@ -6299,16 +6733,44 @@
         <w:pStyle w:val="Compact"/>
       </w:pPr>
       <w:r>
-        <w:t xml:space="preserve">di kepala tabel ringkasan cocotb (</w:t>
-      </w:r>
-      <w:r>
         <w:rPr>
           <w:rStyle w:val="VerbatimChar"/>
-        </w:rPr>
-        <w:t xml:space="preserve">FAIL=0</w:t>
-      </w:r>
-      <w:r>
-        <w:t xml:space="preserve">);</w:t>
+          <w:bCs/>
+          <w:b/>
+        </w:rPr>
+        <w:t xml:space="preserve">guard</w:t>
+      </w:r>
+      <w:r>
+        <w:rPr>
+          <w:bCs/>
+          <w:b/>
+        </w:rPr>
+        <w:t xml:space="preserve"> </w:t>
+      </w:r>
+      <w:r>
+        <w:rPr>
+          <w:bCs/>
+          <w:b/>
+        </w:rPr>
+        <w:t xml:space="preserve">memakai 424 LUT di Vivado, sedangkan Yosys 169.</w:t>
+      </w:r>
+      <w:r>
+        <w:t xml:space="preserve"> </w:t>
+      </w:r>
+      <w:r>
+        <w:t xml:space="preserve">Netlistnya jelas</w:t>
+      </w:r>
+      <w:r>
+        <w:t xml:space="preserve"> </w:t>
+      </w:r>
+      <w:r>
+        <w:t xml:space="preserve">berbeda, dan bukti SAT safe-state hanya berlaku untuk netlist Yosys</w:t>
+      </w:r>
+      <w:r>
+        <w:t xml:space="preserve"> </w:t>
+      </w:r>
+      <w:r>
+        <w:t xml:space="preserve">(risiko 1).</w:t>
       </w:r>
     </w:p>
     <w:p>
@@ -6316,6 +6778,278 @@
         <w:numPr>
           <w:ilvl w:val="0"/>
           <w:numId w:val="1013"/>
+        </w:numPr>
+        <w:pStyle w:val="Compact"/>
+      </w:pPr>
+      <w:r>
+        <w:rPr>
+          <w:bCs/>
+          <w:b/>
+        </w:rPr>
+        <w:t xml:space="preserve">Timing.</w:t>
+      </w:r>
+      <w:r>
+        <w:t xml:space="preserve"> </w:t>
+      </w:r>
+      <w:r>
+        <w:t xml:space="preserve">Jalur terlambat ada di</w:t>
+      </w:r>
+      <w:r>
+        <w:t xml:space="preserve"> </w:t>
+      </w:r>
+      <w:r>
+        <w:rPr>
+          <w:rStyle w:val="VerbatimChar"/>
+        </w:rPr>
+        <w:t xml:space="preserve">template_mem</w:t>
+      </w:r>
+      <w:r>
+        <w:t xml:space="preserve">, dari block RAM ke DSP</w:t>
+      </w:r>
+      <w:r>
+        <w:t xml:space="preserve"> </w:t>
+      </w:r>
+      <w:r>
+        <w:rPr>
+          <w:rStyle w:val="VerbatimChar"/>
+        </w:rPr>
+        <w:t xml:space="preserve">g_wdelta</w:t>
+      </w:r>
+      <w:r>
+        <w:t xml:space="preserve">, dengan slack 3,68 ns pada 10 ns.</w:t>
+      </w:r>
+    </w:p>
+    <w:bookmarkEnd w:id="30"/>
+    <w:bookmarkStart w:id="31" w:name="verifikasi-dan-ci"/>
+    <w:p>
+      <w:pPr>
+        <w:pStyle w:val="Heading1"/>
+      </w:pPr>
+      <w:r>
+        <w:t xml:space="preserve">9. Verifikasi dan CI</w:t>
+      </w:r>
+    </w:p>
+    <w:p>
+      <w:pPr>
+        <w:pStyle w:val="FirstParagraph"/>
+      </w:pPr>
+      <w:r>
+        <w:rPr>
+          <w:rStyle w:val="VerbatimChar"/>
+        </w:rPr>
+        <w:t xml:space="preserve">make test</w:t>
+      </w:r>
+      <w:r>
+        <w:t xml:space="preserve"> </w:t>
+      </w:r>
+      <w:r>
+        <w:t xml:space="preserve">menjalankan semua target di bawah: 30 menit lokal, 33 menit di CI</w:t>
+      </w:r>
+      <w:r>
+        <w:t xml:space="preserve"> </w:t>
+      </w:r>
+      <w:r>
+        <w:t xml:space="preserve">(job</w:t>
+      </w:r>
+      <w:r>
+        <w:t xml:space="preserve"> </w:t>
+      </w:r>
+      <w:r>
+        <w:rPr>
+          <w:rStyle w:val="VerbatimChar"/>
+        </w:rPr>
+        <w:t xml:space="preserve">cocotb</w:t>
+      </w:r>
+      <w:r>
+        <w:t xml:space="preserve"> </w:t>
+      </w:r>
+      <w:r>
+        <w:t xml:space="preserve">PR #8, 04:55–05:28 UTC, 17 Oktober 2026). CI GitHub</w:t>
+      </w:r>
+      <w:r>
+        <w:t xml:space="preserve"> </w:t>
+      </w:r>
+      <w:r>
+        <w:t xml:space="preserve">Actions menjalankannya di setiap PR dan setiap push ke main. Setiap merge</w:t>
+      </w:r>
+      <w:r>
+        <w:t xml:space="preserve"> </w:t>
+      </w:r>
+      <w:r>
+        <w:t xml:space="preserve">dilakukan setelah CI hijau dan log-nya diperiksa.</w:t>
+      </w:r>
+    </w:p>
+    <w:p>
+      <w:pPr>
+        <w:pStyle w:val="BodyText"/>
+      </w:pPr>
+      <w:r>
+        <w:t xml:space="preserve">Di luar CI,</w:t>
+      </w:r>
+      <w:r>
+        <w:t xml:space="preserve"> </w:t>
+      </w:r>
+      <w:r>
+        <w:rPr>
+          <w:rStyle w:val="VerbatimChar"/>
+        </w:rPr>
+        <w:t xml:space="preserve">make test</w:t>
+      </w:r>
+      <w:r>
+        <w:t xml:space="preserve"> </w:t>
+      </w:r>
+      <w:r>
+        <w:t xml:space="preserve">butuh</w:t>
+      </w:r>
+      <w:r>
+        <w:t xml:space="preserve"> </w:t>
+      </w:r>
+      <w:r>
+        <w:rPr>
+          <w:rStyle w:val="VerbatimChar"/>
+        </w:rPr>
+        <w:t xml:space="preserve">python3 -m pip install -r requirements.txt</w:t>
+      </w:r>
+      <w:r>
+        <w:t xml:space="preserve"> </w:t>
+      </w:r>
+      <w:r>
+        <w:t xml:space="preserve">(cocotb 1.8.1, numpy) serta Icarus Verilog, Yosys, tclsh, dan pandoc. Tanpa</w:t>
+      </w:r>
+      <w:r>
+        <w:t xml:space="preserve"> </w:t>
+      </w:r>
+      <w:r>
+        <w:t xml:space="preserve">cocotb, setiap target simulasi berhenti dengan pesan yang menyebut perintah</w:t>
+      </w:r>
+      <w:r>
+        <w:t xml:space="preserve"> </w:t>
+      </w:r>
+      <w:r>
+        <w:t xml:space="preserve">pemasangan itu (PR #10).</w:t>
+      </w:r>
+    </w:p>
+    <w:p>
+      <w:pPr>
+        <w:pStyle w:val="BodyText"/>
+      </w:pPr>
+      <w:r>
+        <w:t xml:space="preserve">Pada 20 Oktober 2026</w:t>
+      </w:r>
+      <w:r>
+        <w:t xml:space="preserve"> </w:t>
+      </w:r>
+      <w:r>
+        <w:rPr>
+          <w:rStyle w:val="VerbatimChar"/>
+        </w:rPr>
+        <w:t xml:space="preserve">make test</w:t>
+      </w:r>
+      <w:r>
+        <w:t xml:space="preserve"> </w:t>
+      </w:r>
+      <w:r>
+        <w:t xml:space="preserve">dijalankan di laptop pengguna (WSL, venv</w:t>
+      </w:r>
+      <w:r>
+        <w:t xml:space="preserve"> </w:t>
+      </w:r>
+      <w:r>
+        <w:t xml:space="preserve">Python) dan selesai dengan exit 0. Ini mereproduksi hasil CI di mesin kedua,</w:t>
+      </w:r>
+      <w:r>
+        <w:t xml:space="preserve"> </w:t>
+      </w:r>
+      <w:r>
+        <w:t xml:space="preserve">bukan bukti Vivado atau board.</w:t>
+      </w:r>
+    </w:p>
+    <w:p>
+      <w:pPr>
+        <w:pStyle w:val="BodyText"/>
+      </w:pPr>
+      <w:r>
+        <w:rPr>
+          <w:bCs/>
+          <w:b/>
+        </w:rPr>
+        <w:t xml:space="preserve">Cara membaca output.</w:t>
+      </w:r>
+      <w:r>
+        <w:t xml:space="preserve"> </w:t>
+      </w:r>
+      <w:r>
+        <w:t xml:space="preserve">Ukurannya adalah exit code</w:t>
+      </w:r>
+      <w:r>
+        <w:t xml:space="preserve"> </w:t>
+      </w:r>
+      <w:r>
+        <w:rPr>
+          <w:rStyle w:val="VerbatimChar"/>
+        </w:rPr>
+        <w:t xml:space="preserve">make test</w:t>
+      </w:r>
+      <w:r>
+        <w:t xml:space="preserve"> </w:t>
+      </w:r>
+      <w:r>
+        <w:t xml:space="preserve">(0 = semua</w:t>
+      </w:r>
+      <w:r>
+        <w:t xml:space="preserve"> </w:t>
+      </w:r>
+      <w:r>
+        <w:t xml:space="preserve">target lulus), bukan ada atau tidaknya kata</w:t>
+      </w:r>
+      <w:r>
+        <w:t xml:space="preserve"> </w:t>
+      </w:r>
+      <w:r>
+        <w:t xml:space="preserve">“</w:t>
+      </w:r>
+      <w:r>
+        <w:t xml:space="preserve">FAIL</w:t>
+      </w:r>
+      <w:r>
+        <w:t xml:space="preserve">”</w:t>
+      </w:r>
+      <w:r>
+        <w:t xml:space="preserve">. Kata itu memang muncul pada</w:t>
+      </w:r>
+      <w:r>
+        <w:t xml:space="preserve"> </w:t>
+      </w:r>
+      <w:r>
+        <w:t xml:space="preserve">hasil yang benar:</w:t>
+      </w:r>
+    </w:p>
+    <w:p>
+      <w:pPr>
+        <w:numPr>
+          <w:ilvl w:val="0"/>
+          <w:numId w:val="1015"/>
+        </w:numPr>
+        <w:pStyle w:val="Compact"/>
+      </w:pPr>
+      <w:r>
+        <w:t xml:space="preserve">di kepala tabel ringkasan cocotb (</w:t>
+      </w:r>
+      <w:r>
+        <w:rPr>
+          <w:rStyle w:val="VerbatimChar"/>
+        </w:rPr>
+        <w:t xml:space="preserve">FAIL=0</w:t>
+      </w:r>
+      <w:r>
+        <w:t xml:space="preserve">);</w:t>
+      </w:r>
+    </w:p>
+    <w:p>
+      <w:pPr>
+        <w:numPr>
+          <w:ilvl w:val="0"/>
+          <w:numId w:val="1015"/>
         </w:numPr>
         <w:pStyle w:val="Compact"/>
       </w:pPr>
@@ -7072,341 +7806,16 @@
       <w:pPr>
         <w:numPr>
           <w:ilvl w:val="0"/>
-          <w:numId w:val="1014"/>
-        </w:numPr>
-        <w:pStyle w:val="Compact"/>
-      </w:pPr>
-      <w:r>
-        <w:rPr>
-          <w:bCs/>
-          <w:b/>
-        </w:rPr>
-        <w:t xml:space="preserve">Belum ada board.</w:t>
-      </w:r>
-      <w:r>
-        <w:t xml:space="preserve"> </w:t>
-      </w:r>
-      <w:r>
-        <w:t xml:space="preserve">Semua klaim fungsional berlaku untuk simulasi RTL.</w:t>
-      </w:r>
-    </w:p>
-    <w:p>
-      <w:pPr>
-        <w:numPr>
-          <w:ilvl w:val="1"/>
-          <w:numId w:val="1015"/>
-        </w:numPr>
-        <w:pStyle w:val="Compact"/>
-      </w:pPr>
-      <w:r>
-        <w:t xml:space="preserve">Build Vivado 2026.1 sudah memastikan beberapa hal: timing 100 MHz, jumlah</w:t>
-      </w:r>
-      <w:r>
-        <w:t xml:space="preserve"> </w:t>
-      </w:r>
-      <w:r>
-        <w:t xml:space="preserve">FF register redundan, block RAM/DSP, dan FSM</w:t>
-      </w:r>
-      <w:r>
-        <w:t xml:space="preserve"> </w:t>
-      </w:r>
-      <w:r>
-        <w:rPr>
-          <w:rStyle w:val="VerbatimChar"/>
-        </w:rPr>
-        <w:t xml:space="preserve">guard</w:t>
-      </w:r>
-      <w:r>
-        <w:t xml:space="preserve"> </w:t>
-      </w:r>
-      <w:r>
-        <w:t xml:space="preserve">yang tidak dikode</w:t>
-      </w:r>
-      <w:r>
-        <w:t xml:space="preserve"> </w:t>
-      </w:r>
-      <w:r>
-        <w:t xml:space="preserve">ulang.</w:t>
-      </w:r>
-    </w:p>
-    <w:p>
-      <w:pPr>
-        <w:numPr>
-          <w:ilvl w:val="1"/>
-          <w:numId w:val="1015"/>
-        </w:numPr>
-        <w:pStyle w:val="Compact"/>
-      </w:pPr>
-      <w:r>
-        <w:t xml:space="preserve">Logika safe-state baru dibuktikan dengan SAT pada netlist Yosys. Netlist</w:t>
-      </w:r>
-      <w:r>
-        <w:t xml:space="preserve"> </w:t>
-      </w:r>
-      <w:r>
-        <w:rPr>
-          <w:rStyle w:val="VerbatimChar"/>
-        </w:rPr>
-        <w:t xml:space="preserve">guard</w:t>
-      </w:r>
-      <w:r>
-        <w:t xml:space="preserve"> </w:t>
-      </w:r>
-      <w:r>
-        <w:t xml:space="preserve">di Vivado berbeda (424 LUT, Yosys 169).</w:t>
-      </w:r>
-    </w:p>
-    <w:p>
-      <w:pPr>
-        <w:numPr>
-          <w:ilvl w:val="0"/>
-          <w:numId w:val="1014"/>
-        </w:numPr>
-        <w:pStyle w:val="Compact"/>
-      </w:pPr>
-      <w:r>
-        <w:rPr>
-          <w:bCs/>
-          <w:b/>
-        </w:rPr>
-        <w:t xml:space="preserve">Pemuatan bitstream di Linux KV260</w:t>
-      </w:r>
-      <w:r>
-        <w:t xml:space="preserve"> </w:t>
-      </w:r>
-      <w:r>
-        <w:t xml:space="preserve">(overlay device tree,</w:t>
-      </w:r>
-      <w:r>
-        <w:t xml:space="preserve"> </w:t>
-      </w:r>
-      <w:r>
-        <w:rPr>
-          <w:rStyle w:val="VerbatimChar"/>
-        </w:rPr>
-        <w:t xml:space="preserve">xmutil</w:t>
-      </w:r>
-      <w:r>
-        <w:t xml:space="preserve">) adalah</w:t>
-      </w:r>
-      <w:r>
-        <w:t xml:space="preserve"> </w:t>
-      </w:r>
-      <w:r>
-        <w:t xml:space="preserve">bagian paling tidak pasti; tanpa overlay</w:t>
-      </w:r>
-      <w:r>
-        <w:t xml:space="preserve"> </w:t>
-      </w:r>
-      <w:r>
-        <w:rPr>
-          <w:rStyle w:val="VerbatimChar"/>
-        </w:rPr>
-        <w:t xml:space="preserve">pl_clk0</w:t>
-      </w:r>
-      <w:r>
-        <w:t xml:space="preserve"> </w:t>
-      </w:r>
-      <w:r>
-        <w:t xml:space="preserve">mungkin mati dan akses</w:t>
-      </w:r>
-      <w:r>
-        <w:t xml:space="preserve"> </w:t>
-      </w:r>
-      <w:r>
-        <w:t xml:space="preserve">AXI menggantung. [Menebak]</w:t>
-      </w:r>
-      <w:r>
-        <w:t xml:space="preserve"> </w:t>
-      </w:r>
-      <w:r>
-        <w:rPr>
-          <w:rStyle w:val="VerbatimChar"/>
-        </w:rPr>
-        <w:t xml:space="preserve">pl.dtsi</w:t>
-      </w:r>
-      <w:r>
-        <w:t xml:space="preserve"> </w:t>
-      </w:r>
-      <w:r>
-        <w:t xml:space="preserve">hasil XSA sudah dicek (21 Oktober</w:t>
-      </w:r>
-      <w:r>
-        <w:t xml:space="preserve"> </w:t>
-      </w:r>
-      <w:r>
-        <w:t xml:space="preserve">2026): alamat,</w:t>
-      </w:r>
-      <w:r>
-        <w:t xml:space="preserve"> </w:t>
-      </w:r>
-      <w:r>
-        <w:rPr>
-          <w:rStyle w:val="VerbatimChar"/>
-        </w:rPr>
-        <w:t xml:space="preserve">pl_clk0</w:t>
-      </w:r>
-      <w:r>
-        <w:t xml:space="preserve"> </w:t>
-      </w:r>
-      <w:r>
-        <w:t xml:space="preserve">(node</w:t>
-      </w:r>
-      <w:r>
-        <w:t xml:space="preserve"> </w:t>
-      </w:r>
-      <w:r>
-        <w:rPr>
-          <w:rStyle w:val="VerbatimChar"/>
-        </w:rPr>
-        <w:t xml:space="preserve">fclk</w:t>
-      </w:r>
-      <w:r>
-        <w:t xml:space="preserve">, sekitar 99,999 MHz), dan parameter</w:t>
-      </w:r>
-      <w:r>
-        <w:t xml:space="preserve"> </w:t>
-      </w:r>
-      <w:r>
-        <w:t xml:space="preserve">guard cocok dengan repo.</w:t>
-      </w:r>
-      <w:r>
-        <w:t xml:space="preserve"> </w:t>
-      </w:r>
-      <w:r>
-        <w:rPr>
-          <w:rStyle w:val="VerbatimChar"/>
-        </w:rPr>
-        <w:t xml:space="preserve">firmware-name</w:t>
-      </w:r>
-      <w:r>
-        <w:t xml:space="preserve"> </w:t>
-      </w:r>
-      <w:r>
-        <w:t xml:space="preserve">di sana (</w:t>
-      </w:r>
-      <w:r>
-        <w:rPr>
-          <w:rStyle w:val="VerbatimChar"/>
-        </w:rPr>
-        <w:t xml:space="preserve">padan_kv260.bit.bin</w:t>
-      </w:r>
-      <w:r>
-        <w:t xml:space="preserve">)</w:t>
-      </w:r>
-      <w:r>
-        <w:t xml:space="preserve"> </w:t>
-      </w:r>
-      <w:r>
-        <w:t xml:space="preserve">berbeda dari nama di panduan lama, dan panduan sudah diperbaiki. Pemuatan</w:t>
-      </w:r>
-      <w:r>
-        <w:t xml:space="preserve"> </w:t>
-      </w:r>
-      <w:r>
-        <w:t xml:space="preserve">di board belum dicoba.</w:t>
-      </w:r>
-    </w:p>
-    <w:p>
-      <w:pPr>
-        <w:numPr>
-          <w:ilvl w:val="0"/>
-          <w:numId w:val="1014"/>
-        </w:numPr>
-        <w:pStyle w:val="Compact"/>
-      </w:pPr>
-      <w:r>
-        <w:rPr>
-          <w:bCs/>
-          <w:b/>
-        </w:rPr>
-        <w:t xml:space="preserve">Template selalu ada di luar chip.</w:t>
-      </w:r>
-      <w:r>
-        <w:t xml:space="preserve"> </w:t>
-      </w:r>
-      <w:r>
-        <w:t xml:space="preserve">Keadaan guard volatil dan setiap reset</w:t>
-      </w:r>
-      <w:r>
-        <w:t xml:space="preserve"> </w:t>
-      </w:r>
-      <w:r>
-        <w:t xml:space="preserve">menghapus template, jadi host harus mengirim ulang template setiap boot.</w:t>
-      </w:r>
-    </w:p>
-    <w:p>
-      <w:pPr>
-        <w:numPr>
-          <w:ilvl w:val="0"/>
-          <w:numId w:val="1014"/>
-        </w:numPr>
-        <w:pStyle w:val="Compact"/>
-      </w:pPr>
-      <w:r>
-        <w:rPr>
-          <w:bCs/>
-          <w:b/>
-        </w:rPr>
-        <w:t xml:space="preserve">Pembatas hanya menghitung kegagalan berturut-turut.</w:t>
-      </w:r>
-      <w:r>
-        <w:t xml:space="preserve"> </w:t>
-      </w:r>
-      <w:r>
-        <w:t xml:space="preserve">Penyerang dengan satu</w:t>
-      </w:r>
-      <w:r>
-        <w:t xml:space="preserve"> </w:t>
-      </w:r>
-      <w:r>
-        <w:t xml:space="preserve">probe sah bisa menyelipkannya setiap 4 percobaan.</w:t>
-      </w:r>
-    </w:p>
-    <w:p>
-      <w:pPr>
-        <w:numPr>
-          <w:ilvl w:val="0"/>
-          <w:numId w:val="1014"/>
-        </w:numPr>
-        <w:pStyle w:val="Compact"/>
-      </w:pPr>
-      <w:r>
-        <w:rPr>
-          <w:bCs/>
-          <w:b/>
-        </w:rPr>
-        <w:t xml:space="preserve">Fault kendali belum disimulasikan:</w:t>
-      </w:r>
-      <w:r>
-        <w:t xml:space="preserve"> </w:t>
-      </w:r>
-      <w:r>
-        <w:t xml:space="preserve">sequencer, tag baris, FSM. Flip pada</w:t>
-      </w:r>
-      <w:r>
-        <w:t xml:space="preserve"> </w:t>
-      </w:r>
-      <w:r>
-        <w:t xml:space="preserve">tag baris bisa membuat ABFT dan kedua komparator salah secara konsisten.</w:t>
-      </w:r>
-      <w:r>
-        <w:t xml:space="preserve"> </w:t>
-      </w:r>
-      <w:r>
-        <w:t xml:space="preserve">[Kemungkinan Besar]</w:t>
-      </w:r>
-    </w:p>
-    <w:p>
-      <w:pPr>
-        <w:numPr>
-          <w:ilvl w:val="1"/>
           <w:numId w:val="1016"/>
         </w:numPr>
         <w:pStyle w:val="Compact"/>
       </w:pPr>
       <w:r>
-        <w:t xml:space="preserve">Vivado 2026.1 mengode ulang FSM</w:t>
+        <w:rPr>
+          <w:bCs/>
+          <w:b/>
+        </w:rPr>
+        <w:t xml:space="preserve">Uji board baru sebagian.</w:t>
       </w:r>
       <w:r>
         <w:t xml:space="preserve"> </w:t>
@@ -7415,76 +7824,113 @@
         <w:rPr>
           <w:rStyle w:val="VerbatimChar"/>
         </w:rPr>
-        <w:t xml:space="preserve">template_mem</w:t>
-      </w:r>
-      <w:r>
-        <w:t xml:space="preserve"> </w:t>
-      </w:r>
-      <w:r>
-        <w:t xml:space="preserve">dan</w:t>
-      </w:r>
-      <w:r>
-        <w:t xml:space="preserve"> </w:t>
-      </w:r>
-      <w:r>
-        <w:rPr>
-          <w:rStyle w:val="VerbatimChar"/>
-        </w:rPr>
-        <w:t xml:space="preserve">abft_check</w:t>
-      </w:r>
-      <w:r>
-        <w:t xml:space="preserve"> </w:t>
-      </w:r>
-      <w:r>
-        <w:t xml:space="preserve">(sequential) serta</w:t>
-      </w:r>
-      <w:r>
-        <w:t xml:space="preserve"> </w:t>
-      </w:r>
-      <w:r>
-        <w:rPr>
-          <w:rStyle w:val="VerbatimChar"/>
-        </w:rPr>
-        <w:t xml:space="preserve">padan_avmm</w:t>
-      </w:r>
-      <w:r>
-        <w:t xml:space="preserve"> </w:t>
-      </w:r>
-      <w:r>
-        <w:t xml:space="preserve">dan</w:t>
-      </w:r>
-      <w:r>
-        <w:t xml:space="preserve"> </w:t>
-      </w:r>
-      <w:r>
-        <w:rPr>
-          <w:rStyle w:val="VerbatimChar"/>
-        </w:rPr>
-        <w:t xml:space="preserve">padan_axil</w:t>
-      </w:r>
-      <w:r>
-        <w:t xml:space="preserve"> </w:t>
-      </w:r>
-      <w:r>
-        <w:t xml:space="preserve">(one-hot) [Pasti, log</w:t>
-      </w:r>
-      <w:r>
-        <w:t xml:space="preserve"> </w:t>
-      </w:r>
-      <w:r>
-        <w:t xml:space="preserve">sintesis].</w:t>
+        <w:t xml:space="preserve">padan_test.py</w:t>
+      </w:r>
+      <w:r>
+        <w:t xml:space="preserve"> </w:t>
+      </w:r>
+      <w:r>
+        <w:t xml:space="preserve">lulus di board dengan bitstream</w:t>
+      </w:r>
+      <w:r>
+        <w:t xml:space="preserve"> </w:t>
+      </w:r>
+      <w:r>
+        <w:t xml:space="preserve">build pertama (bagian 5). Tamper fisik dan bitstream terbaru belum diuji.</w:t>
+      </w:r>
+      <w:r>
+        <w:t xml:space="preserve"> </w:t>
+      </w:r>
+      <w:r>
+        <w:t xml:space="preserve">Klaim keamanan fault tetap berasal dari simulasi RTL.</w:t>
       </w:r>
     </w:p>
     <w:p>
       <w:pPr>
         <w:numPr>
           <w:ilvl w:val="1"/>
+          <w:numId w:val="1017"/>
+        </w:numPr>
+        <w:pStyle w:val="Compact"/>
+      </w:pPr>
+      <w:r>
+        <w:t xml:space="preserve">Build Vivado 2026.1 sudah memastikan beberapa hal: timing 100 MHz, jumlah</w:t>
+      </w:r>
+      <w:r>
+        <w:t xml:space="preserve"> </w:t>
+      </w:r>
+      <w:r>
+        <w:t xml:space="preserve">FF register redundan, block RAM/DSP, dan FSM</w:t>
+      </w:r>
+      <w:r>
+        <w:t xml:space="preserve"> </w:t>
+      </w:r>
+      <w:r>
+        <w:rPr>
+          <w:rStyle w:val="VerbatimChar"/>
+        </w:rPr>
+        <w:t xml:space="preserve">guard</w:t>
+      </w:r>
+      <w:r>
+        <w:t xml:space="preserve"> </w:t>
+      </w:r>
+      <w:r>
+        <w:t xml:space="preserve">yang tidak dikode</w:t>
+      </w:r>
+      <w:r>
+        <w:t xml:space="preserve"> </w:t>
+      </w:r>
+      <w:r>
+        <w:t xml:space="preserve">ulang.</w:t>
+      </w:r>
+    </w:p>
+    <w:p>
+      <w:pPr>
+        <w:numPr>
+          <w:ilvl w:val="1"/>
+          <w:numId w:val="1017"/>
+        </w:numPr>
+        <w:pStyle w:val="Compact"/>
+      </w:pPr>
+      <w:r>
+        <w:t xml:space="preserve">Logika safe-state baru dibuktikan dengan SAT pada netlist Yosys. Netlist</w:t>
+      </w:r>
+      <w:r>
+        <w:t xml:space="preserve"> </w:t>
+      </w:r>
+      <w:r>
+        <w:rPr>
+          <w:rStyle w:val="VerbatimChar"/>
+        </w:rPr>
+        <w:t xml:space="preserve">guard</w:t>
+      </w:r>
+      <w:r>
+        <w:t xml:space="preserve"> </w:t>
+      </w:r>
+      <w:r>
+        <w:t xml:space="preserve">di Vivado berbeda (424 LUT, Yosys 169).</w:t>
+      </w:r>
+    </w:p>
+    <w:p>
+      <w:pPr>
+        <w:numPr>
+          <w:ilvl w:val="0"/>
           <w:numId w:val="1016"/>
         </w:numPr>
         <w:pStyle w:val="Compact"/>
       </w:pPr>
       <w:r>
-        <w:t xml:space="preserve">Cabang</w:t>
+        <w:rPr>
+          <w:bCs/>
+          <w:b/>
+        </w:rPr>
+        <w:t xml:space="preserve">Pemuatan bitstream di Linux KV260</w:t>
+      </w:r>
+      <w:r>
+        <w:t xml:space="preserve"> </w:t>
+      </w:r>
+      <w:r>
+        <w:t xml:space="preserve">(overlay device tree,</w:t>
       </w:r>
       <w:r>
         <w:t xml:space="preserve"> </w:t>
@@ -7493,104 +7939,208 @@
         <w:rPr>
           <w:rStyle w:val="VerbatimChar"/>
         </w:rPr>
-        <w:t xml:space="preserve">default</w:t>
-      </w:r>
-      <w:r>
-        <w:t xml:space="preserve"> </w:t>
-      </w:r>
-      <w:r>
-        <w:t xml:space="preserve">di RTL, yaitu jalan pulang ke IDLE dari state ilegal,</w:t>
-      </w:r>
-      <w:r>
-        <w:t xml:space="preserve"> </w:t>
-      </w:r>
-      <w:r>
-        <w:t xml:space="preserve">kemungkinan besar hilang. Satu flip pada register one-hot bisa membuat bus</w:t>
-      </w:r>
-      <w:r>
-        <w:t xml:space="preserve"> </w:t>
-      </w:r>
-      <w:r>
-        <w:t xml:space="preserve">atau sequencer macet sampai reset [Kemungkinan Besar].</w:t>
+        <w:t xml:space="preserve">xmutil</w:t>
+      </w:r>
+      <w:r>
+        <w:t xml:space="preserve">) adalah</w:t>
+      </w:r>
+      <w:r>
+        <w:t xml:space="preserve"> </w:t>
+      </w:r>
+      <w:r>
+        <w:t xml:space="preserve">bagian paling tidak pasti; tanpa overlay</w:t>
+      </w:r>
+      <w:r>
+        <w:t xml:space="preserve"> </w:t>
+      </w:r>
+      <w:r>
+        <w:rPr>
+          <w:rStyle w:val="VerbatimChar"/>
+        </w:rPr>
+        <w:t xml:space="preserve">pl_clk0</w:t>
+      </w:r>
+      <w:r>
+        <w:t xml:space="preserve"> </w:t>
+      </w:r>
+      <w:r>
+        <w:t xml:space="preserve">mungkin mati dan akses</w:t>
+      </w:r>
+      <w:r>
+        <w:t xml:space="preserve"> </w:t>
+      </w:r>
+      <w:r>
+        <w:t xml:space="preserve">AXI menggantung. [Menebak] Status saat ini:</w:t>
       </w:r>
     </w:p>
     <w:p>
       <w:pPr>
         <w:numPr>
           <w:ilvl w:val="1"/>
+          <w:numId w:val="1018"/>
+        </w:numPr>
+        <w:pStyle w:val="Compact"/>
+      </w:pPr>
+      <w:r>
+        <w:t xml:space="preserve">Overlay dari</w:t>
+      </w:r>
+      <w:r>
+        <w:t xml:space="preserve"> </w:t>
+      </w:r>
+      <w:r>
+        <w:rPr>
+          <w:rStyle w:val="VerbatimChar"/>
+        </w:rPr>
+        <w:t xml:space="preserve">pl.dtsi</w:t>
+      </w:r>
+      <w:r>
+        <w:t xml:space="preserve"> </w:t>
+      </w:r>
+      <w:r>
+        <w:t xml:space="preserve">sudah berhasil dimuat di board dengan</w:t>
+      </w:r>
+      <w:r>
+        <w:t xml:space="preserve"> </w:t>
+      </w:r>
+      <w:r>
+        <w:rPr>
+          <w:rStyle w:val="VerbatimChar"/>
+        </w:rPr>
+        <w:t xml:space="preserve">xmutil</w:t>
+      </w:r>
+      <w:r>
+        <w:t xml:space="preserve">.</w:t>
+      </w:r>
+    </w:p>
+    <w:p>
+      <w:pPr>
+        <w:numPr>
+          <w:ilvl w:val="1"/>
+          <w:numId w:val="1018"/>
+        </w:numPr>
+        <w:pStyle w:val="Compact"/>
+      </w:pPr>
+      <w:r>
+        <w:rPr>
+          <w:rStyle w:val="VerbatimChar"/>
+        </w:rPr>
+        <w:t xml:space="preserve">pl_clk0</w:t>
+      </w:r>
+      <w:r>
+        <w:t xml:space="preserve"> </w:t>
+      </w:r>
+      <w:r>
+        <w:t xml:space="preserve">berjalan pada 99.999.999 Hz.</w:t>
+      </w:r>
+    </w:p>
+    <w:p>
+      <w:pPr>
+        <w:numPr>
+          <w:ilvl w:val="1"/>
+          <w:numId w:val="1018"/>
+        </w:numPr>
+        <w:pStyle w:val="Compact"/>
+      </w:pPr>
+      <w:r>
+        <w:rPr>
+          <w:rStyle w:val="VerbatimChar"/>
+        </w:rPr>
+        <w:t xml:space="preserve">firmware-name</w:t>
+      </w:r>
+      <w:r>
+        <w:t xml:space="preserve"> </w:t>
+      </w:r>
+      <w:r>
+        <w:t xml:space="preserve">(</w:t>
+      </w:r>
+      <w:r>
+        <w:rPr>
+          <w:rStyle w:val="VerbatimChar"/>
+        </w:rPr>
+        <w:t xml:space="preserve">padan_kv260.bit.bin</w:t>
+      </w:r>
+      <w:r>
+        <w:t xml:space="preserve">) sudah disesuaikan di panduan.</w:t>
+      </w:r>
+    </w:p>
+    <w:p>
+      <w:pPr>
+        <w:numPr>
+          <w:ilvl w:val="1"/>
+          <w:numId w:val="1018"/>
+        </w:numPr>
+        <w:pStyle w:val="Compact"/>
+      </w:pPr>
+      <w:r>
+        <w:t xml:space="preserve">Sisa risiko: image Linux atau firmware lain bisa berperilaku berbeda,</w:t>
+      </w:r>
+      <w:r>
+        <w:t xml:space="preserve"> </w:t>
+      </w:r>
+      <w:r>
+        <w:t xml:space="preserve">misalnya error divider clock yang muncul saat pemuatan pertama.</w:t>
+      </w:r>
+    </w:p>
+    <w:p>
+      <w:pPr>
+        <w:numPr>
+          <w:ilvl w:val="0"/>
           <w:numId w:val="1016"/>
         </w:numPr>
         <w:pStyle w:val="Compact"/>
       </w:pPr>
       <w:r>
-        <w:t xml:space="preserve">Perbaikannya:</w:t>
-      </w:r>
-      <w:r>
-        <w:t xml:space="preserve"> </w:t>
-      </w:r>
-      <w:r>
-        <w:rPr>
-          <w:rStyle w:val="VerbatimChar"/>
-        </w:rPr>
-        <w:t xml:space="preserve">fsm_encoding = "none"</w:t>
-      </w:r>
-      <w:r>
-        <w:t xml:space="preserve"> </w:t>
-      </w:r>
-      <w:r>
-        <w:t xml:space="preserve">dipasang pada keempat register</w:t>
-      </w:r>
-      <w:r>
-        <w:t xml:space="preserve"> </w:t>
-      </w:r>
-      <w:r>
-        <w:t xml:space="preserve">(22 Oktober 2026). Simulasi tidak terpengaruh. Yosys juga mematuhinya:</w:t>
-      </w:r>
-      <w:r>
-        <w:t xml:space="preserve"> </w:t>
-      </w:r>
-      <w:r>
-        <w:t xml:space="preserve">estimasi</w:t>
-      </w:r>
-      <w:r>
-        <w:t xml:space="preserve"> </w:t>
-      </w:r>
-      <w:r>
-        <w:rPr>
-          <w:rStyle w:val="VerbatimChar"/>
-        </w:rPr>
-        <w:t xml:space="preserve">padan_axil</w:t>
-      </w:r>
-      <w:r>
-        <w:t xml:space="preserve"> </w:t>
-      </w:r>
-      <w:r>
-        <w:t xml:space="preserve">naik dari 4.248 menjadi 4.358 LUT, dan jumlah DSP,</w:t>
-      </w:r>
-      <w:r>
-        <w:t xml:space="preserve"> </w:t>
-      </w:r>
-      <w:r>
-        <w:t xml:space="preserve">block RAM, serta FF register redundan tidak berubah [Pasti].</w:t>
+        <w:rPr>
+          <w:bCs/>
+          <w:b/>
+        </w:rPr>
+        <w:t xml:space="preserve">Template selalu ada di luar chip.</w:t>
+      </w:r>
+      <w:r>
+        <w:t xml:space="preserve"> </w:t>
+      </w:r>
+      <w:r>
+        <w:t xml:space="preserve">Keadaan guard volatil dan setiap reset</w:t>
+      </w:r>
+      <w:r>
+        <w:t xml:space="preserve"> </w:t>
+      </w:r>
+      <w:r>
+        <w:t xml:space="preserve">menghapus template, jadi host harus mengirim ulang template setiap boot.</w:t>
       </w:r>
     </w:p>
     <w:p>
       <w:pPr>
         <w:numPr>
-          <w:ilvl w:val="1"/>
+          <w:ilvl w:val="0"/>
           <w:numId w:val="1016"/>
         </w:numPr>
         <w:pStyle w:val="Compact"/>
       </w:pPr>
       <w:r>
-        <w:t xml:space="preserve">Efeknya di Vivado belum diverifikasi; perlu build ulang.</w:t>
+        <w:rPr>
+          <w:bCs/>
+          <w:b/>
+        </w:rPr>
+        <w:t xml:space="preserve">Pembatas hanya menghitung kegagalan berturut-turut.</w:t>
+      </w:r>
+      <w:r>
+        <w:t xml:space="preserve"> </w:t>
+      </w:r>
+      <w:r>
+        <w:t xml:space="preserve">Penyerang dengan satu</w:t>
+      </w:r>
+      <w:r>
+        <w:t xml:space="preserve"> </w:t>
+      </w:r>
+      <w:r>
+        <w:t xml:space="preserve">probe sah bisa menyelipkannya setiap 4 percobaan.</w:t>
       </w:r>
     </w:p>
     <w:p>
       <w:pPr>
         <w:numPr>
           <w:ilvl w:val="0"/>
-          <w:numId w:val="1014"/>
+          <w:numId w:val="1016"/>
         </w:numPr>
         <w:pStyle w:val="Compact"/>
       </w:pPr>
@@ -7599,26 +8149,227 @@
           <w:bCs/>
           <w:b/>
         </w:rPr>
-        <w:t xml:space="preserve">Fault ganda</w:t>
-      </w:r>
-      <w:r>
-        <w:t xml:space="preserve"> </w:t>
-      </w:r>
-      <w:r>
-        <w:t xml:space="preserve">bisa salah lokalisasi; lokalisasi tidak boleh dipakai untuk</w:t>
-      </w:r>
-      <w:r>
-        <w:t xml:space="preserve"> </w:t>
-      </w:r>
-      <w:r>
-        <w:t xml:space="preserve">koreksi otomatis.</w:t>
+        <w:t xml:space="preserve">Fault kendali belum disimulasikan:</w:t>
+      </w:r>
+      <w:r>
+        <w:t xml:space="preserve"> </w:t>
+      </w:r>
+      <w:r>
+        <w:t xml:space="preserve">sequencer, tag baris, FSM. Flip pada</w:t>
+      </w:r>
+      <w:r>
+        <w:t xml:space="preserve"> </w:t>
+      </w:r>
+      <w:r>
+        <w:t xml:space="preserve">tag baris bisa membuat ABFT dan kedua komparator salah secara konsisten.</w:t>
+      </w:r>
+      <w:r>
+        <w:t xml:space="preserve"> </w:t>
+      </w:r>
+      <w:r>
+        <w:t xml:space="preserve">[Kemungkinan Besar]</w:t>
+      </w:r>
+    </w:p>
+    <w:p>
+      <w:pPr>
+        <w:numPr>
+          <w:ilvl w:val="1"/>
+          <w:numId w:val="1019"/>
+        </w:numPr>
+        <w:pStyle w:val="Compact"/>
+      </w:pPr>
+      <w:r>
+        <w:t xml:space="preserve">Vivado 2026.1 mengode ulang FSM</w:t>
+      </w:r>
+      <w:r>
+        <w:t xml:space="preserve"> </w:t>
+      </w:r>
+      <w:r>
+        <w:rPr>
+          <w:rStyle w:val="VerbatimChar"/>
+        </w:rPr>
+        <w:t xml:space="preserve">template_mem</w:t>
+      </w:r>
+      <w:r>
+        <w:t xml:space="preserve"> </w:t>
+      </w:r>
+      <w:r>
+        <w:t xml:space="preserve">dan</w:t>
+      </w:r>
+      <w:r>
+        <w:t xml:space="preserve"> </w:t>
+      </w:r>
+      <w:r>
+        <w:rPr>
+          <w:rStyle w:val="VerbatimChar"/>
+        </w:rPr>
+        <w:t xml:space="preserve">abft_check</w:t>
+      </w:r>
+      <w:r>
+        <w:t xml:space="preserve"> </w:t>
+      </w:r>
+      <w:r>
+        <w:t xml:space="preserve">(sequential) serta</w:t>
+      </w:r>
+      <w:r>
+        <w:t xml:space="preserve"> </w:t>
+      </w:r>
+      <w:r>
+        <w:rPr>
+          <w:rStyle w:val="VerbatimChar"/>
+        </w:rPr>
+        <w:t xml:space="preserve">padan_avmm</w:t>
+      </w:r>
+      <w:r>
+        <w:t xml:space="preserve"> </w:t>
+      </w:r>
+      <w:r>
+        <w:t xml:space="preserve">dan</w:t>
+      </w:r>
+      <w:r>
+        <w:t xml:space="preserve"> </w:t>
+      </w:r>
+      <w:r>
+        <w:rPr>
+          <w:rStyle w:val="VerbatimChar"/>
+        </w:rPr>
+        <w:t xml:space="preserve">padan_axil</w:t>
+      </w:r>
+      <w:r>
+        <w:t xml:space="preserve"> </w:t>
+      </w:r>
+      <w:r>
+        <w:t xml:space="preserve">(one-hot) [Pasti, log</w:t>
+      </w:r>
+      <w:r>
+        <w:t xml:space="preserve"> </w:t>
+      </w:r>
+      <w:r>
+        <w:t xml:space="preserve">sintesis].</w:t>
+      </w:r>
+    </w:p>
+    <w:p>
+      <w:pPr>
+        <w:numPr>
+          <w:ilvl w:val="1"/>
+          <w:numId w:val="1019"/>
+        </w:numPr>
+        <w:pStyle w:val="Compact"/>
+      </w:pPr>
+      <w:r>
+        <w:t xml:space="preserve">Cabang</w:t>
+      </w:r>
+      <w:r>
+        <w:t xml:space="preserve"> </w:t>
+      </w:r>
+      <w:r>
+        <w:rPr>
+          <w:rStyle w:val="VerbatimChar"/>
+        </w:rPr>
+        <w:t xml:space="preserve">default</w:t>
+      </w:r>
+      <w:r>
+        <w:t xml:space="preserve"> </w:t>
+      </w:r>
+      <w:r>
+        <w:t xml:space="preserve">di RTL, yaitu jalan pulang ke IDLE dari state ilegal,</w:t>
+      </w:r>
+      <w:r>
+        <w:t xml:space="preserve"> </w:t>
+      </w:r>
+      <w:r>
+        <w:t xml:space="preserve">kemungkinan besar hilang. Satu flip pada register one-hot bisa membuat bus</w:t>
+      </w:r>
+      <w:r>
+        <w:t xml:space="preserve"> </w:t>
+      </w:r>
+      <w:r>
+        <w:t xml:space="preserve">atau sequencer macet sampai reset [Kemungkinan Besar].</w:t>
+      </w:r>
+    </w:p>
+    <w:p>
+      <w:pPr>
+        <w:numPr>
+          <w:ilvl w:val="1"/>
+          <w:numId w:val="1019"/>
+        </w:numPr>
+        <w:pStyle w:val="Compact"/>
+      </w:pPr>
+      <w:r>
+        <w:t xml:space="preserve">Perbaikannya:</w:t>
+      </w:r>
+      <w:r>
+        <w:t xml:space="preserve"> </w:t>
+      </w:r>
+      <w:r>
+        <w:rPr>
+          <w:rStyle w:val="VerbatimChar"/>
+        </w:rPr>
+        <w:t xml:space="preserve">fsm_encoding = "none"</w:t>
+      </w:r>
+      <w:r>
+        <w:t xml:space="preserve"> </w:t>
+      </w:r>
+      <w:r>
+        <w:t xml:space="preserve">dipasang pada keempat register</w:t>
+      </w:r>
+      <w:r>
+        <w:t xml:space="preserve"> </w:t>
+      </w:r>
+      <w:r>
+        <w:t xml:space="preserve">(22 Oktober 2026). Simulasi tidak terpengaruh. Yosys juga mematuhinya:</w:t>
+      </w:r>
+      <w:r>
+        <w:t xml:space="preserve"> </w:t>
+      </w:r>
+      <w:r>
+        <w:t xml:space="preserve">estimasi</w:t>
+      </w:r>
+      <w:r>
+        <w:t xml:space="preserve"> </w:t>
+      </w:r>
+      <w:r>
+        <w:rPr>
+          <w:rStyle w:val="VerbatimChar"/>
+        </w:rPr>
+        <w:t xml:space="preserve">padan_axil</w:t>
+      </w:r>
+      <w:r>
+        <w:t xml:space="preserve"> </w:t>
+      </w:r>
+      <w:r>
+        <w:t xml:space="preserve">naik dari 4.248 menjadi 4.358 LUT, dan jumlah DSP,</w:t>
+      </w:r>
+      <w:r>
+        <w:t xml:space="preserve"> </w:t>
+      </w:r>
+      <w:r>
+        <w:t xml:space="preserve">block RAM, serta FF register redundan tidak berubah [Pasti].</w:t>
+      </w:r>
+    </w:p>
+    <w:p>
+      <w:pPr>
+        <w:numPr>
+          <w:ilvl w:val="1"/>
+          <w:numId w:val="1019"/>
+        </w:numPr>
+        <w:pStyle w:val="Compact"/>
+      </w:pPr>
+      <w:r>
+        <w:t xml:space="preserve">Sudah di-merge di PR #13 (5b854d6). Efeknya di Vivado dan board belum</w:t>
+      </w:r>
+      <w:r>
+        <w:t xml:space="preserve"> </w:t>
+      </w:r>
+      <w:r>
+        <w:t xml:space="preserve">diverifikasi; perlu build ulang.</w:t>
       </w:r>
     </w:p>
     <w:p>
       <w:pPr>
         <w:numPr>
           <w:ilvl w:val="0"/>
-          <w:numId w:val="1014"/>
+          <w:numId w:val="1016"/>
         </w:numPr>
         <w:pStyle w:val="Compact"/>
       </w:pPr>
@@ -7627,20 +8378,26 @@
           <w:bCs/>
           <w:b/>
         </w:rPr>
-        <w:t xml:space="preserve">Flip dua bit</w:t>
-      </w:r>
-      <w:r>
-        <w:t xml:space="preserve"> </w:t>
-      </w:r>
-      <w:r>
-        <w:t xml:space="preserve">bisa membawa LOCKD ke OPEN; flip satu bit selalu tertangkap.</w:t>
+        <w:t xml:space="preserve">Fault ganda</w:t>
+      </w:r>
+      <w:r>
+        <w:t xml:space="preserve"> </w:t>
+      </w:r>
+      <w:r>
+        <w:t xml:space="preserve">bisa salah lokalisasi; lokalisasi tidak boleh dipakai untuk</w:t>
+      </w:r>
+      <w:r>
+        <w:t xml:space="preserve"> </w:t>
+      </w:r>
+      <w:r>
+        <w:t xml:space="preserve">koreksi otomatis.</w:t>
       </w:r>
     </w:p>
     <w:p>
       <w:pPr>
         <w:numPr>
           <w:ilvl w:val="0"/>
-          <w:numId w:val="1014"/>
+          <w:numId w:val="1016"/>
         </w:numPr>
         <w:pStyle w:val="Compact"/>
       </w:pPr>
@@ -7649,35 +8406,20 @@
           <w:bCs/>
           <w:b/>
         </w:rPr>
-        <w:t xml:space="preserve">Bitstream debug adalah alat DoS</w:t>
-      </w:r>
-      <w:r>
-        <w:t xml:space="preserve"> </w:t>
-      </w:r>
-      <w:r>
-        <w:t xml:space="preserve">dan bisa dibangun lewat</w:t>
-      </w:r>
-      <w:r>
-        <w:t xml:space="preserve"> </w:t>
-      </w:r>
-      <w:r>
-        <w:rPr>
-          <w:rStyle w:val="VerbatimChar"/>
-        </w:rPr>
-        <w:t xml:space="preserve">verilog_define</w:t>
-      </w:r>
-      <w:r>
-        <w:t xml:space="preserve"> </w:t>
-      </w:r>
-      <w:r>
-        <w:t xml:space="preserve">Vivado di luar repo. Penandanya STATUS[31] = 1.</w:t>
+        <w:t xml:space="preserve">Flip dua bit</w:t>
+      </w:r>
+      <w:r>
+        <w:t xml:space="preserve"> </w:t>
+      </w:r>
+      <w:r>
+        <w:t xml:space="preserve">bisa membawa LOCKD ke OPEN; flip satu bit selalu tertangkap.</w:t>
       </w:r>
     </w:p>
     <w:p>
       <w:pPr>
         <w:numPr>
           <w:ilvl w:val="0"/>
-          <w:numId w:val="1014"/>
+          <w:numId w:val="1016"/>
         </w:numPr>
         <w:pStyle w:val="Compact"/>
       </w:pPr>
@@ -7686,26 +8428,35 @@
           <w:bCs/>
           <w:b/>
         </w:rPr>
-        <w:t xml:space="preserve">Tamper PMOD dengan pull-up internal</w:t>
-      </w:r>
-      <w:r>
-        <w:t xml:space="preserve"> </w:t>
-      </w:r>
-      <w:r>
-        <w:t xml:space="preserve">peka terhadap kabel lepas atau</w:t>
-      </w:r>
-      <w:r>
-        <w:t xml:space="preserve"> </w:t>
-      </w:r>
-      <w:r>
-        <w:t xml:space="preserve">sentuhan ke GND; satu glitch sudah menghapus enrollment.</w:t>
+        <w:t xml:space="preserve">Bitstream debug adalah alat DoS</w:t>
+      </w:r>
+      <w:r>
+        <w:t xml:space="preserve"> </w:t>
+      </w:r>
+      <w:r>
+        <w:t xml:space="preserve">dan bisa dibangun lewat</w:t>
+      </w:r>
+      <w:r>
+        <w:t xml:space="preserve"> </w:t>
+      </w:r>
+      <w:r>
+        <w:rPr>
+          <w:rStyle w:val="VerbatimChar"/>
+        </w:rPr>
+        <w:t xml:space="preserve">verilog_define</w:t>
+      </w:r>
+      <w:r>
+        <w:t xml:space="preserve"> </w:t>
+      </w:r>
+      <w:r>
+        <w:t xml:space="preserve">Vivado di luar repo. Penandanya STATUS[31] = 1.</w:t>
       </w:r>
     </w:p>
     <w:p>
       <w:pPr>
         <w:numPr>
           <w:ilvl w:val="0"/>
-          <w:numId w:val="1014"/>
+          <w:numId w:val="1016"/>
         </w:numPr>
         <w:pStyle w:val="Compact"/>
       </w:pPr>
@@ -7714,6 +8465,34 @@
           <w:bCs/>
           <w:b/>
         </w:rPr>
+        <w:t xml:space="preserve">Tamper PMOD dengan pull-up internal</w:t>
+      </w:r>
+      <w:r>
+        <w:t xml:space="preserve"> </w:t>
+      </w:r>
+      <w:r>
+        <w:t xml:space="preserve">peka terhadap kabel lepas atau</w:t>
+      </w:r>
+      <w:r>
+        <w:t xml:space="preserve"> </w:t>
+      </w:r>
+      <w:r>
+        <w:t xml:space="preserve">sentuhan ke GND; satu glitch sudah menghapus enrollment.</w:t>
+      </w:r>
+    </w:p>
+    <w:p>
+      <w:pPr>
+        <w:numPr>
+          <w:ilvl w:val="0"/>
+          <w:numId w:val="1016"/>
+        </w:numPr>
+        <w:pStyle w:val="Compact"/>
+      </w:pPr>
+      <w:r>
+        <w:rPr>
+          <w:bCs/>
+          <w:b/>
+        </w:rPr>
         <w:t xml:space="preserve">Hasil INT8 vs float memakai data sintetis;</w:t>
       </w:r>
       <w:r>
@@ -7743,7 +8522,7 @@
       <w:pPr>
         <w:numPr>
           <w:ilvl w:val="0"/>
-          <w:numId w:val="1017"/>
+          <w:numId w:val="1020"/>
         </w:numPr>
         <w:pStyle w:val="Compact"/>
       </w:pPr>
@@ -7804,7 +8583,7 @@
       <w:pPr>
         <w:numPr>
           <w:ilvl w:val="0"/>
-          <w:numId w:val="1017"/>
+          <w:numId w:val="1020"/>
         </w:numPr>
         <w:pStyle w:val="Compact"/>
       </w:pPr>
@@ -7832,7 +8611,7 @@
       <w:pPr>
         <w:numPr>
           <w:ilvl w:val="0"/>
-          <w:numId w:val="1017"/>
+          <w:numId w:val="1020"/>
         </w:numPr>
         <w:pStyle w:val="Compact"/>
       </w:pPr>
@@ -7841,13 +8620,7 @@
           <w:bCs/>
           <w:b/>
         </w:rPr>
-        <w:t xml:space="preserve">Uji di board:</w:t>
-      </w:r>
-      <w:r>
-        <w:t xml:space="preserve"> </w:t>
-      </w:r>
-      <w:r>
-        <w:t xml:space="preserve">muat bitstream dengan overlay, jalankan</w:t>
+        <w:t xml:space="preserve">Uji di board dengan bitstream baru:</w:t>
       </w:r>
       <w:r>
         <w:t xml:space="preserve"> </w:t>
@@ -7862,26 +8635,32 @@
         <w:t xml:space="preserve"> </w:t>
       </w:r>
       <w:r>
-        <w:t xml:space="preserve">(target</w:t>
-      </w:r>
-      <w:r>
-        <w:t xml:space="preserve"> </w:t>
+        <w:t xml:space="preserve">(harus PASS</w:t>
+      </w:r>
+      <w:r>
+        <w:t xml:space="preserve"> </w:t>
+      </w:r>
+      <w:r>
+        <w:t xml:space="preserve">46/46), lalu uji tamper PMOD manual (</w:t>
       </w:r>
       <w:r>
         <w:rPr>
           <w:rStyle w:val="VerbatimChar"/>
         </w:rPr>
-        <w:t xml:space="preserve">PADAN KV260: PASS (46 kasus ...)</w:t>
-      </w:r>
-      <w:r>
-        <w:t xml:space="preserve">), lalu uji tamper PMOD manual.</w:t>
+        <w:t xml:space="preserve">docs/fpga_howto.md</w:t>
+      </w:r>
+      <w:r>
+        <w:t xml:space="preserve"> </w:t>
+      </w:r>
+      <w:r>
+        <w:t xml:space="preserve">bagian 7).</w:t>
       </w:r>
     </w:p>
     <w:p>
       <w:pPr>
         <w:numPr>
           <w:ilvl w:val="0"/>
-          <w:numId w:val="1017"/>
+          <w:numId w:val="1020"/>
         </w:numPr>
         <w:pStyle w:val="Compact"/>
       </w:pPr>
@@ -7909,7 +8688,7 @@
       <w:pPr>
         <w:numPr>
           <w:ilvl w:val="0"/>
-          <w:numId w:val="1017"/>
+          <w:numId w:val="1020"/>
         </w:numPr>
         <w:pStyle w:val="Compact"/>
       </w:pPr>
@@ -8247,6 +9026,12 @@
     <w:abstractNumId w:val="991"/>
   </w:num>
   <w:num w:numId="1014">
+    <w:abstractNumId w:val="991"/>
+  </w:num>
+  <w:num w:numId="1015">
+    <w:abstractNumId w:val="991"/>
+  </w:num>
+  <w:num w:numId="1016">
     <w:abstractNumId w:val="99411"/>
     <w:lvlOverride w:ilvl="0">
       <w:startOverride w:val="1"/>
@@ -8276,13 +9061,16 @@
       <w:startOverride w:val="1"/>
     </w:lvlOverride>
   </w:num>
-  <w:num w:numId="1015">
+  <w:num w:numId="1017">
     <w:abstractNumId w:val="991"/>
   </w:num>
-  <w:num w:numId="1016">
+  <w:num w:numId="1018">
     <w:abstractNumId w:val="991"/>
   </w:num>
-  <w:num w:numId="1017">
+  <w:num w:numId="1019">
+    <w:abstractNumId w:val="991"/>
+  </w:num>
+  <w:num w:numId="1020">
     <w:abstractNumId w:val="99411"/>
     <w:lvlOverride w:ilvl="0">
       <w:startOverride w:val="1"/>

</xml_diff>

<commit_message>
Laporan: uji kamera pertama padan_cam.py di KV260 (backend model)
Dilaporkan pengguna lewat dua screenshot terminal (22 Oktober 2026):
- INT8 tanpa galat: kosinus float vs INT8 = 1,0000, 0% terpotong.
- Galeri tersimpan; wajah yang sama di satu sesi memberi kosinus 0,902-0,925.
- Subjek lain: 9 verifikasi dengan kosinus 0,312-0,842 (6 MATCH, 3 NO_MATCH),
  tiga nilai dalam +-0,005 dari tau 0,363, sehingga tau perlu dikalibrasi.
- Belum diuji: backend FPGA dengan kamera dan ingatan lintas sesi.

Co-Authored-By: Claude Opus 5.5 <noreply@anthropic.com>
Claude-Session: https://claude.ai/code/session_01JWHcwMqQzXkB9LnTCQYUWo
</commit_message>
<xml_diff>
--- a/docs/laporan/Laporan_PADAN.docx
+++ b/docs/laporan/Laporan_PADAN.docx
@@ -724,6 +724,91 @@
       </w:r>
       <w:r>
         <w:t xml:space="preserve">(bagian 5).</w:t>
+      </w:r>
+    </w:p>
+    <w:p>
+      <w:pPr>
+        <w:numPr>
+          <w:ilvl w:val="0"/>
+          <w:numId w:val="1001"/>
+        </w:numPr>
+        <w:pStyle w:val="Compact"/>
+      </w:pPr>
+      <w:r>
+        <w:rPr>
+          <w:bCs/>
+          <w:b/>
+        </w:rPr>
+        <w:t xml:space="preserve">Kamera pertama (22 Oktober 2026, dilaporkan pengguna):</w:t>
+      </w:r>
+    </w:p>
+    <w:p>
+      <w:pPr>
+        <w:numPr>
+          <w:ilvl w:val="1"/>
+          <w:numId w:val="1005"/>
+        </w:numPr>
+        <w:pStyle w:val="Compact"/>
+      </w:pPr>
+      <w:r>
+        <w:rPr>
+          <w:rStyle w:val="VerbatimChar"/>
+        </w:rPr>
+        <w:t xml:space="preserve">padan_cam.py</w:t>
+      </w:r>
+      <w:r>
+        <w:t xml:space="preserve"> </w:t>
+      </w:r>
+      <w:r>
+        <w:t xml:space="preserve">berjalan di KV260 dengan webcam USB, memakai backend model</w:t>
+      </w:r>
+      <w:r>
+        <w:t xml:space="preserve"> </w:t>
+      </w:r>
+      <w:r>
+        <w:t xml:space="preserve">(golden model di CPU, belum FPGA).</w:t>
+      </w:r>
+    </w:p>
+    <w:p>
+      <w:pPr>
+        <w:numPr>
+          <w:ilvl w:val="1"/>
+          <w:numId w:val="1005"/>
+        </w:numPr>
+        <w:pStyle w:val="Compact"/>
+      </w:pPr>
+      <w:r>
+        <w:t xml:space="preserve">Kuantisasi INT8 tidak mengubah embedding: kosinus float vs INT8 = 1,0000.</w:t>
+      </w:r>
+    </w:p>
+    <w:p>
+      <w:pPr>
+        <w:numPr>
+          <w:ilvl w:val="1"/>
+          <w:numId w:val="1005"/>
+        </w:numPr>
+        <w:pStyle w:val="Compact"/>
+      </w:pPr>
+      <w:r>
+        <w:t xml:space="preserve">Dalam satu sesi, wajah yang sama memberi kosinus 0,90–0,93.</w:t>
+      </w:r>
+    </w:p>
+    <w:p>
+      <w:pPr>
+        <w:numPr>
+          <w:ilvl w:val="1"/>
+          <w:numId w:val="1005"/>
+        </w:numPr>
+        <w:pStyle w:val="Compact"/>
+      </w:pPr>
+      <w:r>
+        <w:t xml:space="preserve">Pada subjek lain, kosinus menyebar 0,31–0,84 di sekitar τ 0,363, jadi τ</w:t>
+      </w:r>
+      <w:r>
+        <w:t xml:space="preserve"> </w:t>
+      </w:r>
+      <w:r>
+        <w:t xml:space="preserve">perlu dikalibrasi (risiko 10).</w:t>
       </w:r>
     </w:p>
     <w:p>
@@ -1943,22 +2028,19 @@
               <w:jc w:val="left"/>
             </w:pPr>
             <w:r>
-              <w:rPr>
-                <w:rStyle w:val="VerbatimChar"/>
-              </w:rPr>
-              <w:t xml:space="preserve">sw/kv260/padan_cam.py</w:t>
-            </w:r>
-          </w:p>
-        </w:tc>
-        <w:tc>
-          <w:tcPr/>
-          <w:p>
-            <w:pPr>
-              <w:pStyle w:val="Compact"/>
-              <w:jc w:val="left"/>
-            </w:pPr>
-            <w:r>
-              <w:t xml:space="preserve">Skrip pengguna masuk repo; galeri persisten (nama + template INT8, 0600) supaya wajah tetap dikenali di sesi baru; self-test di CI</w:t>
+              <w:t xml:space="preserve">c9526c6 (PR #15)</w:t>
+            </w:r>
+          </w:p>
+        </w:tc>
+        <w:tc>
+          <w:tcPr/>
+          <w:p>
+            <w:pPr>
+              <w:pStyle w:val="Compact"/>
+              <w:jc w:val="left"/>
+            </w:pPr>
+            <w:r>
+              <w:t xml:space="preserve">Skrip pengguna masuk repo; galeri persisten (nama + template INT8, 0600); self-test di CI; uji kamera pertama di KV260 dengan backend model (INT8 tanpa galat, τ perlu kalibrasi)</w:t>
             </w:r>
           </w:p>
         </w:tc>
@@ -2419,7 +2501,7 @@
       <w:pPr>
         <w:numPr>
           <w:ilvl w:val="0"/>
-          <w:numId w:val="1005"/>
+          <w:numId w:val="1006"/>
         </w:numPr>
         <w:pStyle w:val="Compact"/>
       </w:pPr>
@@ -2453,7 +2535,7 @@
       <w:pPr>
         <w:numPr>
           <w:ilvl w:val="0"/>
-          <w:numId w:val="1005"/>
+          <w:numId w:val="1006"/>
         </w:numPr>
         <w:pStyle w:val="Compact"/>
       </w:pPr>
@@ -2481,7 +2563,7 @@
       <w:pPr>
         <w:numPr>
           <w:ilvl w:val="0"/>
-          <w:numId w:val="1005"/>
+          <w:numId w:val="1006"/>
         </w:numPr>
         <w:pStyle w:val="Compact"/>
       </w:pPr>
@@ -2515,7 +2597,7 @@
       <w:pPr>
         <w:numPr>
           <w:ilvl w:val="0"/>
-          <w:numId w:val="1005"/>
+          <w:numId w:val="1006"/>
         </w:numPr>
         <w:pStyle w:val="Compact"/>
       </w:pPr>
@@ -2549,7 +2631,7 @@
       <w:pPr>
         <w:numPr>
           <w:ilvl w:val="0"/>
-          <w:numId w:val="1005"/>
+          <w:numId w:val="1006"/>
         </w:numPr>
         <w:pStyle w:val="Compact"/>
       </w:pPr>
@@ -2583,7 +2665,7 @@
       <w:pPr>
         <w:numPr>
           <w:ilvl w:val="0"/>
-          <w:numId w:val="1005"/>
+          <w:numId w:val="1006"/>
         </w:numPr>
         <w:pStyle w:val="Compact"/>
       </w:pPr>
@@ -2778,7 +2860,7 @@
       <w:pPr>
         <w:numPr>
           <w:ilvl w:val="0"/>
-          <w:numId w:val="1006"/>
+          <w:numId w:val="1007"/>
         </w:numPr>
         <w:pStyle w:val="Compact"/>
       </w:pPr>
@@ -2806,7 +2888,7 @@
       <w:pPr>
         <w:numPr>
           <w:ilvl w:val="0"/>
-          <w:numId w:val="1006"/>
+          <w:numId w:val="1007"/>
         </w:numPr>
         <w:pStyle w:val="Compact"/>
       </w:pPr>
@@ -2828,7 +2910,7 @@
       <w:pPr>
         <w:numPr>
           <w:ilvl w:val="0"/>
-          <w:numId w:val="1006"/>
+          <w:numId w:val="1007"/>
         </w:numPr>
         <w:pStyle w:val="Compact"/>
       </w:pPr>
@@ -3172,7 +3254,7 @@
       <w:pPr>
         <w:numPr>
           <w:ilvl w:val="0"/>
-          <w:numId w:val="1007"/>
+          <w:numId w:val="1008"/>
         </w:numPr>
         <w:pStyle w:val="Compact"/>
       </w:pPr>
@@ -3194,7 +3276,7 @@
       <w:pPr>
         <w:numPr>
           <w:ilvl w:val="0"/>
-          <w:numId w:val="1007"/>
+          <w:numId w:val="1008"/>
         </w:numPr>
         <w:pStyle w:val="Compact"/>
       </w:pPr>
@@ -3222,7 +3304,7 @@
       <w:pPr>
         <w:numPr>
           <w:ilvl w:val="0"/>
-          <w:numId w:val="1007"/>
+          <w:numId w:val="1008"/>
         </w:numPr>
         <w:pStyle w:val="Compact"/>
       </w:pPr>
@@ -3250,7 +3332,7 @@
       <w:pPr>
         <w:numPr>
           <w:ilvl w:val="0"/>
-          <w:numId w:val="1007"/>
+          <w:numId w:val="1008"/>
         </w:numPr>
         <w:pStyle w:val="Compact"/>
       </w:pPr>
@@ -3293,7 +3375,7 @@
       <w:pPr>
         <w:numPr>
           <w:ilvl w:val="0"/>
-          <w:numId w:val="1007"/>
+          <w:numId w:val="1008"/>
         </w:numPr>
         <w:pStyle w:val="Compact"/>
       </w:pPr>
@@ -3883,7 +3965,7 @@
               <w:t xml:space="preserve"> </w:t>
             </w:r>
             <w:r>
-              <w:t xml:space="preserve">(izin 0600, tidak dienkripsi, diabaikan git) dan ditulis ulang ke PADAN setiap skrip mulai. Self-test di CI tanpa kamera; kamera dan akurasi wajah nyata belum diuji.</w:t>
+              <w:t xml:space="preserve">(izin 0600, tidak dienkripsi, diabaikan git) dan ditulis ulang ke PADAN setiap skrip mulai. Self-test di CI tanpa kamera. Kamera sudah diuji pengguna dengan backend model (hasil di bawah); backend FPGA dengan kamera belum.</w:t>
             </w:r>
           </w:p>
         </w:tc>
@@ -3893,47 +3975,23 @@
       <w:pPr>
         <w:numPr>
           <w:ilvl w:val="0"/>
-          <w:numId w:val="1008"/>
-        </w:numPr>
-        <w:pStyle w:val="Compact"/>
-      </w:pPr>
-      <w:r>
-        <w:rPr>
-          <w:bCs/>
-          <w:b/>
-        </w:rPr>
-        <w:t xml:space="preserve">Yang diuji di CI tanpa Vivado dan board:</w:t>
-      </w:r>
-    </w:p>
-    <w:p>
-      <w:pPr>
-        <w:numPr>
-          <w:ilvl w:val="1"/>
           <w:numId w:val="1009"/>
         </w:numPr>
         <w:pStyle w:val="Compact"/>
       </w:pPr>
       <w:r>
         <w:rPr>
-          <w:rStyle w:val="VerbatimChar"/>
-        </w:rPr>
-        <w:t xml:space="preserve">padan_axil</w:t>
-      </w:r>
-      <w:r>
-        <w:t xml:space="preserve">: 6 test protokol (urutan AW/W, backpressure B/R, SLVERR, AR</w:t>
-      </w:r>
-      <w:r>
-        <w:t xml:space="preserve"> </w:t>
-      </w:r>
-      <w:r>
-        <w:t xml:space="preserve">bersamaan, tamper) dan 8 mutan, semua terbunuh. [Pasti]</w:t>
+          <w:bCs/>
+          <w:b/>
+        </w:rPr>
+        <w:t xml:space="preserve">Yang diuji di CI tanpa Vivado dan board:</w:t>
       </w:r>
     </w:p>
     <w:p>
       <w:pPr>
         <w:numPr>
           <w:ilvl w:val="1"/>
-          <w:numId w:val="1009"/>
+          <w:numId w:val="1010"/>
         </w:numPr>
         <w:pStyle w:val="Compact"/>
       </w:pPr>
@@ -3941,36 +3999,60 @@
         <w:rPr>
           <w:rStyle w:val="VerbatimChar"/>
         </w:rPr>
-        <w:t xml:space="preserve">padan_test.py</w:t>
-      </w:r>
-      <w:r>
-        <w:t xml:space="preserve"> </w:t>
-      </w:r>
-      <w:r>
-        <w:t xml:space="preserve">tanpa diubah melawan RTL lewat AXI: 46/46 PASS tanpa</w:t>
-      </w:r>
-      <w:r>
-        <w:t xml:space="preserve"> </w:t>
-      </w:r>
-      <w:r>
-        <w:t xml:space="preserve">pelanggaran protokol; fault memori terdeteksi dan HALT setelah FAULT ke-3;</w:t>
-      </w:r>
-      <w:r>
-        <w:t xml:space="preserve"> </w:t>
-      </w:r>
-      <w:r>
-        <w:t xml:space="preserve">base salah tidak menulis apa pun. [Pasti, simulasi]</w:t>
+        <w:t xml:space="preserve">padan_axil</w:t>
+      </w:r>
+      <w:r>
+        <w:t xml:space="preserve">: 6 test protokol (urutan AW/W, backpressure B/R, SLVERR, AR</w:t>
+      </w:r>
+      <w:r>
+        <w:t xml:space="preserve"> </w:t>
+      </w:r>
+      <w:r>
+        <w:t xml:space="preserve">bersamaan, tamper) dan 8 mutan, semua terbunuh. [Pasti]</w:t>
       </w:r>
     </w:p>
     <w:p>
       <w:pPr>
         <w:numPr>
           <w:ilvl w:val="1"/>
-          <w:numId w:val="1009"/>
+          <w:numId w:val="1010"/>
         </w:numPr>
         <w:pStyle w:val="Compact"/>
       </w:pPr>
       <w:r>
+        <w:rPr>
+          <w:rStyle w:val="VerbatimChar"/>
+        </w:rPr>
+        <w:t xml:space="preserve">padan_test.py</w:t>
+      </w:r>
+      <w:r>
+        <w:t xml:space="preserve"> </w:t>
+      </w:r>
+      <w:r>
+        <w:t xml:space="preserve">tanpa diubah melawan RTL lewat AXI: 46/46 PASS tanpa</w:t>
+      </w:r>
+      <w:r>
+        <w:t xml:space="preserve"> </w:t>
+      </w:r>
+      <w:r>
+        <w:t xml:space="preserve">pelanggaran protokol; fault memori terdeteksi dan HALT setelah FAULT ke-3;</w:t>
+      </w:r>
+      <w:r>
+        <w:t xml:space="preserve"> </w:t>
+      </w:r>
+      <w:r>
+        <w:t xml:space="preserve">base salah tidak menulis apa pun. [Pasti, simulasi]</w:t>
+      </w:r>
+    </w:p>
+    <w:p>
+      <w:pPr>
+        <w:numPr>
+          <w:ilvl w:val="1"/>
+          <w:numId w:val="1010"/>
+        </w:numPr>
+        <w:pStyle w:val="Compact"/>
+      </w:pPr>
+      <w:r>
         <w:t xml:space="preserve">Skrip Vivado di tclsh dengan stub: nilai kunci konsisten dengan RTL dan</w:t>
       </w:r>
       <w:r>
@@ -3984,7 +4066,7 @@
       <w:pPr>
         <w:numPr>
           <w:ilvl w:val="0"/>
-          <w:numId w:val="1008"/>
+          <w:numId w:val="1009"/>
         </w:numPr>
         <w:pStyle w:val="Compact"/>
       </w:pPr>
@@ -4459,7 +4541,7 @@
       <w:pPr>
         <w:numPr>
           <w:ilvl w:val="0"/>
-          <w:numId w:val="1010"/>
+          <w:numId w:val="1011"/>
         </w:numPr>
         <w:pStyle w:val="Compact"/>
       </w:pPr>
@@ -4514,7 +4596,7 @@
       <w:pPr>
         <w:numPr>
           <w:ilvl w:val="0"/>
-          <w:numId w:val="1010"/>
+          <w:numId w:val="1011"/>
         </w:numPr>
         <w:pStyle w:val="Compact"/>
       </w:pPr>
@@ -4557,7 +4639,7 @@
       <w:pPr>
         <w:numPr>
           <w:ilvl w:val="0"/>
-          <w:numId w:val="1010"/>
+          <w:numId w:val="1011"/>
         </w:numPr>
         <w:pStyle w:val="Compact"/>
       </w:pPr>
@@ -4606,7 +4688,7 @@
       <w:pPr>
         <w:numPr>
           <w:ilvl w:val="0"/>
-          <w:numId w:val="1010"/>
+          <w:numId w:val="1011"/>
         </w:numPr>
         <w:pStyle w:val="Compact"/>
       </w:pPr>
@@ -4630,46 +4712,80 @@
         <w:t xml:space="preserve">jalur baca template), dan perilaku di bawah fault nyata.</w:t>
       </w:r>
     </w:p>
-    <w:bookmarkEnd w:id="27"/>
-    <w:bookmarkStart w:id="28" w:name="guard-keamanan-di-tingkat-sistem"/>
-    <w:p>
-      <w:pPr>
-        <w:pStyle w:val="Heading1"/>
-      </w:pPr>
-      <w:r>
-        <w:t xml:space="preserve">6. Guard: keamanan di tingkat sistem</w:t>
-      </w:r>
-    </w:p>
     <w:p>
       <w:pPr>
         <w:pStyle w:val="FirstParagraph"/>
       </w:pPr>
       <w:r>
         <w:rPr>
+          <w:bCs/>
+          <w:b/>
+        </w:rPr>
+        <w:t xml:space="preserve">Uji kamera</w:t>
+      </w:r>
+      <w:r>
+        <w:rPr>
+          <w:bCs/>
+          <w:b/>
+        </w:rPr>
+        <w:t xml:space="preserve"> </w:t>
+      </w:r>
+      <w:r>
+        <w:rPr>
           <w:rStyle w:val="VerbatimChar"/>
-        </w:rPr>
-        <w:t xml:space="preserve">guard.v</w:t>
-      </w:r>
-      <w:r>
-        <w:t xml:space="preserve"> </w:t>
-      </w:r>
-      <w:r>
-        <w:t xml:space="preserve">mengendalikan izin bus. Setiap reset melakukan zeroize sebelum</w:t>
-      </w:r>
-      <w:r>
-        <w:t xml:space="preserve"> </w:t>
-      </w:r>
-      <w:r>
-        <w:t xml:space="preserve">perangkat bisa dipakai (</w:t>
+          <w:bCs/>
+          <w:b/>
+        </w:rPr>
+        <w:t xml:space="preserve">padan_cam.py</w:t>
+      </w:r>
+      <w:r>
+        <w:t xml:space="preserve"> </w:t>
+      </w:r>
+      <w:r>
+        <w:t xml:space="preserve">(22 Oktober 2026; dijalankan dan dilaporkan</w:t>
+      </w:r>
+      <w:r>
+        <w:t xml:space="preserve"> </w:t>
+      </w:r>
+      <w:r>
+        <w:t xml:space="preserve">pengguna lewat dua screenshot terminal). Semua run memakai</w:t>
+      </w:r>
+      <w:r>
+        <w:t xml:space="preserve"> </w:t>
       </w:r>
       <w:r>
         <w:rPr>
           <w:rStyle w:val="VerbatimChar"/>
         </w:rPr>
-        <w:t xml:space="preserve">docs/rtl_guard.md</w:t>
-      </w:r>
-      <w:r>
-        <w:t xml:space="preserve">).</w:t>
+        <w:t xml:space="preserve">--backend model</w:t>
+      </w:r>
+      <w:r>
+        <w:t xml:space="preserve">,</w:t>
+      </w:r>
+      <w:r>
+        <w:t xml:space="preserve"> </w:t>
+      </w:r>
+      <w:r>
+        <w:t xml:space="preserve">yaitu golden model di CPU KV260,</w:t>
+      </w:r>
+      <w:r>
+        <w:t xml:space="preserve"> </w:t>
+      </w:r>
+      <w:r>
+        <w:rPr>
+          <w:bCs/>
+          <w:b/>
+        </w:rPr>
+        <w:t xml:space="preserve">bukan PADAN di FPGA</w:t>
+      </w:r>
+      <w:r>
+        <w:t xml:space="preserve">. Detektor yang dipakai</w:t>
+      </w:r>
+      <w:r>
+        <w:t xml:space="preserve"> </w:t>
+      </w:r>
+      <w:r>
+        <w:t xml:space="preserve">YuNet 2023mar, dan pengenal SFace 2021dec.</w:t>
       </w:r>
     </w:p>
     <w:tbl>
@@ -4695,19 +4811,19 @@
               <w:jc w:val="left"/>
             </w:pPr>
             <w:r>
-              <w:t xml:space="preserve">Fungsi</w:t>
-            </w:r>
-          </w:p>
-        </w:tc>
-        <w:tc>
-          <w:tcPr/>
-          <w:p>
-            <w:pPr>
-              <w:pStyle w:val="Compact"/>
-              <w:jc w:val="left"/>
-            </w:pPr>
-            <w:r>
-              <w:t xml:space="preserve">Perilaku</w:t>
+              <w:t xml:space="preserve">Butir</w:t>
+            </w:r>
+          </w:p>
+        </w:tc>
+        <w:tc>
+          <w:tcPr/>
+          <w:p>
+            <w:pPr>
+              <w:pStyle w:val="Compact"/>
+              <w:jc w:val="left"/>
+            </w:pPr>
+            <w:r>
+              <w:t xml:space="preserve">Hasil</w:t>
             </w:r>
           </w:p>
         </w:tc>
@@ -4721,19 +4837,19 @@
               <w:jc w:val="left"/>
             </w:pPr>
             <w:r>
-              <w:t xml:space="preserve">Pembatas percobaan</w:t>
-            </w:r>
-          </w:p>
-        </w:tc>
-        <w:tc>
-          <w:tcPr/>
-          <w:p>
-            <w:pPr>
-              <w:pStyle w:val="Compact"/>
-              <w:jc w:val="left"/>
-            </w:pPr>
-            <w:r>
-              <w:t xml:space="preserve">K = 5 NO_MATCH berturut-turut → LOUT (keluar hanya lewat reset); MATCH menolkan penghitung</w:t>
+              <w:t xml:space="preserve">Kamera, YuNet, dan SFace di KV260</w:t>
+            </w:r>
+          </w:p>
+        </w:tc>
+        <w:tc>
+          <w:tcPr/>
+          <w:p>
+            <w:pPr>
+              <w:pStyle w:val="Compact"/>
+              <w:jc w:val="left"/>
+            </w:pPr>
+            <w:r>
+              <w:t xml:space="preserve">Berjalan; enroll 4 frame berhasil</w:t>
             </w:r>
           </w:p>
         </w:tc>
@@ -4747,19 +4863,31 @@
               <w:jc w:val="left"/>
             </w:pPr>
             <w:r>
-              <w:t xml:space="preserve">LOCK</w:t>
-            </w:r>
-          </w:p>
-        </w:tc>
-        <w:tc>
-          <w:tcPr/>
-          <w:p>
-            <w:pPr>
-              <w:pStyle w:val="Compact"/>
-              <w:jc w:val="left"/>
-            </w:pPr>
-            <w:r>
-              <w:t xml:space="preserve">Setelah LOCK, template tidak bisa ditulis atau dihapus; probe dan MATCH tetap bisa</w:t>
+              <w:t xml:space="preserve">Kuantisasi INT8 (perintah</w:t>
+            </w:r>
+            <w:r>
+              <w:t xml:space="preserve"> </w:t>
+            </w:r>
+            <w:r>
+              <w:rPr>
+                <w:rStyle w:val="VerbatimChar"/>
+              </w:rPr>
+              <w:t xml:space="preserve">c</w:t>
+            </w:r>
+            <w:r>
+              <w:t xml:space="preserve">, 2 wajah)</w:t>
+            </w:r>
+          </w:p>
+        </w:tc>
+        <w:tc>
+          <w:tcPr/>
+          <w:p>
+            <w:pPr>
+              <w:pStyle w:val="Compact"/>
+              <w:jc w:val="left"/>
+            </w:pPr>
+            <w:r>
+              <w:t xml:space="preserve">0,0% nilai terpotong di ±127; kosinus float vs INT8 = 1,0000; rentang q [-90, 90]</w:t>
             </w:r>
           </w:p>
         </w:tc>
@@ -4773,19 +4901,22 @@
               <w:jc w:val="left"/>
             </w:pPr>
             <w:r>
-              <w:t xml:space="preserve">τ terkunci</w:t>
-            </w:r>
-          </w:p>
-        </w:tc>
-        <w:tc>
-          <w:tcPr/>
-          <w:p>
-            <w:pPr>
-              <w:pStyle w:val="Compact"/>
-              <w:jc w:val="left"/>
-            </w:pPr>
-            <w:r>
-              <w:t xml:space="preserve">Di LOCKD, decision memakai GUARD_TAU, bukan τ dari host</w:t>
+              <w:t xml:space="preserve">Galeri persisten</w:t>
+            </w:r>
+          </w:p>
+        </w:tc>
+        <w:tc>
+          <w:tcPr/>
+          <w:p>
+            <w:pPr>
+              <w:pStyle w:val="Compact"/>
+              <w:jc w:val="left"/>
+            </w:pPr>
+            <w:r>
+              <w:rPr>
+                <w:rStyle w:val="VerbatimChar"/>
+              </w:rPr>
+              <w:t xml:space="preserve">enroll slot 0 … (disimpan di …/padan_galeri.json)</w:t>
             </w:r>
           </w:p>
         </w:tc>
@@ -4799,19 +4930,31 @@
               <w:jc w:val="left"/>
             </w:pPr>
             <w:r>
-              <w:t xml:space="preserve">FAULT</w:t>
-            </w:r>
-          </w:p>
-        </w:tc>
-        <w:tc>
-          <w:tcPr/>
-          <w:p>
-            <w:pPr>
-              <w:pStyle w:val="Compact"/>
-              <w:jc w:val="left"/>
-            </w:pPr>
-            <w:r>
-              <w:t xml:space="preserve">Penghitung kumulatif; FAULT ke-3 → zeroize → HALT</w:t>
+              <w:t xml:space="preserve">Wajah yang sama, sesi yang sama (6 kali</w:t>
+            </w:r>
+            <w:r>
+              <w:t xml:space="preserve"> </w:t>
+            </w:r>
+            <w:r>
+              <w:rPr>
+                <w:rStyle w:val="VerbatimChar"/>
+              </w:rPr>
+              <w:t xml:space="preserve">v</w:t>
+            </w:r>
+            <w:r>
+              <w:t xml:space="preserve">)</w:t>
+            </w:r>
+          </w:p>
+        </w:tc>
+        <w:tc>
+          <w:tcPr/>
+          <w:p>
+            <w:pPr>
+              <w:pStyle w:val="Compact"/>
+              <w:jc w:val="left"/>
+            </w:pPr>
+            <w:r>
+              <w:t xml:space="preserve">MATCH, kosinus 0,902–0,925</w:t>
             </w:r>
           </w:p>
         </w:tc>
@@ -4825,19 +4968,31 @@
               <w:jc w:val="left"/>
             </w:pPr>
             <w:r>
-              <w:t xml:space="preserve">Tamper</w:t>
-            </w:r>
-          </w:p>
-        </w:tc>
-        <w:tc>
-          <w:tcPr/>
-          <w:p>
-            <w:pPr>
-              <w:pStyle w:val="Compact"/>
-              <w:jc w:val="left"/>
-            </w:pPr>
-            <w:r>
-              <w:t xml:space="preserve">Pin PMOD J2 (KV260), sinkronisasi 2-FF → zeroize → HALT</w:t>
+              <w:t xml:space="preserve">Subjek lain, skrip lama (9 kali</w:t>
+            </w:r>
+            <w:r>
+              <w:t xml:space="preserve"> </w:t>
+            </w:r>
+            <w:r>
+              <w:rPr>
+                <w:rStyle w:val="VerbatimChar"/>
+              </w:rPr>
+              <w:t xml:space="preserve">v</w:t>
+            </w:r>
+            <w:r>
+              <w:t xml:space="preserve">)</w:t>
+            </w:r>
+          </w:p>
+        </w:tc>
+        <w:tc>
+          <w:tcPr/>
+          <w:p>
+            <w:pPr>
+              <w:pStyle w:val="Compact"/>
+              <w:jc w:val="left"/>
+            </w:pPr>
+            <w:r>
+              <w:t xml:space="preserve">Kosinus 0,312–0,842: 6 MATCH, 3 NO_MATCH; tiga nilai (0,358, 0,359, 0,365) berada dalam ±0,005 dari τ</w:t>
             </w:r>
           </w:p>
         </w:tc>
@@ -4851,171 +5006,50 @@
               <w:jc w:val="left"/>
             </w:pPr>
             <w:r>
-              <w:t xml:space="preserve">Safe-state</w:t>
-            </w:r>
-          </w:p>
-        </w:tc>
-        <w:tc>
-          <w:tcPr/>
-          <w:p>
-            <w:pPr>
-              <w:pStyle w:val="Compact"/>
-              <w:jc w:val="left"/>
-            </w:pPr>
-            <w:r>
-              <w:t xml:space="preserve">State 4 bit berparitas genap; kode ilegal atau ketidakcocokan penghitung/komplemen → zeroize → HALT</w:t>
+              <w:t xml:space="preserve">Ingatan lintas sesi</w:t>
+            </w:r>
+          </w:p>
+        </w:tc>
+        <w:tc>
+          <w:tcPr/>
+          <w:p>
+            <w:pPr>
+              <w:pStyle w:val="Compact"/>
+              <w:jc w:val="left"/>
+            </w:pPr>
+            <w:r>
+              <w:t xml:space="preserve">belum diuji</w:t>
+            </w:r>
+          </w:p>
+        </w:tc>
+      </w:tr>
+      <w:tr>
+        <w:tc>
+          <w:tcPr/>
+          <w:p>
+            <w:pPr>
+              <w:pStyle w:val="Compact"/>
+              <w:jc w:val="left"/>
+            </w:pPr>
+            <w:r>
+              <w:t xml:space="preserve">Backend PADAN (FPGA) dengan kamera</w:t>
+            </w:r>
+          </w:p>
+        </w:tc>
+        <w:tc>
+          <w:tcPr/>
+          <w:p>
+            <w:pPr>
+              <w:pStyle w:val="Compact"/>
+              <w:jc w:val="left"/>
+            </w:pPr>
+            <w:r>
+              <w:t xml:space="preserve">belum diuji</w:t>
             </w:r>
           </w:p>
         </w:tc>
       </w:tr>
     </w:tbl>
-    <w:p>
-      <w:pPr>
-        <w:pStyle w:val="BodyText"/>
-      </w:pPr>
-      <w:r>
-        <w:rPr>
-          <w:bCs/>
-          <w:b/>
-        </w:rPr>
-        <w:t xml:space="preserve">τ terkunci tidak ada di spesifikasi awal.</w:t>
-      </w:r>
-      <w:r>
-        <w:t xml:space="preserve"> </w:t>
-      </w:r>
-      <w:r>
-        <w:t xml:space="preserve">Tanpanya, host cukup menulis</w:t>
-      </w:r>
-      <w:r>
-        <w:t xml:space="preserve"> </w:t>
-      </w:r>
-      <w:r>
-        <w:t xml:space="preserve">τ = −2^31 untuk mendapat MATCH dan menolkan penghitung, sehingga pembatas</w:t>
-      </w:r>
-      <w:r>
-        <w:t xml:space="preserve"> </w:t>
-      </w:r>
-      <w:r>
-        <w:t xml:space="preserve">percobaan tidak berarti. [Pasti]</w:t>
-      </w:r>
-    </w:p>
-    <w:p>
-      <w:pPr>
-        <w:numPr>
-          <w:ilvl w:val="0"/>
-          <w:numId w:val="1011"/>
-        </w:numPr>
-        <w:pStyle w:val="Compact"/>
-      </w:pPr>
-      <w:r>
-        <w:t xml:space="preserve">9 test dengan parameter rilis. Zeroize dibuktikan dengan memindai seluruh</w:t>
-      </w:r>
-      <w:r>
-        <w:t xml:space="preserve"> </w:t>
-      </w:r>
-      <w:r>
-        <w:t xml:space="preserve">16 × 144 word memori dan register probe di simulasi.</w:t>
-      </w:r>
-    </w:p>
-    <w:p>
-      <w:pPr>
-        <w:numPr>
-          <w:ilvl w:val="0"/>
-          <w:numId w:val="1011"/>
-        </w:numPr>
-        <w:pStyle w:val="Compact"/>
-      </w:pPr>
-      <w:r>
-        <w:t xml:space="preserve">Bukti SAT Yosys setelah sintesis: setiap state ilegal mematikan semua izin dan</w:t>
-      </w:r>
-      <w:r>
-        <w:t xml:space="preserve"> </w:t>
-      </w:r>
-      <w:r>
-        <w:t xml:space="preserve">menuju zeroize; ada kontrol negatif.</w:t>
-      </w:r>
-    </w:p>
-    <w:p>
-      <w:pPr>
-        <w:numPr>
-          <w:ilvl w:val="0"/>
-          <w:numId w:val="1011"/>
-        </w:numPr>
-        <w:pStyle w:val="Compact"/>
-      </w:pPr>
-      <w:r>
-        <w:t xml:space="preserve">12 mutan guard terbunuh, termasuk clear yang melewatkan baris checksum dan</w:t>
-      </w:r>
-      <w:r>
-        <w:t xml:space="preserve"> </w:t>
-      </w:r>
-      <w:r>
-        <w:t xml:space="preserve">sinkronisasi tamper 1-FF.</w:t>
-      </w:r>
-    </w:p>
-    <w:bookmarkEnd w:id="28"/>
-    <w:bookmarkStart w:id="29" w:name="injeksi-fault-debug-debug_fault"/>
-    <w:p>
-      <w:pPr>
-        <w:pStyle w:val="Heading1"/>
-      </w:pPr>
-      <w:r>
-        <w:t xml:space="preserve">7. Injeksi fault debug (DEBUG_FAULT)</w:t>
-      </w:r>
-    </w:p>
-    <w:p>
-      <w:pPr>
-        <w:pStyle w:val="FirstParagraph"/>
-      </w:pPr>
-      <w:r>
-        <w:t xml:space="preserve">Build debug punya register DBG_FAULT untuk menambahkan delta ke produk satu</w:t>
-      </w:r>
-      <w:r>
-        <w:t xml:space="preserve"> </w:t>
-      </w:r>
-      <w:r>
-        <w:t xml:space="preserve">lane, serta DBG_ABFT untuk membaca hasil lokalisasi. Build rilis</w:t>
-      </w:r>
-      <w:r>
-        <w:t xml:space="preserve"> </w:t>
-      </w:r>
-      <w:r>
-        <w:rPr>
-          <w:bCs/>
-          <w:b/>
-        </w:rPr>
-        <w:t xml:space="preserve">tidak</w:t>
-      </w:r>
-      <w:r>
-        <w:rPr>
-          <w:bCs/>
-          <w:b/>
-        </w:rPr>
-        <w:t xml:space="preserve"> </w:t>
-      </w:r>
-      <w:r>
-        <w:rPr>
-          <w:bCs/>
-          <w:b/>
-        </w:rPr>
-        <w:t xml:space="preserve">memuat</w:t>
-      </w:r>
-      <w:r>
-        <w:t xml:space="preserve"> </w:t>
-      </w:r>
-      <w:r>
-        <w:t xml:space="preserve">port, register, atau logikanya (</w:t>
-      </w:r>
-      <w:r>
-        <w:rPr>
-          <w:rStyle w:val="VerbatimChar"/>
-        </w:rPr>
-        <w:t xml:space="preserve">docs/rtl_debug_fault.md</w:t>
-      </w:r>
-      <w:r>
-        <w:t xml:space="preserve">).</w:t>
-      </w:r>
-    </w:p>
     <w:p>
       <w:pPr>
         <w:numPr>
@@ -5029,25 +5063,34 @@
           <w:bCs/>
           <w:b/>
         </w:rPr>
-        <w:t xml:space="preserve">Delta aditif, bukan pengganti.</w:t>
-      </w:r>
-      <w:r>
-        <w:t xml:space="preserve"> </w:t>
-      </w:r>
-      <w:r>
-        <w:t xml:space="preserve">Dengan delta aditif, residu ABFT hanya</w:t>
-      </w:r>
-      <w:r>
-        <w:t xml:space="preserve"> </w:t>
-      </w:r>
-      <w:r>
-        <w:t xml:space="preserve">bergantung pada delta dan baris. Dengan nilai pengganti, residu membocorkan</w:t>
-      </w:r>
-      <w:r>
-        <w:t xml:space="preserve"> </w:t>
-      </w:r>
-      <w:r>
-        <w:t xml:space="preserve">T·p. [Pasti, aljabar]</w:t>
+        <w:t xml:space="preserve">INT8 tidak menjadi sumber galat</w:t>
+      </w:r>
+      <w:r>
+        <w:t xml:space="preserve"> </w:t>
+      </w:r>
+      <w:r>
+        <w:t xml:space="preserve">untuk embedding SFace yang sudah</w:t>
+      </w:r>
+      <w:r>
+        <w:t xml:space="preserve"> </w:t>
+      </w:r>
+      <w:r>
+        <w:t xml:space="preserve">dinormalisasi L2 [Pasti untuk dua wajah yang diuji]. Asumsi kuantisasi dari</w:t>
+      </w:r>
+      <w:r>
+        <w:t xml:space="preserve"> </w:t>
+      </w:r>
+      <w:r>
+        <w:t xml:space="preserve">data sintetis (</w:t>
+      </w:r>
+      <w:r>
+        <w:rPr>
+          <w:rStyle w:val="VerbatimChar"/>
+        </w:rPr>
+        <w:t xml:space="preserve">model/padan_data.py</w:t>
+      </w:r>
+      <w:r>
+        <w:t xml:space="preserve">) berlaku pada data nyata ini.</w:t>
       </w:r>
     </w:p>
     <w:p>
@@ -5059,20 +5102,480 @@
         <w:pStyle w:val="Compact"/>
       </w:pPr>
       <w:r>
-        <w:t xml:space="preserve">288 injeksi (16 lane × 18 baris): semuanya FAULT; 256 dilokalisasi ke</w:t>
-      </w:r>
-      <w:r>
-        <w:t xml:space="preserve"> </w:t>
-      </w:r>
-      <w:r>
-        <w:t xml:space="preserve">barisnya, 32 terdeteksi di baris checksum.</w:t>
+        <w:rPr>
+          <w:bCs/>
+          <w:b/>
+        </w:rPr>
+        <w:t xml:space="preserve">Sebaran kosinus subjek kedua lebar.</w:t>
+      </w:r>
+      <w:r>
+        <w:t xml:space="preserve"> </w:t>
+      </w:r>
+      <w:r>
+        <w:t xml:space="preserve">Tidak diketahui apakah semua</w:t>
+      </w:r>
+      <w:r>
+        <w:t xml:space="preserve"> </w:t>
+      </w:r>
+      <w:r>
+        <w:t xml:space="preserve">percobaan itu orang yang sama. Bila ya, τ 0,363 menimbulkan salah tolak;</w:t>
+      </w:r>
+      <w:r>
+        <w:t xml:space="preserve"> </w:t>
+      </w:r>
+      <w:r>
+        <w:t xml:space="preserve">bila tidak, τ menerima wajah lain sampai 0,365 [Menebak]. Kalibrasi τ dengan</w:t>
+      </w:r>
+      <w:r>
+        <w:t xml:space="preserve"> </w:t>
+      </w:r>
+      <w:r>
+        <w:t xml:space="preserve">beberapa orang yang di-enroll dan tidak di-enroll diperlukan sebelum demo.</w:t>
+      </w:r>
+    </w:p>
+    <w:bookmarkEnd w:id="27"/>
+    <w:bookmarkStart w:id="28" w:name="guard-keamanan-di-tingkat-sistem"/>
+    <w:p>
+      <w:pPr>
+        <w:pStyle w:val="Heading1"/>
+      </w:pPr>
+      <w:r>
+        <w:t xml:space="preserve">6. Guard: keamanan di tingkat sistem</w:t>
+      </w:r>
+    </w:p>
+    <w:p>
+      <w:pPr>
+        <w:pStyle w:val="FirstParagraph"/>
+      </w:pPr>
+      <w:r>
+        <w:rPr>
+          <w:rStyle w:val="VerbatimChar"/>
+        </w:rPr>
+        <w:t xml:space="preserve">guard.v</w:t>
+      </w:r>
+      <w:r>
+        <w:t xml:space="preserve"> </w:t>
+      </w:r>
+      <w:r>
+        <w:t xml:space="preserve">mengendalikan izin bus. Setiap reset melakukan zeroize sebelum</w:t>
+      </w:r>
+      <w:r>
+        <w:t xml:space="preserve"> </w:t>
+      </w:r>
+      <w:r>
+        <w:t xml:space="preserve">perangkat bisa dipakai (</w:t>
+      </w:r>
+      <w:r>
+        <w:rPr>
+          <w:rStyle w:val="VerbatimChar"/>
+        </w:rPr>
+        <w:t xml:space="preserve">docs/rtl_guard.md</w:t>
+      </w:r>
+      <w:r>
+        <w:t xml:space="preserve">).</w:t>
+      </w:r>
+    </w:p>
+    <w:tbl>
+      <w:tblPr>
+        <w:tblStyle w:val="Table"/>
+        <w:tblW w:type="pct" w:w="5000"/>
+        <w:tblLook w:firstRow="1" w:lastRow="0" w:firstColumn="0" w:lastColumn="0" w:noHBand="0" w:noVBand="0" w:val="0020"/>
+        <w:jc w:val="start"/>
+      </w:tblPr>
+      <w:tblGrid>
+        <w:gridCol w:w="3960"/>
+        <w:gridCol w:w="3960"/>
+      </w:tblGrid>
+      <w:tr>
+        <w:trPr>
+          <w:tblHeader w:val="true"/>
+        </w:trPr>
+        <w:tc>
+          <w:tcPr/>
+          <w:p>
+            <w:pPr>
+              <w:pStyle w:val="Compact"/>
+              <w:jc w:val="left"/>
+            </w:pPr>
+            <w:r>
+              <w:t xml:space="preserve">Fungsi</w:t>
+            </w:r>
+          </w:p>
+        </w:tc>
+        <w:tc>
+          <w:tcPr/>
+          <w:p>
+            <w:pPr>
+              <w:pStyle w:val="Compact"/>
+              <w:jc w:val="left"/>
+            </w:pPr>
+            <w:r>
+              <w:t xml:space="preserve">Perilaku</w:t>
+            </w:r>
+          </w:p>
+        </w:tc>
+      </w:tr>
+      <w:tr>
+        <w:tc>
+          <w:tcPr/>
+          <w:p>
+            <w:pPr>
+              <w:pStyle w:val="Compact"/>
+              <w:jc w:val="left"/>
+            </w:pPr>
+            <w:r>
+              <w:t xml:space="preserve">Pembatas percobaan</w:t>
+            </w:r>
+          </w:p>
+        </w:tc>
+        <w:tc>
+          <w:tcPr/>
+          <w:p>
+            <w:pPr>
+              <w:pStyle w:val="Compact"/>
+              <w:jc w:val="left"/>
+            </w:pPr>
+            <w:r>
+              <w:t xml:space="preserve">K = 5 NO_MATCH berturut-turut → LOUT (keluar hanya lewat reset); MATCH menolkan penghitung</w:t>
+            </w:r>
+          </w:p>
+        </w:tc>
+      </w:tr>
+      <w:tr>
+        <w:tc>
+          <w:tcPr/>
+          <w:p>
+            <w:pPr>
+              <w:pStyle w:val="Compact"/>
+              <w:jc w:val="left"/>
+            </w:pPr>
+            <w:r>
+              <w:t xml:space="preserve">LOCK</w:t>
+            </w:r>
+          </w:p>
+        </w:tc>
+        <w:tc>
+          <w:tcPr/>
+          <w:p>
+            <w:pPr>
+              <w:pStyle w:val="Compact"/>
+              <w:jc w:val="left"/>
+            </w:pPr>
+            <w:r>
+              <w:t xml:space="preserve">Setelah LOCK, template tidak bisa ditulis atau dihapus; probe dan MATCH tetap bisa</w:t>
+            </w:r>
+          </w:p>
+        </w:tc>
+      </w:tr>
+      <w:tr>
+        <w:tc>
+          <w:tcPr/>
+          <w:p>
+            <w:pPr>
+              <w:pStyle w:val="Compact"/>
+              <w:jc w:val="left"/>
+            </w:pPr>
+            <w:r>
+              <w:t xml:space="preserve">τ terkunci</w:t>
+            </w:r>
+          </w:p>
+        </w:tc>
+        <w:tc>
+          <w:tcPr/>
+          <w:p>
+            <w:pPr>
+              <w:pStyle w:val="Compact"/>
+              <w:jc w:val="left"/>
+            </w:pPr>
+            <w:r>
+              <w:t xml:space="preserve">Di LOCKD, decision memakai GUARD_TAU, bukan τ dari host</w:t>
+            </w:r>
+          </w:p>
+        </w:tc>
+      </w:tr>
+      <w:tr>
+        <w:tc>
+          <w:tcPr/>
+          <w:p>
+            <w:pPr>
+              <w:pStyle w:val="Compact"/>
+              <w:jc w:val="left"/>
+            </w:pPr>
+            <w:r>
+              <w:t xml:space="preserve">FAULT</w:t>
+            </w:r>
+          </w:p>
+        </w:tc>
+        <w:tc>
+          <w:tcPr/>
+          <w:p>
+            <w:pPr>
+              <w:pStyle w:val="Compact"/>
+              <w:jc w:val="left"/>
+            </w:pPr>
+            <w:r>
+              <w:t xml:space="preserve">Penghitung kumulatif; FAULT ke-3 → zeroize → HALT</w:t>
+            </w:r>
+          </w:p>
+        </w:tc>
+      </w:tr>
+      <w:tr>
+        <w:tc>
+          <w:tcPr/>
+          <w:p>
+            <w:pPr>
+              <w:pStyle w:val="Compact"/>
+              <w:jc w:val="left"/>
+            </w:pPr>
+            <w:r>
+              <w:t xml:space="preserve">Tamper</w:t>
+            </w:r>
+          </w:p>
+        </w:tc>
+        <w:tc>
+          <w:tcPr/>
+          <w:p>
+            <w:pPr>
+              <w:pStyle w:val="Compact"/>
+              <w:jc w:val="left"/>
+            </w:pPr>
+            <w:r>
+              <w:t xml:space="preserve">Pin PMOD J2 (KV260), sinkronisasi 2-FF → zeroize → HALT</w:t>
+            </w:r>
+          </w:p>
+        </w:tc>
+      </w:tr>
+      <w:tr>
+        <w:tc>
+          <w:tcPr/>
+          <w:p>
+            <w:pPr>
+              <w:pStyle w:val="Compact"/>
+              <w:jc w:val="left"/>
+            </w:pPr>
+            <w:r>
+              <w:t xml:space="preserve">Safe-state</w:t>
+            </w:r>
+          </w:p>
+        </w:tc>
+        <w:tc>
+          <w:tcPr/>
+          <w:p>
+            <w:pPr>
+              <w:pStyle w:val="Compact"/>
+              <w:jc w:val="left"/>
+            </w:pPr>
+            <w:r>
+              <w:t xml:space="preserve">State 4 bit berparitas genap; kode ilegal atau ketidakcocokan penghitung/komplemen → zeroize → HALT</w:t>
+            </w:r>
+          </w:p>
+        </w:tc>
+      </w:tr>
+    </w:tbl>
+    <w:p>
+      <w:pPr>
+        <w:pStyle w:val="BodyText"/>
+      </w:pPr>
+      <w:r>
+        <w:rPr>
+          <w:bCs/>
+          <w:b/>
+        </w:rPr>
+        <w:t xml:space="preserve">τ terkunci tidak ada di spesifikasi awal.</w:t>
+      </w:r>
+      <w:r>
+        <w:t xml:space="preserve"> </w:t>
+      </w:r>
+      <w:r>
+        <w:t xml:space="preserve">Tanpanya, host cukup menulis</w:t>
+      </w:r>
+      <w:r>
+        <w:t xml:space="preserve"> </w:t>
+      </w:r>
+      <w:r>
+        <w:t xml:space="preserve">τ = −2^31 untuk mendapat MATCH dan menolkan penghitung, sehingga pembatas</w:t>
+      </w:r>
+      <w:r>
+        <w:t xml:space="preserve"> </w:t>
+      </w:r>
+      <w:r>
+        <w:t xml:space="preserve">percobaan tidak berarti. [Pasti]</w:t>
       </w:r>
     </w:p>
     <w:p>
       <w:pPr>
         <w:numPr>
           <w:ilvl w:val="0"/>
-          <w:numId w:val="1012"/>
+          <w:numId w:val="1013"/>
+        </w:numPr>
+        <w:pStyle w:val="Compact"/>
+      </w:pPr>
+      <w:r>
+        <w:t xml:space="preserve">9 test dengan parameter rilis. Zeroize dibuktikan dengan memindai seluruh</w:t>
+      </w:r>
+      <w:r>
+        <w:t xml:space="preserve"> </w:t>
+      </w:r>
+      <w:r>
+        <w:t xml:space="preserve">16 × 144 word memori dan register probe di simulasi.</w:t>
+      </w:r>
+    </w:p>
+    <w:p>
+      <w:pPr>
+        <w:numPr>
+          <w:ilvl w:val="0"/>
+          <w:numId w:val="1013"/>
+        </w:numPr>
+        <w:pStyle w:val="Compact"/>
+      </w:pPr>
+      <w:r>
+        <w:t xml:space="preserve">Bukti SAT Yosys setelah sintesis: setiap state ilegal mematikan semua izin dan</w:t>
+      </w:r>
+      <w:r>
+        <w:t xml:space="preserve"> </w:t>
+      </w:r>
+      <w:r>
+        <w:t xml:space="preserve">menuju zeroize; ada kontrol negatif.</w:t>
+      </w:r>
+    </w:p>
+    <w:p>
+      <w:pPr>
+        <w:numPr>
+          <w:ilvl w:val="0"/>
+          <w:numId w:val="1013"/>
+        </w:numPr>
+        <w:pStyle w:val="Compact"/>
+      </w:pPr>
+      <w:r>
+        <w:t xml:space="preserve">12 mutan guard terbunuh, termasuk clear yang melewatkan baris checksum dan</w:t>
+      </w:r>
+      <w:r>
+        <w:t xml:space="preserve"> </w:t>
+      </w:r>
+      <w:r>
+        <w:t xml:space="preserve">sinkronisasi tamper 1-FF.</w:t>
+      </w:r>
+    </w:p>
+    <w:bookmarkEnd w:id="28"/>
+    <w:bookmarkStart w:id="29" w:name="injeksi-fault-debug-debug_fault"/>
+    <w:p>
+      <w:pPr>
+        <w:pStyle w:val="Heading1"/>
+      </w:pPr>
+      <w:r>
+        <w:t xml:space="preserve">7. Injeksi fault debug (DEBUG_FAULT)</w:t>
+      </w:r>
+    </w:p>
+    <w:p>
+      <w:pPr>
+        <w:pStyle w:val="FirstParagraph"/>
+      </w:pPr>
+      <w:r>
+        <w:t xml:space="preserve">Build debug punya register DBG_FAULT untuk menambahkan delta ke produk satu</w:t>
+      </w:r>
+      <w:r>
+        <w:t xml:space="preserve"> </w:t>
+      </w:r>
+      <w:r>
+        <w:t xml:space="preserve">lane, serta DBG_ABFT untuk membaca hasil lokalisasi. Build rilis</w:t>
+      </w:r>
+      <w:r>
+        <w:t xml:space="preserve"> </w:t>
+      </w:r>
+      <w:r>
+        <w:rPr>
+          <w:bCs/>
+          <w:b/>
+        </w:rPr>
+        <w:t xml:space="preserve">tidak</w:t>
+      </w:r>
+      <w:r>
+        <w:rPr>
+          <w:bCs/>
+          <w:b/>
+        </w:rPr>
+        <w:t xml:space="preserve"> </w:t>
+      </w:r>
+      <w:r>
+        <w:rPr>
+          <w:bCs/>
+          <w:b/>
+        </w:rPr>
+        <w:t xml:space="preserve">memuat</w:t>
+      </w:r>
+      <w:r>
+        <w:t xml:space="preserve"> </w:t>
+      </w:r>
+      <w:r>
+        <w:t xml:space="preserve">port, register, atau logikanya (</w:t>
+      </w:r>
+      <w:r>
+        <w:rPr>
+          <w:rStyle w:val="VerbatimChar"/>
+        </w:rPr>
+        <w:t xml:space="preserve">docs/rtl_debug_fault.md</w:t>
+      </w:r>
+      <w:r>
+        <w:t xml:space="preserve">).</w:t>
+      </w:r>
+    </w:p>
+    <w:p>
+      <w:pPr>
+        <w:numPr>
+          <w:ilvl w:val="0"/>
+          <w:numId w:val="1014"/>
+        </w:numPr>
+        <w:pStyle w:val="Compact"/>
+      </w:pPr>
+      <w:r>
+        <w:rPr>
+          <w:bCs/>
+          <w:b/>
+        </w:rPr>
+        <w:t xml:space="preserve">Delta aditif, bukan pengganti.</w:t>
+      </w:r>
+      <w:r>
+        <w:t xml:space="preserve"> </w:t>
+      </w:r>
+      <w:r>
+        <w:t xml:space="preserve">Dengan delta aditif, residu ABFT hanya</w:t>
+      </w:r>
+      <w:r>
+        <w:t xml:space="preserve"> </w:t>
+      </w:r>
+      <w:r>
+        <w:t xml:space="preserve">bergantung pada delta dan baris. Dengan nilai pengganti, residu membocorkan</w:t>
+      </w:r>
+      <w:r>
+        <w:t xml:space="preserve"> </w:t>
+      </w:r>
+      <w:r>
+        <w:t xml:space="preserve">T·p. [Pasti, aljabar]</w:t>
+      </w:r>
+    </w:p>
+    <w:p>
+      <w:pPr>
+        <w:numPr>
+          <w:ilvl w:val="0"/>
+          <w:numId w:val="1014"/>
+        </w:numPr>
+        <w:pStyle w:val="Compact"/>
+      </w:pPr>
+      <w:r>
+        <w:t xml:space="preserve">288 injeksi (16 lane × 18 baris): semuanya FAULT; 256 dilokalisasi ke</w:t>
+      </w:r>
+      <w:r>
+        <w:t xml:space="preserve"> </w:t>
+      </w:r>
+      <w:r>
+        <w:t xml:space="preserve">barisnya, 32 terdeteksi di baris checksum.</w:t>
+      </w:r>
+    </w:p>
+    <w:p>
+      <w:pPr>
+        <w:numPr>
+          <w:ilvl w:val="0"/>
+          <w:numId w:val="1014"/>
         </w:numPr>
         <w:pStyle w:val="Compact"/>
       </w:pPr>
@@ -6648,7 +7151,7 @@
       <w:pPr>
         <w:numPr>
           <w:ilvl w:val="0"/>
-          <w:numId w:val="1013"/>
+          <w:numId w:val="1015"/>
         </w:numPr>
         <w:pStyle w:val="Compact"/>
       </w:pPr>
@@ -6693,7 +7196,7 @@
       <w:pPr>
         <w:numPr>
           <w:ilvl w:val="1"/>
-          <w:numId w:val="1014"/>
+          <w:numId w:val="1016"/>
         </w:numPr>
         <w:pStyle w:val="Compact"/>
       </w:pPr>
@@ -6759,7 +7262,7 @@
       <w:pPr>
         <w:numPr>
           <w:ilvl w:val="1"/>
-          <w:numId w:val="1014"/>
+          <w:numId w:val="1016"/>
         </w:numPr>
         <w:pStyle w:val="Compact"/>
       </w:pPr>
@@ -6786,7 +7289,7 @@
       <w:pPr>
         <w:numPr>
           <w:ilvl w:val="1"/>
-          <w:numId w:val="1014"/>
+          <w:numId w:val="1016"/>
         </w:numPr>
         <w:pStyle w:val="Compact"/>
       </w:pPr>
@@ -6807,306 +7310,6 @@
       </w:r>
       <w:r>
         <w:t xml:space="preserve">kini menerima 16–18 DSP.</w:t>
-      </w:r>
-    </w:p>
-    <w:p>
-      <w:pPr>
-        <w:numPr>
-          <w:ilvl w:val="0"/>
-          <w:numId w:val="1013"/>
-        </w:numPr>
-        <w:pStyle w:val="Compact"/>
-      </w:pPr>
-      <w:r>
-        <w:rPr>
-          <w:rStyle w:val="VerbatimChar"/>
-          <w:bCs/>
-          <w:b/>
-        </w:rPr>
-        <w:t xml:space="preserve">guard</w:t>
-      </w:r>
-      <w:r>
-        <w:rPr>
-          <w:bCs/>
-          <w:b/>
-        </w:rPr>
-        <w:t xml:space="preserve"> </w:t>
-      </w:r>
-      <w:r>
-        <w:rPr>
-          <w:bCs/>
-          <w:b/>
-        </w:rPr>
-        <w:t xml:space="preserve">memakai 424 LUT di Vivado, sedangkan Yosys 169.</w:t>
-      </w:r>
-      <w:r>
-        <w:t xml:space="preserve"> </w:t>
-      </w:r>
-      <w:r>
-        <w:t xml:space="preserve">Netlistnya jelas</w:t>
-      </w:r>
-      <w:r>
-        <w:t xml:space="preserve"> </w:t>
-      </w:r>
-      <w:r>
-        <w:t xml:space="preserve">berbeda, dan bukti SAT safe-state hanya berlaku untuk netlist Yosys</w:t>
-      </w:r>
-      <w:r>
-        <w:t xml:space="preserve"> </w:t>
-      </w:r>
-      <w:r>
-        <w:t xml:space="preserve">(risiko 1).</w:t>
-      </w:r>
-    </w:p>
-    <w:p>
-      <w:pPr>
-        <w:numPr>
-          <w:ilvl w:val="0"/>
-          <w:numId w:val="1013"/>
-        </w:numPr>
-        <w:pStyle w:val="Compact"/>
-      </w:pPr>
-      <w:r>
-        <w:rPr>
-          <w:bCs/>
-          <w:b/>
-        </w:rPr>
-        <w:t xml:space="preserve">Timing.</w:t>
-      </w:r>
-      <w:r>
-        <w:t xml:space="preserve"> </w:t>
-      </w:r>
-      <w:r>
-        <w:t xml:space="preserve">Jalur terlambat ada di</w:t>
-      </w:r>
-      <w:r>
-        <w:t xml:space="preserve"> </w:t>
-      </w:r>
-      <w:r>
-        <w:rPr>
-          <w:rStyle w:val="VerbatimChar"/>
-        </w:rPr>
-        <w:t xml:space="preserve">template_mem</w:t>
-      </w:r>
-      <w:r>
-        <w:t xml:space="preserve">, dari block RAM ke DSP</w:t>
-      </w:r>
-      <w:r>
-        <w:t xml:space="preserve"> </w:t>
-      </w:r>
-      <w:r>
-        <w:rPr>
-          <w:rStyle w:val="VerbatimChar"/>
-        </w:rPr>
-        <w:t xml:space="preserve">g_wdelta</w:t>
-      </w:r>
-      <w:r>
-        <w:t xml:space="preserve">, dengan slack 3,68 ns pada 10 ns.</w:t>
-      </w:r>
-    </w:p>
-    <w:bookmarkEnd w:id="30"/>
-    <w:bookmarkStart w:id="31" w:name="verifikasi-dan-ci"/>
-    <w:p>
-      <w:pPr>
-        <w:pStyle w:val="Heading1"/>
-      </w:pPr>
-      <w:r>
-        <w:t xml:space="preserve">9. Verifikasi dan CI</w:t>
-      </w:r>
-    </w:p>
-    <w:p>
-      <w:pPr>
-        <w:pStyle w:val="FirstParagraph"/>
-      </w:pPr>
-      <w:r>
-        <w:rPr>
-          <w:rStyle w:val="VerbatimChar"/>
-        </w:rPr>
-        <w:t xml:space="preserve">make test</w:t>
-      </w:r>
-      <w:r>
-        <w:t xml:space="preserve"> </w:t>
-      </w:r>
-      <w:r>
-        <w:t xml:space="preserve">menjalankan semua target di bawah: 30 menit lokal, 33 menit di CI</w:t>
-      </w:r>
-      <w:r>
-        <w:t xml:space="preserve"> </w:t>
-      </w:r>
-      <w:r>
-        <w:t xml:space="preserve">(job</w:t>
-      </w:r>
-      <w:r>
-        <w:t xml:space="preserve"> </w:t>
-      </w:r>
-      <w:r>
-        <w:rPr>
-          <w:rStyle w:val="VerbatimChar"/>
-        </w:rPr>
-        <w:t xml:space="preserve">cocotb</w:t>
-      </w:r>
-      <w:r>
-        <w:t xml:space="preserve"> </w:t>
-      </w:r>
-      <w:r>
-        <w:t xml:space="preserve">PR #8, 04:55–05:28 UTC, 17 Oktober 2026). CI GitHub</w:t>
-      </w:r>
-      <w:r>
-        <w:t xml:space="preserve"> </w:t>
-      </w:r>
-      <w:r>
-        <w:t xml:space="preserve">Actions menjalankannya di setiap PR dan setiap push ke main. Setiap merge</w:t>
-      </w:r>
-      <w:r>
-        <w:t xml:space="preserve"> </w:t>
-      </w:r>
-      <w:r>
-        <w:t xml:space="preserve">dilakukan setelah CI hijau dan log-nya diperiksa.</w:t>
-      </w:r>
-    </w:p>
-    <w:p>
-      <w:pPr>
-        <w:pStyle w:val="BodyText"/>
-      </w:pPr>
-      <w:r>
-        <w:t xml:space="preserve">Di luar CI,</w:t>
-      </w:r>
-      <w:r>
-        <w:t xml:space="preserve"> </w:t>
-      </w:r>
-      <w:r>
-        <w:rPr>
-          <w:rStyle w:val="VerbatimChar"/>
-        </w:rPr>
-        <w:t xml:space="preserve">make test</w:t>
-      </w:r>
-      <w:r>
-        <w:t xml:space="preserve"> </w:t>
-      </w:r>
-      <w:r>
-        <w:t xml:space="preserve">butuh</w:t>
-      </w:r>
-      <w:r>
-        <w:t xml:space="preserve"> </w:t>
-      </w:r>
-      <w:r>
-        <w:rPr>
-          <w:rStyle w:val="VerbatimChar"/>
-        </w:rPr>
-        <w:t xml:space="preserve">python3 -m pip install -r requirements.txt</w:t>
-      </w:r>
-      <w:r>
-        <w:t xml:space="preserve"> </w:t>
-      </w:r>
-      <w:r>
-        <w:t xml:space="preserve">(cocotb 1.8.1, numpy) serta Icarus Verilog, Yosys, tclsh, dan pandoc. Tanpa</w:t>
-      </w:r>
-      <w:r>
-        <w:t xml:space="preserve"> </w:t>
-      </w:r>
-      <w:r>
-        <w:t xml:space="preserve">cocotb, setiap target simulasi berhenti dengan pesan yang menyebut perintah</w:t>
-      </w:r>
-      <w:r>
-        <w:t xml:space="preserve"> </w:t>
-      </w:r>
-      <w:r>
-        <w:t xml:space="preserve">pemasangan itu (PR #10).</w:t>
-      </w:r>
-    </w:p>
-    <w:p>
-      <w:pPr>
-        <w:pStyle w:val="BodyText"/>
-      </w:pPr>
-      <w:r>
-        <w:t xml:space="preserve">Pada 20 Oktober 2026</w:t>
-      </w:r>
-      <w:r>
-        <w:t xml:space="preserve"> </w:t>
-      </w:r>
-      <w:r>
-        <w:rPr>
-          <w:rStyle w:val="VerbatimChar"/>
-        </w:rPr>
-        <w:t xml:space="preserve">make test</w:t>
-      </w:r>
-      <w:r>
-        <w:t xml:space="preserve"> </w:t>
-      </w:r>
-      <w:r>
-        <w:t xml:space="preserve">dijalankan di laptop pengguna (WSL, venv</w:t>
-      </w:r>
-      <w:r>
-        <w:t xml:space="preserve"> </w:t>
-      </w:r>
-      <w:r>
-        <w:t xml:space="preserve">Python) dan selesai dengan exit 0. Ini mereproduksi hasil CI di mesin kedua,</w:t>
-      </w:r>
-      <w:r>
-        <w:t xml:space="preserve"> </w:t>
-      </w:r>
-      <w:r>
-        <w:t xml:space="preserve">bukan bukti Vivado atau board.</w:t>
-      </w:r>
-    </w:p>
-    <w:p>
-      <w:pPr>
-        <w:pStyle w:val="BodyText"/>
-      </w:pPr>
-      <w:r>
-        <w:rPr>
-          <w:bCs/>
-          <w:b/>
-        </w:rPr>
-        <w:t xml:space="preserve">Cara membaca output.</w:t>
-      </w:r>
-      <w:r>
-        <w:t xml:space="preserve"> </w:t>
-      </w:r>
-      <w:r>
-        <w:t xml:space="preserve">Ukurannya adalah exit code</w:t>
-      </w:r>
-      <w:r>
-        <w:t xml:space="preserve"> </w:t>
-      </w:r>
-      <w:r>
-        <w:rPr>
-          <w:rStyle w:val="VerbatimChar"/>
-        </w:rPr>
-        <w:t xml:space="preserve">make test</w:t>
-      </w:r>
-      <w:r>
-        <w:t xml:space="preserve"> </w:t>
-      </w:r>
-      <w:r>
-        <w:t xml:space="preserve">(0 = semua</w:t>
-      </w:r>
-      <w:r>
-        <w:t xml:space="preserve"> </w:t>
-      </w:r>
-      <w:r>
-        <w:t xml:space="preserve">target lulus), bukan ada atau tidaknya kata</w:t>
-      </w:r>
-      <w:r>
-        <w:t xml:space="preserve"> </w:t>
-      </w:r>
-      <w:r>
-        <w:t xml:space="preserve">“</w:t>
-      </w:r>
-      <w:r>
-        <w:t xml:space="preserve">FAIL</w:t>
-      </w:r>
-      <w:r>
-        <w:t xml:space="preserve">”</w:t>
-      </w:r>
-      <w:r>
-        <w:t xml:space="preserve">. Kata itu memang muncul pada</w:t>
-      </w:r>
-      <w:r>
-        <w:t xml:space="preserve"> </w:t>
-      </w:r>
-      <w:r>
-        <w:t xml:space="preserve">hasil yang benar:</w:t>
       </w:r>
     </w:p>
     <w:p>
@@ -7118,16 +7321,44 @@
         <w:pStyle w:val="Compact"/>
       </w:pPr>
       <w:r>
-        <w:t xml:space="preserve">di kepala tabel ringkasan cocotb (</w:t>
-      </w:r>
-      <w:r>
         <w:rPr>
           <w:rStyle w:val="VerbatimChar"/>
-        </w:rPr>
-        <w:t xml:space="preserve">FAIL=0</w:t>
-      </w:r>
-      <w:r>
-        <w:t xml:space="preserve">);</w:t>
+          <w:bCs/>
+          <w:b/>
+        </w:rPr>
+        <w:t xml:space="preserve">guard</w:t>
+      </w:r>
+      <w:r>
+        <w:rPr>
+          <w:bCs/>
+          <w:b/>
+        </w:rPr>
+        <w:t xml:space="preserve"> </w:t>
+      </w:r>
+      <w:r>
+        <w:rPr>
+          <w:bCs/>
+          <w:b/>
+        </w:rPr>
+        <w:t xml:space="preserve">memakai 424 LUT di Vivado, sedangkan Yosys 169.</w:t>
+      </w:r>
+      <w:r>
+        <w:t xml:space="preserve"> </w:t>
+      </w:r>
+      <w:r>
+        <w:t xml:space="preserve">Netlistnya jelas</w:t>
+      </w:r>
+      <w:r>
+        <w:t xml:space="preserve"> </w:t>
+      </w:r>
+      <w:r>
+        <w:t xml:space="preserve">berbeda, dan bukti SAT safe-state hanya berlaku untuk netlist Yosys</w:t>
+      </w:r>
+      <w:r>
+        <w:t xml:space="preserve"> </w:t>
+      </w:r>
+      <w:r>
+        <w:t xml:space="preserve">(risiko 1).</w:t>
       </w:r>
     </w:p>
     <w:p>
@@ -7135,6 +7366,278 @@
         <w:numPr>
           <w:ilvl w:val="0"/>
           <w:numId w:val="1015"/>
+        </w:numPr>
+        <w:pStyle w:val="Compact"/>
+      </w:pPr>
+      <w:r>
+        <w:rPr>
+          <w:bCs/>
+          <w:b/>
+        </w:rPr>
+        <w:t xml:space="preserve">Timing.</w:t>
+      </w:r>
+      <w:r>
+        <w:t xml:space="preserve"> </w:t>
+      </w:r>
+      <w:r>
+        <w:t xml:space="preserve">Jalur terlambat ada di</w:t>
+      </w:r>
+      <w:r>
+        <w:t xml:space="preserve"> </w:t>
+      </w:r>
+      <w:r>
+        <w:rPr>
+          <w:rStyle w:val="VerbatimChar"/>
+        </w:rPr>
+        <w:t xml:space="preserve">template_mem</w:t>
+      </w:r>
+      <w:r>
+        <w:t xml:space="preserve">, dari block RAM ke DSP</w:t>
+      </w:r>
+      <w:r>
+        <w:t xml:space="preserve"> </w:t>
+      </w:r>
+      <w:r>
+        <w:rPr>
+          <w:rStyle w:val="VerbatimChar"/>
+        </w:rPr>
+        <w:t xml:space="preserve">g_wdelta</w:t>
+      </w:r>
+      <w:r>
+        <w:t xml:space="preserve">, dengan slack 3,68 ns pada 10 ns.</w:t>
+      </w:r>
+    </w:p>
+    <w:bookmarkEnd w:id="30"/>
+    <w:bookmarkStart w:id="31" w:name="verifikasi-dan-ci"/>
+    <w:p>
+      <w:pPr>
+        <w:pStyle w:val="Heading1"/>
+      </w:pPr>
+      <w:r>
+        <w:t xml:space="preserve">9. Verifikasi dan CI</w:t>
+      </w:r>
+    </w:p>
+    <w:p>
+      <w:pPr>
+        <w:pStyle w:val="FirstParagraph"/>
+      </w:pPr>
+      <w:r>
+        <w:rPr>
+          <w:rStyle w:val="VerbatimChar"/>
+        </w:rPr>
+        <w:t xml:space="preserve">make test</w:t>
+      </w:r>
+      <w:r>
+        <w:t xml:space="preserve"> </w:t>
+      </w:r>
+      <w:r>
+        <w:t xml:space="preserve">menjalankan semua target di bawah: 30 menit lokal, 33 menit di CI</w:t>
+      </w:r>
+      <w:r>
+        <w:t xml:space="preserve"> </w:t>
+      </w:r>
+      <w:r>
+        <w:t xml:space="preserve">(job</w:t>
+      </w:r>
+      <w:r>
+        <w:t xml:space="preserve"> </w:t>
+      </w:r>
+      <w:r>
+        <w:rPr>
+          <w:rStyle w:val="VerbatimChar"/>
+        </w:rPr>
+        <w:t xml:space="preserve">cocotb</w:t>
+      </w:r>
+      <w:r>
+        <w:t xml:space="preserve"> </w:t>
+      </w:r>
+      <w:r>
+        <w:t xml:space="preserve">PR #8, 04:55–05:28 UTC, 17 Oktober 2026). CI GitHub</w:t>
+      </w:r>
+      <w:r>
+        <w:t xml:space="preserve"> </w:t>
+      </w:r>
+      <w:r>
+        <w:t xml:space="preserve">Actions menjalankannya di setiap PR dan setiap push ke main. Setiap merge</w:t>
+      </w:r>
+      <w:r>
+        <w:t xml:space="preserve"> </w:t>
+      </w:r>
+      <w:r>
+        <w:t xml:space="preserve">dilakukan setelah CI hijau dan log-nya diperiksa.</w:t>
+      </w:r>
+    </w:p>
+    <w:p>
+      <w:pPr>
+        <w:pStyle w:val="BodyText"/>
+      </w:pPr>
+      <w:r>
+        <w:t xml:space="preserve">Di luar CI,</w:t>
+      </w:r>
+      <w:r>
+        <w:t xml:space="preserve"> </w:t>
+      </w:r>
+      <w:r>
+        <w:rPr>
+          <w:rStyle w:val="VerbatimChar"/>
+        </w:rPr>
+        <w:t xml:space="preserve">make test</w:t>
+      </w:r>
+      <w:r>
+        <w:t xml:space="preserve"> </w:t>
+      </w:r>
+      <w:r>
+        <w:t xml:space="preserve">butuh</w:t>
+      </w:r>
+      <w:r>
+        <w:t xml:space="preserve"> </w:t>
+      </w:r>
+      <w:r>
+        <w:rPr>
+          <w:rStyle w:val="VerbatimChar"/>
+        </w:rPr>
+        <w:t xml:space="preserve">python3 -m pip install -r requirements.txt</w:t>
+      </w:r>
+      <w:r>
+        <w:t xml:space="preserve"> </w:t>
+      </w:r>
+      <w:r>
+        <w:t xml:space="preserve">(cocotb 1.8.1, numpy) serta Icarus Verilog, Yosys, tclsh, dan pandoc. Tanpa</w:t>
+      </w:r>
+      <w:r>
+        <w:t xml:space="preserve"> </w:t>
+      </w:r>
+      <w:r>
+        <w:t xml:space="preserve">cocotb, setiap target simulasi berhenti dengan pesan yang menyebut perintah</w:t>
+      </w:r>
+      <w:r>
+        <w:t xml:space="preserve"> </w:t>
+      </w:r>
+      <w:r>
+        <w:t xml:space="preserve">pemasangan itu (PR #10).</w:t>
+      </w:r>
+    </w:p>
+    <w:p>
+      <w:pPr>
+        <w:pStyle w:val="BodyText"/>
+      </w:pPr>
+      <w:r>
+        <w:t xml:space="preserve">Pada 20 Oktober 2026</w:t>
+      </w:r>
+      <w:r>
+        <w:t xml:space="preserve"> </w:t>
+      </w:r>
+      <w:r>
+        <w:rPr>
+          <w:rStyle w:val="VerbatimChar"/>
+        </w:rPr>
+        <w:t xml:space="preserve">make test</w:t>
+      </w:r>
+      <w:r>
+        <w:t xml:space="preserve"> </w:t>
+      </w:r>
+      <w:r>
+        <w:t xml:space="preserve">dijalankan di laptop pengguna (WSL, venv</w:t>
+      </w:r>
+      <w:r>
+        <w:t xml:space="preserve"> </w:t>
+      </w:r>
+      <w:r>
+        <w:t xml:space="preserve">Python) dan selesai dengan exit 0. Ini mereproduksi hasil CI di mesin kedua,</w:t>
+      </w:r>
+      <w:r>
+        <w:t xml:space="preserve"> </w:t>
+      </w:r>
+      <w:r>
+        <w:t xml:space="preserve">bukan bukti Vivado atau board.</w:t>
+      </w:r>
+    </w:p>
+    <w:p>
+      <w:pPr>
+        <w:pStyle w:val="BodyText"/>
+      </w:pPr>
+      <w:r>
+        <w:rPr>
+          <w:bCs/>
+          <w:b/>
+        </w:rPr>
+        <w:t xml:space="preserve">Cara membaca output.</w:t>
+      </w:r>
+      <w:r>
+        <w:t xml:space="preserve"> </w:t>
+      </w:r>
+      <w:r>
+        <w:t xml:space="preserve">Ukurannya adalah exit code</w:t>
+      </w:r>
+      <w:r>
+        <w:t xml:space="preserve"> </w:t>
+      </w:r>
+      <w:r>
+        <w:rPr>
+          <w:rStyle w:val="VerbatimChar"/>
+        </w:rPr>
+        <w:t xml:space="preserve">make test</w:t>
+      </w:r>
+      <w:r>
+        <w:t xml:space="preserve"> </w:t>
+      </w:r>
+      <w:r>
+        <w:t xml:space="preserve">(0 = semua</w:t>
+      </w:r>
+      <w:r>
+        <w:t xml:space="preserve"> </w:t>
+      </w:r>
+      <w:r>
+        <w:t xml:space="preserve">target lulus), bukan ada atau tidaknya kata</w:t>
+      </w:r>
+      <w:r>
+        <w:t xml:space="preserve"> </w:t>
+      </w:r>
+      <w:r>
+        <w:t xml:space="preserve">“</w:t>
+      </w:r>
+      <w:r>
+        <w:t xml:space="preserve">FAIL</w:t>
+      </w:r>
+      <w:r>
+        <w:t xml:space="preserve">”</w:t>
+      </w:r>
+      <w:r>
+        <w:t xml:space="preserve">. Kata itu memang muncul pada</w:t>
+      </w:r>
+      <w:r>
+        <w:t xml:space="preserve"> </w:t>
+      </w:r>
+      <w:r>
+        <w:t xml:space="preserve">hasil yang benar:</w:t>
+      </w:r>
+    </w:p>
+    <w:p>
+      <w:pPr>
+        <w:numPr>
+          <w:ilvl w:val="0"/>
+          <w:numId w:val="1017"/>
+        </w:numPr>
+        <w:pStyle w:val="Compact"/>
+      </w:pPr>
+      <w:r>
+        <w:t xml:space="preserve">di kepala tabel ringkasan cocotb (</w:t>
+      </w:r>
+      <w:r>
+        <w:rPr>
+          <w:rStyle w:val="VerbatimChar"/>
+        </w:rPr>
+        <w:t xml:space="preserve">FAIL=0</w:t>
+      </w:r>
+      <w:r>
+        <w:t xml:space="preserve">);</w:t>
+      </w:r>
+    </w:p>
+    <w:p>
+      <w:pPr>
+        <w:numPr>
+          <w:ilvl w:val="0"/>
+          <w:numId w:val="1017"/>
         </w:numPr>
         <w:pStyle w:val="Compact"/>
       </w:pPr>
@@ -7891,306 +8394,43 @@
       <w:pPr>
         <w:numPr>
           <w:ilvl w:val="0"/>
-          <w:numId w:val="1016"/>
-        </w:numPr>
-        <w:pStyle w:val="Compact"/>
-      </w:pPr>
-      <w:r>
-        <w:rPr>
-          <w:bCs/>
-          <w:b/>
-        </w:rPr>
-        <w:t xml:space="preserve">Uji board baru sebagian.</w:t>
-      </w:r>
-      <w:r>
-        <w:t xml:space="preserve"> </w:t>
-      </w:r>
-      <w:r>
-        <w:rPr>
-          <w:rStyle w:val="VerbatimChar"/>
-        </w:rPr>
-        <w:t xml:space="preserve">padan_test.py</w:t>
-      </w:r>
-      <w:r>
-        <w:t xml:space="preserve"> </w:t>
-      </w:r>
-      <w:r>
-        <w:t xml:space="preserve">lulus di board dengan bitstream</w:t>
-      </w:r>
-      <w:r>
-        <w:t xml:space="preserve"> </w:t>
-      </w:r>
-      <w:r>
-        <w:t xml:space="preserve">build pertama (bagian 5). Tamper fisik dan bitstream terbaru belum diuji.</w:t>
-      </w:r>
-      <w:r>
-        <w:t xml:space="preserve"> </w:t>
-      </w:r>
-      <w:r>
-        <w:t xml:space="preserve">Klaim keamanan fault tetap berasal dari simulasi RTL.</w:t>
-      </w:r>
-    </w:p>
-    <w:p>
-      <w:pPr>
-        <w:numPr>
-          <w:ilvl w:val="1"/>
-          <w:numId w:val="1017"/>
-        </w:numPr>
-        <w:pStyle w:val="Compact"/>
-      </w:pPr>
-      <w:r>
-        <w:t xml:space="preserve">Build Vivado 2026.1 sudah memastikan beberapa hal: timing 100 MHz, jumlah</w:t>
-      </w:r>
-      <w:r>
-        <w:t xml:space="preserve"> </w:t>
-      </w:r>
-      <w:r>
-        <w:t xml:space="preserve">FF register redundan, block RAM/DSP, dan FSM</w:t>
-      </w:r>
-      <w:r>
-        <w:t xml:space="preserve"> </w:t>
-      </w:r>
-      <w:r>
-        <w:rPr>
-          <w:rStyle w:val="VerbatimChar"/>
-        </w:rPr>
-        <w:t xml:space="preserve">guard</w:t>
-      </w:r>
-      <w:r>
-        <w:t xml:space="preserve"> </w:t>
-      </w:r>
-      <w:r>
-        <w:t xml:space="preserve">yang tidak dikode</w:t>
-      </w:r>
-      <w:r>
-        <w:t xml:space="preserve"> </w:t>
-      </w:r>
-      <w:r>
-        <w:t xml:space="preserve">ulang.</w:t>
-      </w:r>
-    </w:p>
-    <w:p>
-      <w:pPr>
-        <w:numPr>
-          <w:ilvl w:val="1"/>
-          <w:numId w:val="1017"/>
-        </w:numPr>
-        <w:pStyle w:val="Compact"/>
-      </w:pPr>
-      <w:r>
-        <w:t xml:space="preserve">Logika safe-state baru dibuktikan dengan SAT pada netlist Yosys. Netlist</w:t>
-      </w:r>
-      <w:r>
-        <w:t xml:space="preserve"> </w:t>
-      </w:r>
-      <w:r>
-        <w:rPr>
-          <w:rStyle w:val="VerbatimChar"/>
-        </w:rPr>
-        <w:t xml:space="preserve">guard</w:t>
-      </w:r>
-      <w:r>
-        <w:t xml:space="preserve"> </w:t>
-      </w:r>
-      <w:r>
-        <w:t xml:space="preserve">di Vivado berbeda (424 LUT, Yosys 169).</w:t>
-      </w:r>
-    </w:p>
-    <w:p>
-      <w:pPr>
-        <w:numPr>
-          <w:ilvl w:val="0"/>
-          <w:numId w:val="1016"/>
-        </w:numPr>
-        <w:pStyle w:val="Compact"/>
-      </w:pPr>
-      <w:r>
-        <w:rPr>
-          <w:bCs/>
-          <w:b/>
-        </w:rPr>
-        <w:t xml:space="preserve">Pemuatan bitstream di Linux KV260</w:t>
-      </w:r>
-      <w:r>
-        <w:t xml:space="preserve"> </w:t>
-      </w:r>
-      <w:r>
-        <w:t xml:space="preserve">(overlay device tree,</w:t>
-      </w:r>
-      <w:r>
-        <w:t xml:space="preserve"> </w:t>
-      </w:r>
-      <w:r>
-        <w:rPr>
-          <w:rStyle w:val="VerbatimChar"/>
-        </w:rPr>
-        <w:t xml:space="preserve">xmutil</w:t>
-      </w:r>
-      <w:r>
-        <w:t xml:space="preserve">) adalah</w:t>
-      </w:r>
-      <w:r>
-        <w:t xml:space="preserve"> </w:t>
-      </w:r>
-      <w:r>
-        <w:t xml:space="preserve">bagian paling tidak pasti; tanpa overlay</w:t>
-      </w:r>
-      <w:r>
-        <w:t xml:space="preserve"> </w:t>
-      </w:r>
-      <w:r>
-        <w:rPr>
-          <w:rStyle w:val="VerbatimChar"/>
-        </w:rPr>
-        <w:t xml:space="preserve">pl_clk0</w:t>
-      </w:r>
-      <w:r>
-        <w:t xml:space="preserve"> </w:t>
-      </w:r>
-      <w:r>
-        <w:t xml:space="preserve">mungkin mati dan akses</w:t>
-      </w:r>
-      <w:r>
-        <w:t xml:space="preserve"> </w:t>
-      </w:r>
-      <w:r>
-        <w:t xml:space="preserve">AXI menggantung. [Menebak] Status saat ini:</w:t>
-      </w:r>
-    </w:p>
-    <w:p>
-      <w:pPr>
-        <w:numPr>
-          <w:ilvl w:val="1"/>
           <w:numId w:val="1018"/>
         </w:numPr>
         <w:pStyle w:val="Compact"/>
       </w:pPr>
       <w:r>
-        <w:t xml:space="preserve">Overlay dari</w:t>
-      </w:r>
-      <w:r>
-        <w:t xml:space="preserve"> </w:t>
-      </w:r>
-      <w:r>
-        <w:rPr>
-          <w:rStyle w:val="VerbatimChar"/>
-        </w:rPr>
-        <w:t xml:space="preserve">pl.dtsi</w:t>
-      </w:r>
-      <w:r>
-        <w:t xml:space="preserve"> </w:t>
-      </w:r>
-      <w:r>
-        <w:t xml:space="preserve">sudah berhasil dimuat di board dengan</w:t>
-      </w:r>
-      <w:r>
-        <w:t xml:space="preserve"> </w:t>
-      </w:r>
-      <w:r>
-        <w:rPr>
-          <w:rStyle w:val="VerbatimChar"/>
-        </w:rPr>
-        <w:t xml:space="preserve">xmutil</w:t>
-      </w:r>
-      <w:r>
-        <w:t xml:space="preserve">.</w:t>
-      </w:r>
-    </w:p>
-    <w:p>
-      <w:pPr>
-        <w:numPr>
-          <w:ilvl w:val="1"/>
-          <w:numId w:val="1018"/>
-        </w:numPr>
-        <w:pStyle w:val="Compact"/>
-      </w:pPr>
-      <w:r>
-        <w:rPr>
-          <w:rStyle w:val="VerbatimChar"/>
-        </w:rPr>
-        <w:t xml:space="preserve">pl_clk0</w:t>
-      </w:r>
-      <w:r>
-        <w:t xml:space="preserve"> </w:t>
-      </w:r>
-      <w:r>
-        <w:t xml:space="preserve">berjalan pada 99.999.999 Hz.</w:t>
-      </w:r>
-    </w:p>
-    <w:p>
-      <w:pPr>
-        <w:numPr>
-          <w:ilvl w:val="1"/>
-          <w:numId w:val="1018"/>
-        </w:numPr>
-        <w:pStyle w:val="Compact"/>
-      </w:pPr>
-      <w:r>
-        <w:rPr>
-          <w:rStyle w:val="VerbatimChar"/>
-        </w:rPr>
-        <w:t xml:space="preserve">firmware-name</w:t>
-      </w:r>
-      <w:r>
-        <w:t xml:space="preserve"> </w:t>
-      </w:r>
-      <w:r>
-        <w:t xml:space="preserve">(</w:t>
-      </w:r>
-      <w:r>
-        <w:rPr>
-          <w:rStyle w:val="VerbatimChar"/>
-        </w:rPr>
-        <w:t xml:space="preserve">padan_kv260.bit.bin</w:t>
-      </w:r>
-      <w:r>
-        <w:t xml:space="preserve">) sudah disesuaikan di panduan.</w:t>
-      </w:r>
-    </w:p>
-    <w:p>
-      <w:pPr>
-        <w:numPr>
-          <w:ilvl w:val="1"/>
-          <w:numId w:val="1018"/>
-        </w:numPr>
-        <w:pStyle w:val="Compact"/>
-      </w:pPr>
-      <w:r>
-        <w:t xml:space="preserve">Sisa risiko: image Linux atau firmware lain bisa berperilaku berbeda,</w:t>
-      </w:r>
-      <w:r>
-        <w:t xml:space="preserve"> </w:t>
-      </w:r>
-      <w:r>
-        <w:t xml:space="preserve">misalnya error divider clock yang muncul saat pemuatan pertama.</w:t>
-      </w:r>
-    </w:p>
-    <w:p>
-      <w:pPr>
-        <w:numPr>
-          <w:ilvl w:val="0"/>
-          <w:numId w:val="1016"/>
-        </w:numPr>
-        <w:pStyle w:val="Compact"/>
-      </w:pPr>
-      <w:r>
         <w:rPr>
           <w:bCs/>
           <w:b/>
         </w:rPr>
-        <w:t xml:space="preserve">Template selalu ada di luar chip.</w:t>
-      </w:r>
-      <w:r>
-        <w:t xml:space="preserve"> </w:t>
-      </w:r>
-      <w:r>
-        <w:t xml:space="preserve">Keadaan guard volatil dan setiap reset</w:t>
-      </w:r>
-      <w:r>
-        <w:t xml:space="preserve"> </w:t>
-      </w:r>
-      <w:r>
-        <w:t xml:space="preserve">menghapus template, jadi host harus mengirim ulang template setiap boot.</w:t>
+        <w:t xml:space="preserve">Uji board baru sebagian.</w:t>
+      </w:r>
+      <w:r>
+        <w:t xml:space="preserve"> </w:t>
+      </w:r>
+      <w:r>
+        <w:rPr>
+          <w:rStyle w:val="VerbatimChar"/>
+        </w:rPr>
+        <w:t xml:space="preserve">padan_test.py</w:t>
+      </w:r>
+      <w:r>
+        <w:t xml:space="preserve"> </w:t>
+      </w:r>
+      <w:r>
+        <w:t xml:space="preserve">lulus di board dengan bitstream</w:t>
+      </w:r>
+      <w:r>
+        <w:t xml:space="preserve"> </w:t>
+      </w:r>
+      <w:r>
+        <w:t xml:space="preserve">build pertama (bagian 5). Tamper fisik dan bitstream terbaru belum diuji.</w:t>
+      </w:r>
+      <w:r>
+        <w:t xml:space="preserve"> </w:t>
+      </w:r>
+      <w:r>
+        <w:t xml:space="preserve">Klaim keamanan fault tetap berasal dari simulasi RTL.</w:t>
       </w:r>
     </w:p>
     <w:p>
@@ -8202,28 +8442,34 @@
         <w:pStyle w:val="Compact"/>
       </w:pPr>
       <w:r>
+        <w:t xml:space="preserve">Build Vivado 2026.1 sudah memastikan beberapa hal: timing 100 MHz, jumlah</w:t>
+      </w:r>
+      <w:r>
+        <w:t xml:space="preserve"> </w:t>
+      </w:r>
+      <w:r>
+        <w:t xml:space="preserve">FF register redundan, block RAM/DSP, dan FSM</w:t>
+      </w:r>
+      <w:r>
+        <w:t xml:space="preserve"> </w:t>
+      </w:r>
+      <w:r>
         <w:rPr>
           <w:rStyle w:val="VerbatimChar"/>
         </w:rPr>
-        <w:t xml:space="preserve">padan_cam.py</w:t>
-      </w:r>
-      <w:r>
-        <w:t xml:space="preserve"> </w:t>
-      </w:r>
-      <w:r>
-        <w:t xml:space="preserve">melakukannya dari</w:t>
-      </w:r>
-      <w:r>
-        <w:t xml:space="preserve"> </w:t>
-      </w:r>
-      <w:r>
-        <w:rPr>
-          <w:rStyle w:val="VerbatimChar"/>
-        </w:rPr>
-        <w:t xml:space="preserve">padan_galeri.json</w:t>
-      </w:r>
-      <w:r>
-        <w:t xml:space="preserve">.</w:t>
+        <w:t xml:space="preserve">guard</w:t>
+      </w:r>
+      <w:r>
+        <w:t xml:space="preserve"> </w:t>
+      </w:r>
+      <w:r>
+        <w:t xml:space="preserve">yang tidak dikode</w:t>
+      </w:r>
+      <w:r>
+        <w:t xml:space="preserve"> </w:t>
+      </w:r>
+      <w:r>
+        <w:t xml:space="preserve">ulang.</w:t>
       </w:r>
     </w:p>
     <w:p>
@@ -8235,93 +8481,83 @@
         <w:pStyle w:val="Compact"/>
       </w:pPr>
       <w:r>
-        <w:t xml:space="preserve">Berkas itu berisi template wajah sukarelawan dan tidak dienkripsi;</w:t>
-      </w:r>
-      <w:r>
-        <w:t xml:space="preserve"> </w:t>
-      </w:r>
-      <w:r>
-        <w:t xml:space="preserve">perlindungannya hanya izin 0600 (root).</w:t>
+        <w:t xml:space="preserve">Logika safe-state baru dibuktikan dengan SAT pada netlist Yosys. Netlist</w:t>
+      </w:r>
+      <w:r>
+        <w:t xml:space="preserve"> </w:t>
+      </w:r>
+      <w:r>
+        <w:rPr>
+          <w:rStyle w:val="VerbatimChar"/>
+        </w:rPr>
+        <w:t xml:space="preserve">guard</w:t>
+      </w:r>
+      <w:r>
+        <w:t xml:space="preserve"> </w:t>
+      </w:r>
+      <w:r>
+        <w:t xml:space="preserve">di Vivado berbeda (424 LUT, Yosys 169).</w:t>
       </w:r>
     </w:p>
     <w:p>
       <w:pPr>
         <w:numPr>
-          <w:ilvl w:val="1"/>
-          <w:numId w:val="1019"/>
+          <w:ilvl w:val="0"/>
+          <w:numId w:val="1018"/>
         </w:numPr>
         <w:pStyle w:val="Compact"/>
       </w:pPr>
       <w:r>
-        <w:t xml:space="preserve">Siapa pun yang punya akses root atau kartu SD bisa membaca template, jadi</w:t>
-      </w:r>
-      <w:r>
-        <w:t xml:space="preserve"> </w:t>
-      </w:r>
-      <w:r>
-        <w:t xml:space="preserve">perlindungan zeroize di FPGA tidak berlaku untuk salinan di host.</w:t>
-      </w:r>
-    </w:p>
-    <w:p>
-      <w:pPr>
-        <w:numPr>
-          <w:ilvl w:val="0"/>
-          <w:numId w:val="1016"/>
-        </w:numPr>
-        <w:pStyle w:val="Compact"/>
-      </w:pPr>
-      <w:r>
         <w:rPr>
           <w:bCs/>
           <w:b/>
         </w:rPr>
-        <w:t xml:space="preserve">Pembatas hanya menghitung kegagalan berturut-turut.</w:t>
-      </w:r>
-      <w:r>
-        <w:t xml:space="preserve"> </w:t>
-      </w:r>
-      <w:r>
-        <w:t xml:space="preserve">Penyerang dengan satu</w:t>
-      </w:r>
-      <w:r>
-        <w:t xml:space="preserve"> </w:t>
-      </w:r>
-      <w:r>
-        <w:t xml:space="preserve">probe sah bisa menyelipkannya setiap 4 percobaan.</w:t>
-      </w:r>
-    </w:p>
-    <w:p>
-      <w:pPr>
-        <w:numPr>
-          <w:ilvl w:val="0"/>
-          <w:numId w:val="1016"/>
-        </w:numPr>
-        <w:pStyle w:val="Compact"/>
-      </w:pPr>
-      <w:r>
-        <w:rPr>
-          <w:bCs/>
-          <w:b/>
-        </w:rPr>
-        <w:t xml:space="preserve">Fault kendali belum disimulasikan:</w:t>
-      </w:r>
-      <w:r>
-        <w:t xml:space="preserve"> </w:t>
-      </w:r>
-      <w:r>
-        <w:t xml:space="preserve">sequencer, tag baris, FSM. Flip pada</w:t>
-      </w:r>
-      <w:r>
-        <w:t xml:space="preserve"> </w:t>
-      </w:r>
-      <w:r>
-        <w:t xml:space="preserve">tag baris bisa membuat ABFT dan kedua komparator salah secara konsisten.</w:t>
-      </w:r>
-      <w:r>
-        <w:t xml:space="preserve"> </w:t>
-      </w:r>
-      <w:r>
-        <w:t xml:space="preserve">[Kemungkinan Besar]</w:t>
+        <w:t xml:space="preserve">Pemuatan bitstream di Linux KV260</w:t>
+      </w:r>
+      <w:r>
+        <w:t xml:space="preserve"> </w:t>
+      </w:r>
+      <w:r>
+        <w:t xml:space="preserve">(overlay device tree,</w:t>
+      </w:r>
+      <w:r>
+        <w:t xml:space="preserve"> </w:t>
+      </w:r>
+      <w:r>
+        <w:rPr>
+          <w:rStyle w:val="VerbatimChar"/>
+        </w:rPr>
+        <w:t xml:space="preserve">xmutil</w:t>
+      </w:r>
+      <w:r>
+        <w:t xml:space="preserve">) adalah</w:t>
+      </w:r>
+      <w:r>
+        <w:t xml:space="preserve"> </w:t>
+      </w:r>
+      <w:r>
+        <w:t xml:space="preserve">bagian paling tidak pasti; tanpa overlay</w:t>
+      </w:r>
+      <w:r>
+        <w:t xml:space="preserve"> </w:t>
+      </w:r>
+      <w:r>
+        <w:rPr>
+          <w:rStyle w:val="VerbatimChar"/>
+        </w:rPr>
+        <w:t xml:space="preserve">pl_clk0</w:t>
+      </w:r>
+      <w:r>
+        <w:t xml:space="preserve"> </w:t>
+      </w:r>
+      <w:r>
+        <w:t xml:space="preserve">mungkin mati dan akses</w:t>
+      </w:r>
+      <w:r>
+        <w:t xml:space="preserve"> </w:t>
+      </w:r>
+      <w:r>
+        <w:t xml:space="preserve">AXI menggantung. [Menebak] Status saat ini:</w:t>
       </w:r>
     </w:p>
     <w:p>
@@ -8333,7 +8569,7 @@
         <w:pStyle w:val="Compact"/>
       </w:pPr>
       <w:r>
-        <w:t xml:space="preserve">Vivado 2026.1 mengode ulang FSM</w:t>
+        <w:t xml:space="preserve">Overlay dari</w:t>
       </w:r>
       <w:r>
         <w:t xml:space="preserve"> </w:t>
@@ -8342,13 +8578,13 @@
         <w:rPr>
           <w:rStyle w:val="VerbatimChar"/>
         </w:rPr>
-        <w:t xml:space="preserve">template_mem</w:t>
-      </w:r>
-      <w:r>
-        <w:t xml:space="preserve"> </w:t>
-      </w:r>
-      <w:r>
-        <w:t xml:space="preserve">dan</w:t>
+        <w:t xml:space="preserve">pl.dtsi</w:t>
+      </w:r>
+      <w:r>
+        <w:t xml:space="preserve"> </w:t>
+      </w:r>
+      <w:r>
+        <w:t xml:space="preserve">sudah berhasil dimuat di board dengan</w:t>
       </w:r>
       <w:r>
         <w:t xml:space="preserve"> </w:t>
@@ -8357,49 +8593,10 @@
         <w:rPr>
           <w:rStyle w:val="VerbatimChar"/>
         </w:rPr>
-        <w:t xml:space="preserve">abft_check</w:t>
-      </w:r>
-      <w:r>
-        <w:t xml:space="preserve"> </w:t>
-      </w:r>
-      <w:r>
-        <w:t xml:space="preserve">(sequential) serta</w:t>
-      </w:r>
-      <w:r>
-        <w:t xml:space="preserve"> </w:t>
-      </w:r>
-      <w:r>
-        <w:rPr>
-          <w:rStyle w:val="VerbatimChar"/>
-        </w:rPr>
-        <w:t xml:space="preserve">padan_avmm</w:t>
-      </w:r>
-      <w:r>
-        <w:t xml:space="preserve"> </w:t>
-      </w:r>
-      <w:r>
-        <w:t xml:space="preserve">dan</w:t>
-      </w:r>
-      <w:r>
-        <w:t xml:space="preserve"> </w:t>
-      </w:r>
-      <w:r>
-        <w:rPr>
-          <w:rStyle w:val="VerbatimChar"/>
-        </w:rPr>
-        <w:t xml:space="preserve">padan_axil</w:t>
-      </w:r>
-      <w:r>
-        <w:t xml:space="preserve"> </w:t>
-      </w:r>
-      <w:r>
-        <w:t xml:space="preserve">(one-hot) [Pasti, log</w:t>
-      </w:r>
-      <w:r>
-        <w:t xml:space="preserve"> </w:t>
-      </w:r>
-      <w:r>
-        <w:t xml:space="preserve">sintesis].</w:t>
+        <w:t xml:space="preserve">xmutil</w:t>
+      </w:r>
+      <w:r>
+        <w:t xml:space="preserve">.</w:t>
       </w:r>
     </w:p>
     <w:p>
@@ -8411,34 +8608,16 @@
         <w:pStyle w:val="Compact"/>
       </w:pPr>
       <w:r>
-        <w:t xml:space="preserve">Cabang</w:t>
-      </w:r>
-      <w:r>
-        <w:t xml:space="preserve"> </w:t>
-      </w:r>
-      <w:r>
         <w:rPr>
           <w:rStyle w:val="VerbatimChar"/>
         </w:rPr>
-        <w:t xml:space="preserve">default</w:t>
-      </w:r>
-      <w:r>
-        <w:t xml:space="preserve"> </w:t>
-      </w:r>
-      <w:r>
-        <w:t xml:space="preserve">di RTL, yaitu jalan pulang ke IDLE dari state ilegal,</w:t>
-      </w:r>
-      <w:r>
-        <w:t xml:space="preserve"> </w:t>
-      </w:r>
-      <w:r>
-        <w:t xml:space="preserve">kemungkinan besar hilang. Satu flip pada register one-hot bisa membuat bus</w:t>
-      </w:r>
-      <w:r>
-        <w:t xml:space="preserve"> </w:t>
-      </w:r>
-      <w:r>
-        <w:t xml:space="preserve">atau sequencer macet sampai reset [Kemungkinan Besar].</w:t>
+        <w:t xml:space="preserve">pl_clk0</w:t>
+      </w:r>
+      <w:r>
+        <w:t xml:space="preserve"> </w:t>
+      </w:r>
+      <w:r>
+        <w:t xml:space="preserve">berjalan pada 99.999.999 Hz.</w:t>
       </w:r>
     </w:p>
     <w:p>
@@ -8450,55 +8629,25 @@
         <w:pStyle w:val="Compact"/>
       </w:pPr>
       <w:r>
-        <w:t xml:space="preserve">Perbaikannya:</w:t>
-      </w:r>
-      <w:r>
-        <w:t xml:space="preserve"> </w:t>
-      </w:r>
-      <w:r>
         <w:rPr>
           <w:rStyle w:val="VerbatimChar"/>
         </w:rPr>
-        <w:t xml:space="preserve">fsm_encoding = "none"</w:t>
-      </w:r>
-      <w:r>
-        <w:t xml:space="preserve"> </w:t>
-      </w:r>
-      <w:r>
-        <w:t xml:space="preserve">dipasang pada keempat register</w:t>
-      </w:r>
-      <w:r>
-        <w:t xml:space="preserve"> </w:t>
-      </w:r>
-      <w:r>
-        <w:t xml:space="preserve">(22 Oktober 2026). Simulasi tidak terpengaruh. Yosys juga mematuhinya:</w:t>
-      </w:r>
-      <w:r>
-        <w:t xml:space="preserve"> </w:t>
-      </w:r>
-      <w:r>
-        <w:t xml:space="preserve">estimasi</w:t>
-      </w:r>
-      <w:r>
-        <w:t xml:space="preserve"> </w:t>
+        <w:t xml:space="preserve">firmware-name</w:t>
+      </w:r>
+      <w:r>
+        <w:t xml:space="preserve"> </w:t>
+      </w:r>
+      <w:r>
+        <w:t xml:space="preserve">(</w:t>
       </w:r>
       <w:r>
         <w:rPr>
           <w:rStyle w:val="VerbatimChar"/>
         </w:rPr>
-        <w:t xml:space="preserve">padan_axil</w:t>
-      </w:r>
-      <w:r>
-        <w:t xml:space="preserve"> </w:t>
-      </w:r>
-      <w:r>
-        <w:t xml:space="preserve">naik dari 4.248 menjadi 4.358 LUT, dan jumlah DSP,</w:t>
-      </w:r>
-      <w:r>
-        <w:t xml:space="preserve"> </w:t>
-      </w:r>
-      <w:r>
-        <w:t xml:space="preserve">block RAM, serta FF register redundan tidak berubah [Pasti].</w:t>
+        <w:t xml:space="preserve">padan_kv260.bit.bin</w:t>
+      </w:r>
+      <w:r>
+        <w:t xml:space="preserve">) sudah disesuaikan di panduan.</w:t>
       </w:r>
     </w:p>
     <w:p>
@@ -8510,20 +8659,20 @@
         <w:pStyle w:val="Compact"/>
       </w:pPr>
       <w:r>
-        <w:t xml:space="preserve">Sudah di-merge di PR #13 (5b854d6). Efeknya di Vivado dan board belum</w:t>
-      </w:r>
-      <w:r>
-        <w:t xml:space="preserve"> </w:t>
-      </w:r>
-      <w:r>
-        <w:t xml:space="preserve">diverifikasi; perlu build ulang.</w:t>
+        <w:t xml:space="preserve">Sisa risiko: image Linux atau firmware lain bisa berperilaku berbeda,</w:t>
+      </w:r>
+      <w:r>
+        <w:t xml:space="preserve"> </w:t>
+      </w:r>
+      <w:r>
+        <w:t xml:space="preserve">misalnya error divider clock yang muncul saat pemuatan pertama.</w:t>
       </w:r>
     </w:p>
     <w:p>
       <w:pPr>
         <w:numPr>
           <w:ilvl w:val="0"/>
-          <w:numId w:val="1016"/>
+          <w:numId w:val="1018"/>
         </w:numPr>
         <w:pStyle w:val="Compact"/>
       </w:pPr>
@@ -8532,208 +8681,40 @@
           <w:bCs/>
           <w:b/>
         </w:rPr>
-        <w:t xml:space="preserve">Fault ganda</w:t>
-      </w:r>
-      <w:r>
-        <w:t xml:space="preserve"> </w:t>
-      </w:r>
-      <w:r>
-        <w:t xml:space="preserve">bisa salah lokalisasi; lokalisasi tidak boleh dipakai untuk</w:t>
-      </w:r>
-      <w:r>
-        <w:t xml:space="preserve"> </w:t>
-      </w:r>
-      <w:r>
-        <w:t xml:space="preserve">koreksi otomatis.</w:t>
+        <w:t xml:space="preserve">Template selalu ada di luar chip.</w:t>
+      </w:r>
+      <w:r>
+        <w:t xml:space="preserve"> </w:t>
+      </w:r>
+      <w:r>
+        <w:t xml:space="preserve">Keadaan guard volatil dan setiap reset</w:t>
+      </w:r>
+      <w:r>
+        <w:t xml:space="preserve"> </w:t>
+      </w:r>
+      <w:r>
+        <w:t xml:space="preserve">menghapus template, jadi host harus mengirim ulang template setiap boot.</w:t>
       </w:r>
     </w:p>
     <w:p>
       <w:pPr>
         <w:numPr>
-          <w:ilvl w:val="0"/>
-          <w:numId w:val="1016"/>
-        </w:numPr>
-        <w:pStyle w:val="Compact"/>
-      </w:pPr>
-      <w:r>
-        <w:rPr>
-          <w:bCs/>
-          <w:b/>
-        </w:rPr>
-        <w:t xml:space="preserve">Flip dua bit</w:t>
-      </w:r>
-      <w:r>
-        <w:t xml:space="preserve"> </w:t>
-      </w:r>
-      <w:r>
-        <w:t xml:space="preserve">bisa membawa LOCKD ke OPEN; flip satu bit selalu tertangkap.</w:t>
-      </w:r>
-    </w:p>
-    <w:p>
-      <w:pPr>
-        <w:numPr>
-          <w:ilvl w:val="0"/>
-          <w:numId w:val="1016"/>
-        </w:numPr>
-        <w:pStyle w:val="Compact"/>
-      </w:pPr>
-      <w:r>
-        <w:rPr>
-          <w:bCs/>
-          <w:b/>
-        </w:rPr>
-        <w:t xml:space="preserve">Bitstream debug adalah alat DoS</w:t>
-      </w:r>
-      <w:r>
-        <w:t xml:space="preserve"> </w:t>
-      </w:r>
-      <w:r>
-        <w:t xml:space="preserve">dan bisa dibangun lewat</w:t>
-      </w:r>
-      <w:r>
-        <w:t xml:space="preserve"> </w:t>
-      </w:r>
-      <w:r>
-        <w:rPr>
-          <w:rStyle w:val="VerbatimChar"/>
-        </w:rPr>
-        <w:t xml:space="preserve">verilog_define</w:t>
-      </w:r>
-      <w:r>
-        <w:t xml:space="preserve"> </w:t>
-      </w:r>
-      <w:r>
-        <w:t xml:space="preserve">Vivado di luar repo. Penandanya STATUS[31] = 1.</w:t>
-      </w:r>
-    </w:p>
-    <w:p>
-      <w:pPr>
-        <w:numPr>
-          <w:ilvl w:val="0"/>
-          <w:numId w:val="1016"/>
-        </w:numPr>
-        <w:pStyle w:val="Compact"/>
-      </w:pPr>
-      <w:r>
-        <w:rPr>
-          <w:bCs/>
-          <w:b/>
-        </w:rPr>
-        <w:t xml:space="preserve">Tamper PMOD dengan pull-up internal</w:t>
-      </w:r>
-      <w:r>
-        <w:t xml:space="preserve"> </w:t>
-      </w:r>
-      <w:r>
-        <w:t xml:space="preserve">peka terhadap kabel lepas atau</w:t>
-      </w:r>
-      <w:r>
-        <w:t xml:space="preserve"> </w:t>
-      </w:r>
-      <w:r>
-        <w:t xml:space="preserve">sentuhan ke GND; satu glitch sudah menghapus enrollment.</w:t>
-      </w:r>
-    </w:p>
-    <w:p>
-      <w:pPr>
-        <w:numPr>
-          <w:ilvl w:val="0"/>
-          <w:numId w:val="1016"/>
-        </w:numPr>
-        <w:pStyle w:val="Compact"/>
-      </w:pPr>
-      <w:r>
-        <w:rPr>
-          <w:bCs/>
-          <w:b/>
-        </w:rPr>
-        <w:t xml:space="preserve">Hasil INT8 vs float memakai data sintetis;</w:t>
-      </w:r>
-      <w:r>
-        <w:t xml:space="preserve"> </w:t>
-      </w:r>
-      <w:r>
-        <w:t xml:space="preserve">tidak ada klaim akurasi</w:t>
-      </w:r>
-      <w:r>
-        <w:t xml:space="preserve"> </w:t>
-      </w:r>
-      <w:r>
-        <w:t xml:space="preserve">biometrik nyata.</w:t>
-      </w:r>
-      <w:r>
-        <w:t xml:space="preserve"> </w:t>
-      </w:r>
-      <w:r>
-        <w:rPr>
-          <w:rStyle w:val="VerbatimChar"/>
-        </w:rPr>
-        <w:t xml:space="preserve">padan_cam.py</w:t>
-      </w:r>
-      <w:r>
-        <w:t xml:space="preserve"> </w:t>
-      </w:r>
-      <w:r>
-        <w:t xml:space="preserve">memakai ambang kosinus SFace float (0,363)</w:t>
-      </w:r>
-      <w:r>
-        <w:t xml:space="preserve"> </w:t>
-      </w:r>
-      <w:r>
-        <w:t xml:space="preserve">yang belum dikalibrasi untuk INT8 dengan wajah nyata.</w:t>
-      </w:r>
-    </w:p>
-    <w:bookmarkEnd w:id="32"/>
-    <w:bookmarkStart w:id="33" w:name="langkah-berikutnya"/>
-    <w:p>
-      <w:pPr>
-        <w:pStyle w:val="Heading1"/>
-      </w:pPr>
-      <w:r>
-        <w:t xml:space="preserve">11. Langkah berikutnya</w:t>
-      </w:r>
-    </w:p>
-    <w:p>
-      <w:pPr>
-        <w:numPr>
-          <w:ilvl w:val="0"/>
+          <w:ilvl w:val="1"/>
           <w:numId w:val="1021"/>
         </w:numPr>
         <w:pStyle w:val="Compact"/>
       </w:pPr>
       <w:r>
         <w:rPr>
-          <w:bCs/>
-          <w:b/>
-        </w:rPr>
-        <w:t xml:space="preserve">Build ulang di Vivado</w:t>
-      </w:r>
-      <w:r>
-        <w:t xml:space="preserve"> </w:t>
-      </w:r>
-      <w:r>
-        <w:t xml:space="preserve">setelah</w:t>
-      </w:r>
-      <w:r>
-        <w:t xml:space="preserve"> </w:t>
-      </w:r>
-      <w:r>
-        <w:rPr>
           <w:rStyle w:val="VerbatimChar"/>
         </w:rPr>
-        <w:t xml:space="preserve">fsm_encoding = "none"</w:t>
-      </w:r>
-      <w:r>
-        <w:t xml:space="preserve"> </w:t>
-      </w:r>
-      <w:r>
-        <w:t xml:space="preserve">dipasang di empat</w:t>
-      </w:r>
-      <w:r>
-        <w:t xml:space="preserve"> </w:t>
-      </w:r>
-      <w:r>
-        <w:t xml:space="preserve">FSM (risiko 5), lalu jalankan</w:t>
+        <w:t xml:space="preserve">padan_cam.py</w:t>
+      </w:r>
+      <w:r>
+        <w:t xml:space="preserve"> </w:t>
+      </w:r>
+      <w:r>
+        <w:t xml:space="preserve">melakukannya dari</w:t>
       </w:r>
       <w:r>
         <w:t xml:space="preserve"> </w:t>
@@ -8742,100 +8723,81 @@
         <w:rPr>
           <w:rStyle w:val="VerbatimChar"/>
         </w:rPr>
-        <w:t xml:space="preserve">check_reports.py</w:t>
-      </w:r>
-      <w:r>
-        <w:t xml:space="preserve">. Pemeriksaan FSM harus</w:t>
-      </w:r>
-      <w:r>
-        <w:t xml:space="preserve"> </w:t>
-      </w:r>
-      <w:r>
-        <w:t xml:space="preserve">PASS, dan angka utilisasi serta timing dibandingkan dengan build pertama.</w:t>
+        <w:t xml:space="preserve">padan_galeri.json</w:t>
+      </w:r>
+      <w:r>
+        <w:t xml:space="preserve">.</w:t>
       </w:r>
     </w:p>
     <w:p>
       <w:pPr>
         <w:numPr>
-          <w:ilvl w:val="0"/>
+          <w:ilvl w:val="1"/>
           <w:numId w:val="1021"/>
         </w:numPr>
         <w:pStyle w:val="Compact"/>
       </w:pPr>
       <w:r>
-        <w:rPr>
-          <w:bCs/>
-          <w:b/>
-        </w:rPr>
-        <w:t xml:space="preserve">Cek pin H12 = PMOD J2 pin 1</w:t>
-      </w:r>
-      <w:r>
-        <w:t xml:space="preserve"> </w:t>
-      </w:r>
-      <w:r>
-        <w:t xml:space="preserve">di skematik carrier KV260 sebelum menyambung</w:t>
-      </w:r>
-      <w:r>
-        <w:t xml:space="preserve"> </w:t>
-      </w:r>
-      <w:r>
-        <w:t xml:space="preserve">kabel tamper.</w:t>
+        <w:t xml:space="preserve">Berkas itu berisi template wajah sukarelawan dan tidak dienkripsi;</w:t>
+      </w:r>
+      <w:r>
+        <w:t xml:space="preserve"> </w:t>
+      </w:r>
+      <w:r>
+        <w:t xml:space="preserve">perlindungannya hanya izin 0600 (root).</w:t>
       </w:r>
     </w:p>
     <w:p>
       <w:pPr>
         <w:numPr>
-          <w:ilvl w:val="0"/>
+          <w:ilvl w:val="1"/>
           <w:numId w:val="1021"/>
         </w:numPr>
         <w:pStyle w:val="Compact"/>
       </w:pPr>
       <w:r>
+        <w:t xml:space="preserve">Siapa pun yang punya akses root atau kartu SD bisa membaca template, jadi</w:t>
+      </w:r>
+      <w:r>
+        <w:t xml:space="preserve"> </w:t>
+      </w:r>
+      <w:r>
+        <w:t xml:space="preserve">perlindungan zeroize di FPGA tidak berlaku untuk salinan di host.</w:t>
+      </w:r>
+    </w:p>
+    <w:p>
+      <w:pPr>
+        <w:numPr>
+          <w:ilvl w:val="0"/>
+          <w:numId w:val="1018"/>
+        </w:numPr>
+        <w:pStyle w:val="Compact"/>
+      </w:pPr>
+      <w:r>
         <w:rPr>
           <w:bCs/>
           <w:b/>
         </w:rPr>
-        <w:t xml:space="preserve">Uji di board dengan bitstream baru:</w:t>
-      </w:r>
-      <w:r>
-        <w:t xml:space="preserve"> </w:t>
-      </w:r>
-      <w:r>
-        <w:rPr>
-          <w:rStyle w:val="VerbatimChar"/>
-        </w:rPr>
-        <w:t xml:space="preserve">padan_test.py</w:t>
-      </w:r>
-      <w:r>
-        <w:t xml:space="preserve"> </w:t>
-      </w:r>
-      <w:r>
-        <w:t xml:space="preserve">(harus PASS</w:t>
-      </w:r>
-      <w:r>
-        <w:t xml:space="preserve"> </w:t>
-      </w:r>
-      <w:r>
-        <w:t xml:space="preserve">46/46), lalu uji tamper PMOD manual (</w:t>
-      </w:r>
-      <w:r>
-        <w:rPr>
-          <w:rStyle w:val="VerbatimChar"/>
-        </w:rPr>
-        <w:t xml:space="preserve">docs/fpga_howto.md</w:t>
-      </w:r>
-      <w:r>
-        <w:t xml:space="preserve"> </w:t>
-      </w:r>
-      <w:r>
-        <w:t xml:space="preserve">bagian 7).</w:t>
+        <w:t xml:space="preserve">Pembatas hanya menghitung kegagalan berturut-turut.</w:t>
+      </w:r>
+      <w:r>
+        <w:t xml:space="preserve"> </w:t>
+      </w:r>
+      <w:r>
+        <w:t xml:space="preserve">Penyerang dengan satu</w:t>
+      </w:r>
+      <w:r>
+        <w:t xml:space="preserve"> </w:t>
+      </w:r>
+      <w:r>
+        <w:t xml:space="preserve">probe sah bisa menyelipkannya setiap 4 percobaan.</w:t>
       </w:r>
     </w:p>
     <w:p>
       <w:pPr>
         <w:numPr>
           <w:ilvl w:val="0"/>
-          <w:numId w:val="1021"/>
+          <w:numId w:val="1018"/>
         </w:numPr>
         <w:pStyle w:val="Compact"/>
       </w:pPr>
@@ -8844,26 +8806,227 @@
           <w:bCs/>
           <w:b/>
         </w:rPr>
-        <w:t xml:space="preserve">Pertimbangkan penghitung kegagalan total atau pembatas laju</w:t>
-      </w:r>
-      <w:r>
-        <w:t xml:space="preserve"> </w:t>
-      </w:r>
-      <w:r>
-        <w:t xml:space="preserve">bila ancaman</w:t>
-      </w:r>
-      <w:r>
-        <w:t xml:space="preserve"> </w:t>
-      </w:r>
-      <w:r>
-        <w:t xml:space="preserve">probe sah relevan.</w:t>
+        <w:t xml:space="preserve">Fault kendali belum disimulasikan:</w:t>
+      </w:r>
+      <w:r>
+        <w:t xml:space="preserve"> </w:t>
+      </w:r>
+      <w:r>
+        <w:t xml:space="preserve">sequencer, tag baris, FSM. Flip pada</w:t>
+      </w:r>
+      <w:r>
+        <w:t xml:space="preserve"> </w:t>
+      </w:r>
+      <w:r>
+        <w:t xml:space="preserve">tag baris bisa membuat ABFT dan kedua komparator salah secara konsisten.</w:t>
+      </w:r>
+      <w:r>
+        <w:t xml:space="preserve"> </w:t>
+      </w:r>
+      <w:r>
+        <w:t xml:space="preserve">[Kemungkinan Besar]</w:t>
+      </w:r>
+    </w:p>
+    <w:p>
+      <w:pPr>
+        <w:numPr>
+          <w:ilvl w:val="1"/>
+          <w:numId w:val="1022"/>
+        </w:numPr>
+        <w:pStyle w:val="Compact"/>
+      </w:pPr>
+      <w:r>
+        <w:t xml:space="preserve">Vivado 2026.1 mengode ulang FSM</w:t>
+      </w:r>
+      <w:r>
+        <w:t xml:space="preserve"> </w:t>
+      </w:r>
+      <w:r>
+        <w:rPr>
+          <w:rStyle w:val="VerbatimChar"/>
+        </w:rPr>
+        <w:t xml:space="preserve">template_mem</w:t>
+      </w:r>
+      <w:r>
+        <w:t xml:space="preserve"> </w:t>
+      </w:r>
+      <w:r>
+        <w:t xml:space="preserve">dan</w:t>
+      </w:r>
+      <w:r>
+        <w:t xml:space="preserve"> </w:t>
+      </w:r>
+      <w:r>
+        <w:rPr>
+          <w:rStyle w:val="VerbatimChar"/>
+        </w:rPr>
+        <w:t xml:space="preserve">abft_check</w:t>
+      </w:r>
+      <w:r>
+        <w:t xml:space="preserve"> </w:t>
+      </w:r>
+      <w:r>
+        <w:t xml:space="preserve">(sequential) serta</w:t>
+      </w:r>
+      <w:r>
+        <w:t xml:space="preserve"> </w:t>
+      </w:r>
+      <w:r>
+        <w:rPr>
+          <w:rStyle w:val="VerbatimChar"/>
+        </w:rPr>
+        <w:t xml:space="preserve">padan_avmm</w:t>
+      </w:r>
+      <w:r>
+        <w:t xml:space="preserve"> </w:t>
+      </w:r>
+      <w:r>
+        <w:t xml:space="preserve">dan</w:t>
+      </w:r>
+      <w:r>
+        <w:t xml:space="preserve"> </w:t>
+      </w:r>
+      <w:r>
+        <w:rPr>
+          <w:rStyle w:val="VerbatimChar"/>
+        </w:rPr>
+        <w:t xml:space="preserve">padan_axil</w:t>
+      </w:r>
+      <w:r>
+        <w:t xml:space="preserve"> </w:t>
+      </w:r>
+      <w:r>
+        <w:t xml:space="preserve">(one-hot) [Pasti, log</w:t>
+      </w:r>
+      <w:r>
+        <w:t xml:space="preserve"> </w:t>
+      </w:r>
+      <w:r>
+        <w:t xml:space="preserve">sintesis].</w:t>
+      </w:r>
+    </w:p>
+    <w:p>
+      <w:pPr>
+        <w:numPr>
+          <w:ilvl w:val="1"/>
+          <w:numId w:val="1022"/>
+        </w:numPr>
+        <w:pStyle w:val="Compact"/>
+      </w:pPr>
+      <w:r>
+        <w:t xml:space="preserve">Cabang</w:t>
+      </w:r>
+      <w:r>
+        <w:t xml:space="preserve"> </w:t>
+      </w:r>
+      <w:r>
+        <w:rPr>
+          <w:rStyle w:val="VerbatimChar"/>
+        </w:rPr>
+        <w:t xml:space="preserve">default</w:t>
+      </w:r>
+      <w:r>
+        <w:t xml:space="preserve"> </w:t>
+      </w:r>
+      <w:r>
+        <w:t xml:space="preserve">di RTL, yaitu jalan pulang ke IDLE dari state ilegal,</w:t>
+      </w:r>
+      <w:r>
+        <w:t xml:space="preserve"> </w:t>
+      </w:r>
+      <w:r>
+        <w:t xml:space="preserve">kemungkinan besar hilang. Satu flip pada register one-hot bisa membuat bus</w:t>
+      </w:r>
+      <w:r>
+        <w:t xml:space="preserve"> </w:t>
+      </w:r>
+      <w:r>
+        <w:t xml:space="preserve">atau sequencer macet sampai reset [Kemungkinan Besar].</w:t>
+      </w:r>
+    </w:p>
+    <w:p>
+      <w:pPr>
+        <w:numPr>
+          <w:ilvl w:val="1"/>
+          <w:numId w:val="1022"/>
+        </w:numPr>
+        <w:pStyle w:val="Compact"/>
+      </w:pPr>
+      <w:r>
+        <w:t xml:space="preserve">Perbaikannya:</w:t>
+      </w:r>
+      <w:r>
+        <w:t xml:space="preserve"> </w:t>
+      </w:r>
+      <w:r>
+        <w:rPr>
+          <w:rStyle w:val="VerbatimChar"/>
+        </w:rPr>
+        <w:t xml:space="preserve">fsm_encoding = "none"</w:t>
+      </w:r>
+      <w:r>
+        <w:t xml:space="preserve"> </w:t>
+      </w:r>
+      <w:r>
+        <w:t xml:space="preserve">dipasang pada keempat register</w:t>
+      </w:r>
+      <w:r>
+        <w:t xml:space="preserve"> </w:t>
+      </w:r>
+      <w:r>
+        <w:t xml:space="preserve">(22 Oktober 2026). Simulasi tidak terpengaruh. Yosys juga mematuhinya:</w:t>
+      </w:r>
+      <w:r>
+        <w:t xml:space="preserve"> </w:t>
+      </w:r>
+      <w:r>
+        <w:t xml:space="preserve">estimasi</w:t>
+      </w:r>
+      <w:r>
+        <w:t xml:space="preserve"> </w:t>
+      </w:r>
+      <w:r>
+        <w:rPr>
+          <w:rStyle w:val="VerbatimChar"/>
+        </w:rPr>
+        <w:t xml:space="preserve">padan_axil</w:t>
+      </w:r>
+      <w:r>
+        <w:t xml:space="preserve"> </w:t>
+      </w:r>
+      <w:r>
+        <w:t xml:space="preserve">naik dari 4.248 menjadi 4.358 LUT, dan jumlah DSP,</w:t>
+      </w:r>
+      <w:r>
+        <w:t xml:space="preserve"> </w:t>
+      </w:r>
+      <w:r>
+        <w:t xml:space="preserve">block RAM, serta FF register redundan tidak berubah [Pasti].</w:t>
+      </w:r>
+    </w:p>
+    <w:p>
+      <w:pPr>
+        <w:numPr>
+          <w:ilvl w:val="1"/>
+          <w:numId w:val="1022"/>
+        </w:numPr>
+        <w:pStyle w:val="Compact"/>
+      </w:pPr>
+      <w:r>
+        <w:t xml:space="preserve">Sudah di-merge di PR #13 (5b854d6). Efeknya di Vivado dan board belum</w:t>
+      </w:r>
+      <w:r>
+        <w:t xml:space="preserve"> </w:t>
+      </w:r>
+      <w:r>
+        <w:t xml:space="preserve">diverifikasi; perlu build ulang.</w:t>
       </w:r>
     </w:p>
     <w:p>
       <w:pPr>
         <w:numPr>
           <w:ilvl w:val="0"/>
-          <w:numId w:val="1021"/>
+          <w:numId w:val="1018"/>
         </w:numPr>
         <w:pStyle w:val="Compact"/>
       </w:pPr>
@@ -8872,6 +9035,382 @@
           <w:bCs/>
           <w:b/>
         </w:rPr>
+        <w:t xml:space="preserve">Fault ganda</w:t>
+      </w:r>
+      <w:r>
+        <w:t xml:space="preserve"> </w:t>
+      </w:r>
+      <w:r>
+        <w:t xml:space="preserve">bisa salah lokalisasi; lokalisasi tidak boleh dipakai untuk</w:t>
+      </w:r>
+      <w:r>
+        <w:t xml:space="preserve"> </w:t>
+      </w:r>
+      <w:r>
+        <w:t xml:space="preserve">koreksi otomatis.</w:t>
+      </w:r>
+    </w:p>
+    <w:p>
+      <w:pPr>
+        <w:numPr>
+          <w:ilvl w:val="0"/>
+          <w:numId w:val="1018"/>
+        </w:numPr>
+        <w:pStyle w:val="Compact"/>
+      </w:pPr>
+      <w:r>
+        <w:rPr>
+          <w:bCs/>
+          <w:b/>
+        </w:rPr>
+        <w:t xml:space="preserve">Flip dua bit</w:t>
+      </w:r>
+      <w:r>
+        <w:t xml:space="preserve"> </w:t>
+      </w:r>
+      <w:r>
+        <w:t xml:space="preserve">bisa membawa LOCKD ke OPEN; flip satu bit selalu tertangkap.</w:t>
+      </w:r>
+    </w:p>
+    <w:p>
+      <w:pPr>
+        <w:numPr>
+          <w:ilvl w:val="0"/>
+          <w:numId w:val="1018"/>
+        </w:numPr>
+        <w:pStyle w:val="Compact"/>
+      </w:pPr>
+      <w:r>
+        <w:rPr>
+          <w:bCs/>
+          <w:b/>
+        </w:rPr>
+        <w:t xml:space="preserve">Bitstream debug adalah alat DoS</w:t>
+      </w:r>
+      <w:r>
+        <w:t xml:space="preserve"> </w:t>
+      </w:r>
+      <w:r>
+        <w:t xml:space="preserve">dan bisa dibangun lewat</w:t>
+      </w:r>
+      <w:r>
+        <w:t xml:space="preserve"> </w:t>
+      </w:r>
+      <w:r>
+        <w:rPr>
+          <w:rStyle w:val="VerbatimChar"/>
+        </w:rPr>
+        <w:t xml:space="preserve">verilog_define</w:t>
+      </w:r>
+      <w:r>
+        <w:t xml:space="preserve"> </w:t>
+      </w:r>
+      <w:r>
+        <w:t xml:space="preserve">Vivado di luar repo. Penandanya STATUS[31] = 1.</w:t>
+      </w:r>
+    </w:p>
+    <w:p>
+      <w:pPr>
+        <w:numPr>
+          <w:ilvl w:val="0"/>
+          <w:numId w:val="1018"/>
+        </w:numPr>
+        <w:pStyle w:val="Compact"/>
+      </w:pPr>
+      <w:r>
+        <w:rPr>
+          <w:bCs/>
+          <w:b/>
+        </w:rPr>
+        <w:t xml:space="preserve">Tamper PMOD dengan pull-up internal</w:t>
+      </w:r>
+      <w:r>
+        <w:t xml:space="preserve"> </w:t>
+      </w:r>
+      <w:r>
+        <w:t xml:space="preserve">peka terhadap kabel lepas atau</w:t>
+      </w:r>
+      <w:r>
+        <w:t xml:space="preserve"> </w:t>
+      </w:r>
+      <w:r>
+        <w:t xml:space="preserve">sentuhan ke GND; satu glitch sudah menghapus enrollment.</w:t>
+      </w:r>
+    </w:p>
+    <w:p>
+      <w:pPr>
+        <w:numPr>
+          <w:ilvl w:val="0"/>
+          <w:numId w:val="1018"/>
+        </w:numPr>
+        <w:pStyle w:val="Compact"/>
+      </w:pPr>
+      <w:r>
+        <w:rPr>
+          <w:bCs/>
+          <w:b/>
+        </w:rPr>
+        <w:t xml:space="preserve">Hasil INT8 vs float memakai data sintetis;</w:t>
+      </w:r>
+      <w:r>
+        <w:t xml:space="preserve"> </w:t>
+      </w:r>
+      <w:r>
+        <w:t xml:space="preserve">tidak ada klaim akurasi</w:t>
+      </w:r>
+      <w:r>
+        <w:t xml:space="preserve"> </w:t>
+      </w:r>
+      <w:r>
+        <w:t xml:space="preserve">biometrik nyata.</w:t>
+      </w:r>
+      <w:r>
+        <w:t xml:space="preserve"> </w:t>
+      </w:r>
+      <w:r>
+        <w:rPr>
+          <w:rStyle w:val="VerbatimChar"/>
+        </w:rPr>
+        <w:t xml:space="preserve">padan_cam.py</w:t>
+      </w:r>
+      <w:r>
+        <w:t xml:space="preserve"> </w:t>
+      </w:r>
+      <w:r>
+        <w:t xml:space="preserve">memakai ambang kosinus SFace float (0,363)</w:t>
+      </w:r>
+      <w:r>
+        <w:t xml:space="preserve"> </w:t>
+      </w:r>
+      <w:r>
+        <w:t xml:space="preserve">yang belum dikalibrasi untuk INT8 dengan wajah nyata.</w:t>
+      </w:r>
+    </w:p>
+    <w:p>
+      <w:pPr>
+        <w:numPr>
+          <w:ilvl w:val="0"/>
+          <w:numId w:val="1023"/>
+        </w:numPr>
+        <w:pStyle w:val="Compact"/>
+      </w:pPr>
+      <w:r>
+        <w:t xml:space="preserve">Uji kamera pertama menunjukkan kuantisasi INT8 tidak bermasalah</w:t>
+      </w:r>
+      <w:r>
+        <w:t xml:space="preserve"> </w:t>
+      </w:r>
+      <w:r>
+        <w:t xml:space="preserve">(kosinus 1,0000).</w:t>
+      </w:r>
+    </w:p>
+    <w:p>
+      <w:pPr>
+        <w:numPr>
+          <w:ilvl w:val="0"/>
+          <w:numId w:val="1023"/>
+        </w:numPr>
+        <w:pStyle w:val="Compact"/>
+      </w:pPr>
+      <w:r>
+        <w:t xml:space="preserve">Sebaran skor satu subjek justru melintasi τ (0,31–0,84), sehingga</w:t>
+      </w:r>
+      <w:r>
+        <w:t xml:space="preserve"> </w:t>
+      </w:r>
+      <w:r>
+        <w:t xml:space="preserve">kalibrasi menjadi risiko utama akurasi (bagian 5).</w:t>
+      </w:r>
+    </w:p>
+    <w:bookmarkEnd w:id="32"/>
+    <w:bookmarkStart w:id="33" w:name="langkah-berikutnya"/>
+    <w:p>
+      <w:pPr>
+        <w:pStyle w:val="Heading1"/>
+      </w:pPr>
+      <w:r>
+        <w:t xml:space="preserve">11. Langkah berikutnya</w:t>
+      </w:r>
+    </w:p>
+    <w:p>
+      <w:pPr>
+        <w:numPr>
+          <w:ilvl w:val="0"/>
+          <w:numId w:val="1024"/>
+        </w:numPr>
+        <w:pStyle w:val="Compact"/>
+      </w:pPr>
+      <w:r>
+        <w:rPr>
+          <w:bCs/>
+          <w:b/>
+        </w:rPr>
+        <w:t xml:space="preserve">Build ulang di Vivado</w:t>
+      </w:r>
+      <w:r>
+        <w:t xml:space="preserve"> </w:t>
+      </w:r>
+      <w:r>
+        <w:t xml:space="preserve">setelah</w:t>
+      </w:r>
+      <w:r>
+        <w:t xml:space="preserve"> </w:t>
+      </w:r>
+      <w:r>
+        <w:rPr>
+          <w:rStyle w:val="VerbatimChar"/>
+        </w:rPr>
+        <w:t xml:space="preserve">fsm_encoding = "none"</w:t>
+      </w:r>
+      <w:r>
+        <w:t xml:space="preserve"> </w:t>
+      </w:r>
+      <w:r>
+        <w:t xml:space="preserve">dipasang di empat</w:t>
+      </w:r>
+      <w:r>
+        <w:t xml:space="preserve"> </w:t>
+      </w:r>
+      <w:r>
+        <w:t xml:space="preserve">FSM (risiko 5), lalu jalankan</w:t>
+      </w:r>
+      <w:r>
+        <w:t xml:space="preserve"> </w:t>
+      </w:r>
+      <w:r>
+        <w:rPr>
+          <w:rStyle w:val="VerbatimChar"/>
+        </w:rPr>
+        <w:t xml:space="preserve">check_reports.py</w:t>
+      </w:r>
+      <w:r>
+        <w:t xml:space="preserve">. Pemeriksaan FSM harus</w:t>
+      </w:r>
+      <w:r>
+        <w:t xml:space="preserve"> </w:t>
+      </w:r>
+      <w:r>
+        <w:t xml:space="preserve">PASS, dan angka utilisasi serta timing dibandingkan dengan build pertama.</w:t>
+      </w:r>
+    </w:p>
+    <w:p>
+      <w:pPr>
+        <w:numPr>
+          <w:ilvl w:val="0"/>
+          <w:numId w:val="1024"/>
+        </w:numPr>
+        <w:pStyle w:val="Compact"/>
+      </w:pPr>
+      <w:r>
+        <w:rPr>
+          <w:bCs/>
+          <w:b/>
+        </w:rPr>
+        <w:t xml:space="preserve">Cek pin H12 = PMOD J2 pin 1</w:t>
+      </w:r>
+      <w:r>
+        <w:t xml:space="preserve"> </w:t>
+      </w:r>
+      <w:r>
+        <w:t xml:space="preserve">di skematik carrier KV260 sebelum menyambung</w:t>
+      </w:r>
+      <w:r>
+        <w:t xml:space="preserve"> </w:t>
+      </w:r>
+      <w:r>
+        <w:t xml:space="preserve">kabel tamper.</w:t>
+      </w:r>
+    </w:p>
+    <w:p>
+      <w:pPr>
+        <w:numPr>
+          <w:ilvl w:val="0"/>
+          <w:numId w:val="1024"/>
+        </w:numPr>
+        <w:pStyle w:val="Compact"/>
+      </w:pPr>
+      <w:r>
+        <w:rPr>
+          <w:bCs/>
+          <w:b/>
+        </w:rPr>
+        <w:t xml:space="preserve">Uji di board dengan bitstream baru:</w:t>
+      </w:r>
+      <w:r>
+        <w:t xml:space="preserve"> </w:t>
+      </w:r>
+      <w:r>
+        <w:rPr>
+          <w:rStyle w:val="VerbatimChar"/>
+        </w:rPr>
+        <w:t xml:space="preserve">padan_test.py</w:t>
+      </w:r>
+      <w:r>
+        <w:t xml:space="preserve"> </w:t>
+      </w:r>
+      <w:r>
+        <w:t xml:space="preserve">(harus PASS</w:t>
+      </w:r>
+      <w:r>
+        <w:t xml:space="preserve"> </w:t>
+      </w:r>
+      <w:r>
+        <w:t xml:space="preserve">46/46), lalu uji tamper PMOD manual (</w:t>
+      </w:r>
+      <w:r>
+        <w:rPr>
+          <w:rStyle w:val="VerbatimChar"/>
+        </w:rPr>
+        <w:t xml:space="preserve">docs/fpga_howto.md</w:t>
+      </w:r>
+      <w:r>
+        <w:t xml:space="preserve"> </w:t>
+      </w:r>
+      <w:r>
+        <w:t xml:space="preserve">bagian 7).</w:t>
+      </w:r>
+    </w:p>
+    <w:p>
+      <w:pPr>
+        <w:numPr>
+          <w:ilvl w:val="0"/>
+          <w:numId w:val="1024"/>
+        </w:numPr>
+        <w:pStyle w:val="Compact"/>
+      </w:pPr>
+      <w:r>
+        <w:rPr>
+          <w:bCs/>
+          <w:b/>
+        </w:rPr>
+        <w:t xml:space="preserve">Pertimbangkan penghitung kegagalan total atau pembatas laju</w:t>
+      </w:r>
+      <w:r>
+        <w:t xml:space="preserve"> </w:t>
+      </w:r>
+      <w:r>
+        <w:t xml:space="preserve">bila ancaman</w:t>
+      </w:r>
+      <w:r>
+        <w:t xml:space="preserve"> </w:t>
+      </w:r>
+      <w:r>
+        <w:t xml:space="preserve">probe sah relevan.</w:t>
+      </w:r>
+    </w:p>
+    <w:p>
+      <w:pPr>
+        <w:numPr>
+          <w:ilvl w:val="0"/>
+          <w:numId w:val="1024"/>
+        </w:numPr>
+        <w:pStyle w:val="Compact"/>
+      </w:pPr>
+      <w:r>
+        <w:rPr>
+          <w:bCs/>
+          <w:b/>
+        </w:rPr>
         <w:t xml:space="preserve">Tambah simulasi fault kendali</w:t>
       </w:r>
       <w:r>
@@ -8885,6 +9424,79 @@
       </w:r>
       <w:r>
         <w:t xml:space="preserve">kendali.</w:t>
+      </w:r>
+    </w:p>
+    <w:p>
+      <w:pPr>
+        <w:numPr>
+          <w:ilvl w:val="0"/>
+          <w:numId w:val="1024"/>
+        </w:numPr>
+        <w:pStyle w:val="Compact"/>
+      </w:pPr>
+      <w:r>
+        <w:rPr>
+          <w:bCs/>
+          <w:b/>
+        </w:rPr>
+        <w:t xml:space="preserve">Uji kamera di FPGA:</w:t>
+      </w:r>
+      <w:r>
+        <w:t xml:space="preserve"> </w:t>
+      </w:r>
+      <w:r>
+        <w:t xml:space="preserve">jalankan</w:t>
+      </w:r>
+      <w:r>
+        <w:t xml:space="preserve"> </w:t>
+      </w:r>
+      <w:r>
+        <w:rPr>
+          <w:rStyle w:val="VerbatimChar"/>
+        </w:rPr>
+        <w:t xml:space="preserve">padan_cam.py</w:t>
+      </w:r>
+      <w:r>
+        <w:t xml:space="preserve"> </w:t>
+      </w:r>
+      <w:r>
+        <w:t xml:space="preserve">tanpa</w:t>
+      </w:r>
+      <w:r>
+        <w:t xml:space="preserve"> </w:t>
+      </w:r>
+      <w:r>
+        <w:rPr>
+          <w:rStyle w:val="VerbatimChar"/>
+        </w:rPr>
+        <w:t xml:space="preserve">--backend model</w:t>
+      </w:r>
+      <w:r>
+        <w:t xml:space="preserve">, uji</w:t>
+      </w:r>
+      <w:r>
+        <w:t xml:space="preserve"> </w:t>
+      </w:r>
+      <w:r>
+        <w:t xml:space="preserve">galeri lintas sesi (skrip ditutup, lalu</w:t>
+      </w:r>
+      <w:r>
+        <w:t xml:space="preserve"> </w:t>
+      </w:r>
+      <w:r>
+        <w:rPr>
+          <w:rStyle w:val="VerbatimChar"/>
+        </w:rPr>
+        <w:t xml:space="preserve">xmutil loadapp</w:t>
+      </w:r>
+      <w:r>
+        <w:t xml:space="preserve">), dan kalibrasi τ</w:t>
+      </w:r>
+      <w:r>
+        <w:t xml:space="preserve"> </w:t>
+      </w:r>
+      <w:r>
+        <w:t xml:space="preserve">dengan beberapa orang yang di-enroll dan tidak di-enroll.</w:t>
       </w:r>
     </w:p>
     <w:bookmarkEnd w:id="33"/>
@@ -9207,6 +9819,12 @@
     <w:abstractNumId w:val="991"/>
   </w:num>
   <w:num w:numId="1016">
+    <w:abstractNumId w:val="991"/>
+  </w:num>
+  <w:num w:numId="1017">
+    <w:abstractNumId w:val="991"/>
+  </w:num>
+  <w:num w:numId="1018">
     <w:abstractNumId w:val="99411"/>
     <w:lvlOverride w:ilvl="0">
       <w:startOverride w:val="1"/>
@@ -9236,12 +9854,6 @@
       <w:startOverride w:val="1"/>
     </w:lvlOverride>
   </w:num>
-  <w:num w:numId="1017">
-    <w:abstractNumId w:val="991"/>
-  </w:num>
-  <w:num w:numId="1018">
-    <w:abstractNumId w:val="991"/>
-  </w:num>
   <w:num w:numId="1019">
     <w:abstractNumId w:val="991"/>
   </w:num>
@@ -9249,6 +9861,15 @@
     <w:abstractNumId w:val="991"/>
   </w:num>
   <w:num w:numId="1021">
+    <w:abstractNumId w:val="991"/>
+  </w:num>
+  <w:num w:numId="1022">
+    <w:abstractNumId w:val="991"/>
+  </w:num>
+  <w:num w:numId="1023">
+    <w:abstractNumId w:val="991"/>
+  </w:num>
+  <w:num w:numId="1024">
     <w:abstractNumId w:val="99411"/>
     <w:lvlOverride w:ilvl="0">
       <w:startOverride w:val="1"/>

</xml_diff>